<commit_message>
Todas as mockups, descrição incompleta
</commit_message>
<xml_diff>
--- a/docs/Relatorio.docx
+++ b/docs/Relatorio.docx
@@ -649,14 +649,12 @@
         </w:rPr>
         <w:t xml:space="preserve"> | </w:t>
       </w:r>
-      <w:proofErr w:type="gramStart"/>
       <w:r>
         <w:rPr>
           <w:rFonts w:ascii="Arial" w:hAnsi="Arial" w:cs="Arial"/>
         </w:rPr>
         <w:t>Outubro</w:t>
       </w:r>
-      <w:proofErr w:type="gramEnd"/>
       <w:r>
         <w:rPr>
           <w:rFonts w:ascii="Arial" w:hAnsi="Arial" w:cs="Arial"/>
@@ -4667,15 +4665,7 @@
         <w:jc w:val="both"/>
       </w:pPr>
       <w:r>
-        <w:t xml:space="preserve">Face a este cenário, torna-se pertinente a criação de uma aplicação móvel de </w:t>
-      </w:r>
-      <w:proofErr w:type="spellStart"/>
-      <w:r>
-        <w:t>caráter</w:t>
-      </w:r>
-      <w:proofErr w:type="spellEnd"/>
-      <w:r>
-        <w:t xml:space="preserve"> administrativo, concebida exclusivamente para uso dos responsáveis pela Loja Social para simplificar e otimizar as tarefas de gestão da mesma.</w:t>
+        <w:t>Face a este cenário, torna-se pertinente a criação de uma aplicação móvel de caráter administrativo, concebida exclusivamente para uso dos responsáveis pela Loja Social para simplificar e otimizar as tarefas de gestão da mesma.</w:t>
       </w:r>
     </w:p>
     <w:p>
@@ -4769,15 +4759,7 @@
         <w:jc w:val="both"/>
       </w:pPr>
       <w:r>
-        <w:t xml:space="preserve">A Loja Social do IPCA é uma iniciativa de </w:t>
-      </w:r>
-      <w:proofErr w:type="spellStart"/>
-      <w:r>
-        <w:t>caráter</w:t>
-      </w:r>
-      <w:proofErr w:type="spellEnd"/>
-      <w:r>
-        <w:t xml:space="preserve"> solidário e sem fins lucrativos, criada com o propósito de apoiar a comunidade académica, em especial os estudantes em situação de vulnerabilidade socioeconómica. O seu funcionamento baseia-se na recolha de bens doados, que são posteriormente organizados e disponibilizados para distribuição de forma gratuita a quem deles necessite.</w:t>
+        <w:t>A Loja Social do IPCA é uma iniciativa de caráter solidário e sem fins lucrativos, criada com o propósito de apoiar a comunidade académica, em especial os estudantes em situação de vulnerabilidade socioeconómica. O seu funcionamento baseia-se na recolha de bens doados, que são posteriormente organizados e disponibilizados para distribuição de forma gratuita a quem deles necessite.</w:t>
       </w:r>
     </w:p>
     <w:p>
@@ -5691,15 +5673,7 @@
               <w:t xml:space="preserve"> e </w:t>
             </w:r>
             <w:r>
-              <w:t xml:space="preserve">com documentação. Permitir atualizações sem perda de dados, </w:t>
-            </w:r>
-            <w:proofErr w:type="spellStart"/>
-            <w:r>
-              <w:t>logs</w:t>
-            </w:r>
-            <w:proofErr w:type="spellEnd"/>
-            <w:r>
-              <w:t xml:space="preserve"> e métricas disponíveis para equipa técnica.</w:t>
+              <w:t>com documentação. Permitir atualizações sem perda de dados, logs e métricas disponíveis para equipa técnica.</w:t>
             </w:r>
           </w:p>
         </w:tc>
@@ -5812,14 +5786,27 @@
                             <w:r>
                               <w:t xml:space="preserve">Figura </w:t>
                             </w:r>
-                            <w:fldSimple w:instr=" SEQ Figura \* ARABIC ">
-                              <w:r>
-                                <w:rPr>
-                                  <w:noProof/>
-                                </w:rPr>
-                                <w:t>1</w:t>
-                              </w:r>
-                            </w:fldSimple>
+                            <w:r>
+                              <w:fldChar w:fldCharType="begin"/>
+                            </w:r>
+                            <w:r>
+                              <w:instrText xml:space="preserve"> SEQ Figura \* ARABIC </w:instrText>
+                            </w:r>
+                            <w:r>
+                              <w:fldChar w:fldCharType="separate"/>
+                            </w:r>
+                            <w:r>
+                              <w:rPr>
+                                <w:noProof/>
+                              </w:rPr>
+                              <w:t>1</w:t>
+                            </w:r>
+                            <w:r>
+                              <w:rPr>
+                                <w:noProof/>
+                              </w:rPr>
+                              <w:fldChar w:fldCharType="end"/>
+                            </w:r>
                             <w:r>
                               <w:t xml:space="preserve"> - Diagrama BPMN </w:t>
                             </w:r>
@@ -5984,12 +5971,12 @@
       <w:pPr>
         <w:pStyle w:val="Ttulo2"/>
       </w:pPr>
-      <w:bookmarkStart w:id="11" w:name="_Toc215255729"/>
+      <w:bookmarkStart w:id="12" w:name="_Toc215255729"/>
       <w:r>
         <w:lastRenderedPageBreak/>
         <w:t>Gestão de Inventário</w:t>
       </w:r>
-      <w:bookmarkEnd w:id="11"/>
+      <w:bookmarkEnd w:id="12"/>
     </w:p>
     <w:p>
       <w:pPr>
@@ -6069,18 +6056,31 @@
         <w:pStyle w:val="Legenda"/>
         <w:jc w:val="center"/>
       </w:pPr>
-      <w:bookmarkStart w:id="12" w:name="_Toc215255756"/>
+      <w:bookmarkStart w:id="13" w:name="_Toc215255756"/>
       <w:r>
         <w:t xml:space="preserve">Figura </w:t>
       </w:r>
-      <w:fldSimple w:instr=" SEQ Figura \* ARABIC ">
-        <w:r>
-          <w:rPr>
-            <w:noProof/>
-          </w:rPr>
-          <w:t>2</w:t>
-        </w:r>
-      </w:fldSimple>
+      <w:r>
+        <w:fldChar w:fldCharType="begin"/>
+      </w:r>
+      <w:r>
+        <w:instrText xml:space="preserve"> SEQ Figura \* ARABIC </w:instrText>
+      </w:r>
+      <w:r>
+        <w:fldChar w:fldCharType="separate"/>
+      </w:r>
+      <w:r>
+        <w:rPr>
+          <w:noProof/>
+        </w:rPr>
+        <w:t>2</w:t>
+      </w:r>
+      <w:r>
+        <w:rPr>
+          <w:noProof/>
+        </w:rPr>
+        <w:fldChar w:fldCharType="end"/>
+      </w:r>
       <w:r>
         <w:t xml:space="preserve"> - </w:t>
       </w:r>
@@ -6090,7 +6090,7 @@
       <w:r>
         <w:t xml:space="preserve"> Gestão Inventário</w:t>
       </w:r>
-      <w:bookmarkEnd w:id="12"/>
+      <w:bookmarkEnd w:id="13"/>
     </w:p>
     <w:p/>
     <w:p>
@@ -6113,7 +6113,7 @@
           <w:noProof/>
         </w:rPr>
       </w:pPr>
-      <w:bookmarkStart w:id="13" w:name="_Toc215255730"/>
+      <w:bookmarkStart w:id="14" w:name="_Toc215255730"/>
       <w:r>
         <w:rPr>
           <w:noProof/>
@@ -6121,7 +6121,7 @@
         <w:lastRenderedPageBreak/>
         <w:t>Agendamento de Entregas</w:t>
       </w:r>
-      <w:bookmarkEnd w:id="13"/>
+      <w:bookmarkEnd w:id="14"/>
     </w:p>
     <w:p>
       <w:r>
@@ -6175,22 +6175,35 @@
                                 <w:szCs w:val="22"/>
                               </w:rPr>
                             </w:pPr>
-                            <w:bookmarkStart w:id="14" w:name="_Toc215255757"/>
+                            <w:bookmarkStart w:id="15" w:name="_Toc215255757"/>
                             <w:r>
                               <w:t xml:space="preserve">Figura </w:t>
                             </w:r>
-                            <w:fldSimple w:instr=" SEQ Figura \* ARABIC ">
-                              <w:r>
-                                <w:rPr>
-                                  <w:noProof/>
-                                </w:rPr>
-                                <w:t>3</w:t>
-                              </w:r>
-                            </w:fldSimple>
+                            <w:r>
+                              <w:fldChar w:fldCharType="begin"/>
+                            </w:r>
+                            <w:r>
+                              <w:instrText xml:space="preserve"> SEQ Figura \* ARABIC </w:instrText>
+                            </w:r>
+                            <w:r>
+                              <w:fldChar w:fldCharType="separate"/>
+                            </w:r>
+                            <w:r>
+                              <w:rPr>
+                                <w:noProof/>
+                              </w:rPr>
+                              <w:t>3</w:t>
+                            </w:r>
+                            <w:r>
+                              <w:rPr>
+                                <w:noProof/>
+                              </w:rPr>
+                              <w:fldChar w:fldCharType="end"/>
+                            </w:r>
                             <w:r>
                               <w:t xml:space="preserve"> - Diagrama BPMN Agendamento De Entregas</w:t>
                             </w:r>
-                            <w:bookmarkEnd w:id="14"/>
+                            <w:bookmarkEnd w:id="15"/>
                           </w:p>
                         </w:txbxContent>
                       </wps:txbx>
@@ -6353,12 +6366,12 @@
       <w:pPr>
         <w:pStyle w:val="Ttulo2"/>
       </w:pPr>
-      <w:bookmarkStart w:id="15" w:name="_Toc215255731"/>
+      <w:bookmarkStart w:id="17" w:name="_Toc215255731"/>
       <w:r>
         <w:lastRenderedPageBreak/>
         <w:t>Gestão de Benificiários</w:t>
       </w:r>
-      <w:bookmarkEnd w:id="15"/>
+      <w:bookmarkEnd w:id="17"/>
     </w:p>
     <w:p>
       <w:pPr>
@@ -6415,22 +6428,35 @@
                                 <w:szCs w:val="22"/>
                               </w:rPr>
                             </w:pPr>
-                            <w:bookmarkStart w:id="16" w:name="_Toc215255758"/>
+                            <w:bookmarkStart w:id="18" w:name="_Toc215255758"/>
                             <w:r>
                               <w:t xml:space="preserve">Figura </w:t>
                             </w:r>
-                            <w:fldSimple w:instr=" SEQ Figura \* ARABIC ">
-                              <w:r>
-                                <w:rPr>
-                                  <w:noProof/>
-                                </w:rPr>
-                                <w:t>4</w:t>
-                              </w:r>
-                            </w:fldSimple>
+                            <w:r>
+                              <w:fldChar w:fldCharType="begin"/>
+                            </w:r>
+                            <w:r>
+                              <w:instrText xml:space="preserve"> SEQ Figura \* ARABIC </w:instrText>
+                            </w:r>
+                            <w:r>
+                              <w:fldChar w:fldCharType="separate"/>
+                            </w:r>
+                            <w:r>
+                              <w:rPr>
+                                <w:noProof/>
+                              </w:rPr>
+                              <w:t>4</w:t>
+                            </w:r>
+                            <w:r>
+                              <w:rPr>
+                                <w:noProof/>
+                              </w:rPr>
+                              <w:fldChar w:fldCharType="end"/>
+                            </w:r>
                             <w:r>
                               <w:t xml:space="preserve"> - Diagrama BPMN Gestão Benificiários</w:t>
                             </w:r>
-                            <w:bookmarkEnd w:id="16"/>
+                            <w:bookmarkEnd w:id="18"/>
                           </w:p>
                         </w:txbxContent>
                       </wps:txbx>
@@ -6597,12 +6623,12 @@
       <w:pPr>
         <w:pStyle w:val="Ttulo1"/>
       </w:pPr>
-      <w:bookmarkStart w:id="17" w:name="_Toc215255732"/>
+      <w:bookmarkStart w:id="20" w:name="_Toc215255732"/>
       <w:r>
         <w:lastRenderedPageBreak/>
         <w:t>Estudo de Viabilidade</w:t>
       </w:r>
-      <w:bookmarkEnd w:id="17"/>
+      <w:bookmarkEnd w:id="20"/>
     </w:p>
     <w:p>
       <w:pPr>
@@ -6663,11 +6689,11 @@
       <w:pPr>
         <w:pStyle w:val="Ttulo2"/>
       </w:pPr>
-      <w:bookmarkStart w:id="18" w:name="_Toc215255733"/>
+      <w:bookmarkStart w:id="21" w:name="_Toc215255733"/>
       <w:r>
         <w:t>Objetivo da Solução Digital</w:t>
       </w:r>
-      <w:bookmarkEnd w:id="18"/>
+      <w:bookmarkEnd w:id="21"/>
     </w:p>
     <w:p>
       <w:r>
@@ -6702,11 +6728,11 @@
       <w:pPr>
         <w:pStyle w:val="Ttulo2"/>
       </w:pPr>
-      <w:bookmarkStart w:id="19" w:name="_Toc215255734"/>
+      <w:bookmarkStart w:id="22" w:name="_Toc215255734"/>
       <w:r>
         <w:t>Viabilidade Técnica</w:t>
       </w:r>
-      <w:bookmarkEnd w:id="19"/>
+      <w:bookmarkEnd w:id="22"/>
       <w:r>
         <w:t xml:space="preserve"> </w:t>
       </w:r>
@@ -6779,15 +6805,7 @@
         <w:t>Aplica</w:t>
       </w:r>
       <w:r>
-        <w:t xml:space="preserve">ção movel com Android </w:t>
-      </w:r>
-      <w:proofErr w:type="spellStart"/>
-      <w:r>
-        <w:t>Studio</w:t>
-      </w:r>
-      <w:proofErr w:type="spellEnd"/>
-      <w:r>
-        <w:t>;</w:t>
+        <w:t>ção movel com Android Studio;</w:t>
       </w:r>
     </w:p>
     <w:p>
@@ -6800,15 +6818,7 @@
         <w:jc w:val="both"/>
       </w:pPr>
       <w:r>
-        <w:t xml:space="preserve">Website com </w:t>
-      </w:r>
-      <w:proofErr w:type="spellStart"/>
-      <w:r>
-        <w:t>React</w:t>
-      </w:r>
-      <w:proofErr w:type="spellEnd"/>
-      <w:r>
-        <w:t xml:space="preserve"> e Next.js;</w:t>
+        <w:t>Website com React e Next.js;</w:t>
       </w:r>
     </w:p>
     <w:p>
@@ -6885,12 +6895,12 @@
       <w:pPr>
         <w:pStyle w:val="Ttulo2"/>
       </w:pPr>
-      <w:bookmarkStart w:id="20" w:name="_Toc215255735"/>
+      <w:bookmarkStart w:id="23" w:name="_Toc215255735"/>
       <w:r>
         <w:lastRenderedPageBreak/>
         <w:t>Viabilidade Operacional</w:t>
       </w:r>
-      <w:bookmarkEnd w:id="20"/>
+      <w:bookmarkEnd w:id="23"/>
       <w:r>
         <w:t xml:space="preserve"> </w:t>
       </w:r>
@@ -6959,11 +6969,11 @@
       <w:pPr>
         <w:pStyle w:val="Ttulo2"/>
       </w:pPr>
-      <w:bookmarkStart w:id="21" w:name="_Toc215255736"/>
+      <w:bookmarkStart w:id="24" w:name="_Toc215255736"/>
       <w:r>
         <w:t>Analise de Riscos</w:t>
       </w:r>
-      <w:bookmarkEnd w:id="21"/>
+      <w:bookmarkEnd w:id="24"/>
       <w:r>
         <w:t xml:space="preserve"> </w:t>
       </w:r>
@@ -7304,12 +7314,12 @@
       <w:pPr>
         <w:pStyle w:val="Ttulo1"/>
       </w:pPr>
-      <w:bookmarkStart w:id="22" w:name="_Toc215255737"/>
+      <w:bookmarkStart w:id="25" w:name="_Toc215255737"/>
       <w:r>
         <w:lastRenderedPageBreak/>
         <w:t>Arquitetura Técnica da Aplicação</w:t>
       </w:r>
-      <w:bookmarkEnd w:id="22"/>
+      <w:bookmarkEnd w:id="25"/>
     </w:p>
     <w:p>
       <w:r>
@@ -7448,11 +7458,11 @@
       <w:pPr>
         <w:pStyle w:val="Ttulo2"/>
       </w:pPr>
-      <w:bookmarkStart w:id="23" w:name="_Toc215255738"/>
+      <w:bookmarkStart w:id="26" w:name="_Toc215255738"/>
       <w:r>
         <w:t>Tecnologias</w:t>
       </w:r>
-      <w:bookmarkEnd w:id="23"/>
+      <w:bookmarkEnd w:id="26"/>
       <w:r>
         <w:t xml:space="preserve"> </w:t>
       </w:r>
@@ -7539,13 +7549,8 @@
               <w:cnfStyle w:val="000000100000" w:firstRow="0" w:lastRow="0" w:firstColumn="0" w:lastColumn="0" w:oddVBand="0" w:evenVBand="0" w:oddHBand="1" w:evenHBand="0" w:firstRowFirstColumn="0" w:firstRowLastColumn="0" w:lastRowFirstColumn="0" w:lastRowLastColumn="0"/>
             </w:pPr>
             <w:r>
-              <w:t xml:space="preserve">Android </w:t>
-            </w:r>
-            <w:proofErr w:type="spellStart"/>
-            <w:r>
-              <w:t>Studio</w:t>
-            </w:r>
-            <w:proofErr w:type="spellEnd"/>
+              <w:t>Android Studio</w:t>
+            </w:r>
           </w:p>
         </w:tc>
       </w:tr>
@@ -7566,7 +7571,6 @@
                 <w:bCs w:val="0"/>
               </w:rPr>
             </w:pPr>
-            <w:proofErr w:type="spellStart"/>
             <w:r>
               <w:rPr>
                 <w:b w:val="0"/>
@@ -7574,7 +7578,6 @@
               </w:rPr>
               <w:t>Frontend</w:t>
             </w:r>
-            <w:proofErr w:type="spellEnd"/>
           </w:p>
         </w:tc>
         <w:tc>
@@ -7586,13 +7589,8 @@
               <w:jc w:val="center"/>
               <w:cnfStyle w:val="000000000000" w:firstRow="0" w:lastRow="0" w:firstColumn="0" w:lastColumn="0" w:oddVBand="0" w:evenVBand="0" w:oddHBand="0" w:evenHBand="0" w:firstRowFirstColumn="0" w:firstRowLastColumn="0" w:lastRowFirstColumn="0" w:lastRowLastColumn="0"/>
             </w:pPr>
-            <w:proofErr w:type="spellStart"/>
-            <w:r>
-              <w:t>React</w:t>
-            </w:r>
-            <w:proofErr w:type="spellEnd"/>
-            <w:r>
-              <w:t xml:space="preserve"> e Next.js</w:t>
+            <w:r>
+              <w:t>React e Next.js</w:t>
             </w:r>
           </w:p>
         </w:tc>
@@ -7615,7 +7613,6 @@
                 <w:bCs w:val="0"/>
               </w:rPr>
             </w:pPr>
-            <w:proofErr w:type="spellStart"/>
             <w:r>
               <w:rPr>
                 <w:b w:val="0"/>
@@ -7623,7 +7620,6 @@
               </w:rPr>
               <w:t>Backend</w:t>
             </w:r>
-            <w:proofErr w:type="spellEnd"/>
           </w:p>
         </w:tc>
         <w:tc>
@@ -7676,11 +7672,9 @@
               <w:jc w:val="center"/>
               <w:cnfStyle w:val="000000000000" w:firstRow="0" w:lastRow="0" w:firstColumn="0" w:lastColumn="0" w:oddVBand="0" w:evenVBand="0" w:oddHBand="0" w:evenHBand="0" w:firstRowFirstColumn="0" w:firstRowLastColumn="0" w:lastRowFirstColumn="0" w:lastRowLastColumn="0"/>
             </w:pPr>
-            <w:proofErr w:type="spellStart"/>
             <w:r>
               <w:t>PostgreSQL</w:t>
             </w:r>
-            <w:proofErr w:type="spellEnd"/>
           </w:p>
         </w:tc>
       </w:tr>
@@ -7697,12 +7691,12 @@
       <w:pPr>
         <w:pStyle w:val="Ttulo2"/>
       </w:pPr>
-      <w:bookmarkStart w:id="24" w:name="_Toc215255739"/>
+      <w:bookmarkStart w:id="27" w:name="_Toc215255739"/>
       <w:r>
         <w:lastRenderedPageBreak/>
         <w:t>Diagrama de Arquitetura Técnica</w:t>
       </w:r>
-      <w:bookmarkEnd w:id="24"/>
+      <w:bookmarkEnd w:id="27"/>
     </w:p>
     <w:p>
       <w:r>
@@ -7766,27 +7760,35 @@
         <w:pStyle w:val="Legenda"/>
         <w:jc w:val="center"/>
       </w:pPr>
-      <w:bookmarkStart w:id="25" w:name="_Toc215255759"/>
+      <w:bookmarkStart w:id="28" w:name="_Toc215255759"/>
       <w:r>
         <w:t xml:space="preserve">Figura </w:t>
       </w:r>
-      <w:fldSimple w:instr=" SEQ Figura \* ARABIC ">
-        <w:r>
-          <w:rPr>
-            <w:noProof/>
-          </w:rPr>
-          <w:t>5</w:t>
-        </w:r>
-      </w:fldSimple>
-      <w:r>
-        <w:t xml:space="preserve"> - Diagrama Arquitetura </w:t>
-      </w:r>
-      <w:proofErr w:type="spellStart"/>
-      <w:r>
-        <w:t>Tecnica</w:t>
-      </w:r>
-      <w:bookmarkEnd w:id="25"/>
-      <w:proofErr w:type="spellEnd"/>
+      <w:r>
+        <w:fldChar w:fldCharType="begin"/>
+      </w:r>
+      <w:r>
+        <w:instrText xml:space="preserve"> SEQ Figura \* ARABIC </w:instrText>
+      </w:r>
+      <w:r>
+        <w:fldChar w:fldCharType="separate"/>
+      </w:r>
+      <w:r>
+        <w:rPr>
+          <w:noProof/>
+        </w:rPr>
+        <w:t>5</w:t>
+      </w:r>
+      <w:r>
+        <w:rPr>
+          <w:noProof/>
+        </w:rPr>
+        <w:fldChar w:fldCharType="end"/>
+      </w:r>
+      <w:r>
+        <w:t xml:space="preserve"> - Diagrama Arquitetura Tecnica</w:t>
+      </w:r>
+      <w:bookmarkEnd w:id="28"/>
     </w:p>
     <w:p>
       <w:pPr>
@@ -7808,12 +7810,12 @@
       <w:pPr>
         <w:pStyle w:val="Ttulo1"/>
       </w:pPr>
-      <w:bookmarkStart w:id="26" w:name="_Toc215255740"/>
+      <w:bookmarkStart w:id="29" w:name="_Toc215255740"/>
       <w:r>
         <w:lastRenderedPageBreak/>
         <w:t>Diagrama de Estados</w:t>
       </w:r>
-      <w:bookmarkEnd w:id="26"/>
+      <w:bookmarkEnd w:id="29"/>
     </w:p>
     <w:p>
       <w:r>
@@ -7830,11 +7832,11 @@
       <w:pPr>
         <w:pStyle w:val="Ttulo2"/>
       </w:pPr>
-      <w:bookmarkStart w:id="27" w:name="_Toc215255741"/>
+      <w:bookmarkStart w:id="30" w:name="_Toc215255741"/>
       <w:r>
         <w:t>Pedir Apoio</w:t>
       </w:r>
-      <w:bookmarkEnd w:id="27"/>
+      <w:bookmarkEnd w:id="30"/>
     </w:p>
     <w:p>
       <w:r>
@@ -7908,22 +7910,35 @@
         <w:pStyle w:val="Legenda"/>
         <w:jc w:val="center"/>
       </w:pPr>
-      <w:bookmarkStart w:id="28" w:name="_Toc215255760"/>
+      <w:bookmarkStart w:id="31" w:name="_Toc215255760"/>
       <w:r>
         <w:t xml:space="preserve">Figura </w:t>
       </w:r>
-      <w:fldSimple w:instr=" SEQ Figura \* ARABIC ">
-        <w:r>
-          <w:rPr>
-            <w:noProof/>
-          </w:rPr>
-          <w:t>6</w:t>
-        </w:r>
-      </w:fldSimple>
+      <w:r>
+        <w:fldChar w:fldCharType="begin"/>
+      </w:r>
+      <w:r>
+        <w:instrText xml:space="preserve"> SEQ Figura \* ARABIC </w:instrText>
+      </w:r>
+      <w:r>
+        <w:fldChar w:fldCharType="separate"/>
+      </w:r>
+      <w:r>
+        <w:rPr>
+          <w:noProof/>
+        </w:rPr>
+        <w:t>6</w:t>
+      </w:r>
+      <w:r>
+        <w:rPr>
+          <w:noProof/>
+        </w:rPr>
+        <w:fldChar w:fldCharType="end"/>
+      </w:r>
       <w:r>
         <w:t xml:space="preserve"> - Diagrama de Estados Pedir Apoio</w:t>
       </w:r>
-      <w:bookmarkEnd w:id="28"/>
+      <w:bookmarkEnd w:id="31"/>
     </w:p>
     <w:p>
       <w:pPr>
@@ -7948,12 +7963,12 @@
       <w:pPr>
         <w:pStyle w:val="Ttulo2"/>
       </w:pPr>
-      <w:bookmarkStart w:id="29" w:name="_Toc215255742"/>
+      <w:bookmarkStart w:id="32" w:name="_Toc215255742"/>
       <w:r>
         <w:lastRenderedPageBreak/>
         <w:t>Gestão de Inventário</w:t>
       </w:r>
-      <w:bookmarkEnd w:id="29"/>
+      <w:bookmarkEnd w:id="32"/>
     </w:p>
     <w:p>
       <w:r>
@@ -8024,18 +8039,31 @@
         <w:pStyle w:val="Legenda"/>
         <w:jc w:val="center"/>
       </w:pPr>
-      <w:bookmarkStart w:id="30" w:name="_Toc215255761"/>
+      <w:bookmarkStart w:id="33" w:name="_Toc215255761"/>
       <w:r>
         <w:t xml:space="preserve">Figura </w:t>
       </w:r>
-      <w:fldSimple w:instr=" SEQ Figura \* ARABIC ">
-        <w:r>
-          <w:rPr>
-            <w:noProof/>
-          </w:rPr>
-          <w:t>7</w:t>
-        </w:r>
-      </w:fldSimple>
+      <w:r>
+        <w:fldChar w:fldCharType="begin"/>
+      </w:r>
+      <w:r>
+        <w:instrText xml:space="preserve"> SEQ Figura \* ARABIC </w:instrText>
+      </w:r>
+      <w:r>
+        <w:fldChar w:fldCharType="separate"/>
+      </w:r>
+      <w:r>
+        <w:rPr>
+          <w:noProof/>
+        </w:rPr>
+        <w:t>7</w:t>
+      </w:r>
+      <w:r>
+        <w:rPr>
+          <w:noProof/>
+        </w:rPr>
+        <w:fldChar w:fldCharType="end"/>
+      </w:r>
       <w:r>
         <w:t xml:space="preserve"> - </w:t>
       </w:r>
@@ -8045,7 +8073,7 @@
       <w:r>
         <w:t>Gestão de Inventário</w:t>
       </w:r>
-      <w:bookmarkEnd w:id="30"/>
+      <w:bookmarkEnd w:id="33"/>
     </w:p>
     <w:p>
       <w:pPr>
@@ -8093,12 +8121,12 @@
       <w:pPr>
         <w:pStyle w:val="Ttulo2"/>
       </w:pPr>
-      <w:bookmarkStart w:id="31" w:name="_Toc215255743"/>
+      <w:bookmarkStart w:id="34" w:name="_Toc215255743"/>
       <w:r>
         <w:lastRenderedPageBreak/>
         <w:t>Agendamento de Entregas</w:t>
       </w:r>
-      <w:bookmarkEnd w:id="31"/>
+      <w:bookmarkEnd w:id="34"/>
     </w:p>
     <w:p>
       <w:r>
@@ -8169,22 +8197,35 @@
         <w:pStyle w:val="Legenda"/>
         <w:jc w:val="center"/>
       </w:pPr>
-      <w:bookmarkStart w:id="32" w:name="_Toc215255762"/>
+      <w:bookmarkStart w:id="35" w:name="_Toc215255762"/>
       <w:r>
         <w:t xml:space="preserve">Figura </w:t>
       </w:r>
-      <w:fldSimple w:instr=" SEQ Figura \* ARABIC ">
-        <w:r>
-          <w:rPr>
-            <w:noProof/>
-          </w:rPr>
-          <w:t>8</w:t>
-        </w:r>
-      </w:fldSimple>
+      <w:r>
+        <w:fldChar w:fldCharType="begin"/>
+      </w:r>
+      <w:r>
+        <w:instrText xml:space="preserve"> SEQ Figura \* ARABIC </w:instrText>
+      </w:r>
+      <w:r>
+        <w:fldChar w:fldCharType="separate"/>
+      </w:r>
+      <w:r>
+        <w:rPr>
+          <w:noProof/>
+        </w:rPr>
+        <w:t>8</w:t>
+      </w:r>
+      <w:r>
+        <w:rPr>
+          <w:noProof/>
+        </w:rPr>
+        <w:fldChar w:fldCharType="end"/>
+      </w:r>
       <w:r>
         <w:t xml:space="preserve"> - Diagrama de Estados Agendamento de Entregas</w:t>
       </w:r>
-      <w:bookmarkEnd w:id="32"/>
+      <w:bookmarkEnd w:id="35"/>
     </w:p>
     <w:p>
       <w:pPr>
@@ -8220,12 +8261,12 @@
       <w:pPr>
         <w:pStyle w:val="Ttulo2"/>
       </w:pPr>
-      <w:bookmarkStart w:id="33" w:name="_Toc215255744"/>
+      <w:bookmarkStart w:id="36" w:name="_Toc215255744"/>
       <w:r>
         <w:lastRenderedPageBreak/>
         <w:t>Gestão dos Beneficiários</w:t>
       </w:r>
-      <w:bookmarkEnd w:id="33"/>
+      <w:bookmarkEnd w:id="36"/>
       <w:r>
         <w:t xml:space="preserve"> </w:t>
       </w:r>
@@ -8299,18 +8340,31 @@
         <w:pStyle w:val="Legenda"/>
         <w:jc w:val="center"/>
       </w:pPr>
-      <w:bookmarkStart w:id="34" w:name="_Toc215255763"/>
+      <w:bookmarkStart w:id="37" w:name="_Toc215255763"/>
       <w:r>
         <w:t xml:space="preserve">Figura </w:t>
       </w:r>
-      <w:fldSimple w:instr=" SEQ Figura \* ARABIC ">
-        <w:r>
-          <w:rPr>
-            <w:noProof/>
-          </w:rPr>
-          <w:t>9</w:t>
-        </w:r>
-      </w:fldSimple>
+      <w:r>
+        <w:fldChar w:fldCharType="begin"/>
+      </w:r>
+      <w:r>
+        <w:instrText xml:space="preserve"> SEQ Figura \* ARABIC </w:instrText>
+      </w:r>
+      <w:r>
+        <w:fldChar w:fldCharType="separate"/>
+      </w:r>
+      <w:r>
+        <w:rPr>
+          <w:noProof/>
+        </w:rPr>
+        <w:t>9</w:t>
+      </w:r>
+      <w:r>
+        <w:rPr>
+          <w:noProof/>
+        </w:rPr>
+        <w:fldChar w:fldCharType="end"/>
+      </w:r>
       <w:r>
         <w:t xml:space="preserve"> - </w:t>
       </w:r>
@@ -8320,7 +8374,7 @@
       <w:r>
         <w:t>Gestão dos Beneficiários</w:t>
       </w:r>
-      <w:bookmarkEnd w:id="34"/>
+      <w:bookmarkEnd w:id="37"/>
     </w:p>
     <w:p>
       <w:pPr>
@@ -8350,12 +8404,12 @@
       <w:pPr>
         <w:pStyle w:val="Ttulo1"/>
       </w:pPr>
-      <w:bookmarkStart w:id="35" w:name="_Toc215255745"/>
+      <w:bookmarkStart w:id="38" w:name="_Toc215255745"/>
       <w:r>
         <w:lastRenderedPageBreak/>
         <w:t>Diagrama de casos de uso</w:t>
       </w:r>
-      <w:bookmarkEnd w:id="35"/>
+      <w:bookmarkEnd w:id="38"/>
     </w:p>
     <w:p>
       <w:pPr>
@@ -8375,11 +8429,11 @@
       <w:pPr>
         <w:pStyle w:val="Ttulo2"/>
       </w:pPr>
-      <w:bookmarkStart w:id="36" w:name="_Toc215255746"/>
+      <w:bookmarkStart w:id="39" w:name="_Toc215255746"/>
       <w:r>
         <w:t>Pedir Apoio</w:t>
       </w:r>
-      <w:bookmarkEnd w:id="36"/>
+      <w:bookmarkEnd w:id="39"/>
     </w:p>
     <w:p>
       <w:r>
@@ -8455,18 +8509,31 @@
         <w:pStyle w:val="Legenda"/>
         <w:jc w:val="center"/>
       </w:pPr>
-      <w:bookmarkStart w:id="37" w:name="_Toc215255764"/>
+      <w:bookmarkStart w:id="40" w:name="_Toc215255764"/>
       <w:r>
         <w:t xml:space="preserve">Figura </w:t>
       </w:r>
-      <w:fldSimple w:instr=" SEQ Figura \* ARABIC ">
-        <w:r>
-          <w:rPr>
-            <w:noProof/>
-          </w:rPr>
-          <w:t>10</w:t>
-        </w:r>
-      </w:fldSimple>
+      <w:r>
+        <w:fldChar w:fldCharType="begin"/>
+      </w:r>
+      <w:r>
+        <w:instrText xml:space="preserve"> SEQ Figura \* ARABIC </w:instrText>
+      </w:r>
+      <w:r>
+        <w:fldChar w:fldCharType="separate"/>
+      </w:r>
+      <w:r>
+        <w:rPr>
+          <w:noProof/>
+        </w:rPr>
+        <w:t>10</w:t>
+      </w:r>
+      <w:r>
+        <w:rPr>
+          <w:noProof/>
+        </w:rPr>
+        <w:fldChar w:fldCharType="end"/>
+      </w:r>
       <w:r>
         <w:t xml:space="preserve">- </w:t>
       </w:r>
@@ -8476,7 +8543,7 @@
       <w:r>
         <w:t>Casos de Uso Pedir Apoio</w:t>
       </w:r>
-      <w:bookmarkEnd w:id="37"/>
+      <w:bookmarkEnd w:id="40"/>
     </w:p>
     <w:p>
       <w:pPr>
@@ -8492,15 +8559,7 @@
         <w:t xml:space="preserve">diagrama </w:t>
       </w:r>
       <w:r>
-        <w:t>ilustra as interações no módulo de Candidatura, envolvendo o Beneficiário, o Funcionário e o Sistema. O processo inicia-se com o Beneficiário a acionar o caso de uso "Submete ficheiros", carregando a documentação necessária na plataforma. Por sua vez, cabe ao Funcionário executar o caso de uso "Analisa situação", validando a elegibilidade do pedido; existe aqui uma relação de extensão (&lt;&lt;</w:t>
-      </w:r>
-      <w:proofErr w:type="spellStart"/>
-      <w:r>
-        <w:t>Extend</w:t>
-      </w:r>
-      <w:proofErr w:type="spellEnd"/>
-      <w:r>
-        <w:t>&gt;&gt;) para a ação "Insere dados", o que indica que o registo final dos dados no sistema é uma operação condicional, ocorrendo apenas se a análise for positiva e a situação do candidato for considerada regularizada.</w:t>
+        <w:t>ilustra as interações no módulo de Candidatura, envolvendo o Beneficiário, o Funcionário e o Sistema. O processo inicia-se com o Beneficiário a acionar o caso de uso "Submete ficheiros", carregando a documentação necessária na plataforma. Por sua vez, cabe ao Funcionário executar o caso de uso "Analisa situação", validando a elegibilidade do pedido; existe aqui uma relação de extensão (&lt;&lt;Extend&gt;&gt;) para a ação "Insere dados", o que indica que o registo final dos dados no sistema é uma operação condicional, ocorrendo apenas se a análise for positiva e a situação do candidato for considerada regularizada.</w:t>
       </w:r>
     </w:p>
     <w:p>
@@ -8517,12 +8576,12 @@
       <w:pPr>
         <w:pStyle w:val="Ttulo2"/>
       </w:pPr>
-      <w:bookmarkStart w:id="38" w:name="_Toc215255747"/>
+      <w:bookmarkStart w:id="41" w:name="_Toc215255747"/>
       <w:r>
         <w:lastRenderedPageBreak/>
         <w:t>Registo da doação</w:t>
       </w:r>
-      <w:bookmarkEnd w:id="38"/>
+      <w:bookmarkEnd w:id="41"/>
     </w:p>
     <w:p>
       <w:r>
@@ -8592,18 +8651,31 @@
         <w:pStyle w:val="Legenda"/>
         <w:jc w:val="center"/>
       </w:pPr>
-      <w:bookmarkStart w:id="39" w:name="_Toc215255765"/>
+      <w:bookmarkStart w:id="42" w:name="_Toc215255765"/>
       <w:r>
         <w:t xml:space="preserve">Figura </w:t>
       </w:r>
-      <w:fldSimple w:instr=" SEQ Figura \* ARABIC ">
-        <w:r>
-          <w:rPr>
-            <w:noProof/>
-          </w:rPr>
-          <w:t>11</w:t>
-        </w:r>
-      </w:fldSimple>
+      <w:r>
+        <w:fldChar w:fldCharType="begin"/>
+      </w:r>
+      <w:r>
+        <w:instrText xml:space="preserve"> SEQ Figura \* ARABIC </w:instrText>
+      </w:r>
+      <w:r>
+        <w:fldChar w:fldCharType="separate"/>
+      </w:r>
+      <w:r>
+        <w:rPr>
+          <w:noProof/>
+        </w:rPr>
+        <w:t>11</w:t>
+      </w:r>
+      <w:r>
+        <w:rPr>
+          <w:noProof/>
+        </w:rPr>
+        <w:fldChar w:fldCharType="end"/>
+      </w:r>
       <w:r>
         <w:t xml:space="preserve"> - </w:t>
       </w:r>
@@ -8613,7 +8685,7 @@
       <w:r>
         <w:t>Gestão do Inventário</w:t>
       </w:r>
-      <w:bookmarkEnd w:id="39"/>
+      <w:bookmarkEnd w:id="42"/>
     </w:p>
     <w:p/>
     <w:p>
@@ -8624,23 +8696,7 @@
         <w:t>O diagrama</w:t>
       </w:r>
       <w:r>
-        <w:t xml:space="preserve"> representa o processo de Registo de Doação, no qual o ator Funcionário desempenha o papel central na triagem e entrada de bens. O fluxo inicia-se com a receção física dos artigos (Recebe produtos) e a subsequente verificação do seu prazo de consumo (Verifica Validade). Dependendo do resultado desta análise, o sistema apresenta dois comportamentos distintos através de relações de extensão (&lt;&lt;</w:t>
-      </w:r>
-      <w:proofErr w:type="spellStart"/>
-      <w:r>
-        <w:t>Extend</w:t>
-      </w:r>
-      <w:proofErr w:type="spellEnd"/>
-      <w:r>
-        <w:t>&gt;&gt;): caso a validade esteja a terminar, o fluxo desvia para o caso de uso Envia para Associação; por outro lado, se a validade for considerada longa, prossegue-se para o Regista produtos no Sistema. Este último caso de uso incorpora obrigatoriamente, através de uma relação de inclusão (&lt;&lt;</w:t>
-      </w:r>
-      <w:proofErr w:type="spellStart"/>
-      <w:r>
-        <w:t>Include</w:t>
-      </w:r>
-      <w:proofErr w:type="spellEnd"/>
-      <w:r>
-        <w:t>&gt;&gt;), a ação Insere no Sistema, garantindo a persistência dos dados no inventário digital da Loja Social.</w:t>
+        <w:t xml:space="preserve"> representa o processo de Registo de Doação, no qual o ator Funcionário desempenha o papel central na triagem e entrada de bens. O fluxo inicia-se com a receção física dos artigos (Recebe produtos) e a subsequente verificação do seu prazo de consumo (Verifica Validade). Dependendo do resultado desta análise, o sistema apresenta dois comportamentos distintos através de relações de extensão (&lt;&lt;Extend&gt;&gt;): caso a validade esteja a terminar, o fluxo desvia para o caso de uso Envia para Associação; por outro lado, se a validade for considerada longa, prossegue-se para o Regista produtos no Sistema. Este último caso de uso incorpora obrigatoriamente, através de uma relação de inclusão (&lt;&lt;Include&gt;&gt;), a ação Insere no Sistema, garantindo a persistência dos dados no inventário digital da Loja Social.</w:t>
       </w:r>
     </w:p>
     <w:p>
@@ -8655,7 +8711,7 @@
           <w:noProof/>
         </w:rPr>
       </w:pPr>
-      <w:bookmarkStart w:id="40" w:name="_Toc215255748"/>
+      <w:bookmarkStart w:id="43" w:name="_Toc215255748"/>
       <w:r>
         <w:rPr>
           <w:noProof/>
@@ -8663,7 +8719,7 @@
         <w:lastRenderedPageBreak/>
         <w:t>Entregar bens</w:t>
       </w:r>
-      <w:bookmarkEnd w:id="40"/>
+      <w:bookmarkEnd w:id="43"/>
       <w:r>
         <w:rPr>
           <w:noProof/>
@@ -8755,15 +8811,7 @@
         <w:t>representa</w:t>
       </w:r>
       <w:r>
-        <w:t xml:space="preserve"> a colaboração entre o Beneficiário, o Funcionário e o Sistema para a concretização do apoio. O fluxo é coordenado através do caso de uso Agenda Entrega, onde os três intervenientes interagem para definir o momento da recolha. Ao Funcionário cabem as tarefas operacionais de Prepara Entrega (separação dos bens em stock) e Realiza Entrega (entrega física ao beneficiário), enquanto o Sistema assume um papel de suporte automatizado ao executar a </w:t>
-      </w:r>
-      <w:proofErr w:type="gramStart"/>
-      <w:r>
-        <w:t>ação Notifica</w:t>
-      </w:r>
-      <w:proofErr w:type="gramEnd"/>
-      <w:r>
-        <w:t>, garantindo que as partes envolvidas são alertadas sobre o estado e confirmação do agendamento.</w:t>
+        <w:t xml:space="preserve"> a colaboração entre o Beneficiário, o Funcionário e o Sistema para a concretização do apoio. O fluxo é coordenado através do caso de uso Agenda Entrega, onde os três intervenientes interagem para definir o momento da recolha. Ao Funcionário cabem as tarefas operacionais de Prepara Entrega (separação dos bens em stock) e Realiza Entrega (entrega física ao beneficiário), enquanto o Sistema assume um papel de suporte automatizado ao executar a ação Notifica, garantindo que as partes envolvidas são alertadas sobre o estado e confirmação do agendamento.</w:t>
       </w:r>
     </w:p>
     <w:p>
@@ -8775,12 +8823,12 @@
       <w:pPr>
         <w:pStyle w:val="Ttulo1"/>
       </w:pPr>
-      <w:bookmarkStart w:id="41" w:name="_Toc215255749"/>
+      <w:bookmarkStart w:id="44" w:name="_Toc215255749"/>
       <w:r>
         <w:lastRenderedPageBreak/>
         <w:t>Diagrama ER</w:t>
       </w:r>
-      <w:bookmarkEnd w:id="41"/>
+      <w:bookmarkEnd w:id="44"/>
     </w:p>
     <w:p>
       <w:r>
@@ -8840,18 +8888,31 @@
                                 <w:szCs w:val="22"/>
                               </w:rPr>
                             </w:pPr>
-                            <w:bookmarkStart w:id="42" w:name="_Toc215255766"/>
+                            <w:bookmarkStart w:id="45" w:name="_Toc215255766"/>
                             <w:r>
                               <w:t xml:space="preserve">Figura </w:t>
                             </w:r>
-                            <w:fldSimple w:instr=" SEQ Figura \* ARABIC ">
-                              <w:r>
-                                <w:rPr>
-                                  <w:noProof/>
-                                </w:rPr>
-                                <w:t>12</w:t>
-                              </w:r>
-                            </w:fldSimple>
+                            <w:r>
+                              <w:fldChar w:fldCharType="begin"/>
+                            </w:r>
+                            <w:r>
+                              <w:instrText xml:space="preserve"> SEQ Figura \* ARABIC </w:instrText>
+                            </w:r>
+                            <w:r>
+                              <w:fldChar w:fldCharType="separate"/>
+                            </w:r>
+                            <w:r>
+                              <w:rPr>
+                                <w:noProof/>
+                              </w:rPr>
+                              <w:t>12</w:t>
+                            </w:r>
+                            <w:r>
+                              <w:rPr>
+                                <w:noProof/>
+                              </w:rPr>
+                              <w:fldChar w:fldCharType="end"/>
+                            </w:r>
                             <w:r>
                               <w:t xml:space="preserve"> - Diagram</w:t>
                             </w:r>
@@ -8861,7 +8922,7 @@
                             <w:r>
                               <w:t xml:space="preserve"> Entidade-Relação</w:t>
                             </w:r>
-                            <w:bookmarkEnd w:id="42"/>
+                            <w:bookmarkEnd w:id="45"/>
                           </w:p>
                         </w:txbxContent>
                       </wps:txbx>
@@ -9030,20 +9091,14 @@
         <w:jc w:val="both"/>
       </w:pPr>
       <w:r>
-        <w:t>O Modelo Entidade-</w:t>
-      </w:r>
-      <w:proofErr w:type="spellStart"/>
-      <w:r>
-        <w:t>Relac</w:t>
+        <w:t>O Modelo Entidade-Relac</w:t>
       </w:r>
       <w:r>
         <w:t>ão</w:t>
       </w:r>
-      <w:proofErr w:type="spellEnd"/>
       <w:r>
         <w:t xml:space="preserve"> da aplicação da Loja Social foi concebido para suportar os processos de negócio de forma otimizada , utilizando o </w:t>
       </w:r>
-      <w:proofErr w:type="spellStart"/>
       <w:r>
         <w:rPr>
           <w:b/>
@@ -9051,7 +9106,6 @@
         </w:rPr>
         <w:t>PostgreSQL</w:t>
       </w:r>
-      <w:proofErr w:type="spellEnd"/>
       <w:r>
         <w:t>. A estrutura da base de dados garante a centralização de dados, o controlo rigoroso do inventário e a automação de alertas.</w:t>
       </w:r>
@@ -9064,11 +9118,11 @@
           <w:bCs w:val="0"/>
         </w:rPr>
       </w:pPr>
-      <w:bookmarkStart w:id="43" w:name="_Toc215255750"/>
+      <w:bookmarkStart w:id="47" w:name="_Toc215255750"/>
       <w:r>
         <w:t>Organização e Pessoas</w:t>
       </w:r>
-      <w:bookmarkEnd w:id="43"/>
+      <w:bookmarkEnd w:id="47"/>
     </w:p>
     <w:p>
       <w:pPr>
@@ -9078,7 +9132,6 @@
       <w:r>
         <w:t xml:space="preserve">As tabelas </w:t>
       </w:r>
-      <w:proofErr w:type="spellStart"/>
       <w:r>
         <w:rPr>
           <w:b/>
@@ -9086,11 +9139,9 @@
         </w:rPr>
         <w:t>Users</w:t>
       </w:r>
-      <w:proofErr w:type="spellEnd"/>
       <w:r>
         <w:t xml:space="preserve"> e </w:t>
       </w:r>
-      <w:proofErr w:type="spellStart"/>
       <w:r>
         <w:rPr>
           <w:b/>
@@ -9098,7 +9149,6 @@
         </w:rPr>
         <w:t>Beneficiario</w:t>
       </w:r>
-      <w:proofErr w:type="spellEnd"/>
       <w:r>
         <w:t xml:space="preserve"> estabelecem um registo centralizado dos utilizadores e estudantes elegíveis para apoio, sendo a base para a segurança do sistema. A gestão da logística é suportada pelas tabelas </w:t>
       </w:r>
@@ -9140,12 +9190,12 @@
           <w:bCs w:val="0"/>
         </w:rPr>
       </w:pPr>
-      <w:bookmarkStart w:id="44" w:name="_Toc215255751"/>
+      <w:bookmarkStart w:id="48" w:name="_Toc215255751"/>
       <w:r>
         <w:lastRenderedPageBreak/>
         <w:t>Gestão de Inventário e Rastreio</w:t>
       </w:r>
-      <w:bookmarkEnd w:id="44"/>
+      <w:bookmarkEnd w:id="48"/>
     </w:p>
     <w:p>
       <w:pPr>
@@ -9175,7 +9225,6 @@
       <w:r>
         <w:t xml:space="preserve">). Esta separação é vital, pois a tabela Stock armazena a </w:t>
       </w:r>
-      <w:proofErr w:type="spellStart"/>
       <w:r>
         <w:rPr>
           <w:b/>
@@ -9183,11 +9232,9 @@
         </w:rPr>
         <w:t>Data_Validade</w:t>
       </w:r>
-      <w:proofErr w:type="spellEnd"/>
       <w:r>
         <w:t xml:space="preserve">, permitindo ao sistema verificar a proximidade da expiração dos bens e evitar desperdícios. As transações de bens, tanto nas </w:t>
       </w:r>
-      <w:proofErr w:type="spellStart"/>
       <w:r>
         <w:rPr>
           <w:b/>
@@ -9195,7 +9242,6 @@
         </w:rPr>
         <w:t>Doacaos</w:t>
       </w:r>
-      <w:proofErr w:type="spellEnd"/>
       <w:r>
         <w:t xml:space="preserve"> quanto nas </w:t>
       </w:r>
@@ -9209,7 +9255,6 @@
       <w:r>
         <w:t>, são detalhadas através de tabelas específicas (</w:t>
       </w:r>
-      <w:proofErr w:type="spellStart"/>
       <w:r>
         <w:rPr>
           <w:b/>
@@ -9217,11 +9262,9 @@
         </w:rPr>
         <w:t>Doacao_Item</w:t>
       </w:r>
-      <w:proofErr w:type="spellEnd"/>
       <w:r>
         <w:t xml:space="preserve"> e </w:t>
       </w:r>
-      <w:proofErr w:type="spellStart"/>
       <w:r>
         <w:rPr>
           <w:b/>
@@ -9229,7 +9272,6 @@
         </w:rPr>
         <w:t>Entrega_Item</w:t>
       </w:r>
-      <w:proofErr w:type="spellEnd"/>
       <w:r>
         <w:t>), que registam a quantidade exata de cada Item movimentado.</w:t>
       </w:r>
@@ -9252,11 +9294,11 @@
           <w:bCs w:val="0"/>
         </w:rPr>
       </w:pPr>
-      <w:bookmarkStart w:id="45" w:name="_Toc215255752"/>
+      <w:bookmarkStart w:id="49" w:name="_Toc215255752"/>
       <w:r>
         <w:t>Alertas e Auditoria</w:t>
       </w:r>
-      <w:bookmarkEnd w:id="45"/>
+      <w:bookmarkEnd w:id="49"/>
     </w:p>
     <w:p>
       <w:pPr>
@@ -9265,7 +9307,6 @@
       <w:r>
         <w:t xml:space="preserve">Para apoio operacional, o sistema utiliza as tabelas </w:t>
       </w:r>
-      <w:proofErr w:type="spellStart"/>
       <w:r>
         <w:rPr>
           <w:b/>
@@ -9273,11 +9314,9 @@
         </w:rPr>
         <w:t>Notificacao_Agendamento</w:t>
       </w:r>
-      <w:proofErr w:type="spellEnd"/>
       <w:r>
         <w:t xml:space="preserve"> e </w:t>
       </w:r>
-      <w:proofErr w:type="spellStart"/>
       <w:r>
         <w:rPr>
           <w:b/>
@@ -9285,7 +9324,6 @@
         </w:rPr>
         <w:t>Notificacao_Stock</w:t>
       </w:r>
-      <w:proofErr w:type="spellEnd"/>
       <w:r>
         <w:t xml:space="preserve"> para armazenar o histórico de alertas, sendo esta última crucial para notificar sobre a validade próxima dos bens. A estrutura das tabelas permite, por fim, que a aplicação rastreie </w:t>
       </w:r>
@@ -9317,12 +9355,12 @@
       <w:pPr>
         <w:pStyle w:val="Ttulo1"/>
       </w:pPr>
-      <w:bookmarkStart w:id="46" w:name="_Toc215255753"/>
+      <w:bookmarkStart w:id="50" w:name="_Toc215255753"/>
       <w:r>
         <w:lastRenderedPageBreak/>
         <w:t>Diagrama de Classes</w:t>
       </w:r>
-      <w:bookmarkEnd w:id="46"/>
+      <w:bookmarkEnd w:id="50"/>
     </w:p>
     <w:p>
       <w:r>
@@ -9382,22 +9420,35 @@
                                 <w:szCs w:val="22"/>
                               </w:rPr>
                             </w:pPr>
-                            <w:bookmarkStart w:id="47" w:name="_Toc215255767"/>
+                            <w:bookmarkStart w:id="51" w:name="_Toc215255767"/>
                             <w:r>
                               <w:t xml:space="preserve">Figura </w:t>
                             </w:r>
-                            <w:fldSimple w:instr=" SEQ Figura \* ARABIC ">
-                              <w:r>
-                                <w:rPr>
-                                  <w:noProof/>
-                                </w:rPr>
-                                <w:t>13</w:t>
-                              </w:r>
-                            </w:fldSimple>
+                            <w:r>
+                              <w:fldChar w:fldCharType="begin"/>
+                            </w:r>
+                            <w:r>
+                              <w:instrText xml:space="preserve"> SEQ Figura \* ARABIC </w:instrText>
+                            </w:r>
+                            <w:r>
+                              <w:fldChar w:fldCharType="separate"/>
+                            </w:r>
+                            <w:r>
+                              <w:rPr>
+                                <w:noProof/>
+                              </w:rPr>
+                              <w:t>13</w:t>
+                            </w:r>
+                            <w:r>
+                              <w:rPr>
+                                <w:noProof/>
+                              </w:rPr>
+                              <w:fldChar w:fldCharType="end"/>
+                            </w:r>
                             <w:r>
                               <w:t>- Diagrama de Classes</w:t>
                             </w:r>
-                            <w:bookmarkEnd w:id="47"/>
+                            <w:bookmarkEnd w:id="51"/>
                           </w:p>
                         </w:txbxContent>
                       </wps:txbx>
@@ -9604,31 +9655,7 @@
         <w:t>Métodos</w:t>
       </w:r>
       <w:r>
-        <w:t xml:space="preserve"> (</w:t>
-      </w:r>
-      <w:proofErr w:type="spellStart"/>
-      <w:r>
-        <w:t>ex</w:t>
-      </w:r>
-      <w:proofErr w:type="spellEnd"/>
-      <w:r>
-        <w:t>: +</w:t>
-      </w:r>
-      <w:proofErr w:type="spellStart"/>
-      <w:r>
-        <w:t>VerificarValidade</w:t>
-      </w:r>
-      <w:proofErr w:type="spellEnd"/>
-      <w:r>
-        <w:t>(), +</w:t>
-      </w:r>
-      <w:proofErr w:type="spellStart"/>
-      <w:r>
-        <w:t>PrepararItens</w:t>
-      </w:r>
-      <w:proofErr w:type="spellEnd"/>
-      <w:r>
-        <w:t xml:space="preserve">(), +Login()), que representam as ações e funções que a aplicação executa para implementar os requisitos de negócio (como a verificação de expiração ou o fluxo de entrega). A estrutura da base de dados apenas define o </w:t>
+        <w:t xml:space="preserve"> (ex: +VerificarValidade(), +PrepararItens(), +Login()), que representam as ações e funções que a aplicação executa para implementar os requisitos de negócio (como a verificação de expiração ou o fluxo de entrega). A estrutura da base de dados apenas define o </w:t>
       </w:r>
       <w:r>
         <w:rPr>
@@ -9658,15 +9685,7 @@
         <w:t>tipos de dados de retorno</w:t>
       </w:r>
       <w:r>
-        <w:t xml:space="preserve"> dos métodos (</w:t>
-      </w:r>
-      <w:proofErr w:type="spellStart"/>
-      <w:r>
-        <w:t>ex</w:t>
-      </w:r>
-      <w:proofErr w:type="spellEnd"/>
-      <w:r>
-        <w:t>: : Lista&lt;Entregas&gt;), o que é essencial para o desenvolvimento do código, mas irrelevante para a estrutura pura da base de dados.</w:t>
+        <w:t xml:space="preserve"> dos métodos (ex: : Lista&lt;Entregas&gt;), o que é essencial para o desenvolvimento do código, mas irrelevante para a estrutura pura da base de dados.</w:t>
       </w:r>
     </w:p>
     <w:p>
@@ -9861,23 +9880,7 @@
         <w:t xml:space="preserve">. </w:t>
       </w:r>
       <w:r>
-        <w:t xml:space="preserve"> O foco está exclusivamente nos Atributos (</w:t>
-      </w:r>
-      <w:proofErr w:type="spellStart"/>
-      <w:r>
-        <w:t>ex</w:t>
-      </w:r>
-      <w:proofErr w:type="spellEnd"/>
-      <w:r>
-        <w:t xml:space="preserve">: Nome, </w:t>
-      </w:r>
-      <w:proofErr w:type="spellStart"/>
-      <w:r>
-        <w:t>Data_Nasc</w:t>
-      </w:r>
-      <w:proofErr w:type="spellEnd"/>
-      <w:r>
-        <w:t>, Quantidade) e nas Relações (Associações, Agregações), que representam as regras de dados essenciais para o negócio (como a relação entre Beneficiário e Entregas).</w:t>
+        <w:t xml:space="preserve"> O foco está exclusivamente nos Atributos (ex: Nome, Data_Nasc, Quantidade) e nas Relações (Associações, Agregações), que representam as regras de dados essenciais para o negócio (como a relação entre Beneficiário e Entregas).</w:t>
       </w:r>
     </w:p>
     <w:p>
@@ -9907,12 +9910,10 @@
       <w:pPr>
         <w:pStyle w:val="Ttulo1"/>
       </w:pPr>
-      <w:proofErr w:type="spellStart"/>
       <w:r>
         <w:lastRenderedPageBreak/>
         <w:t>Mockups</w:t>
       </w:r>
-      <w:proofErr w:type="spellEnd"/>
     </w:p>
     <w:p>
       <w:pPr>
@@ -9996,24 +9997,26 @@
       <w:r>
         <w:t xml:space="preserve">Figura </w:t>
       </w:r>
-      <w:fldSimple w:instr=" SEQ Figura \* ARABIC ">
-        <w:r>
-          <w:rPr>
-            <w:noProof/>
-          </w:rPr>
-          <w:t>14</w:t>
-        </w:r>
-      </w:fldSimple>
-      <w:r>
-        <w:t xml:space="preserve"> - </w:t>
-      </w:r>
-      <w:proofErr w:type="spellStart"/>
-      <w:r>
-        <w:t>Mockup</w:t>
-      </w:r>
-      <w:proofErr w:type="spellEnd"/>
-      <w:r>
-        <w:t xml:space="preserve"> Página Principal</w:t>
+      <w:r>
+        <w:fldChar w:fldCharType="begin"/>
+      </w:r>
+      <w:r>
+        <w:instrText xml:space="preserve"> SEQ Figura \* ARABIC </w:instrText>
+      </w:r>
+      <w:r>
+        <w:fldChar w:fldCharType="separate"/>
+      </w:r>
+      <w:r>
+        <w:rPr>
+          <w:noProof/>
+        </w:rPr>
+        <w:t>14</w:t>
+      </w:r>
+      <w:r>
+        <w:fldChar w:fldCharType="end"/>
+      </w:r>
+      <w:r>
+        <w:t xml:space="preserve"> - Mockup Página Principal</w:t>
       </w:r>
     </w:p>
     <w:p>
@@ -10087,24 +10090,26 @@
                             <w:r>
                               <w:t xml:space="preserve">Figura </w:t>
                             </w:r>
-                            <w:fldSimple w:instr=" SEQ Figura \* ARABIC ">
-                              <w:r>
-                                <w:rPr>
-                                  <w:noProof/>
-                                </w:rPr>
-                                <w:t>15</w:t>
-                              </w:r>
-                            </w:fldSimple>
                             <w:r>
-                              <w:t xml:space="preserve"> – </w:t>
+                              <w:fldChar w:fldCharType="begin"/>
                             </w:r>
-                            <w:proofErr w:type="spellStart"/>
                             <w:r>
-                              <w:t>Mockup</w:t>
+                              <w:instrText xml:space="preserve"> SEQ Figura \* ARABIC </w:instrText>
                             </w:r>
-                            <w:proofErr w:type="spellEnd"/>
                             <w:r>
-                              <w:t xml:space="preserve"> da Criação da Candidatura</w:t>
+                              <w:fldChar w:fldCharType="separate"/>
+                            </w:r>
+                            <w:r>
+                              <w:rPr>
+                                <w:noProof/>
+                              </w:rPr>
+                              <w:t>15</w:t>
+                            </w:r>
+                            <w:r>
+                              <w:fldChar w:fldCharType="end"/>
+                            </w:r>
+                            <w:r>
+                              <w:t xml:space="preserve"> – Mockup da Criação da Candidatura</w:t>
                             </w:r>
                           </w:p>
                         </w:txbxContent>
@@ -10126,11 +10131,7 @@
           </mc:Choice>
           <mc:Fallback>
             <w:pict>
-              <v:shapetype w14:anchorId="5A06CCB9" id="_x0000_t202" coordsize="21600,21600" o:spt="202" path="m,l,21600r21600,l21600,xe">
-                <v:stroke joinstyle="miter"/>
-                <v:path gradientshapeok="t" o:connecttype="rect"/>
-              </v:shapetype>
-              <v:shape id="_x0000_s1032" type="#_x0000_t202" style="position:absolute;left:0;text-align:left;margin-left:135.75pt;margin-top:488.95pt;width:182.55pt;height:.05pt;z-index:251691008;visibility:visible;mso-wrap-style:square;mso-width-percent:0;mso-wrap-distance-left:9pt;mso-wrap-distance-top:0;mso-wrap-distance-right:9pt;mso-wrap-distance-bottom:0;mso-position-horizontal:absolute;mso-position-horizontal-relative:text;mso-position-vertical:absolute;mso-position-vertical-relative:text;mso-width-percent:0;mso-width-relative:margin;v-text-anchor:top" o:gfxdata="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" stroked="f">
+              <v:shape w14:anchorId="5A06CCB9" id="_x0000_s1032" type="#_x0000_t202" style="position:absolute;left:0;text-align:left;margin-left:135.75pt;margin-top:488.95pt;width:182.55pt;height:.05pt;z-index:251691008;visibility:visible;mso-wrap-style:square;mso-width-percent:0;mso-wrap-distance-left:9pt;mso-wrap-distance-top:0;mso-wrap-distance-right:9pt;mso-wrap-distance-bottom:0;mso-position-horizontal:absolute;mso-position-horizontal-relative:text;mso-position-vertical:absolute;mso-position-vertical-relative:text;mso-width-percent:0;mso-width-relative:margin;v-text-anchor:top" o:gfxdata="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" stroked="f">
                 <v:textbox style="mso-fit-shape-to-text:t" inset="0,0,0,0">
                   <w:txbxContent>
                     <w:p>
@@ -10149,24 +10150,26 @@
                       <w:r>
                         <w:t xml:space="preserve">Figura </w:t>
                       </w:r>
-                      <w:fldSimple w:instr=" SEQ Figura \* ARABIC ">
-                        <w:r>
-                          <w:rPr>
-                            <w:noProof/>
-                          </w:rPr>
-                          <w:t>15</w:t>
-                        </w:r>
-                      </w:fldSimple>
                       <w:r>
-                        <w:t xml:space="preserve"> – </w:t>
+                        <w:fldChar w:fldCharType="begin"/>
                       </w:r>
-                      <w:proofErr w:type="spellStart"/>
                       <w:r>
-                        <w:t>Mockup</w:t>
+                        <w:instrText xml:space="preserve"> SEQ Figura \* ARABIC </w:instrText>
                       </w:r>
-                      <w:proofErr w:type="spellEnd"/>
                       <w:r>
-                        <w:t xml:space="preserve"> da Criação da Candidatura</w:t>
+                        <w:fldChar w:fldCharType="separate"/>
+                      </w:r>
+                      <w:r>
+                        <w:rPr>
+                          <w:noProof/>
+                        </w:rPr>
+                        <w:t>15</w:t>
+                      </w:r>
+                      <w:r>
+                        <w:fldChar w:fldCharType="end"/>
+                      </w:r>
+                      <w:r>
+                        <w:t xml:space="preserve"> – Mockup da Criação da Candidatura</w:t>
                       </w:r>
                     </w:p>
                   </w:txbxContent>
@@ -10283,14 +10286,24 @@
                             <w:r>
                               <w:t xml:space="preserve">Figura </w:t>
                             </w:r>
-                            <w:fldSimple w:instr=" SEQ Figura \* ARABIC ">
-                              <w:r>
-                                <w:rPr>
-                                  <w:noProof/>
-                                </w:rPr>
-                                <w:t>16</w:t>
-                              </w:r>
-                            </w:fldSimple>
+                            <w:r>
+                              <w:fldChar w:fldCharType="begin"/>
+                            </w:r>
+                            <w:r>
+                              <w:instrText xml:space="preserve"> SEQ Figura \* ARABIC </w:instrText>
+                            </w:r>
+                            <w:r>
+                              <w:fldChar w:fldCharType="separate"/>
+                            </w:r>
+                            <w:r>
+                              <w:rPr>
+                                <w:noProof/>
+                              </w:rPr>
+                              <w:t>16</w:t>
+                            </w:r>
+                            <w:r>
+                              <w:fldChar w:fldCharType="end"/>
+                            </w:r>
                             <w:r>
                               <w:t xml:space="preserve"> - Diagrama Sequência da Criação de Candidatura</w:t>
                             </w:r>
@@ -10551,14 +10564,24 @@
                             <w:r>
                               <w:t xml:space="preserve">Figura </w:t>
                             </w:r>
-                            <w:fldSimple w:instr=" SEQ Figura \* ARABIC ">
-                              <w:r>
-                                <w:rPr>
-                                  <w:noProof/>
-                                </w:rPr>
-                                <w:t>17</w:t>
-                              </w:r>
-                            </w:fldSimple>
+                            <w:r>
+                              <w:fldChar w:fldCharType="begin"/>
+                            </w:r>
+                            <w:r>
+                              <w:instrText xml:space="preserve"> SEQ Figura \* ARABIC </w:instrText>
+                            </w:r>
+                            <w:r>
+                              <w:fldChar w:fldCharType="separate"/>
+                            </w:r>
+                            <w:r>
+                              <w:rPr>
+                                <w:noProof/>
+                              </w:rPr>
+                              <w:t>17</w:t>
+                            </w:r>
+                            <w:r>
+                              <w:fldChar w:fldCharType="end"/>
+                            </w:r>
                             <w:r>
                               <w:t xml:space="preserve"> – Diagrama de Sequência</w:t>
                             </w:r>
@@ -10901,14 +10924,24 @@
                             <w:r>
                               <w:t xml:space="preserve">Figura </w:t>
                             </w:r>
-                            <w:fldSimple w:instr=" SEQ Figura \* ARABIC ">
-                              <w:r>
-                                <w:rPr>
-                                  <w:noProof/>
-                                </w:rPr>
-                                <w:t>18</w:t>
-                              </w:r>
-                            </w:fldSimple>
+                            <w:r>
+                              <w:fldChar w:fldCharType="begin"/>
+                            </w:r>
+                            <w:r>
+                              <w:instrText xml:space="preserve"> SEQ Figura \* ARABIC </w:instrText>
+                            </w:r>
+                            <w:r>
+                              <w:fldChar w:fldCharType="separate"/>
+                            </w:r>
+                            <w:r>
+                              <w:rPr>
+                                <w:noProof/>
+                              </w:rPr>
+                              <w:t>18</w:t>
+                            </w:r>
+                            <w:r>
+                              <w:fldChar w:fldCharType="end"/>
+                            </w:r>
                             <w:r>
                               <w:t xml:space="preserve"> - Diagrama Sequência de Estado da Candidatura</w:t>
                             </w:r>
@@ -11108,6 +11141,7 @@
                           <w:p>
                             <w:pPr>
                               <w:pStyle w:val="Legenda"/>
+                              <w:jc w:val="center"/>
                               <w:rPr>
                                 <w:rFonts w:ascii="Arial" w:hAnsi="Arial"/>
                                 <w:b/>
@@ -11133,13 +11167,8 @@
                             <w:r>
                               <w:t xml:space="preserve"> </w:t>
                             </w:r>
-                            <w:proofErr w:type="spellStart"/>
                             <w:r>
-                              <w:t>Mockup</w:t>
-                            </w:r>
-                            <w:proofErr w:type="spellEnd"/>
-                            <w:r>
-                              <w:t xml:space="preserve"> da página inicial do Administrador</w:t>
+                              <w:t>Mockup da página inicial do Administrador</w:t>
                             </w:r>
                           </w:p>
                         </w:txbxContent>
@@ -11167,6 +11196,7 @@
                     <w:p>
                       <w:pPr>
                         <w:pStyle w:val="Legenda"/>
+                        <w:jc w:val="center"/>
                         <w:rPr>
                           <w:rFonts w:ascii="Arial" w:hAnsi="Arial"/>
                           <w:b/>
@@ -11192,13 +11222,8 @@
                       <w:r>
                         <w:t xml:space="preserve"> </w:t>
                       </w:r>
-                      <w:proofErr w:type="spellStart"/>
                       <w:r>
-                        <w:t>Mockup</w:t>
-                      </w:r>
-                      <w:proofErr w:type="spellEnd"/>
-                      <w:r>
-                        <w:t xml:space="preserve"> da página inicial do Administrador</w:t>
+                        <w:t>Mockup da página inicial do Administrador</w:t>
                       </w:r>
                     </w:p>
                   </w:txbxContent>
@@ -11315,6 +11340,7 @@
                           <w:p>
                             <w:pPr>
                               <w:pStyle w:val="Legenda"/>
+                              <w:jc w:val="center"/>
                               <w:rPr>
                                 <w:rFonts w:ascii="Arial" w:hAnsi="Arial"/>
                                 <w:b/>
@@ -11332,15 +11358,7 @@
                               <w:t>20</w:t>
                             </w:r>
                             <w:r>
-                              <w:t xml:space="preserve"> – </w:t>
-                            </w:r>
-                            <w:proofErr w:type="spellStart"/>
-                            <w:r>
-                              <w:t>Mockup</w:t>
-                            </w:r>
-                            <w:proofErr w:type="spellEnd"/>
-                            <w:r>
-                              <w:t xml:space="preserve"> da </w:t>
+                              <w:t xml:space="preserve"> – Mockup da </w:t>
                             </w:r>
                             <w:r>
                               <w:t>página de candidaturas</w:t>
@@ -11371,6 +11389,7 @@
                     <w:p>
                       <w:pPr>
                         <w:pStyle w:val="Legenda"/>
+                        <w:jc w:val="center"/>
                         <w:rPr>
                           <w:rFonts w:ascii="Arial" w:hAnsi="Arial"/>
                           <w:b/>
@@ -11388,15 +11407,7 @@
                         <w:t>20</w:t>
                       </w:r>
                       <w:r>
-                        <w:t xml:space="preserve"> – </w:t>
-                      </w:r>
-                      <w:proofErr w:type="spellStart"/>
-                      <w:r>
-                        <w:t>Mockup</w:t>
-                      </w:r>
-                      <w:proofErr w:type="spellEnd"/>
-                      <w:r>
-                        <w:t xml:space="preserve"> da </w:t>
+                        <w:t xml:space="preserve"> – Mockup da </w:t>
                       </w:r>
                       <w:r>
                         <w:t>página de candidaturas</w:t>
@@ -11477,6 +11488,7 @@
                           <w:p>
                             <w:pPr>
                               <w:pStyle w:val="Legenda"/>
+                              <w:jc w:val="center"/>
                               <w:rPr>
                                 <w:rFonts w:ascii="Arial" w:hAnsi="Arial"/>
                                 <w:b/>
@@ -11494,15 +11506,7 @@
                               <w:t>1</w:t>
                             </w:r>
                             <w:r>
-                              <w:t xml:space="preserve"> – </w:t>
-                            </w:r>
-                            <w:proofErr w:type="spellStart"/>
-                            <w:r>
-                              <w:t>Mockup</w:t>
-                            </w:r>
-                            <w:proofErr w:type="spellEnd"/>
-                            <w:r>
-                              <w:t xml:space="preserve"> da página de </w:t>
+                              <w:t xml:space="preserve"> – Mockup da página de </w:t>
                             </w:r>
                             <w:r>
                               <w:t>stock</w:t>
@@ -11533,6 +11537,7 @@
                     <w:p>
                       <w:pPr>
                         <w:pStyle w:val="Legenda"/>
+                        <w:jc w:val="center"/>
                         <w:rPr>
                           <w:rFonts w:ascii="Arial" w:hAnsi="Arial"/>
                           <w:b/>
@@ -11550,15 +11555,7 @@
                         <w:t>1</w:t>
                       </w:r>
                       <w:r>
-                        <w:t xml:space="preserve"> – </w:t>
-                      </w:r>
-                      <w:proofErr w:type="spellStart"/>
-                      <w:r>
-                        <w:t>Mockup</w:t>
-                      </w:r>
-                      <w:proofErr w:type="spellEnd"/>
-                      <w:r>
-                        <w:t xml:space="preserve"> da página de </w:t>
+                        <w:t xml:space="preserve"> – Mockup da página de </w:t>
                       </w:r>
                       <w:r>
                         <w:t>stock</w:t>
@@ -11611,16 +11608,830 @@
       </w:r>
     </w:p>
     <w:p/>
+    <w:p>
+      <w:pPr>
+        <w:pStyle w:val="Ttulo2"/>
+      </w:pPr>
+      <w:r>
+        <w:lastRenderedPageBreak/>
+        <w:t>Adicionar produto ao s</w:t>
+      </w:r>
+      <w:r>
+        <w:t>tock</w:t>
+      </w:r>
+    </w:p>
+    <w:p>
+      <w:pPr>
+        <w:jc w:val="center"/>
+      </w:pPr>
+      <w:r>
+        <w:drawing>
+          <wp:inline distT="0" distB="0" distL="0" distR="0" wp14:anchorId="12975F56" wp14:editId="56A0A37D">
+            <wp:extent cx="2734057" cy="5725324"/>
+            <wp:effectExtent l="0" t="0" r="9525" b="0"/>
+            <wp:docPr id="558160869" name="Imagem 1" descr="Uma imagem com texto, captura de ecrã, software, número&#10;&#10;Os conteúdos gerados por IA podem estar incorretos."/>
+            <wp:cNvGraphicFramePr>
+              <a:graphicFrameLocks xmlns:a="http://schemas.openxmlformats.org/drawingml/2006/main" noChangeAspect="1"/>
+            </wp:cNvGraphicFramePr>
+            <a:graphic xmlns:a="http://schemas.openxmlformats.org/drawingml/2006/main">
+              <a:graphicData uri="http://schemas.openxmlformats.org/drawingml/2006/picture">
+                <pic:pic xmlns:pic="http://schemas.openxmlformats.org/drawingml/2006/picture">
+                  <pic:nvPicPr>
+                    <pic:cNvPr id="558160869" name="Imagem 1" descr="Uma imagem com texto, captura de ecrã, software, número&#10;&#10;Os conteúdos gerados por IA podem estar incorretos."/>
+                    <pic:cNvPicPr/>
+                  </pic:nvPicPr>
+                  <pic:blipFill>
+                    <a:blip r:embed="rId34"/>
+                    <a:stretch>
+                      <a:fillRect/>
+                    </a:stretch>
+                  </pic:blipFill>
+                  <pic:spPr>
+                    <a:xfrm>
+                      <a:off x="0" y="0"/>
+                      <a:ext cx="2734057" cy="5725324"/>
+                    </a:xfrm>
+                    <a:prstGeom prst="rect">
+                      <a:avLst/>
+                    </a:prstGeom>
+                  </pic:spPr>
+                </pic:pic>
+              </a:graphicData>
+            </a:graphic>
+          </wp:inline>
+        </w:drawing>
+      </w:r>
+    </w:p>
+    <w:p>
+      <w:pPr>
+        <w:jc w:val="center"/>
+      </w:pPr>
+      <w:r>
+        <w:rPr>
+          <w:noProof/>
+        </w:rPr>
+        <mc:AlternateContent>
+          <mc:Choice Requires="wps">
+            <w:drawing>
+              <wp:anchor distT="0" distB="0" distL="114300" distR="114300" simplePos="0" relativeHeight="251703296" behindDoc="1" locked="0" layoutInCell="1" allowOverlap="1" wp14:anchorId="386332F8" wp14:editId="0915F151">
+                <wp:simplePos x="0" y="0"/>
+                <wp:positionH relativeFrom="margin">
+                  <wp:align>center</wp:align>
+                </wp:positionH>
+                <wp:positionV relativeFrom="paragraph">
+                  <wp:posOffset>5715</wp:posOffset>
+                </wp:positionV>
+                <wp:extent cx="2794635" cy="635"/>
+                <wp:effectExtent l="0" t="0" r="5715" b="0"/>
+                <wp:wrapTight wrapText="bothSides">
+                  <wp:wrapPolygon edited="0">
+                    <wp:start x="0" y="0"/>
+                    <wp:lineTo x="0" y="20057"/>
+                    <wp:lineTo x="21497" y="20057"/>
+                    <wp:lineTo x="21497" y="0"/>
+                    <wp:lineTo x="0" y="0"/>
+                  </wp:wrapPolygon>
+                </wp:wrapTight>
+                <wp:docPr id="237228350" name="Caixa de texto 1"/>
+                <wp:cNvGraphicFramePr/>
+                <a:graphic xmlns:a="http://schemas.openxmlformats.org/drawingml/2006/main">
+                  <a:graphicData uri="http://schemas.microsoft.com/office/word/2010/wordprocessingShape">
+                    <wps:wsp>
+                      <wps:cNvSpPr txBox="1"/>
+                      <wps:spPr>
+                        <a:xfrm>
+                          <a:off x="0" y="0"/>
+                          <a:ext cx="2794635" cy="635"/>
+                        </a:xfrm>
+                        <a:prstGeom prst="rect">
+                          <a:avLst/>
+                        </a:prstGeom>
+                        <a:solidFill>
+                          <a:prstClr val="white"/>
+                        </a:solidFill>
+                        <a:ln>
+                          <a:noFill/>
+                        </a:ln>
+                      </wps:spPr>
+                      <wps:txbx>
+                        <w:txbxContent>
+                          <w:p>
+                            <w:pPr>
+                              <w:pStyle w:val="Legenda"/>
+                              <w:jc w:val="center"/>
+                              <w:rPr>
+                                <w:rFonts w:ascii="Arial" w:hAnsi="Arial"/>
+                                <w:b/>
+                                <w:bCs/>
+                                <w:noProof/>
+                                <w:color w:val="000000" w:themeColor="text1"/>
+                                <w:sz w:val="26"/>
+                                <w:szCs w:val="26"/>
+                              </w:rPr>
+                            </w:pPr>
+                            <w:r>
+                              <w:t>Figura 2</w:t>
+                            </w:r>
+                            <w:r>
+                              <w:t>2</w:t>
+                            </w:r>
+                            <w:r>
+                              <w:t xml:space="preserve"> – Mockup d</w:t>
+                            </w:r>
+                            <w:r>
+                              <w:t xml:space="preserve">o formulário de adição de produto ao </w:t>
+                            </w:r>
+                            <w:r>
+                              <w:t>stock</w:t>
+                            </w:r>
+                          </w:p>
+                        </w:txbxContent>
+                      </wps:txbx>
+                      <wps:bodyPr rot="0" spcFirstLastPara="0" vertOverflow="overflow" horzOverflow="overflow" vert="horz" wrap="square" lIns="0" tIns="0" rIns="0" bIns="0" numCol="1" spcCol="0" rtlCol="0" fromWordArt="0" anchor="t" anchorCtr="0" forceAA="0" compatLnSpc="1">
+                        <a:prstTxWarp prst="textNoShape">
+                          <a:avLst/>
+                        </a:prstTxWarp>
+                        <a:spAutoFit/>
+                      </wps:bodyPr>
+                    </wps:wsp>
+                  </a:graphicData>
+                </a:graphic>
+                <wp14:sizeRelH relativeFrom="margin">
+                  <wp14:pctWidth>0</wp14:pctWidth>
+                </wp14:sizeRelH>
+              </wp:anchor>
+            </w:drawing>
+          </mc:Choice>
+          <mc:Fallback>
+            <w:pict>
+              <v:shape w14:anchorId="386332F8" id="_x0000_s1039" type="#_x0000_t202" style="position:absolute;left:0;text-align:left;margin-left:0;margin-top:.45pt;width:220.05pt;height:.05pt;z-index:-251613184;visibility:visible;mso-wrap-style:square;mso-width-percent:0;mso-wrap-distance-left:9pt;mso-wrap-distance-top:0;mso-wrap-distance-right:9pt;mso-wrap-distance-bottom:0;mso-position-horizontal:center;mso-position-horizontal-relative:margin;mso-position-vertical:absolute;mso-position-vertical-relative:text;mso-width-percent:0;mso-width-relative:margin;v-text-anchor:top" o:gfxdata="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" stroked="f">
+                <v:textbox style="mso-fit-shape-to-text:t" inset="0,0,0,0">
+                  <w:txbxContent>
+                    <w:p>
+                      <w:pPr>
+                        <w:pStyle w:val="Legenda"/>
+                        <w:jc w:val="center"/>
+                        <w:rPr>
+                          <w:rFonts w:ascii="Arial" w:hAnsi="Arial"/>
+                          <w:b/>
+                          <w:bCs/>
+                          <w:noProof/>
+                          <w:color w:val="000000" w:themeColor="text1"/>
+                          <w:sz w:val="26"/>
+                          <w:szCs w:val="26"/>
+                        </w:rPr>
+                      </w:pPr>
+                      <w:r>
+                        <w:t>Figura 2</w:t>
+                      </w:r>
+                      <w:r>
+                        <w:t>2</w:t>
+                      </w:r>
+                      <w:r>
+                        <w:t xml:space="preserve"> – Mockup d</w:t>
+                      </w:r>
+                      <w:r>
+                        <w:t xml:space="preserve">o formulário de adição de produto ao </w:t>
+                      </w:r>
+                      <w:r>
+                        <w:t>stock</w:t>
+                      </w:r>
+                    </w:p>
+                  </w:txbxContent>
+                </v:textbox>
+                <w10:wrap type="tight" anchorx="margin"/>
+              </v:shape>
+            </w:pict>
+          </mc:Fallback>
+        </mc:AlternateContent>
+      </w:r>
+    </w:p>
     <w:p/>
     <w:p>
       <w:pPr>
+        <w:pStyle w:val="Ttulo2"/>
+      </w:pPr>
+      <w:r>
+        <w:lastRenderedPageBreak/>
+        <w:t>Gestão de produtos no</w:t>
+      </w:r>
+      <w:r>
+        <w:t xml:space="preserve"> stock</w:t>
+      </w:r>
+    </w:p>
+    <w:p>
+      <w:pPr>
+        <w:jc w:val="center"/>
+      </w:pPr>
+      <w:r>
+        <w:drawing>
+          <wp:inline distT="0" distB="0" distL="0" distR="0" wp14:anchorId="771C950B" wp14:editId="190DD7CE">
+            <wp:extent cx="5579745" cy="3786505"/>
+            <wp:effectExtent l="0" t="0" r="1905" b="4445"/>
+            <wp:docPr id="793567212" name="Imagem 1" descr="Uma imagem com texto, captura de ecrã, software, Ícone de computador&#10;&#10;Os conteúdos gerados por IA podem estar incorretos."/>
+            <wp:cNvGraphicFramePr>
+              <a:graphicFrameLocks xmlns:a="http://schemas.openxmlformats.org/drawingml/2006/main" noChangeAspect="1"/>
+            </wp:cNvGraphicFramePr>
+            <a:graphic xmlns:a="http://schemas.openxmlformats.org/drawingml/2006/main">
+              <a:graphicData uri="http://schemas.openxmlformats.org/drawingml/2006/picture">
+                <pic:pic xmlns:pic="http://schemas.openxmlformats.org/drawingml/2006/picture">
+                  <pic:nvPicPr>
+                    <pic:cNvPr id="793567212" name="Imagem 1" descr="Uma imagem com texto, captura de ecrã, software, Ícone de computador&#10;&#10;Os conteúdos gerados por IA podem estar incorretos."/>
+                    <pic:cNvPicPr/>
+                  </pic:nvPicPr>
+                  <pic:blipFill>
+                    <a:blip r:embed="rId35"/>
+                    <a:stretch>
+                      <a:fillRect/>
+                    </a:stretch>
+                  </pic:blipFill>
+                  <pic:spPr>
+                    <a:xfrm>
+                      <a:off x="0" y="0"/>
+                      <a:ext cx="5579745" cy="3786505"/>
+                    </a:xfrm>
+                    <a:prstGeom prst="rect">
+                      <a:avLst/>
+                    </a:prstGeom>
+                  </pic:spPr>
+                </pic:pic>
+              </a:graphicData>
+            </a:graphic>
+          </wp:inline>
+        </w:drawing>
+      </w:r>
+    </w:p>
+    <w:p>
+      <w:r>
+        <w:rPr>
+          <w:noProof/>
+        </w:rPr>
+        <mc:AlternateContent>
+          <mc:Choice Requires="wps">
+            <w:drawing>
+              <wp:anchor distT="0" distB="0" distL="114300" distR="114300" simplePos="0" relativeHeight="251705344" behindDoc="1" locked="0" layoutInCell="1" allowOverlap="1" wp14:anchorId="447FCAC5" wp14:editId="58E03DE9">
+                <wp:simplePos x="0" y="0"/>
+                <wp:positionH relativeFrom="margin">
+                  <wp:align>center</wp:align>
+                </wp:positionH>
+                <wp:positionV relativeFrom="paragraph">
+                  <wp:posOffset>5715</wp:posOffset>
+                </wp:positionV>
+                <wp:extent cx="2794635" cy="635"/>
+                <wp:effectExtent l="0" t="0" r="5715" b="0"/>
+                <wp:wrapTight wrapText="bothSides">
+                  <wp:wrapPolygon edited="0">
+                    <wp:start x="0" y="0"/>
+                    <wp:lineTo x="0" y="20282"/>
+                    <wp:lineTo x="21497" y="20282"/>
+                    <wp:lineTo x="21497" y="0"/>
+                    <wp:lineTo x="0" y="0"/>
+                  </wp:wrapPolygon>
+                </wp:wrapTight>
+                <wp:docPr id="1515682992" name="Caixa de texto 1"/>
+                <wp:cNvGraphicFramePr/>
+                <a:graphic xmlns:a="http://schemas.openxmlformats.org/drawingml/2006/main">
+                  <a:graphicData uri="http://schemas.microsoft.com/office/word/2010/wordprocessingShape">
+                    <wps:wsp>
+                      <wps:cNvSpPr txBox="1"/>
+                      <wps:spPr>
+                        <a:xfrm>
+                          <a:off x="0" y="0"/>
+                          <a:ext cx="2794635" cy="635"/>
+                        </a:xfrm>
+                        <a:prstGeom prst="rect">
+                          <a:avLst/>
+                        </a:prstGeom>
+                        <a:solidFill>
+                          <a:prstClr val="white"/>
+                        </a:solidFill>
+                        <a:ln>
+                          <a:noFill/>
+                        </a:ln>
+                      </wps:spPr>
+                      <wps:txbx>
+                        <w:txbxContent>
+                          <w:p>
+                            <w:pPr>
+                              <w:pStyle w:val="Legenda"/>
+                              <w:jc w:val="center"/>
+                              <w:rPr>
+                                <w:rFonts w:ascii="Arial" w:hAnsi="Arial"/>
+                                <w:b/>
+                                <w:bCs/>
+                                <w:noProof/>
+                                <w:color w:val="000000" w:themeColor="text1"/>
+                                <w:sz w:val="26"/>
+                                <w:szCs w:val="26"/>
+                              </w:rPr>
+                            </w:pPr>
+                            <w:r>
+                              <w:t>Figura 2</w:t>
+                            </w:r>
+                            <w:r>
+                              <w:t>3</w:t>
+                            </w:r>
+                            <w:r>
+                              <w:t xml:space="preserve"> – Mockup</w:t>
+                            </w:r>
+                            <w:r>
+                              <w:t>s</w:t>
+                            </w:r>
+                            <w:r>
+                              <w:t xml:space="preserve"> d</w:t>
+                            </w:r>
+                            <w:r>
+                              <w:t>as páginas de gestão de</w:t>
+                            </w:r>
+                            <w:r>
+                              <w:t xml:space="preserve"> produto</w:t>
+                            </w:r>
+                            <w:r>
+                              <w:t>s</w:t>
+                            </w:r>
+                            <w:r>
+                              <w:t xml:space="preserve"> </w:t>
+                            </w:r>
+                            <w:r>
+                              <w:t>n</w:t>
+                            </w:r>
+                            <w:r>
+                              <w:t>o stock</w:t>
+                            </w:r>
+                          </w:p>
+                        </w:txbxContent>
+                      </wps:txbx>
+                      <wps:bodyPr rot="0" spcFirstLastPara="0" vertOverflow="overflow" horzOverflow="overflow" vert="horz" wrap="square" lIns="0" tIns="0" rIns="0" bIns="0" numCol="1" spcCol="0" rtlCol="0" fromWordArt="0" anchor="t" anchorCtr="0" forceAA="0" compatLnSpc="1">
+                        <a:prstTxWarp prst="textNoShape">
+                          <a:avLst/>
+                        </a:prstTxWarp>
+                        <a:spAutoFit/>
+                      </wps:bodyPr>
+                    </wps:wsp>
+                  </a:graphicData>
+                </a:graphic>
+                <wp14:sizeRelH relativeFrom="margin">
+                  <wp14:pctWidth>0</wp14:pctWidth>
+                </wp14:sizeRelH>
+              </wp:anchor>
+            </w:drawing>
+          </mc:Choice>
+          <mc:Fallback>
+            <w:pict>
+              <v:shape w14:anchorId="447FCAC5" id="_x0000_s1040" type="#_x0000_t202" style="position:absolute;margin-left:0;margin-top:.45pt;width:220.05pt;height:.05pt;z-index:-251611136;visibility:visible;mso-wrap-style:square;mso-width-percent:0;mso-wrap-distance-left:9pt;mso-wrap-distance-top:0;mso-wrap-distance-right:9pt;mso-wrap-distance-bottom:0;mso-position-horizontal:center;mso-position-horizontal-relative:margin;mso-position-vertical:absolute;mso-position-vertical-relative:text;mso-width-percent:0;mso-width-relative:margin;v-text-anchor:top" o:gfxdata="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" stroked="f">
+                <v:textbox style="mso-fit-shape-to-text:t" inset="0,0,0,0">
+                  <w:txbxContent>
+                    <w:p>
+                      <w:pPr>
+                        <w:pStyle w:val="Legenda"/>
+                        <w:jc w:val="center"/>
+                        <w:rPr>
+                          <w:rFonts w:ascii="Arial" w:hAnsi="Arial"/>
+                          <w:b/>
+                          <w:bCs/>
+                          <w:noProof/>
+                          <w:color w:val="000000" w:themeColor="text1"/>
+                          <w:sz w:val="26"/>
+                          <w:szCs w:val="26"/>
+                        </w:rPr>
+                      </w:pPr>
+                      <w:r>
+                        <w:t>Figura 2</w:t>
+                      </w:r>
+                      <w:r>
+                        <w:t>3</w:t>
+                      </w:r>
+                      <w:r>
+                        <w:t xml:space="preserve"> – Mockup</w:t>
+                      </w:r>
+                      <w:r>
+                        <w:t>s</w:t>
+                      </w:r>
+                      <w:r>
+                        <w:t xml:space="preserve"> d</w:t>
+                      </w:r>
+                      <w:r>
+                        <w:t>as páginas de gestão de</w:t>
+                      </w:r>
+                      <w:r>
+                        <w:t xml:space="preserve"> produto</w:t>
+                      </w:r>
+                      <w:r>
+                        <w:t>s</w:t>
+                      </w:r>
+                      <w:r>
+                        <w:t xml:space="preserve"> </w:t>
+                      </w:r>
+                      <w:r>
+                        <w:t>n</w:t>
+                      </w:r>
+                      <w:r>
+                        <w:t>o stock</w:t>
+                      </w:r>
+                    </w:p>
+                  </w:txbxContent>
+                </v:textbox>
+                <w10:wrap type="tight" anchorx="margin"/>
+              </v:shape>
+            </w:pict>
+          </mc:Fallback>
+        </mc:AlternateContent>
+      </w:r>
+    </w:p>
+    <w:p/>
+    <w:p>
+      <w:pPr>
+        <w:pStyle w:val="Ttulo2"/>
+      </w:pPr>
+      <w:r>
+        <w:lastRenderedPageBreak/>
+        <w:t xml:space="preserve">Gestão de </w:t>
+      </w:r>
+      <w:r>
+        <w:t>subsidiários</w:t>
+      </w:r>
+    </w:p>
+    <w:p>
+      <w:pPr>
+        <w:jc w:val="center"/>
+      </w:pPr>
+      <w:r>
+        <w:rPr>
+          <w:noProof/>
+        </w:rPr>
+        <mc:AlternateContent>
+          <mc:Choice Requires="wps">
+            <w:drawing>
+              <wp:anchor distT="0" distB="0" distL="114300" distR="114300" simplePos="0" relativeHeight="251707392" behindDoc="1" locked="0" layoutInCell="1" allowOverlap="1" wp14:anchorId="394C169E" wp14:editId="17244F1F">
+                <wp:simplePos x="0" y="0"/>
+                <wp:positionH relativeFrom="margin">
+                  <wp:align>center</wp:align>
+                </wp:positionH>
+                <wp:positionV relativeFrom="paragraph">
+                  <wp:posOffset>5857875</wp:posOffset>
+                </wp:positionV>
+                <wp:extent cx="2794635" cy="635"/>
+                <wp:effectExtent l="0" t="0" r="5715" b="0"/>
+                <wp:wrapTight wrapText="bothSides">
+                  <wp:wrapPolygon edited="0">
+                    <wp:start x="0" y="0"/>
+                    <wp:lineTo x="0" y="20282"/>
+                    <wp:lineTo x="21497" y="20282"/>
+                    <wp:lineTo x="21497" y="0"/>
+                    <wp:lineTo x="0" y="0"/>
+                  </wp:wrapPolygon>
+                </wp:wrapTight>
+                <wp:docPr id="1561912282" name="Caixa de texto 1"/>
+                <wp:cNvGraphicFramePr/>
+                <a:graphic xmlns:a="http://schemas.openxmlformats.org/drawingml/2006/main">
+                  <a:graphicData uri="http://schemas.microsoft.com/office/word/2010/wordprocessingShape">
+                    <wps:wsp>
+                      <wps:cNvSpPr txBox="1"/>
+                      <wps:spPr>
+                        <a:xfrm>
+                          <a:off x="0" y="0"/>
+                          <a:ext cx="2794635" cy="635"/>
+                        </a:xfrm>
+                        <a:prstGeom prst="rect">
+                          <a:avLst/>
+                        </a:prstGeom>
+                        <a:solidFill>
+                          <a:prstClr val="white"/>
+                        </a:solidFill>
+                        <a:ln>
+                          <a:noFill/>
+                        </a:ln>
+                      </wps:spPr>
+                      <wps:txbx>
+                        <w:txbxContent>
+                          <w:p>
+                            <w:pPr>
+                              <w:pStyle w:val="Legenda"/>
+                              <w:jc w:val="center"/>
+                              <w:rPr>
+                                <w:rFonts w:ascii="Arial" w:hAnsi="Arial"/>
+                                <w:b/>
+                                <w:bCs/>
+                                <w:noProof/>
+                                <w:color w:val="000000" w:themeColor="text1"/>
+                                <w:sz w:val="26"/>
+                                <w:szCs w:val="26"/>
+                              </w:rPr>
+                            </w:pPr>
+                            <w:r>
+                              <w:t>Figura 2</w:t>
+                            </w:r>
+                            <w:r>
+                              <w:t>4</w:t>
+                            </w:r>
+                            <w:r>
+                              <w:t xml:space="preserve"> – Mockup </w:t>
+                            </w:r>
+                            <w:r>
+                              <w:t>da página de gestão de subsidiários</w:t>
+                            </w:r>
+                          </w:p>
+                        </w:txbxContent>
+                      </wps:txbx>
+                      <wps:bodyPr rot="0" spcFirstLastPara="0" vertOverflow="overflow" horzOverflow="overflow" vert="horz" wrap="square" lIns="0" tIns="0" rIns="0" bIns="0" numCol="1" spcCol="0" rtlCol="0" fromWordArt="0" anchor="t" anchorCtr="0" forceAA="0" compatLnSpc="1">
+                        <a:prstTxWarp prst="textNoShape">
+                          <a:avLst/>
+                        </a:prstTxWarp>
+                        <a:spAutoFit/>
+                      </wps:bodyPr>
+                    </wps:wsp>
+                  </a:graphicData>
+                </a:graphic>
+                <wp14:sizeRelH relativeFrom="margin">
+                  <wp14:pctWidth>0</wp14:pctWidth>
+                </wp14:sizeRelH>
+              </wp:anchor>
+            </w:drawing>
+          </mc:Choice>
+          <mc:Fallback>
+            <w:pict>
+              <v:shape w14:anchorId="394C169E" id="_x0000_s1041" type="#_x0000_t202" style="position:absolute;left:0;text-align:left;margin-left:0;margin-top:461.25pt;width:220.05pt;height:.05pt;z-index:-251609088;visibility:visible;mso-wrap-style:square;mso-width-percent:0;mso-wrap-distance-left:9pt;mso-wrap-distance-top:0;mso-wrap-distance-right:9pt;mso-wrap-distance-bottom:0;mso-position-horizontal:center;mso-position-horizontal-relative:margin;mso-position-vertical:absolute;mso-position-vertical-relative:text;mso-width-percent:0;mso-width-relative:margin;v-text-anchor:top" o:gfxdata="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" stroked="f">
+                <v:textbox style="mso-fit-shape-to-text:t" inset="0,0,0,0">
+                  <w:txbxContent>
+                    <w:p>
+                      <w:pPr>
+                        <w:pStyle w:val="Legenda"/>
+                        <w:jc w:val="center"/>
+                        <w:rPr>
+                          <w:rFonts w:ascii="Arial" w:hAnsi="Arial"/>
+                          <w:b/>
+                          <w:bCs/>
+                          <w:noProof/>
+                          <w:color w:val="000000" w:themeColor="text1"/>
+                          <w:sz w:val="26"/>
+                          <w:szCs w:val="26"/>
+                        </w:rPr>
+                      </w:pPr>
+                      <w:r>
+                        <w:t>Figura 2</w:t>
+                      </w:r>
+                      <w:r>
+                        <w:t>4</w:t>
+                      </w:r>
+                      <w:r>
+                        <w:t xml:space="preserve"> – Mockup </w:t>
+                      </w:r>
+                      <w:r>
+                        <w:t>da página de gestão de subsidiários</w:t>
+                      </w:r>
+                    </w:p>
+                  </w:txbxContent>
+                </v:textbox>
+                <w10:wrap type="tight" anchorx="margin"/>
+              </v:shape>
+            </w:pict>
+          </mc:Fallback>
+        </mc:AlternateContent>
+      </w:r>
+      <w:r>
+        <w:drawing>
+          <wp:inline distT="0" distB="0" distL="0" distR="0" wp14:anchorId="53FE6BF6" wp14:editId="29AC08D2">
+            <wp:extent cx="2657846" cy="5715798"/>
+            <wp:effectExtent l="0" t="0" r="9525" b="0"/>
+            <wp:docPr id="1946395785" name="Imagem 1" descr="Uma imagem com texto, captura de ecrã, software, número&#10;&#10;Os conteúdos gerados por IA podem estar incorretos."/>
+            <wp:cNvGraphicFramePr>
+              <a:graphicFrameLocks xmlns:a="http://schemas.openxmlformats.org/drawingml/2006/main" noChangeAspect="1"/>
+            </wp:cNvGraphicFramePr>
+            <a:graphic xmlns:a="http://schemas.openxmlformats.org/drawingml/2006/main">
+              <a:graphicData uri="http://schemas.openxmlformats.org/drawingml/2006/picture">
+                <pic:pic xmlns:pic="http://schemas.openxmlformats.org/drawingml/2006/picture">
+                  <pic:nvPicPr>
+                    <pic:cNvPr id="1946395785" name="Imagem 1" descr="Uma imagem com texto, captura de ecrã, software, número&#10;&#10;Os conteúdos gerados por IA podem estar incorretos."/>
+                    <pic:cNvPicPr/>
+                  </pic:nvPicPr>
+                  <pic:blipFill>
+                    <a:blip r:embed="rId36"/>
+                    <a:stretch>
+                      <a:fillRect/>
+                    </a:stretch>
+                  </pic:blipFill>
+                  <pic:spPr>
+                    <a:xfrm>
+                      <a:off x="0" y="0"/>
+                      <a:ext cx="2657846" cy="5715798"/>
+                    </a:xfrm>
+                    <a:prstGeom prst="rect">
+                      <a:avLst/>
+                    </a:prstGeom>
+                  </pic:spPr>
+                </pic:pic>
+              </a:graphicData>
+            </a:graphic>
+          </wp:inline>
+        </w:drawing>
+      </w:r>
+    </w:p>
+    <w:p>
+      <w:pPr>
+        <w:jc w:val="center"/>
+      </w:pPr>
+    </w:p>
+    <w:p>
+      <w:pPr>
+        <w:pStyle w:val="Ttulo2"/>
+      </w:pPr>
+      <w:r>
+        <w:lastRenderedPageBreak/>
+        <w:t>Calendário</w:t>
+      </w:r>
+    </w:p>
+    <w:p>
+      <w:pPr>
+        <w:jc w:val="center"/>
+      </w:pPr>
+      <w:r>
+        <w:rPr>
+          <w:noProof/>
+        </w:rPr>
+        <mc:AlternateContent>
+          <mc:Choice Requires="wps">
+            <w:drawing>
+              <wp:anchor distT="0" distB="0" distL="114300" distR="114300" simplePos="0" relativeHeight="251709440" behindDoc="1" locked="0" layoutInCell="1" allowOverlap="1" wp14:anchorId="5E851F1D" wp14:editId="18B58BD1">
+                <wp:simplePos x="0" y="0"/>
+                <wp:positionH relativeFrom="margin">
+                  <wp:align>center</wp:align>
+                </wp:positionH>
+                <wp:positionV relativeFrom="paragraph">
+                  <wp:posOffset>6054090</wp:posOffset>
+                </wp:positionV>
+                <wp:extent cx="2794635" cy="635"/>
+                <wp:effectExtent l="0" t="0" r="5715" b="0"/>
+                <wp:wrapTight wrapText="bothSides">
+                  <wp:wrapPolygon edited="0">
+                    <wp:start x="0" y="0"/>
+                    <wp:lineTo x="0" y="20282"/>
+                    <wp:lineTo x="21497" y="20282"/>
+                    <wp:lineTo x="21497" y="0"/>
+                    <wp:lineTo x="0" y="0"/>
+                  </wp:wrapPolygon>
+                </wp:wrapTight>
+                <wp:docPr id="982319483" name="Caixa de texto 1"/>
+                <wp:cNvGraphicFramePr/>
+                <a:graphic xmlns:a="http://schemas.openxmlformats.org/drawingml/2006/main">
+                  <a:graphicData uri="http://schemas.microsoft.com/office/word/2010/wordprocessingShape">
+                    <wps:wsp>
+                      <wps:cNvSpPr txBox="1"/>
+                      <wps:spPr>
+                        <a:xfrm>
+                          <a:off x="0" y="0"/>
+                          <a:ext cx="2794635" cy="635"/>
+                        </a:xfrm>
+                        <a:prstGeom prst="rect">
+                          <a:avLst/>
+                        </a:prstGeom>
+                        <a:solidFill>
+                          <a:prstClr val="white"/>
+                        </a:solidFill>
+                        <a:ln>
+                          <a:noFill/>
+                        </a:ln>
+                      </wps:spPr>
+                      <wps:txbx>
+                        <w:txbxContent>
+                          <w:p>
+                            <w:pPr>
+                              <w:pStyle w:val="Legenda"/>
+                              <w:jc w:val="center"/>
+                              <w:rPr>
+                                <w:rFonts w:ascii="Arial" w:hAnsi="Arial"/>
+                                <w:b/>
+                                <w:bCs/>
+                                <w:noProof/>
+                                <w:color w:val="000000" w:themeColor="text1"/>
+                                <w:sz w:val="26"/>
+                                <w:szCs w:val="26"/>
+                              </w:rPr>
+                            </w:pPr>
+                            <w:r>
+                              <w:t>Figura 2</w:t>
+                            </w:r>
+                            <w:r>
+                              <w:t>5</w:t>
+                            </w:r>
+                            <w:r>
+                              <w:t xml:space="preserve"> – Mockup</w:t>
+                            </w:r>
+                            <w:r>
+                              <w:t xml:space="preserve"> da página do calendário</w:t>
+                            </w:r>
+                          </w:p>
+                        </w:txbxContent>
+                      </wps:txbx>
+                      <wps:bodyPr rot="0" spcFirstLastPara="0" vertOverflow="overflow" horzOverflow="overflow" vert="horz" wrap="square" lIns="0" tIns="0" rIns="0" bIns="0" numCol="1" spcCol="0" rtlCol="0" fromWordArt="0" anchor="t" anchorCtr="0" forceAA="0" compatLnSpc="1">
+                        <a:prstTxWarp prst="textNoShape">
+                          <a:avLst/>
+                        </a:prstTxWarp>
+                        <a:spAutoFit/>
+                      </wps:bodyPr>
+                    </wps:wsp>
+                  </a:graphicData>
+                </a:graphic>
+                <wp14:sizeRelH relativeFrom="margin">
+                  <wp14:pctWidth>0</wp14:pctWidth>
+                </wp14:sizeRelH>
+              </wp:anchor>
+            </w:drawing>
+          </mc:Choice>
+          <mc:Fallback>
+            <w:pict>
+              <v:shape w14:anchorId="5E851F1D" id="_x0000_s1042" type="#_x0000_t202" style="position:absolute;left:0;text-align:left;margin-left:0;margin-top:476.7pt;width:220.05pt;height:.05pt;z-index:-251607040;visibility:visible;mso-wrap-style:square;mso-width-percent:0;mso-wrap-distance-left:9pt;mso-wrap-distance-top:0;mso-wrap-distance-right:9pt;mso-wrap-distance-bottom:0;mso-position-horizontal:center;mso-position-horizontal-relative:margin;mso-position-vertical:absolute;mso-position-vertical-relative:text;mso-width-percent:0;mso-width-relative:margin;v-text-anchor:top" o:gfxdata="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" stroked="f">
+                <v:textbox style="mso-fit-shape-to-text:t" inset="0,0,0,0">
+                  <w:txbxContent>
+                    <w:p>
+                      <w:pPr>
+                        <w:pStyle w:val="Legenda"/>
+                        <w:jc w:val="center"/>
+                        <w:rPr>
+                          <w:rFonts w:ascii="Arial" w:hAnsi="Arial"/>
+                          <w:b/>
+                          <w:bCs/>
+                          <w:noProof/>
+                          <w:color w:val="000000" w:themeColor="text1"/>
+                          <w:sz w:val="26"/>
+                          <w:szCs w:val="26"/>
+                        </w:rPr>
+                      </w:pPr>
+                      <w:r>
+                        <w:t>Figura 2</w:t>
+                      </w:r>
+                      <w:r>
+                        <w:t>5</w:t>
+                      </w:r>
+                      <w:r>
+                        <w:t xml:space="preserve"> – Mockup</w:t>
+                      </w:r>
+                      <w:r>
+                        <w:t xml:space="preserve"> da página do calendário</w:t>
+                      </w:r>
+                    </w:p>
+                  </w:txbxContent>
+                </v:textbox>
+                <w10:wrap type="tight" anchorx="margin"/>
+              </v:shape>
+            </w:pict>
+          </mc:Fallback>
+        </mc:AlternateContent>
+      </w:r>
+      <w:r>
+        <w:drawing>
+          <wp:inline distT="0" distB="0" distL="0" distR="0" wp14:anchorId="4B7FB77B" wp14:editId="35EB8DB4">
+            <wp:extent cx="2772162" cy="5896798"/>
+            <wp:effectExtent l="0" t="0" r="9525" b="8890"/>
+            <wp:docPr id="1501502541" name="Imagem 1" descr="Uma imagem com texto, captura de ecrã, número, design&#10;&#10;Os conteúdos gerados por IA podem estar incorretos."/>
+            <wp:cNvGraphicFramePr>
+              <a:graphicFrameLocks xmlns:a="http://schemas.openxmlformats.org/drawingml/2006/main" noChangeAspect="1"/>
+            </wp:cNvGraphicFramePr>
+            <a:graphic xmlns:a="http://schemas.openxmlformats.org/drawingml/2006/main">
+              <a:graphicData uri="http://schemas.openxmlformats.org/drawingml/2006/picture">
+                <pic:pic xmlns:pic="http://schemas.openxmlformats.org/drawingml/2006/picture">
+                  <pic:nvPicPr>
+                    <pic:cNvPr id="1501502541" name="Imagem 1" descr="Uma imagem com texto, captura de ecrã, número, design&#10;&#10;Os conteúdos gerados por IA podem estar incorretos."/>
+                    <pic:cNvPicPr/>
+                  </pic:nvPicPr>
+                  <pic:blipFill>
+                    <a:blip r:embed="rId37"/>
+                    <a:stretch>
+                      <a:fillRect/>
+                    </a:stretch>
+                  </pic:blipFill>
+                  <pic:spPr>
+                    <a:xfrm>
+                      <a:off x="0" y="0"/>
+                      <a:ext cx="2772162" cy="5896798"/>
+                    </a:xfrm>
+                    <a:prstGeom prst="rect">
+                      <a:avLst/>
+                    </a:prstGeom>
+                  </pic:spPr>
+                </pic:pic>
+              </a:graphicData>
+            </a:graphic>
+          </wp:inline>
+        </w:drawing>
+      </w:r>
+    </w:p>
+    <w:p>
+      <w:pPr>
+        <w:jc w:val="center"/>
+      </w:pPr>
+    </w:p>
+    <w:p/>
+    <w:p/>
+    <w:p>
+      <w:pPr>
         <w:pStyle w:val="Ttulo1"/>
       </w:pPr>
-      <w:bookmarkStart w:id="48" w:name="_Toc215255754"/>
-      <w:r>
+      <w:bookmarkStart w:id="53" w:name="_Toc215255754"/>
+      <w:r>
+        <w:lastRenderedPageBreak/>
         <w:t>Conclusão</w:t>
       </w:r>
-      <w:bookmarkEnd w:id="48"/>
+      <w:bookmarkEnd w:id="53"/>
     </w:p>
     <w:p>
       <w:pPr>
@@ -11632,19 +12443,12 @@
           <w:rFonts w:cstheme="minorHAnsi"/>
         </w:rPr>
       </w:pPr>
-      <w:bookmarkStart w:id="49" w:name="_Toc448947953"/>
+      <w:bookmarkStart w:id="54" w:name="_Toc448947953"/>
       <w:r>
         <w:rPr>
           <w:rFonts w:cstheme="minorHAnsi"/>
         </w:rPr>
-        <w:t xml:space="preserve">O presente trabalho permitiu desenvolver uma análise completa e detalhada do projeto da Loja Social, abordando desde a descrição da organização e dos seus objetivos até à modelação dos processos de negócio e a definição da arquitetura técnica da aplicação. Ao longo do estudo, foram </w:t>
-      </w:r>
-      <w:r>
-        <w:rPr>
-          <w:rFonts w:cstheme="minorHAnsi"/>
-        </w:rPr>
-        <w:lastRenderedPageBreak/>
-        <w:t>identificados os principais problemas a resolver, tais como a gestão manual de pedidos, doações e entregas, e foram propostos mecanismos que permitem automatizar, organizar e monitorizar estas atividades de forma mais eficiente.</w:t>
+        <w:t>O presente trabalho permitiu desenvolver uma análise completa e detalhada do projeto da Loja Social, abordando desde a descrição da organização e dos seus objetivos até à modelação dos processos de negócio e a definição da arquitetura técnica da aplicação. Ao longo do estudo, foram identificados os principais problemas a resolver, tais como a gestão manual de pedidos, doações e entregas, e foram propostos mecanismos que permitem automatizar, organizar e monitorizar estas atividades de forma mais eficiente.</w:t>
       </w:r>
     </w:p>
     <w:p>
@@ -11680,12 +12484,12 @@
         </w:rPr>
         <w:t>Em suma, o trabalho não só descreve o projeto de forma detalhada, como também fornece uma base sólida para a implementação futura da aplicação, contribuindo para a melhoria dos processos internos da Loja Social e para um apoio mais eficaz e organizado aos beneficiários.</w:t>
       </w:r>
-      <w:bookmarkEnd w:id="49"/>
+      <w:bookmarkEnd w:id="54"/>
     </w:p>
     <w:sectPr>
-      <w:headerReference w:type="default" r:id="rId34"/>
-      <w:footerReference w:type="default" r:id="rId35"/>
-      <w:footerReference w:type="first" r:id="rId36"/>
+      <w:headerReference w:type="default" r:id="rId38"/>
+      <w:footerReference w:type="default" r:id="rId39"/>
+      <w:footerReference w:type="first" r:id="rId40"/>
       <w:pgSz w:w="11906" w:h="16838"/>
       <w:pgMar w:top="1418" w:right="1418" w:bottom="1418" w:left="1701" w:header="709" w:footer="709" w:gutter="0"/>
       <w:cols w:space="708"/>
@@ -12975,6 +13779,126 @@
     </w:lvlOverride>
   </w:num>
   <w:num w:numId="16" w16cid:durableId="664554041">
+    <w:abstractNumId w:val="4"/>
+    <w:lvlOverride w:ilvl="0">
+      <w:startOverride w:val="1"/>
+    </w:lvlOverride>
+    <w:lvlOverride w:ilvl="1">
+      <w:startOverride w:val="1"/>
+    </w:lvlOverride>
+    <w:lvlOverride w:ilvl="2">
+      <w:startOverride w:val="1"/>
+    </w:lvlOverride>
+    <w:lvlOverride w:ilvl="3">
+      <w:startOverride w:val="1"/>
+    </w:lvlOverride>
+    <w:lvlOverride w:ilvl="4">
+      <w:startOverride w:val="1"/>
+    </w:lvlOverride>
+    <w:lvlOverride w:ilvl="5">
+      <w:startOverride w:val="1"/>
+    </w:lvlOverride>
+    <w:lvlOverride w:ilvl="6">
+      <w:startOverride w:val="1"/>
+    </w:lvlOverride>
+    <w:lvlOverride w:ilvl="7">
+      <w:startOverride w:val="1"/>
+    </w:lvlOverride>
+    <w:lvlOverride w:ilvl="8">
+      <w:startOverride w:val="1"/>
+    </w:lvlOverride>
+  </w:num>
+  <w:num w:numId="17" w16cid:durableId="1612712025">
+    <w:abstractNumId w:val="4"/>
+    <w:lvlOverride w:ilvl="0">
+      <w:startOverride w:val="1"/>
+    </w:lvlOverride>
+    <w:lvlOverride w:ilvl="1">
+      <w:startOverride w:val="1"/>
+    </w:lvlOverride>
+    <w:lvlOverride w:ilvl="2">
+      <w:startOverride w:val="1"/>
+    </w:lvlOverride>
+    <w:lvlOverride w:ilvl="3">
+      <w:startOverride w:val="1"/>
+    </w:lvlOverride>
+    <w:lvlOverride w:ilvl="4">
+      <w:startOverride w:val="1"/>
+    </w:lvlOverride>
+    <w:lvlOverride w:ilvl="5">
+      <w:startOverride w:val="1"/>
+    </w:lvlOverride>
+    <w:lvlOverride w:ilvl="6">
+      <w:startOverride w:val="1"/>
+    </w:lvlOverride>
+    <w:lvlOverride w:ilvl="7">
+      <w:startOverride w:val="1"/>
+    </w:lvlOverride>
+    <w:lvlOverride w:ilvl="8">
+      <w:startOverride w:val="1"/>
+    </w:lvlOverride>
+  </w:num>
+  <w:num w:numId="18" w16cid:durableId="1178696172">
+    <w:abstractNumId w:val="4"/>
+    <w:lvlOverride w:ilvl="0">
+      <w:startOverride w:val="1"/>
+    </w:lvlOverride>
+    <w:lvlOverride w:ilvl="1">
+      <w:startOverride w:val="1"/>
+    </w:lvlOverride>
+    <w:lvlOverride w:ilvl="2">
+      <w:startOverride w:val="1"/>
+    </w:lvlOverride>
+    <w:lvlOverride w:ilvl="3">
+      <w:startOverride w:val="1"/>
+    </w:lvlOverride>
+    <w:lvlOverride w:ilvl="4">
+      <w:startOverride w:val="1"/>
+    </w:lvlOverride>
+    <w:lvlOverride w:ilvl="5">
+      <w:startOverride w:val="1"/>
+    </w:lvlOverride>
+    <w:lvlOverride w:ilvl="6">
+      <w:startOverride w:val="1"/>
+    </w:lvlOverride>
+    <w:lvlOverride w:ilvl="7">
+      <w:startOverride w:val="1"/>
+    </w:lvlOverride>
+    <w:lvlOverride w:ilvl="8">
+      <w:startOverride w:val="1"/>
+    </w:lvlOverride>
+  </w:num>
+  <w:num w:numId="19" w16cid:durableId="200754442">
+    <w:abstractNumId w:val="4"/>
+    <w:lvlOverride w:ilvl="0">
+      <w:startOverride w:val="1"/>
+    </w:lvlOverride>
+    <w:lvlOverride w:ilvl="1">
+      <w:startOverride w:val="1"/>
+    </w:lvlOverride>
+    <w:lvlOverride w:ilvl="2">
+      <w:startOverride w:val="1"/>
+    </w:lvlOverride>
+    <w:lvlOverride w:ilvl="3">
+      <w:startOverride w:val="1"/>
+    </w:lvlOverride>
+    <w:lvlOverride w:ilvl="4">
+      <w:startOverride w:val="1"/>
+    </w:lvlOverride>
+    <w:lvlOverride w:ilvl="5">
+      <w:startOverride w:val="1"/>
+    </w:lvlOverride>
+    <w:lvlOverride w:ilvl="6">
+      <w:startOverride w:val="1"/>
+    </w:lvlOverride>
+    <w:lvlOverride w:ilvl="7">
+      <w:startOverride w:val="1"/>
+    </w:lvlOverride>
+    <w:lvlOverride w:ilvl="8">
+      <w:startOverride w:val="1"/>
+    </w:lvlOverride>
+  </w:num>
+  <w:num w:numId="20" w16cid:durableId="2041785104">
     <w:abstractNumId w:val="4"/>
     <w:lvlOverride w:ilvl="0">
       <w:startOverride w:val="1"/>

</xml_diff>

<commit_message>
Update Relatorio.docx documentation file
Modified the Relatorio.docx file in the docs directory. The changes may include updated content or formatting in the project documentation.
</commit_message>
<xml_diff>
--- a/docs/Relatorio.docx
+++ b/docs/Relatorio.docx
@@ -270,7 +270,6 @@
     <w:p>
       <w:pPr>
         <w:pStyle w:val="SemEspaamento"/>
-        <w:ind w:firstLine="2268"/>
         <w:jc w:val="center"/>
         <w:rPr>
           <w:rFonts w:ascii="Arial" w:hAnsi="Arial" w:cs="Arial"/>
@@ -309,7 +308,6 @@
     <w:p>
       <w:pPr>
         <w:pStyle w:val="SemEspaamento"/>
-        <w:ind w:firstLine="2268"/>
         <w:jc w:val="center"/>
         <w:rPr>
           <w:rFonts w:ascii="Arial" w:hAnsi="Arial" w:cs="Arial"/>
@@ -348,7 +346,6 @@
     <w:p>
       <w:pPr>
         <w:pStyle w:val="SemEspaamento"/>
-        <w:ind w:firstLine="2268"/>
         <w:jc w:val="center"/>
         <w:rPr>
           <w:rFonts w:ascii="Arial" w:hAnsi="Arial" w:cs="Arial"/>
@@ -387,7 +384,6 @@
     <w:p>
       <w:pPr>
         <w:pStyle w:val="SemEspaamento"/>
-        <w:ind w:firstLine="2268"/>
         <w:jc w:val="center"/>
         <w:rPr>
           <w:rFonts w:ascii="Arial" w:hAnsi="Arial" w:cs="Arial"/>
@@ -426,7 +422,6 @@
     <w:p>
       <w:pPr>
         <w:pStyle w:val="SemEspaamento"/>
-        <w:ind w:firstLine="2268"/>
         <w:jc w:val="center"/>
         <w:rPr>
           <w:rFonts w:ascii="Arial" w:hAnsi="Arial" w:cs="Arial"/>
@@ -5752,6 +5747,20 @@
       </w:pPr>
       <w:r>
         <w:t>Criar candidatura</w:t>
+      </w:r>
+    </w:p>
+    <w:p>
+      <w:pPr>
+        <w:jc w:val="both"/>
+      </w:pPr>
+      <w:r>
+        <w:t xml:space="preserve">Na imagem seguinte é possível observar o diagrama BPMN </w:t>
+      </w:r>
+      <w:r>
+        <w:t>de candidatura a beneficiário</w:t>
+      </w:r>
+      <w:r>
+        <w:t xml:space="preserve">. </w:t>
       </w:r>
     </w:p>
     <w:p>
@@ -5888,6 +5897,9 @@
         </mc:AlternateContent>
       </w:r>
       <w:r>
+        <w:rPr>
+          <w:noProof/>
+        </w:rPr>
         <w:drawing>
           <wp:inline distT="0" distB="0" distL="0" distR="0" wp14:anchorId="21652659" wp14:editId="5D443F82">
             <wp:extent cx="5579745" cy="2286635"/>
@@ -5927,9 +5939,109 @@
     </w:p>
     <w:p>
       <w:pPr>
+        <w:jc w:val="both"/>
+      </w:pPr>
+      <w:r>
+        <w:rPr>
+          <w:b/>
+          <w:bCs/>
+        </w:rPr>
+        <w:t>Intervenientes</w:t>
+      </w:r>
+      <w:r>
+        <w:t xml:space="preserve">: O processo divide-se em duas </w:t>
+      </w:r>
+      <w:proofErr w:type="spellStart"/>
+      <w:r>
+        <w:t>lanes</w:t>
+      </w:r>
+      <w:proofErr w:type="spellEnd"/>
+      <w:r>
+        <w:t>: o Utilizador e a Loja Social.</w:t>
+      </w:r>
+    </w:p>
+    <w:p>
+      <w:pPr>
+        <w:jc w:val="both"/>
+      </w:pPr>
+      <w:r>
+        <w:rPr>
+          <w:b/>
+          <w:bCs/>
+        </w:rPr>
+        <w:t>Fluxo do Processo:</w:t>
+      </w:r>
+      <w:r>
+        <w:t xml:space="preserve"> </w:t>
+      </w:r>
+      <w:r>
+        <w:t xml:space="preserve"> </w:t>
+      </w:r>
+      <w:r>
+        <w:t>O Utilizador inicia o processo com a tarefa "Cria candidatura".</w:t>
+      </w:r>
+    </w:p>
+    <w:p>
+      <w:pPr>
+        <w:jc w:val="both"/>
+      </w:pPr>
+      <w:r>
+        <w:t>A Loja Social recebe e "Analisa candidatura".</w:t>
+      </w:r>
+    </w:p>
+    <w:p>
+      <w:pPr>
+        <w:jc w:val="both"/>
+      </w:pPr>
+      <w:r>
+        <w:t>Existe um ponto de decisão (Gateway):</w:t>
+      </w:r>
+    </w:p>
+    <w:p>
+      <w:pPr>
+        <w:pStyle w:val="PargrafodaLista"/>
+        <w:numPr>
+          <w:ilvl w:val="0"/>
+          <w:numId w:val="22"/>
+        </w:numPr>
+        <w:jc w:val="both"/>
+      </w:pPr>
+      <w:r>
+        <w:t>Correção necessária: Se houver erros, a Loja "Notifica utilizador", que deve realizar a "Correção da candidatura".</w:t>
+      </w:r>
+    </w:p>
+    <w:p>
+      <w:pPr>
+        <w:pStyle w:val="PargrafodaLista"/>
+        <w:numPr>
+          <w:ilvl w:val="0"/>
+          <w:numId w:val="22"/>
+        </w:numPr>
+        <w:jc w:val="both"/>
+      </w:pPr>
+      <w:r>
+        <w:t>Recusada: Se não cumprir os requisitos, a candidatura é recusada e o processo termina.</w:t>
+      </w:r>
+    </w:p>
+    <w:p>
+      <w:pPr>
+        <w:pStyle w:val="PargrafodaLista"/>
+        <w:numPr>
+          <w:ilvl w:val="0"/>
+          <w:numId w:val="22"/>
+        </w:numPr>
+        <w:jc w:val="both"/>
+      </w:pPr>
+      <w:r>
+        <w:t>Aceite: Se tudo estiver conforme, a Loja "Toma a decisão" positiva, notifica o beneficiário e executa o "Regista beneficiário" no sistema.</w:t>
+      </w:r>
+    </w:p>
+    <w:p>
+      <w:pPr>
         <w:pStyle w:val="Ttulo2"/>
       </w:pPr>
       <w:r>
+        <w:lastRenderedPageBreak/>
         <w:t>Pedido de bens</w:t>
       </w:r>
     </w:p>
@@ -5999,27 +6111,14 @@
                             <w:r>
                               <w:t xml:space="preserve">Figura </w:t>
                             </w:r>
-                            <w:r>
-                              <w:fldChar w:fldCharType="begin"/>
-                            </w:r>
-                            <w:r>
-                              <w:instrText xml:space="preserve"> SEQ Figura \* ARABIC </w:instrText>
-                            </w:r>
-                            <w:r>
-                              <w:fldChar w:fldCharType="separate"/>
-                            </w:r>
-                            <w:r>
-                              <w:rPr>
-                                <w:noProof/>
-                              </w:rPr>
-                              <w:t>2</w:t>
-                            </w:r>
-                            <w:r>
-                              <w:rPr>
-                                <w:noProof/>
-                              </w:rPr>
-                              <w:fldChar w:fldCharType="end"/>
-                            </w:r>
+                            <w:fldSimple w:instr=" SEQ Figura \* ARABIC ">
+                              <w:r>
+                                <w:rPr>
+                                  <w:noProof/>
+                                </w:rPr>
+                                <w:t>2</w:t>
+                              </w:r>
+                            </w:fldSimple>
                             <w:r>
                               <w:t xml:space="preserve"> - Diagrama BPMN </w:t>
                             </w:r>
@@ -6059,27 +6158,14 @@
                       <w:r>
                         <w:t xml:space="preserve">Figura </w:t>
                       </w:r>
-                      <w:r>
-                        <w:fldChar w:fldCharType="begin"/>
-                      </w:r>
-                      <w:r>
-                        <w:instrText xml:space="preserve"> SEQ Figura \* ARABIC </w:instrText>
-                      </w:r>
-                      <w:r>
-                        <w:fldChar w:fldCharType="separate"/>
-                      </w:r>
-                      <w:r>
-                        <w:rPr>
-                          <w:noProof/>
-                        </w:rPr>
-                        <w:t>2</w:t>
-                      </w:r>
-                      <w:r>
-                        <w:rPr>
-                          <w:noProof/>
-                        </w:rPr>
-                        <w:fldChar w:fldCharType="end"/>
-                      </w:r>
+                      <w:fldSimple w:instr=" SEQ Figura \* ARABIC ">
+                        <w:r>
+                          <w:rPr>
+                            <w:noProof/>
+                          </w:rPr>
+                          <w:t>2</w:t>
+                        </w:r>
+                      </w:fldSimple>
                       <w:r>
                         <w:t xml:space="preserve"> - Diagrama BPMN </w:t>
                       </w:r>
@@ -6100,7 +6186,7 @@
           <w:noProof/>
         </w:rPr>
         <w:drawing>
-          <wp:inline distT="0" distB="0" distL="0" distR="0" wp14:anchorId="6F228B50" wp14:editId="359C5CB0">
+          <wp:inline distT="0" distB="0" distL="0" distR="0" wp14:anchorId="6F228B50" wp14:editId="3B2AAE39">
             <wp:extent cx="3987067" cy="2355850"/>
             <wp:effectExtent l="0" t="0" r="0" b="6350"/>
             <wp:docPr id="826101158" name="Imagem 20" descr="Uma imagem com captura de ecrã, diagrama, texto, file&#10;&#10;Os conteúdos gerados por IA podem estar incorretos."/>
@@ -6147,32 +6233,84 @@
         <w:jc w:val="both"/>
       </w:pPr>
       <w:r>
-        <w:lastRenderedPageBreak/>
-        <w:t xml:space="preserve">O processo tem início com o beneficiário, que solicita apoio à Loja Social. Após receber o pedido, a loja </w:t>
-      </w:r>
-      <w:r>
-        <w:t>procura os bens necessários no stock</w:t>
-      </w:r>
-      <w:r>
-        <w:t xml:space="preserve">. Em seguida, o beneficiário </w:t>
-      </w:r>
-      <w:r>
-        <w:t>é notificado no caso de não terem bens disponíveis</w:t>
-      </w:r>
-      <w:r>
-        <w:t>, c</w:t>
-      </w:r>
-      <w:r>
-        <w:t xml:space="preserve">aso contrário, </w:t>
-      </w:r>
-      <w:r>
-        <w:t>os bens são organizados e agendada a entrega</w:t>
-      </w:r>
-      <w:r>
-        <w:t>.</w:t>
-      </w:r>
-    </w:p>
-    <w:p>
+        <w:rPr>
+          <w:b/>
+          <w:bCs/>
+        </w:rPr>
+        <w:t>Intervenientes</w:t>
+      </w:r>
+      <w:r>
+        <w:t xml:space="preserve">: </w:t>
+      </w:r>
+      <w:r>
+        <w:t>Beneficiário</w:t>
+      </w:r>
+      <w:r>
+        <w:t xml:space="preserve"> e Loja Social.</w:t>
+      </w:r>
+    </w:p>
+    <w:p>
+      <w:pPr>
+        <w:jc w:val="both"/>
+      </w:pPr>
+      <w:r>
+        <w:rPr>
+          <w:b/>
+          <w:bCs/>
+        </w:rPr>
+        <w:t>Fluxo do Processo</w:t>
+      </w:r>
+      <w:r>
+        <w:t>:</w:t>
+      </w:r>
+      <w:r>
+        <w:t xml:space="preserve"> </w:t>
+      </w:r>
+      <w:r>
+        <w:t>O Beneficiário "Pede Bens".</w:t>
+      </w:r>
+    </w:p>
+    <w:p>
+      <w:pPr>
+        <w:jc w:val="both"/>
+      </w:pPr>
+      <w:r>
+        <w:t>A Loja Social "Recebe Pedido" e "Procura Bens no Stock".</w:t>
+      </w:r>
+    </w:p>
+    <w:p>
+      <w:pPr>
+        <w:jc w:val="both"/>
+      </w:pPr>
+      <w:r>
+        <w:t>Verificação de Stock:</w:t>
+      </w:r>
+    </w:p>
+    <w:p>
+      <w:pPr>
+        <w:pStyle w:val="PargrafodaLista"/>
+        <w:numPr>
+          <w:ilvl w:val="0"/>
+          <w:numId w:val="23"/>
+        </w:numPr>
+        <w:jc w:val="both"/>
+      </w:pPr>
+      <w:r>
+        <w:t>Não existe: O sistema "Notifica o Beneficiário" da indisponibilidade.</w:t>
+      </w:r>
+    </w:p>
+    <w:p>
+      <w:pPr>
+        <w:pStyle w:val="PargrafodaLista"/>
+        <w:numPr>
+          <w:ilvl w:val="0"/>
+          <w:numId w:val="23"/>
+        </w:numPr>
+        <w:jc w:val="both"/>
+      </w:pPr>
+      <w:r>
+        <w:t>Existe: A Loja "Organiza os bens para entrega" e "Agenda entrega", notificando o beneficiário com a data agendada.</w:t>
+      </w:r>
       <w:r>
         <w:br w:type="page"/>
       </w:r>
@@ -6291,14 +6429,81 @@
     </w:p>
     <w:p/>
     <w:p>
-      <w:pPr>
-        <w:jc w:val="both"/>
-      </w:pPr>
-      <w:r>
-        <w:t>O processo inicia-se com o doador, que entrega os bens à Loja Social. O colaborador procede à análise do estado dos bens e, caso estes não se encontrem em condições adequadas, contacta uma associação parceira para efetuar a doação. Se os bens estiverem em condições, o sistema regista a entrada e procede à atualização do stock.</w:t>
-      </w:r>
-    </w:p>
-    <w:p>
+      <w:r>
+        <w:t>Este processo detalha como a Loja Social recebe, analisa e integra novos bens no seu sistema, assegurando que apenas artigos em condições adequadas ficam disponíveis para os estudantes.</w:t>
+      </w:r>
+    </w:p>
+    <w:p>
+      <w:r>
+        <w:rPr>
+          <w:b/>
+          <w:bCs/>
+        </w:rPr>
+        <w:t>Intervenientes:</w:t>
+      </w:r>
+      <w:r>
+        <w:t xml:space="preserve"> Doador e Loja Social.</w:t>
+      </w:r>
+    </w:p>
+    <w:p>
+      <w:pPr>
+        <w:rPr>
+          <w:b/>
+          <w:bCs/>
+        </w:rPr>
+      </w:pPr>
+      <w:r>
+        <w:rPr>
+          <w:b/>
+          <w:bCs/>
+        </w:rPr>
+        <w:t>Fluxo do Processo:</w:t>
+      </w:r>
+      <w:r>
+        <w:rPr>
+          <w:b/>
+          <w:bCs/>
+        </w:rPr>
+        <w:t xml:space="preserve"> </w:t>
+      </w:r>
+      <w:r>
+        <w:t>Receção da Doação: O processo inicia-se externamente com o Doador, que se dirige à Loja Social e "Doa Bens".</w:t>
+      </w:r>
+    </w:p>
+    <w:p>
+      <w:r>
+        <w:t>O Colaborador recebe os itens e executa a tarefa "Analisar Bem" para verificar o estado de conservação e a validade dos produtos.</w:t>
+      </w:r>
+    </w:p>
+    <w:p>
+      <w:r>
+        <w:t>Decisão de Aceitação (Gateway): Ocorre um ponto de decisão baseado na qualidade/validade dos bens:</w:t>
+      </w:r>
+    </w:p>
+    <w:p>
+      <w:pPr>
+        <w:pStyle w:val="PargrafodaLista"/>
+        <w:numPr>
+          <w:ilvl w:val="0"/>
+          <w:numId w:val="26"/>
+        </w:numPr>
+      </w:pPr>
+      <w:r>
+        <w:t>Não Aceite (Condições inadequadas): Se os bens não reunirem as condições necessárias para a Loja Social, estes não são descartados, mas sim encaminhados para outra via. O colaborador retira o bem e contacta uma associação parceira para efetuar a doação a essa entidade externa. No diagrama, isto segue o fluxo de "Retirar Bem" e "Notifica Instituição".</w:t>
+      </w:r>
+    </w:p>
+    <w:p>
+      <w:pPr>
+        <w:pStyle w:val="PargrafodaLista"/>
+        <w:numPr>
+          <w:ilvl w:val="0"/>
+          <w:numId w:val="26"/>
+        </w:numPr>
+      </w:pPr>
+      <w:r>
+        <w:lastRenderedPageBreak/>
+        <w:t>Aceite (Boas condições): Se os bens estiverem em condições adequadas, o colaborador aceita a doação. O sistema regista a entrada e executa a tarefa "Atualizar stock", tornando os bens disponíveis para distribuição.</w:t>
+      </w:r>
       <w:r>
         <w:br w:type="page"/>
       </w:r>
@@ -6513,27 +6718,112 @@
       </w:pPr>
     </w:p>
     <w:p>
-      <w:pPr>
-        <w:jc w:val="both"/>
-      </w:pPr>
-      <w:r>
-        <w:t>O processo inicia-se com o sistema, que notifica o beneficiário. Este informa a sua disponibilidade para a receção do apoio, sendo essa informação recebida pelo sistema e transmitida ao colaborador. O colaborador analisa a disponibilidade e, caso exista compatibilidade, a entrega é agendada e o beneficiário é notificado pelo sistema.</w:t>
-      </w:r>
-    </w:p>
-    <w:p>
-      <w:pPr>
-        <w:jc w:val="both"/>
-      </w:pPr>
-    </w:p>
-    <w:p>
-      <w:pPr>
-        <w:jc w:val="both"/>
-      </w:pPr>
-      <w:r>
-        <w:t>Se não existir disponibilidade, o colaborador propõe uma nova data, sendo o beneficiário notificado pelo sistema para avaliar a proposta. Caso aceite, o sistema agenda a entrega e envia a confirmação. Caso contrário, o processo reinicia, repetindo-se estes passos até ser encontrada uma data mutuamente disponível.</w:t>
-      </w:r>
-    </w:p>
-    <w:p>
+      <w:r>
+        <w:rPr>
+          <w:b/>
+          <w:bCs/>
+        </w:rPr>
+        <w:t>Intervenientes</w:t>
+      </w:r>
+      <w:r>
+        <w:t>: Beneficiário e Colaborador SAS.</w:t>
+      </w:r>
+    </w:p>
+    <w:p>
+      <w:r>
+        <w:rPr>
+          <w:b/>
+          <w:bCs/>
+        </w:rPr>
+        <w:t>Fluxo do Processo:</w:t>
+      </w:r>
+      <w:r>
+        <w:t xml:space="preserve"> </w:t>
+      </w:r>
+      <w:r>
+        <w:t>Início e Notificação: O processo inicia-se com o Sistema a notificar o beneficiário sobre a necessidade de agendar uma entrega.</w:t>
+      </w:r>
+    </w:p>
+    <w:p>
+      <w:r>
+        <w:t>Disponibilidade: O Beneficiário informa a sua disponibilidade para receber o apoio. Esta informação é captada pelo Sistema e transmitida ao Colaborador.</w:t>
+      </w:r>
+    </w:p>
+    <w:p>
+      <w:r>
+        <w:t>Aná</w:t>
+      </w:r>
+      <w:r>
+        <w:t>l</w:t>
+      </w:r>
+      <w:r>
+        <w:t>ise e Decisão: O Colaborador analisa a disponibilidade indicada:</w:t>
+      </w:r>
+    </w:p>
+    <w:p>
+      <w:pPr>
+        <w:pStyle w:val="PargrafodaLista"/>
+        <w:numPr>
+          <w:ilvl w:val="0"/>
+          <w:numId w:val="25"/>
+        </w:numPr>
+      </w:pPr>
+      <w:r>
+        <w:t>Se compatível: A entrega é imediatamente agendada e o Sistema notifica o beneficiário com a confirmação.</w:t>
+      </w:r>
+    </w:p>
+    <w:p>
+      <w:pPr>
+        <w:pStyle w:val="PargrafodaLista"/>
+        <w:numPr>
+          <w:ilvl w:val="0"/>
+          <w:numId w:val="25"/>
+        </w:numPr>
+      </w:pPr>
+      <w:r>
+        <w:t>Se incompatível: O Colaborador propõe uma nova data alternativa.</w:t>
+      </w:r>
+    </w:p>
+    <w:p>
+      <w:r>
+        <w:t>Negociação</w:t>
+      </w:r>
+      <w:r>
+        <w:t xml:space="preserve">: </w:t>
+      </w:r>
+      <w:r>
+        <w:t>Caso seja proposta uma nova data, o Beneficiário é notificado para a avaliar:</w:t>
+      </w:r>
+    </w:p>
+    <w:p>
+      <w:r>
+        <w:t>Se aceitar: O Sistema agenda a entrega e envia a confirmação final.</w:t>
+      </w:r>
+    </w:p>
+    <w:p>
+      <w:r>
+        <w:t xml:space="preserve">Se recusar: O processo entra num </w:t>
+      </w:r>
+      <w:proofErr w:type="spellStart"/>
+      <w:r>
+        <w:t>loop</w:t>
+      </w:r>
+      <w:proofErr w:type="spellEnd"/>
+      <w:r>
+        <w:t xml:space="preserve">, </w:t>
+      </w:r>
+      <w:r>
+        <w:t>havendo a repetição</w:t>
+      </w:r>
+      <w:r>
+        <w:t xml:space="preserve"> </w:t>
+      </w:r>
+      <w:r>
+        <w:t>d</w:t>
+      </w:r>
+      <w:r>
+        <w:t>os passos anteriores até que se encontre uma data mutuamente disponível.</w:t>
+      </w:r>
       <w:r>
         <w:br w:type="page"/>
       </w:r>
@@ -6699,6 +6989,9 @@
         </mc:AlternateContent>
       </w:r>
       <w:r>
+        <w:rPr>
+          <w:noProof/>
+        </w:rPr>
         <w:drawing>
           <wp:inline distT="0" distB="0" distL="0" distR="0" wp14:anchorId="4B2B01D6" wp14:editId="40F44CBA">
             <wp:extent cx="5579745" cy="2504440"/>
@@ -6739,21 +7032,40 @@
     <w:p>
       <w:pPr>
         <w:jc w:val="both"/>
-      </w:pPr>
-      <w:r>
-        <w:t xml:space="preserve">O processo tem início com o colaborador, que </w:t>
-      </w:r>
-      <w:r>
-        <w:t>agenda a entrega</w:t>
+        <w:rPr>
+          <w:u w:val="single"/>
+        </w:rPr>
+      </w:pPr>
+      <w:r>
+        <w:rPr>
+          <w:b/>
+          <w:bCs/>
+        </w:rPr>
+        <w:t>Intervenientes</w:t>
+      </w:r>
+      <w:r>
+        <w:t>: Beneficiário e Loja Social.</w:t>
+      </w:r>
+    </w:p>
+    <w:p>
+      <w:pPr>
+        <w:jc w:val="both"/>
+      </w:pPr>
+      <w:r>
+        <w:rPr>
+          <w:b/>
+          <w:bCs/>
+        </w:rPr>
+        <w:t>Fluxo</w:t>
+      </w:r>
+      <w:r>
+        <w:t>:</w:t>
       </w:r>
       <w:r>
         <w:t xml:space="preserve"> </w:t>
       </w:r>
       <w:r>
-        <w:t>d</w:t>
-      </w:r>
-      <w:r>
-        <w:t>os bens. Em seguida, o sistema notifica o beneficiário para proceder à recolha. Caso o beneficiário compareça, os bens são entregues e o stock é atualizado.</w:t>
+        <w:t>Inicia-se com o agendamento da entrega de bens.</w:t>
       </w:r>
     </w:p>
     <w:p>
@@ -6761,22 +7073,51 @@
         <w:jc w:val="both"/>
       </w:pPr>
       <w:r>
-        <w:t>Se o beneficiário não comparecer, mas informar previamente, é agendada uma nova entrega. Caso não compareça nem informe, o colaborador verifica o número de ausências anteriores. Se o beneficiário ainda não tiver ultrapassado três faltas, é agendada nova data de entrega; contudo, se ultrapassar esse limite,</w:t>
-      </w:r>
-      <w:r>
-        <w:t xml:space="preserve"> </w:t>
-      </w:r>
-      <w:r>
-        <w:t xml:space="preserve">o caso é enviado para a administração que analisa e, dependendo da decisão, </w:t>
-      </w:r>
-      <w:r>
-        <w:t>mantem o apoio ou informa o beneficiário da perda da mesma</w:t>
-      </w:r>
-      <w:r>
-        <w:t>.</w:t>
-      </w:r>
-    </w:p>
-    <w:p/>
+        <w:t>Se o beneficiário comparece, "Recebe bens" e a Loja "Atualiza bens no stock".</w:t>
+      </w:r>
+    </w:p>
+    <w:p>
+      <w:pPr>
+        <w:jc w:val="both"/>
+      </w:pPr>
+      <w:r>
+        <w:t>Se o beneficiário não comparece:</w:t>
+      </w:r>
+    </w:p>
+    <w:p>
+      <w:pPr>
+        <w:pStyle w:val="PargrafodaLista"/>
+        <w:numPr>
+          <w:ilvl w:val="0"/>
+          <w:numId w:val="24"/>
+        </w:numPr>
+        <w:jc w:val="both"/>
+      </w:pPr>
+      <w:r>
+        <w:t>Pode "Procura justificação". Se justificar, reagenda-se.</w:t>
+      </w:r>
+    </w:p>
+    <w:p>
+      <w:pPr>
+        <w:pStyle w:val="PargrafodaLista"/>
+        <w:numPr>
+          <w:ilvl w:val="0"/>
+          <w:numId w:val="24"/>
+        </w:numPr>
+        <w:jc w:val="both"/>
+      </w:pPr>
+      <w:r>
+        <w:t>Se for falta injustificada, verifica-se o histórico ("Mais de 3 faltas?").</w:t>
+      </w:r>
+    </w:p>
+    <w:p>
+      <w:pPr>
+        <w:jc w:val="both"/>
+      </w:pPr>
+      <w:r>
+        <w:t>Consequência: Se ultrapassar 3 faltas, a Administração é informada para analisar o caso, podendo decidir "Suspende apoio" ou manter, informando o beneficiário.</w:t>
+      </w:r>
+    </w:p>
     <w:p>
       <w:r>
         <w:br w:type="page"/>
@@ -8946,11 +9287,9 @@
       <w:r>
         <w:t xml:space="preserve"> a colaboração entre o Beneficiário, o Funcionário e o Sistema para a concretização do apoio. O fluxo é coordenado através do caso de uso Agenda Entrega, onde os três intervenientes interagem para definir o momento da recolha. Ao Funcionário cabem as tarefas operacionais de Prepara Entrega (separação dos bens em stock) e Realiza Entrega (entrega física ao beneficiário), enquanto o Sistema assume um papel de suporte automatizado ao executar a </w:t>
       </w:r>
-      <w:proofErr w:type="gramStart"/>
-      <w:r>
-        <w:t>ação Notifica</w:t>
-      </w:r>
-      <w:proofErr w:type="gramEnd"/>
+      <w:r>
+        <w:t>ação. Notifica</w:t>
+      </w:r>
       <w:r>
         <w:t>, garantindo que as partes envolvidas são alertadas sobre o estado e confirmação do agendamento.</w:t>
       </w:r>
@@ -9208,14 +9547,12 @@
       <w:r>
         <w:t>O Modelo Entidade-</w:t>
       </w:r>
-      <w:proofErr w:type="spellStart"/>
-      <w:r>
-        <w:t>Relac</w:t>
+      <w:r>
+        <w:t>Relaç</w:t>
       </w:r>
       <w:r>
         <w:t>ão</w:t>
       </w:r>
-      <w:proofErr w:type="spellEnd"/>
       <w:r>
         <w:t xml:space="preserve"> da aplicação da Loja Social foi concebido para suportar os processos de negócio de forma </w:t>
       </w:r>
@@ -9274,15 +9611,13 @@
       <w:r>
         <w:t xml:space="preserve"> e </w:t>
       </w:r>
-      <w:proofErr w:type="spellStart"/>
       <w:r>
         <w:rPr>
           <w:b/>
           <w:bCs/>
         </w:rPr>
-        <w:t>Beneficiario</w:t>
-      </w:r>
-      <w:proofErr w:type="spellEnd"/>
+        <w:t>Beneficiário</w:t>
+      </w:r>
       <w:r>
         <w:t xml:space="preserve"> estabelecem um registo centralizado dos utilizadores e estudantes elegíveis para apoio, sendo a base para a segurança do sistema. A gestão da logística é suportada pelas tabelas </w:t>
       </w:r>
@@ -10290,15 +10625,7 @@
                               </w:r>
                             </w:fldSimple>
                             <w:r>
-                              <w:t xml:space="preserve"> – </w:t>
-                            </w:r>
-                            <w:proofErr w:type="spellStart"/>
-                            <w:r>
-                              <w:t>Mockup</w:t>
-                            </w:r>
-                            <w:proofErr w:type="spellEnd"/>
-                            <w:r>
-                              <w:t xml:space="preserve"> da Criação da Candidatura</w:t>
+                              <w:t xml:space="preserve"> – Mockup da Criação da Candidatura</w:t>
                             </w:r>
                           </w:p>
                         </w:txbxContent>
@@ -10348,15 +10675,7 @@
                         </w:r>
                       </w:fldSimple>
                       <w:r>
-                        <w:t xml:space="preserve"> – </w:t>
-                      </w:r>
-                      <w:proofErr w:type="spellStart"/>
-                      <w:r>
-                        <w:t>Mockup</w:t>
-                      </w:r>
-                      <w:proofErr w:type="spellEnd"/>
-                      <w:r>
-                        <w:t xml:space="preserve"> da Criação da Candidatura</w:t>
+                        <w:t xml:space="preserve"> – Mockup da Criação da Candidatura</w:t>
                       </w:r>
                     </w:p>
                   </w:txbxContent>
@@ -10889,7 +11208,7 @@
           <w:noProof/>
         </w:rPr>
         <w:drawing>
-          <wp:inline distT="0" distB="0" distL="0" distR="0" wp14:anchorId="33356D91" wp14:editId="52C57E3C">
+          <wp:inline distT="0" distB="0" distL="0" distR="0" wp14:anchorId="33356D91" wp14:editId="2511E92A">
             <wp:extent cx="5321039" cy="2686862"/>
             <wp:effectExtent l="0" t="0" r="0" b="0"/>
             <wp:docPr id="1719185855" name="Imagem 10" descr="Uma imagem com texto, captura de ecrã, Tipo de letra, Marca&#10;&#10;Os conteúdos gerados por IA podem estar incorretos."/>
@@ -11289,15 +11608,7 @@
                               </w:rPr>
                             </w:pPr>
                             <w:r>
-                              <w:t xml:space="preserve">Figura 19 – </w:t>
-                            </w:r>
-                            <w:proofErr w:type="spellStart"/>
-                            <w:r>
-                              <w:t>Mockup</w:t>
-                            </w:r>
-                            <w:proofErr w:type="spellEnd"/>
-                            <w:r>
-                              <w:t xml:space="preserve"> da página inicial do Administrador</w:t>
+                              <w:t>Figura 19 – Mockup da página inicial do Administrador</w:t>
                             </w:r>
                           </w:p>
                         </w:txbxContent>
@@ -11337,15 +11648,7 @@
                         </w:rPr>
                       </w:pPr>
                       <w:r>
-                        <w:t xml:space="preserve">Figura 19 – </w:t>
-                      </w:r>
-                      <w:proofErr w:type="spellStart"/>
-                      <w:r>
-                        <w:t>Mockup</w:t>
-                      </w:r>
-                      <w:proofErr w:type="spellEnd"/>
-                      <w:r>
-                        <w:t xml:space="preserve"> da página inicial do Administrador</w:t>
+                        <w:t>Figura 19 – Mockup da página inicial do Administrador</w:t>
                       </w:r>
                     </w:p>
                   </w:txbxContent>
@@ -11492,15 +11795,7 @@
                               </w:rPr>
                             </w:pPr>
                             <w:r>
-                              <w:t xml:space="preserve">Figura 20 – </w:t>
-                            </w:r>
-                            <w:proofErr w:type="spellStart"/>
-                            <w:r>
-                              <w:t>Mockup</w:t>
-                            </w:r>
-                            <w:proofErr w:type="spellEnd"/>
-                            <w:r>
-                              <w:t xml:space="preserve"> da página de candidaturas</w:t>
+                              <w:t>Figura 20 – Mockup da página de candidaturas</w:t>
                             </w:r>
                           </w:p>
                         </w:txbxContent>
@@ -11540,15 +11835,7 @@
                         </w:rPr>
                       </w:pPr>
                       <w:r>
-                        <w:t xml:space="preserve">Figura 20 – </w:t>
-                      </w:r>
-                      <w:proofErr w:type="spellStart"/>
-                      <w:r>
-                        <w:t>Mockup</w:t>
-                      </w:r>
-                      <w:proofErr w:type="spellEnd"/>
-                      <w:r>
-                        <w:t xml:space="preserve"> da página de candidaturas</w:t>
+                        <w:t>Figura 20 – Mockup da página de candidaturas</w:t>
                       </w:r>
                     </w:p>
                   </w:txbxContent>
@@ -11654,15 +11941,7 @@
                               </w:rPr>
                             </w:pPr>
                             <w:r>
-                              <w:t xml:space="preserve">Figura 21 – </w:t>
-                            </w:r>
-                            <w:proofErr w:type="spellStart"/>
-                            <w:r>
-                              <w:t>Mockup</w:t>
-                            </w:r>
-                            <w:proofErr w:type="spellEnd"/>
-                            <w:r>
-                              <w:t xml:space="preserve"> da página de stock</w:t>
+                              <w:t>Figura 21 – Mockup da página de stock</w:t>
                             </w:r>
                           </w:p>
                         </w:txbxContent>
@@ -11702,15 +11981,7 @@
                         </w:rPr>
                       </w:pPr>
                       <w:r>
-                        <w:t xml:space="preserve">Figura 21 – </w:t>
-                      </w:r>
-                      <w:proofErr w:type="spellStart"/>
-                      <w:r>
-                        <w:t>Mockup</w:t>
-                      </w:r>
-                      <w:proofErr w:type="spellEnd"/>
-                      <w:r>
-                        <w:t xml:space="preserve"> da página de stock</w:t>
+                        <w:t>Figura 21 – Mockup da página de stock</w:t>
                       </w:r>
                     </w:p>
                   </w:txbxContent>
@@ -11904,15 +12175,7 @@
                               <w:t>2</w:t>
                             </w:r>
                             <w:r>
-                              <w:t xml:space="preserve"> – </w:t>
-                            </w:r>
-                            <w:proofErr w:type="spellStart"/>
-                            <w:r>
-                              <w:t>Mockup</w:t>
-                            </w:r>
-                            <w:proofErr w:type="spellEnd"/>
-                            <w:r>
-                              <w:t xml:space="preserve"> do formulário de adição de produto ao stock</w:t>
+                              <w:t xml:space="preserve"> – Mockup do formulário de adição de produto ao stock</w:t>
                             </w:r>
                           </w:p>
                         </w:txbxContent>
@@ -11958,15 +12221,7 @@
                         <w:t>2</w:t>
                       </w:r>
                       <w:r>
-                        <w:t xml:space="preserve"> – </w:t>
-                      </w:r>
-                      <w:proofErr w:type="spellStart"/>
-                      <w:r>
-                        <w:t>Mockup</w:t>
-                      </w:r>
-                      <w:proofErr w:type="spellEnd"/>
-                      <w:r>
-                        <w:t xml:space="preserve"> do formulário de adição de produto ao stock</w:t>
+                        <w:t xml:space="preserve"> – Mockup do formulário de adição de produto ao stock</w:t>
                       </w:r>
                     </w:p>
                   </w:txbxContent>
@@ -12104,15 +12359,7 @@
                               <w:t>3</w:t>
                             </w:r>
                             <w:r>
-                              <w:t xml:space="preserve"> – </w:t>
-                            </w:r>
-                            <w:proofErr w:type="spellStart"/>
-                            <w:r>
-                              <w:t>Mockups</w:t>
-                            </w:r>
-                            <w:proofErr w:type="spellEnd"/>
-                            <w:r>
-                              <w:t xml:space="preserve"> das páginas de gestão de produtos no stock</w:t>
+                              <w:t xml:space="preserve"> – Mockups das páginas de gestão de produtos no stock</w:t>
                             </w:r>
                           </w:p>
                         </w:txbxContent>
@@ -12158,15 +12405,7 @@
                         <w:t>3</w:t>
                       </w:r>
                       <w:r>
-                        <w:t xml:space="preserve"> – </w:t>
-                      </w:r>
-                      <w:proofErr w:type="spellStart"/>
-                      <w:r>
-                        <w:t>Mockups</w:t>
-                      </w:r>
-                      <w:proofErr w:type="spellEnd"/>
-                      <w:r>
-                        <w:t xml:space="preserve"> das páginas de gestão de produtos no stock</w:t>
+                        <w:t xml:space="preserve"> – Mockups das páginas de gestão de produtos no stock</w:t>
                       </w:r>
                     </w:p>
                   </w:txbxContent>
@@ -12259,15 +12498,7 @@
                               </w:rPr>
                             </w:pPr>
                             <w:r>
-                              <w:t xml:space="preserve">Figura 24 – </w:t>
-                            </w:r>
-                            <w:proofErr w:type="spellStart"/>
-                            <w:r>
-                              <w:t>Mockup</w:t>
-                            </w:r>
-                            <w:proofErr w:type="spellEnd"/>
-                            <w:r>
-                              <w:t xml:space="preserve"> da página de gestão de subsidiários</w:t>
+                              <w:t>Figura 24 – Mockup da página de gestão de subsidiários</w:t>
                             </w:r>
                           </w:p>
                         </w:txbxContent>
@@ -12307,15 +12538,7 @@
                         </w:rPr>
                       </w:pPr>
                       <w:r>
-                        <w:t xml:space="preserve">Figura 24 – </w:t>
-                      </w:r>
-                      <w:proofErr w:type="spellStart"/>
-                      <w:r>
-                        <w:t>Mockup</w:t>
-                      </w:r>
-                      <w:proofErr w:type="spellEnd"/>
-                      <w:r>
-                        <w:t xml:space="preserve"> da página de gestão de subsidiários</w:t>
+                        <w:t>Figura 24 – Mockup da página de gestão de subsidiários</w:t>
                       </w:r>
                     </w:p>
                   </w:txbxContent>
@@ -12449,15 +12672,7 @@
                               </w:rPr>
                             </w:pPr>
                             <w:r>
-                              <w:t xml:space="preserve">Figura 25 – </w:t>
-                            </w:r>
-                            <w:proofErr w:type="spellStart"/>
-                            <w:r>
-                              <w:t>Mockup</w:t>
-                            </w:r>
-                            <w:proofErr w:type="spellEnd"/>
-                            <w:r>
-                              <w:t xml:space="preserve"> da página do calendário</w:t>
+                              <w:t>Figura 25 – Mockup da página do calendário</w:t>
                             </w:r>
                           </w:p>
                         </w:txbxContent>
@@ -12497,15 +12712,7 @@
                         </w:rPr>
                       </w:pPr>
                       <w:r>
-                        <w:t xml:space="preserve">Figura 25 – </w:t>
-                      </w:r>
-                      <w:proofErr w:type="spellStart"/>
-                      <w:r>
-                        <w:t>Mockup</w:t>
-                      </w:r>
-                      <w:proofErr w:type="spellEnd"/>
-                      <w:r>
-                        <w:t xml:space="preserve"> da página do calendário</w:t>
+                        <w:t>Figura 25 – Mockup da página do calendário</w:t>
                       </w:r>
                     </w:p>
                   </w:txbxContent>
@@ -12938,6 +13145,119 @@
     </w:lvl>
   </w:abstractNum>
   <w:abstractNum w:abstractNumId="1" w15:restartNumberingAfterBreak="0">
+    <w:nsid w:val="16D36100"/>
+    <w:multiLevelType w:val="hybridMultilevel"/>
+    <w:tmpl w:val="106ECCBA"/>
+    <w:lvl w:ilvl="0" w:tplc="08160001">
+      <w:start w:val="1"/>
+      <w:numFmt w:val="bullet"/>
+      <w:lvlText w:val=""/>
+      <w:lvlJc w:val="left"/>
+      <w:pPr>
+        <w:ind w:left="720" w:hanging="360"/>
+      </w:pPr>
+      <w:rPr>
+        <w:rFonts w:ascii="Symbol" w:hAnsi="Symbol" w:hint="default"/>
+      </w:rPr>
+    </w:lvl>
+    <w:lvl w:ilvl="1" w:tplc="08160003" w:tentative="1">
+      <w:start w:val="1"/>
+      <w:numFmt w:val="bullet"/>
+      <w:lvlText w:val="o"/>
+      <w:lvlJc w:val="left"/>
+      <w:pPr>
+        <w:ind w:left="1440" w:hanging="360"/>
+      </w:pPr>
+      <w:rPr>
+        <w:rFonts w:ascii="Courier New" w:hAnsi="Courier New" w:cs="Courier New" w:hint="default"/>
+      </w:rPr>
+    </w:lvl>
+    <w:lvl w:ilvl="2" w:tplc="08160005" w:tentative="1">
+      <w:start w:val="1"/>
+      <w:numFmt w:val="bullet"/>
+      <w:lvlText w:val=""/>
+      <w:lvlJc w:val="left"/>
+      <w:pPr>
+        <w:ind w:left="2160" w:hanging="360"/>
+      </w:pPr>
+      <w:rPr>
+        <w:rFonts w:ascii="Wingdings" w:hAnsi="Wingdings" w:hint="default"/>
+      </w:rPr>
+    </w:lvl>
+    <w:lvl w:ilvl="3" w:tplc="08160001" w:tentative="1">
+      <w:start w:val="1"/>
+      <w:numFmt w:val="bullet"/>
+      <w:lvlText w:val=""/>
+      <w:lvlJc w:val="left"/>
+      <w:pPr>
+        <w:ind w:left="2880" w:hanging="360"/>
+      </w:pPr>
+      <w:rPr>
+        <w:rFonts w:ascii="Symbol" w:hAnsi="Symbol" w:hint="default"/>
+      </w:rPr>
+    </w:lvl>
+    <w:lvl w:ilvl="4" w:tplc="08160003" w:tentative="1">
+      <w:start w:val="1"/>
+      <w:numFmt w:val="bullet"/>
+      <w:lvlText w:val="o"/>
+      <w:lvlJc w:val="left"/>
+      <w:pPr>
+        <w:ind w:left="3600" w:hanging="360"/>
+      </w:pPr>
+      <w:rPr>
+        <w:rFonts w:ascii="Courier New" w:hAnsi="Courier New" w:cs="Courier New" w:hint="default"/>
+      </w:rPr>
+    </w:lvl>
+    <w:lvl w:ilvl="5" w:tplc="08160005" w:tentative="1">
+      <w:start w:val="1"/>
+      <w:numFmt w:val="bullet"/>
+      <w:lvlText w:val=""/>
+      <w:lvlJc w:val="left"/>
+      <w:pPr>
+        <w:ind w:left="4320" w:hanging="360"/>
+      </w:pPr>
+      <w:rPr>
+        <w:rFonts w:ascii="Wingdings" w:hAnsi="Wingdings" w:hint="default"/>
+      </w:rPr>
+    </w:lvl>
+    <w:lvl w:ilvl="6" w:tplc="08160001" w:tentative="1">
+      <w:start w:val="1"/>
+      <w:numFmt w:val="bullet"/>
+      <w:lvlText w:val=""/>
+      <w:lvlJc w:val="left"/>
+      <w:pPr>
+        <w:ind w:left="5040" w:hanging="360"/>
+      </w:pPr>
+      <w:rPr>
+        <w:rFonts w:ascii="Symbol" w:hAnsi="Symbol" w:hint="default"/>
+      </w:rPr>
+    </w:lvl>
+    <w:lvl w:ilvl="7" w:tplc="08160003" w:tentative="1">
+      <w:start w:val="1"/>
+      <w:numFmt w:val="bullet"/>
+      <w:lvlText w:val="o"/>
+      <w:lvlJc w:val="left"/>
+      <w:pPr>
+        <w:ind w:left="5760" w:hanging="360"/>
+      </w:pPr>
+      <w:rPr>
+        <w:rFonts w:ascii="Courier New" w:hAnsi="Courier New" w:cs="Courier New" w:hint="default"/>
+      </w:rPr>
+    </w:lvl>
+    <w:lvl w:ilvl="8" w:tplc="08160005" w:tentative="1">
+      <w:start w:val="1"/>
+      <w:numFmt w:val="bullet"/>
+      <w:lvlText w:val=""/>
+      <w:lvlJc w:val="left"/>
+      <w:pPr>
+        <w:ind w:left="6480" w:hanging="360"/>
+      </w:pPr>
+      <w:rPr>
+        <w:rFonts w:ascii="Wingdings" w:hAnsi="Wingdings" w:hint="default"/>
+      </w:rPr>
+    </w:lvl>
+  </w:abstractNum>
+  <w:abstractNum w:abstractNumId="2" w15:restartNumberingAfterBreak="0">
     <w:nsid w:val="491870E4"/>
     <w:multiLevelType w:val="hybridMultilevel"/>
     <w:tmpl w:val="22E889C0"/>
@@ -13050,7 +13370,7 @@
       </w:rPr>
     </w:lvl>
   </w:abstractNum>
-  <w:abstractNum w:abstractNumId="2" w15:restartNumberingAfterBreak="0">
+  <w:abstractNum w:abstractNumId="3" w15:restartNumberingAfterBreak="0">
     <w:nsid w:val="4B721BE3"/>
     <w:multiLevelType w:val="hybridMultilevel"/>
     <w:tmpl w:val="0A2ECFDA"/>
@@ -13163,7 +13483,7 @@
       </w:rPr>
     </w:lvl>
   </w:abstractNum>
-  <w:abstractNum w:abstractNumId="3" w15:restartNumberingAfterBreak="0">
+  <w:abstractNum w:abstractNumId="4" w15:restartNumberingAfterBreak="0">
     <w:nsid w:val="4E8A5223"/>
     <w:multiLevelType w:val="hybridMultilevel"/>
     <w:tmpl w:val="A28E9AA6"/>
@@ -13252,7 +13572,7 @@
       </w:pPr>
     </w:lvl>
   </w:abstractNum>
-  <w:abstractNum w:abstractNumId="4" w15:restartNumberingAfterBreak="0">
+  <w:abstractNum w:abstractNumId="5" w15:restartNumberingAfterBreak="0">
     <w:nsid w:val="51BD7638"/>
     <w:multiLevelType w:val="multilevel"/>
     <w:tmpl w:val="7570EAE2"/>
@@ -13343,7 +13663,346 @@
       </w:pPr>
     </w:lvl>
   </w:abstractNum>
-  <w:abstractNum w:abstractNumId="5" w15:restartNumberingAfterBreak="0">
+  <w:abstractNum w:abstractNumId="6" w15:restartNumberingAfterBreak="0">
+    <w:nsid w:val="5AE96047"/>
+    <w:multiLevelType w:val="hybridMultilevel"/>
+    <w:tmpl w:val="B5B44A74"/>
+    <w:lvl w:ilvl="0" w:tplc="08160001">
+      <w:start w:val="1"/>
+      <w:numFmt w:val="bullet"/>
+      <w:lvlText w:val=""/>
+      <w:lvlJc w:val="left"/>
+      <w:pPr>
+        <w:ind w:left="720" w:hanging="360"/>
+      </w:pPr>
+      <w:rPr>
+        <w:rFonts w:ascii="Symbol" w:hAnsi="Symbol" w:hint="default"/>
+      </w:rPr>
+    </w:lvl>
+    <w:lvl w:ilvl="1" w:tplc="08160003" w:tentative="1">
+      <w:start w:val="1"/>
+      <w:numFmt w:val="bullet"/>
+      <w:lvlText w:val="o"/>
+      <w:lvlJc w:val="left"/>
+      <w:pPr>
+        <w:ind w:left="1440" w:hanging="360"/>
+      </w:pPr>
+      <w:rPr>
+        <w:rFonts w:ascii="Courier New" w:hAnsi="Courier New" w:cs="Courier New" w:hint="default"/>
+      </w:rPr>
+    </w:lvl>
+    <w:lvl w:ilvl="2" w:tplc="08160005" w:tentative="1">
+      <w:start w:val="1"/>
+      <w:numFmt w:val="bullet"/>
+      <w:lvlText w:val=""/>
+      <w:lvlJc w:val="left"/>
+      <w:pPr>
+        <w:ind w:left="2160" w:hanging="360"/>
+      </w:pPr>
+      <w:rPr>
+        <w:rFonts w:ascii="Wingdings" w:hAnsi="Wingdings" w:hint="default"/>
+      </w:rPr>
+    </w:lvl>
+    <w:lvl w:ilvl="3" w:tplc="08160001" w:tentative="1">
+      <w:start w:val="1"/>
+      <w:numFmt w:val="bullet"/>
+      <w:lvlText w:val=""/>
+      <w:lvlJc w:val="left"/>
+      <w:pPr>
+        <w:ind w:left="2880" w:hanging="360"/>
+      </w:pPr>
+      <w:rPr>
+        <w:rFonts w:ascii="Symbol" w:hAnsi="Symbol" w:hint="default"/>
+      </w:rPr>
+    </w:lvl>
+    <w:lvl w:ilvl="4" w:tplc="08160003" w:tentative="1">
+      <w:start w:val="1"/>
+      <w:numFmt w:val="bullet"/>
+      <w:lvlText w:val="o"/>
+      <w:lvlJc w:val="left"/>
+      <w:pPr>
+        <w:ind w:left="3600" w:hanging="360"/>
+      </w:pPr>
+      <w:rPr>
+        <w:rFonts w:ascii="Courier New" w:hAnsi="Courier New" w:cs="Courier New" w:hint="default"/>
+      </w:rPr>
+    </w:lvl>
+    <w:lvl w:ilvl="5" w:tplc="08160005" w:tentative="1">
+      <w:start w:val="1"/>
+      <w:numFmt w:val="bullet"/>
+      <w:lvlText w:val=""/>
+      <w:lvlJc w:val="left"/>
+      <w:pPr>
+        <w:ind w:left="4320" w:hanging="360"/>
+      </w:pPr>
+      <w:rPr>
+        <w:rFonts w:ascii="Wingdings" w:hAnsi="Wingdings" w:hint="default"/>
+      </w:rPr>
+    </w:lvl>
+    <w:lvl w:ilvl="6" w:tplc="08160001" w:tentative="1">
+      <w:start w:val="1"/>
+      <w:numFmt w:val="bullet"/>
+      <w:lvlText w:val=""/>
+      <w:lvlJc w:val="left"/>
+      <w:pPr>
+        <w:ind w:left="5040" w:hanging="360"/>
+      </w:pPr>
+      <w:rPr>
+        <w:rFonts w:ascii="Symbol" w:hAnsi="Symbol" w:hint="default"/>
+      </w:rPr>
+    </w:lvl>
+    <w:lvl w:ilvl="7" w:tplc="08160003" w:tentative="1">
+      <w:start w:val="1"/>
+      <w:numFmt w:val="bullet"/>
+      <w:lvlText w:val="o"/>
+      <w:lvlJc w:val="left"/>
+      <w:pPr>
+        <w:ind w:left="5760" w:hanging="360"/>
+      </w:pPr>
+      <w:rPr>
+        <w:rFonts w:ascii="Courier New" w:hAnsi="Courier New" w:cs="Courier New" w:hint="default"/>
+      </w:rPr>
+    </w:lvl>
+    <w:lvl w:ilvl="8" w:tplc="08160005" w:tentative="1">
+      <w:start w:val="1"/>
+      <w:numFmt w:val="bullet"/>
+      <w:lvlText w:val=""/>
+      <w:lvlJc w:val="left"/>
+      <w:pPr>
+        <w:ind w:left="6480" w:hanging="360"/>
+      </w:pPr>
+      <w:rPr>
+        <w:rFonts w:ascii="Wingdings" w:hAnsi="Wingdings" w:hint="default"/>
+      </w:rPr>
+    </w:lvl>
+  </w:abstractNum>
+  <w:abstractNum w:abstractNumId="7" w15:restartNumberingAfterBreak="0">
+    <w:nsid w:val="66895850"/>
+    <w:multiLevelType w:val="hybridMultilevel"/>
+    <w:tmpl w:val="9808E29A"/>
+    <w:lvl w:ilvl="0" w:tplc="08160001">
+      <w:start w:val="1"/>
+      <w:numFmt w:val="bullet"/>
+      <w:lvlText w:val=""/>
+      <w:lvlJc w:val="left"/>
+      <w:pPr>
+        <w:ind w:left="720" w:hanging="360"/>
+      </w:pPr>
+      <w:rPr>
+        <w:rFonts w:ascii="Symbol" w:hAnsi="Symbol" w:hint="default"/>
+      </w:rPr>
+    </w:lvl>
+    <w:lvl w:ilvl="1" w:tplc="08160003" w:tentative="1">
+      <w:start w:val="1"/>
+      <w:numFmt w:val="bullet"/>
+      <w:lvlText w:val="o"/>
+      <w:lvlJc w:val="left"/>
+      <w:pPr>
+        <w:ind w:left="1440" w:hanging="360"/>
+      </w:pPr>
+      <w:rPr>
+        <w:rFonts w:ascii="Courier New" w:hAnsi="Courier New" w:cs="Courier New" w:hint="default"/>
+      </w:rPr>
+    </w:lvl>
+    <w:lvl w:ilvl="2" w:tplc="08160005" w:tentative="1">
+      <w:start w:val="1"/>
+      <w:numFmt w:val="bullet"/>
+      <w:lvlText w:val=""/>
+      <w:lvlJc w:val="left"/>
+      <w:pPr>
+        <w:ind w:left="2160" w:hanging="360"/>
+      </w:pPr>
+      <w:rPr>
+        <w:rFonts w:ascii="Wingdings" w:hAnsi="Wingdings" w:hint="default"/>
+      </w:rPr>
+    </w:lvl>
+    <w:lvl w:ilvl="3" w:tplc="08160001" w:tentative="1">
+      <w:start w:val="1"/>
+      <w:numFmt w:val="bullet"/>
+      <w:lvlText w:val=""/>
+      <w:lvlJc w:val="left"/>
+      <w:pPr>
+        <w:ind w:left="2880" w:hanging="360"/>
+      </w:pPr>
+      <w:rPr>
+        <w:rFonts w:ascii="Symbol" w:hAnsi="Symbol" w:hint="default"/>
+      </w:rPr>
+    </w:lvl>
+    <w:lvl w:ilvl="4" w:tplc="08160003" w:tentative="1">
+      <w:start w:val="1"/>
+      <w:numFmt w:val="bullet"/>
+      <w:lvlText w:val="o"/>
+      <w:lvlJc w:val="left"/>
+      <w:pPr>
+        <w:ind w:left="3600" w:hanging="360"/>
+      </w:pPr>
+      <w:rPr>
+        <w:rFonts w:ascii="Courier New" w:hAnsi="Courier New" w:cs="Courier New" w:hint="default"/>
+      </w:rPr>
+    </w:lvl>
+    <w:lvl w:ilvl="5" w:tplc="08160005" w:tentative="1">
+      <w:start w:val="1"/>
+      <w:numFmt w:val="bullet"/>
+      <w:lvlText w:val=""/>
+      <w:lvlJc w:val="left"/>
+      <w:pPr>
+        <w:ind w:left="4320" w:hanging="360"/>
+      </w:pPr>
+      <w:rPr>
+        <w:rFonts w:ascii="Wingdings" w:hAnsi="Wingdings" w:hint="default"/>
+      </w:rPr>
+    </w:lvl>
+    <w:lvl w:ilvl="6" w:tplc="08160001" w:tentative="1">
+      <w:start w:val="1"/>
+      <w:numFmt w:val="bullet"/>
+      <w:lvlText w:val=""/>
+      <w:lvlJc w:val="left"/>
+      <w:pPr>
+        <w:ind w:left="5040" w:hanging="360"/>
+      </w:pPr>
+      <w:rPr>
+        <w:rFonts w:ascii="Symbol" w:hAnsi="Symbol" w:hint="default"/>
+      </w:rPr>
+    </w:lvl>
+    <w:lvl w:ilvl="7" w:tplc="08160003" w:tentative="1">
+      <w:start w:val="1"/>
+      <w:numFmt w:val="bullet"/>
+      <w:lvlText w:val="o"/>
+      <w:lvlJc w:val="left"/>
+      <w:pPr>
+        <w:ind w:left="5760" w:hanging="360"/>
+      </w:pPr>
+      <w:rPr>
+        <w:rFonts w:ascii="Courier New" w:hAnsi="Courier New" w:cs="Courier New" w:hint="default"/>
+      </w:rPr>
+    </w:lvl>
+    <w:lvl w:ilvl="8" w:tplc="08160005" w:tentative="1">
+      <w:start w:val="1"/>
+      <w:numFmt w:val="bullet"/>
+      <w:lvlText w:val=""/>
+      <w:lvlJc w:val="left"/>
+      <w:pPr>
+        <w:ind w:left="6480" w:hanging="360"/>
+      </w:pPr>
+      <w:rPr>
+        <w:rFonts w:ascii="Wingdings" w:hAnsi="Wingdings" w:hint="default"/>
+      </w:rPr>
+    </w:lvl>
+  </w:abstractNum>
+  <w:abstractNum w:abstractNumId="8" w15:restartNumberingAfterBreak="0">
+    <w:nsid w:val="6CAA7169"/>
+    <w:multiLevelType w:val="hybridMultilevel"/>
+    <w:tmpl w:val="2E6AE494"/>
+    <w:lvl w:ilvl="0" w:tplc="08160001">
+      <w:start w:val="1"/>
+      <w:numFmt w:val="bullet"/>
+      <w:lvlText w:val=""/>
+      <w:lvlJc w:val="left"/>
+      <w:pPr>
+        <w:ind w:left="720" w:hanging="360"/>
+      </w:pPr>
+      <w:rPr>
+        <w:rFonts w:ascii="Symbol" w:hAnsi="Symbol" w:hint="default"/>
+      </w:rPr>
+    </w:lvl>
+    <w:lvl w:ilvl="1" w:tplc="08160003" w:tentative="1">
+      <w:start w:val="1"/>
+      <w:numFmt w:val="bullet"/>
+      <w:lvlText w:val="o"/>
+      <w:lvlJc w:val="left"/>
+      <w:pPr>
+        <w:ind w:left="1440" w:hanging="360"/>
+      </w:pPr>
+      <w:rPr>
+        <w:rFonts w:ascii="Courier New" w:hAnsi="Courier New" w:cs="Courier New" w:hint="default"/>
+      </w:rPr>
+    </w:lvl>
+    <w:lvl w:ilvl="2" w:tplc="08160005" w:tentative="1">
+      <w:start w:val="1"/>
+      <w:numFmt w:val="bullet"/>
+      <w:lvlText w:val=""/>
+      <w:lvlJc w:val="left"/>
+      <w:pPr>
+        <w:ind w:left="2160" w:hanging="360"/>
+      </w:pPr>
+      <w:rPr>
+        <w:rFonts w:ascii="Wingdings" w:hAnsi="Wingdings" w:hint="default"/>
+      </w:rPr>
+    </w:lvl>
+    <w:lvl w:ilvl="3" w:tplc="08160001" w:tentative="1">
+      <w:start w:val="1"/>
+      <w:numFmt w:val="bullet"/>
+      <w:lvlText w:val=""/>
+      <w:lvlJc w:val="left"/>
+      <w:pPr>
+        <w:ind w:left="2880" w:hanging="360"/>
+      </w:pPr>
+      <w:rPr>
+        <w:rFonts w:ascii="Symbol" w:hAnsi="Symbol" w:hint="default"/>
+      </w:rPr>
+    </w:lvl>
+    <w:lvl w:ilvl="4" w:tplc="08160003" w:tentative="1">
+      <w:start w:val="1"/>
+      <w:numFmt w:val="bullet"/>
+      <w:lvlText w:val="o"/>
+      <w:lvlJc w:val="left"/>
+      <w:pPr>
+        <w:ind w:left="3600" w:hanging="360"/>
+      </w:pPr>
+      <w:rPr>
+        <w:rFonts w:ascii="Courier New" w:hAnsi="Courier New" w:cs="Courier New" w:hint="default"/>
+      </w:rPr>
+    </w:lvl>
+    <w:lvl w:ilvl="5" w:tplc="08160005" w:tentative="1">
+      <w:start w:val="1"/>
+      <w:numFmt w:val="bullet"/>
+      <w:lvlText w:val=""/>
+      <w:lvlJc w:val="left"/>
+      <w:pPr>
+        <w:ind w:left="4320" w:hanging="360"/>
+      </w:pPr>
+      <w:rPr>
+        <w:rFonts w:ascii="Wingdings" w:hAnsi="Wingdings" w:hint="default"/>
+      </w:rPr>
+    </w:lvl>
+    <w:lvl w:ilvl="6" w:tplc="08160001" w:tentative="1">
+      <w:start w:val="1"/>
+      <w:numFmt w:val="bullet"/>
+      <w:lvlText w:val=""/>
+      <w:lvlJc w:val="left"/>
+      <w:pPr>
+        <w:ind w:left="5040" w:hanging="360"/>
+      </w:pPr>
+      <w:rPr>
+        <w:rFonts w:ascii="Symbol" w:hAnsi="Symbol" w:hint="default"/>
+      </w:rPr>
+    </w:lvl>
+    <w:lvl w:ilvl="7" w:tplc="08160003" w:tentative="1">
+      <w:start w:val="1"/>
+      <w:numFmt w:val="bullet"/>
+      <w:lvlText w:val="o"/>
+      <w:lvlJc w:val="left"/>
+      <w:pPr>
+        <w:ind w:left="5760" w:hanging="360"/>
+      </w:pPr>
+      <w:rPr>
+        <w:rFonts w:ascii="Courier New" w:hAnsi="Courier New" w:cs="Courier New" w:hint="default"/>
+      </w:rPr>
+    </w:lvl>
+    <w:lvl w:ilvl="8" w:tplc="08160005" w:tentative="1">
+      <w:start w:val="1"/>
+      <w:numFmt w:val="bullet"/>
+      <w:lvlText w:val=""/>
+      <w:lvlJc w:val="left"/>
+      <w:pPr>
+        <w:ind w:left="6480" w:hanging="360"/>
+      </w:pPr>
+      <w:rPr>
+        <w:rFonts w:ascii="Wingdings" w:hAnsi="Wingdings" w:hint="default"/>
+      </w:rPr>
+    </w:lvl>
+  </w:abstractNum>
+  <w:abstractNum w:abstractNumId="9" w15:restartNumberingAfterBreak="0">
     <w:nsid w:val="70F071EB"/>
     <w:multiLevelType w:val="multilevel"/>
     <w:tmpl w:val="4080E3BA"/>
@@ -13456,7 +14115,7 @@
       </w:rPr>
     </w:lvl>
   </w:abstractNum>
-  <w:abstractNum w:abstractNumId="6" w15:restartNumberingAfterBreak="0">
+  <w:abstractNum w:abstractNumId="10" w15:restartNumberingAfterBreak="0">
     <w:nsid w:val="71CA1B65"/>
     <w:multiLevelType w:val="hybridMultilevel"/>
     <w:tmpl w:val="CAD49EBA"/>
@@ -13568,7 +14227,7 @@
       </w:rPr>
     </w:lvl>
   </w:abstractNum>
-  <w:abstractNum w:abstractNumId="7" w15:restartNumberingAfterBreak="0">
+  <w:abstractNum w:abstractNumId="11" w15:restartNumberingAfterBreak="0">
     <w:nsid w:val="77717036"/>
     <w:multiLevelType w:val="hybridMultilevel"/>
     <w:tmpl w:val="40C8A86E"/>
@@ -13681,7 +14340,7 @@
       </w:rPr>
     </w:lvl>
   </w:abstractNum>
-  <w:abstractNum w:abstractNumId="8" w15:restartNumberingAfterBreak="0">
+  <w:abstractNum w:abstractNumId="12" w15:restartNumberingAfterBreak="0">
     <w:nsid w:val="791159AC"/>
     <w:multiLevelType w:val="hybridMultilevel"/>
     <w:tmpl w:val="E494B5F6"/>
@@ -13794,23 +14453,136 @@
       </w:rPr>
     </w:lvl>
   </w:abstractNum>
+  <w:abstractNum w:abstractNumId="13" w15:restartNumberingAfterBreak="0">
+    <w:nsid w:val="7FC5078D"/>
+    <w:multiLevelType w:val="hybridMultilevel"/>
+    <w:tmpl w:val="AE9C0E8A"/>
+    <w:lvl w:ilvl="0" w:tplc="08160001">
+      <w:start w:val="1"/>
+      <w:numFmt w:val="bullet"/>
+      <w:lvlText w:val=""/>
+      <w:lvlJc w:val="left"/>
+      <w:pPr>
+        <w:ind w:left="720" w:hanging="360"/>
+      </w:pPr>
+      <w:rPr>
+        <w:rFonts w:ascii="Symbol" w:hAnsi="Symbol" w:hint="default"/>
+      </w:rPr>
+    </w:lvl>
+    <w:lvl w:ilvl="1" w:tplc="08160003" w:tentative="1">
+      <w:start w:val="1"/>
+      <w:numFmt w:val="bullet"/>
+      <w:lvlText w:val="o"/>
+      <w:lvlJc w:val="left"/>
+      <w:pPr>
+        <w:ind w:left="1440" w:hanging="360"/>
+      </w:pPr>
+      <w:rPr>
+        <w:rFonts w:ascii="Courier New" w:hAnsi="Courier New" w:cs="Courier New" w:hint="default"/>
+      </w:rPr>
+    </w:lvl>
+    <w:lvl w:ilvl="2" w:tplc="08160005" w:tentative="1">
+      <w:start w:val="1"/>
+      <w:numFmt w:val="bullet"/>
+      <w:lvlText w:val=""/>
+      <w:lvlJc w:val="left"/>
+      <w:pPr>
+        <w:ind w:left="2160" w:hanging="360"/>
+      </w:pPr>
+      <w:rPr>
+        <w:rFonts w:ascii="Wingdings" w:hAnsi="Wingdings" w:hint="default"/>
+      </w:rPr>
+    </w:lvl>
+    <w:lvl w:ilvl="3" w:tplc="08160001" w:tentative="1">
+      <w:start w:val="1"/>
+      <w:numFmt w:val="bullet"/>
+      <w:lvlText w:val=""/>
+      <w:lvlJc w:val="left"/>
+      <w:pPr>
+        <w:ind w:left="2880" w:hanging="360"/>
+      </w:pPr>
+      <w:rPr>
+        <w:rFonts w:ascii="Symbol" w:hAnsi="Symbol" w:hint="default"/>
+      </w:rPr>
+    </w:lvl>
+    <w:lvl w:ilvl="4" w:tplc="08160003" w:tentative="1">
+      <w:start w:val="1"/>
+      <w:numFmt w:val="bullet"/>
+      <w:lvlText w:val="o"/>
+      <w:lvlJc w:val="left"/>
+      <w:pPr>
+        <w:ind w:left="3600" w:hanging="360"/>
+      </w:pPr>
+      <w:rPr>
+        <w:rFonts w:ascii="Courier New" w:hAnsi="Courier New" w:cs="Courier New" w:hint="default"/>
+      </w:rPr>
+    </w:lvl>
+    <w:lvl w:ilvl="5" w:tplc="08160005" w:tentative="1">
+      <w:start w:val="1"/>
+      <w:numFmt w:val="bullet"/>
+      <w:lvlText w:val=""/>
+      <w:lvlJc w:val="left"/>
+      <w:pPr>
+        <w:ind w:left="4320" w:hanging="360"/>
+      </w:pPr>
+      <w:rPr>
+        <w:rFonts w:ascii="Wingdings" w:hAnsi="Wingdings" w:hint="default"/>
+      </w:rPr>
+    </w:lvl>
+    <w:lvl w:ilvl="6" w:tplc="08160001" w:tentative="1">
+      <w:start w:val="1"/>
+      <w:numFmt w:val="bullet"/>
+      <w:lvlText w:val=""/>
+      <w:lvlJc w:val="left"/>
+      <w:pPr>
+        <w:ind w:left="5040" w:hanging="360"/>
+      </w:pPr>
+      <w:rPr>
+        <w:rFonts w:ascii="Symbol" w:hAnsi="Symbol" w:hint="default"/>
+      </w:rPr>
+    </w:lvl>
+    <w:lvl w:ilvl="7" w:tplc="08160003" w:tentative="1">
+      <w:start w:val="1"/>
+      <w:numFmt w:val="bullet"/>
+      <w:lvlText w:val="o"/>
+      <w:lvlJc w:val="left"/>
+      <w:pPr>
+        <w:ind w:left="5760" w:hanging="360"/>
+      </w:pPr>
+      <w:rPr>
+        <w:rFonts w:ascii="Courier New" w:hAnsi="Courier New" w:cs="Courier New" w:hint="default"/>
+      </w:rPr>
+    </w:lvl>
+    <w:lvl w:ilvl="8" w:tplc="08160005" w:tentative="1">
+      <w:start w:val="1"/>
+      <w:numFmt w:val="bullet"/>
+      <w:lvlText w:val=""/>
+      <w:lvlJc w:val="left"/>
+      <w:pPr>
+        <w:ind w:left="6480" w:hanging="360"/>
+      </w:pPr>
+      <w:rPr>
+        <w:rFonts w:ascii="Wingdings" w:hAnsi="Wingdings" w:hint="default"/>
+      </w:rPr>
+    </w:lvl>
+  </w:abstractNum>
   <w:num w:numId="1" w16cid:durableId="1378385288">
+    <w:abstractNumId w:val="5"/>
+  </w:num>
+  <w:num w:numId="2" w16cid:durableId="2094349142">
+    <w:abstractNumId w:val="9"/>
+  </w:num>
+  <w:num w:numId="3" w16cid:durableId="387728177">
     <w:abstractNumId w:val="4"/>
   </w:num>
-  <w:num w:numId="2" w16cid:durableId="2094349142">
+  <w:num w:numId="4" w16cid:durableId="1018698418">
     <w:abstractNumId w:val="5"/>
   </w:num>
-  <w:num w:numId="3" w16cid:durableId="387728177">
-    <w:abstractNumId w:val="3"/>
-  </w:num>
-  <w:num w:numId="4" w16cid:durableId="1018698418">
-    <w:abstractNumId w:val="4"/>
-  </w:num>
   <w:num w:numId="5" w16cid:durableId="1641033722">
-    <w:abstractNumId w:val="4"/>
+    <w:abstractNumId w:val="5"/>
   </w:num>
   <w:num w:numId="6" w16cid:durableId="391730874">
-    <w:abstractNumId w:val="4"/>
+    <w:abstractNumId w:val="5"/>
     <w:lvlOverride w:ilvl="0">
       <w:startOverride w:val="1"/>
     </w:lvlOverride>
@@ -13840,28 +14612,28 @@
     </w:lvlOverride>
   </w:num>
   <w:num w:numId="7" w16cid:durableId="61876254">
-    <w:abstractNumId w:val="1"/>
+    <w:abstractNumId w:val="2"/>
   </w:num>
   <w:num w:numId="8" w16cid:durableId="1231815040">
-    <w:abstractNumId w:val="2"/>
+    <w:abstractNumId w:val="3"/>
   </w:num>
   <w:num w:numId="9" w16cid:durableId="1126656068">
-    <w:abstractNumId w:val="6"/>
+    <w:abstractNumId w:val="10"/>
   </w:num>
   <w:num w:numId="10" w16cid:durableId="1784684789">
     <w:abstractNumId w:val="0"/>
   </w:num>
   <w:num w:numId="11" w16cid:durableId="855774475">
-    <w:abstractNumId w:val="8"/>
+    <w:abstractNumId w:val="12"/>
   </w:num>
   <w:num w:numId="12" w16cid:durableId="375811482">
-    <w:abstractNumId w:val="7"/>
+    <w:abstractNumId w:val="11"/>
   </w:num>
   <w:num w:numId="13" w16cid:durableId="1745955133">
-    <w:abstractNumId w:val="4"/>
+    <w:abstractNumId w:val="5"/>
   </w:num>
   <w:num w:numId="14" w16cid:durableId="1153332724">
-    <w:abstractNumId w:val="4"/>
+    <w:abstractNumId w:val="5"/>
     <w:lvlOverride w:ilvl="0">
       <w:startOverride w:val="1"/>
     </w:lvlOverride>
@@ -13891,7 +14663,7 @@
     </w:lvlOverride>
   </w:num>
   <w:num w:numId="15" w16cid:durableId="260770092">
-    <w:abstractNumId w:val="4"/>
+    <w:abstractNumId w:val="5"/>
     <w:lvlOverride w:ilvl="0">
       <w:startOverride w:val="1"/>
     </w:lvlOverride>
@@ -13921,7 +14693,7 @@
     </w:lvlOverride>
   </w:num>
   <w:num w:numId="16" w16cid:durableId="664554041">
-    <w:abstractNumId w:val="4"/>
+    <w:abstractNumId w:val="5"/>
     <w:lvlOverride w:ilvl="0">
       <w:startOverride w:val="1"/>
     </w:lvlOverride>
@@ -13951,7 +14723,7 @@
     </w:lvlOverride>
   </w:num>
   <w:num w:numId="17" w16cid:durableId="1612712025">
-    <w:abstractNumId w:val="4"/>
+    <w:abstractNumId w:val="5"/>
     <w:lvlOverride w:ilvl="0">
       <w:startOverride w:val="1"/>
     </w:lvlOverride>
@@ -13981,7 +14753,7 @@
     </w:lvlOverride>
   </w:num>
   <w:num w:numId="18" w16cid:durableId="1178696172">
-    <w:abstractNumId w:val="4"/>
+    <w:abstractNumId w:val="5"/>
     <w:lvlOverride w:ilvl="0">
       <w:startOverride w:val="1"/>
     </w:lvlOverride>
@@ -14011,7 +14783,7 @@
     </w:lvlOverride>
   </w:num>
   <w:num w:numId="19" w16cid:durableId="200754442">
-    <w:abstractNumId w:val="4"/>
+    <w:abstractNumId w:val="5"/>
     <w:lvlOverride w:ilvl="0">
       <w:startOverride w:val="1"/>
     </w:lvlOverride>
@@ -14041,7 +14813,7 @@
     </w:lvlOverride>
   </w:num>
   <w:num w:numId="20" w16cid:durableId="2041785104">
-    <w:abstractNumId w:val="4"/>
+    <w:abstractNumId w:val="5"/>
     <w:lvlOverride w:ilvl="0">
       <w:startOverride w:val="1"/>
     </w:lvlOverride>
@@ -14071,7 +14843,7 @@
     </w:lvlOverride>
   </w:num>
   <w:num w:numId="21" w16cid:durableId="2009091962">
-    <w:abstractNumId w:val="4"/>
+    <w:abstractNumId w:val="5"/>
     <w:lvlOverride w:ilvl="0">
       <w:startOverride w:val="1"/>
     </w:lvlOverride>
@@ -14099,6 +14871,21 @@
     <w:lvlOverride w:ilvl="8">
       <w:startOverride w:val="1"/>
     </w:lvlOverride>
+  </w:num>
+  <w:num w:numId="22" w16cid:durableId="710879724">
+    <w:abstractNumId w:val="8"/>
+  </w:num>
+  <w:num w:numId="23" w16cid:durableId="984353287">
+    <w:abstractNumId w:val="7"/>
+  </w:num>
+  <w:num w:numId="24" w16cid:durableId="535235570">
+    <w:abstractNumId w:val="13"/>
+  </w:num>
+  <w:num w:numId="25" w16cid:durableId="433209563">
+    <w:abstractNumId w:val="6"/>
+  </w:num>
+  <w:num w:numId="26" w16cid:durableId="1570730282">
+    <w:abstractNumId w:val="1"/>
   </w:num>
   <w:numIdMacAtCleanup w:val="3"/>
 </w:numbering>
@@ -14502,7 +15289,7 @@
   <w:style w:type="paragraph" w:default="1" w:styleId="Normal">
     <w:name w:val="Normal"/>
     <w:qFormat/>
-    <w:rsid w:val="00520D9A"/>
+    <w:rsid w:val="00764C8C"/>
     <w:pPr>
       <w:spacing w:line="360" w:lineRule="auto"/>
     </w:pPr>

</xml_diff>

<commit_message>
Add scholarship support and PDF generation features
Introduces scholarship data model, repository, and integration into application creation and deletion flows. Adds PDF generation for application documents using pdfbox-android, updates document and storage handling, and extends application and UI models to support new fields. Updates navigation, routes, and campaign listing logic, and includes new assets and XML configuration for file provider support.
</commit_message>
<xml_diff>
--- a/docs/Relatorio.docx
+++ b/docs/Relatorio.docx
@@ -7824,27 +7824,14 @@
                             <w:r>
                               <w:t xml:space="preserve">Figura </w:t>
                             </w:r>
-                            <w:r>
-                              <w:fldChar w:fldCharType="begin"/>
-                            </w:r>
-                            <w:r>
-                              <w:instrText xml:space="preserve"> SEQ Figura \* ARABIC </w:instrText>
-                            </w:r>
-                            <w:r>
-                              <w:fldChar w:fldCharType="separate"/>
-                            </w:r>
-                            <w:r>
-                              <w:rPr>
-                                <w:noProof/>
-                              </w:rPr>
-                              <w:t>1</w:t>
-                            </w:r>
-                            <w:r>
-                              <w:rPr>
-                                <w:noProof/>
-                              </w:rPr>
-                              <w:fldChar w:fldCharType="end"/>
-                            </w:r>
+                            <w:fldSimple w:instr=" SEQ Figura \* ARABIC ">
+                              <w:r>
+                                <w:rPr>
+                                  <w:noProof/>
+                                </w:rPr>
+                                <w:t>1</w:t>
+                              </w:r>
+                            </w:fldSimple>
                             <w:r>
                               <w:t xml:space="preserve"> - Diagrama BPMN </w:t>
                             </w:r>
@@ -7890,27 +7877,14 @@
                       <w:r>
                         <w:t xml:space="preserve">Figura </w:t>
                       </w:r>
-                      <w:r>
-                        <w:fldChar w:fldCharType="begin"/>
-                      </w:r>
-                      <w:r>
-                        <w:instrText xml:space="preserve"> SEQ Figura \* ARABIC </w:instrText>
-                      </w:r>
-                      <w:r>
-                        <w:fldChar w:fldCharType="separate"/>
-                      </w:r>
-                      <w:r>
-                        <w:rPr>
-                          <w:noProof/>
-                        </w:rPr>
-                        <w:t>1</w:t>
-                      </w:r>
-                      <w:r>
-                        <w:rPr>
-                          <w:noProof/>
-                        </w:rPr>
-                        <w:fldChar w:fldCharType="end"/>
-                      </w:r>
+                      <w:fldSimple w:instr=" SEQ Figura \* ARABIC ">
+                        <w:r>
+                          <w:rPr>
+                            <w:noProof/>
+                          </w:rPr>
+                          <w:t>1</w:t>
+                        </w:r>
+                      </w:fldSimple>
                       <w:r>
                         <w:t xml:space="preserve"> - Diagrama BPMN </w:t>
                       </w:r>
@@ -8145,27 +8119,14 @@
                             <w:r>
                               <w:t xml:space="preserve">Figura </w:t>
                             </w:r>
-                            <w:r>
-                              <w:fldChar w:fldCharType="begin"/>
-                            </w:r>
-                            <w:r>
-                              <w:instrText xml:space="preserve"> SEQ Figura \* ARABIC </w:instrText>
-                            </w:r>
-                            <w:r>
-                              <w:fldChar w:fldCharType="separate"/>
-                            </w:r>
-                            <w:r>
-                              <w:rPr>
-                                <w:noProof/>
-                              </w:rPr>
-                              <w:t>2</w:t>
-                            </w:r>
-                            <w:r>
-                              <w:rPr>
-                                <w:noProof/>
-                              </w:rPr>
-                              <w:fldChar w:fldCharType="end"/>
-                            </w:r>
+                            <w:fldSimple w:instr=" SEQ Figura \* ARABIC ">
+                              <w:r>
+                                <w:rPr>
+                                  <w:noProof/>
+                                </w:rPr>
+                                <w:t>2</w:t>
+                              </w:r>
+                            </w:fldSimple>
                             <w:r>
                               <w:t xml:space="preserve"> - Diagrama BPMN </w:t>
                             </w:r>
@@ -8207,27 +8168,14 @@
                       <w:r>
                         <w:t xml:space="preserve">Figura </w:t>
                       </w:r>
-                      <w:r>
-                        <w:fldChar w:fldCharType="begin"/>
-                      </w:r>
-                      <w:r>
-                        <w:instrText xml:space="preserve"> SEQ Figura \* ARABIC </w:instrText>
-                      </w:r>
-                      <w:r>
-                        <w:fldChar w:fldCharType="separate"/>
-                      </w:r>
-                      <w:r>
-                        <w:rPr>
-                          <w:noProof/>
-                        </w:rPr>
-                        <w:t>2</w:t>
-                      </w:r>
-                      <w:r>
-                        <w:rPr>
-                          <w:noProof/>
-                        </w:rPr>
-                        <w:fldChar w:fldCharType="end"/>
-                      </w:r>
+                      <w:fldSimple w:instr=" SEQ Figura \* ARABIC ">
+                        <w:r>
+                          <w:rPr>
+                            <w:noProof/>
+                          </w:rPr>
+                          <w:t>2</w:t>
+                        </w:r>
+                      </w:fldSimple>
                       <w:r>
                         <w:t xml:space="preserve"> - Diagrama BPMN </w:t>
                       </w:r>
@@ -8249,7 +8197,7 @@
           <w:noProof/>
         </w:rPr>
         <w:drawing>
-          <wp:inline distT="0" distB="0" distL="0" distR="0" wp14:anchorId="6F228B50" wp14:editId="63CF1AD1">
+          <wp:inline distT="0" distB="0" distL="0" distR="0" wp14:anchorId="6F228B50" wp14:editId="3B088F00">
             <wp:extent cx="3987067" cy="2355850"/>
             <wp:effectExtent l="0" t="0" r="0" b="6350"/>
             <wp:docPr id="826101158" name="Imagem 20" descr="Uma imagem com captura de ecrã, diagrama, texto, file&#10;&#10;Os conteúdos gerados por IA podem estar incorretos."/>
@@ -8459,27 +8407,14 @@
       <w:r>
         <w:t xml:space="preserve">Figura </w:t>
       </w:r>
-      <w:r>
-        <w:fldChar w:fldCharType="begin"/>
-      </w:r>
-      <w:r>
-        <w:instrText xml:space="preserve"> SEQ Figura \* ARABIC </w:instrText>
-      </w:r>
-      <w:r>
-        <w:fldChar w:fldCharType="separate"/>
-      </w:r>
-      <w:r>
-        <w:rPr>
-          <w:noProof/>
-        </w:rPr>
-        <w:t>3</w:t>
-      </w:r>
-      <w:r>
-        <w:rPr>
-          <w:noProof/>
-        </w:rPr>
-        <w:fldChar w:fldCharType="end"/>
-      </w:r>
+      <w:fldSimple w:instr=" SEQ Figura \* ARABIC ">
+        <w:r>
+          <w:rPr>
+            <w:noProof/>
+          </w:rPr>
+          <w:t>3</w:t>
+        </w:r>
+      </w:fldSimple>
       <w:r>
         <w:t xml:space="preserve"> - </w:t>
       </w:r>
@@ -8645,27 +8580,14 @@
                             <w:r>
                               <w:t xml:space="preserve">Figura </w:t>
                             </w:r>
-                            <w:r>
-                              <w:fldChar w:fldCharType="begin"/>
-                            </w:r>
-                            <w:r>
-                              <w:instrText xml:space="preserve"> SEQ Figura \* ARABIC </w:instrText>
-                            </w:r>
-                            <w:r>
-                              <w:fldChar w:fldCharType="separate"/>
-                            </w:r>
-                            <w:r>
-                              <w:rPr>
-                                <w:noProof/>
-                              </w:rPr>
-                              <w:t>4</w:t>
-                            </w:r>
-                            <w:r>
-                              <w:rPr>
-                                <w:noProof/>
-                              </w:rPr>
-                              <w:fldChar w:fldCharType="end"/>
-                            </w:r>
+                            <w:fldSimple w:instr=" SEQ Figura \* ARABIC ">
+                              <w:r>
+                                <w:rPr>
+                                  <w:noProof/>
+                                </w:rPr>
+                                <w:t>4</w:t>
+                              </w:r>
+                            </w:fldSimple>
                             <w:r>
                               <w:t xml:space="preserve"> - Diagrama BPMN Agendamento De Entregas</w:t>
                             </w:r>
@@ -8704,27 +8626,14 @@
                       <w:r>
                         <w:t xml:space="preserve">Figura </w:t>
                       </w:r>
-                      <w:r>
-                        <w:fldChar w:fldCharType="begin"/>
-                      </w:r>
-                      <w:r>
-                        <w:instrText xml:space="preserve"> SEQ Figura \* ARABIC </w:instrText>
-                      </w:r>
-                      <w:r>
-                        <w:fldChar w:fldCharType="separate"/>
-                      </w:r>
-                      <w:r>
-                        <w:rPr>
-                          <w:noProof/>
-                        </w:rPr>
-                        <w:t>4</w:t>
-                      </w:r>
-                      <w:r>
-                        <w:rPr>
-                          <w:noProof/>
-                        </w:rPr>
-                        <w:fldChar w:fldCharType="end"/>
-                      </w:r>
+                      <w:fldSimple w:instr=" SEQ Figura \* ARABIC ">
+                        <w:r>
+                          <w:rPr>
+                            <w:noProof/>
+                          </w:rPr>
+                          <w:t>4</w:t>
+                        </w:r>
+                      </w:fldSimple>
                       <w:r>
                         <w:t xml:space="preserve"> - Diagrama BPMN Agendamento De Entregas</w:t>
                       </w:r>
@@ -8996,27 +8905,14 @@
                             <w:r>
                               <w:t xml:space="preserve">Figura </w:t>
                             </w:r>
-                            <w:r>
-                              <w:fldChar w:fldCharType="begin"/>
-                            </w:r>
-                            <w:r>
-                              <w:instrText xml:space="preserve"> SEQ Figura \* ARABIC </w:instrText>
-                            </w:r>
-                            <w:r>
-                              <w:fldChar w:fldCharType="separate"/>
-                            </w:r>
-                            <w:r>
-                              <w:rPr>
-                                <w:noProof/>
-                              </w:rPr>
-                              <w:t>5</w:t>
-                            </w:r>
-                            <w:r>
-                              <w:rPr>
-                                <w:noProof/>
-                              </w:rPr>
-                              <w:fldChar w:fldCharType="end"/>
-                            </w:r>
+                            <w:fldSimple w:instr=" SEQ Figura \* ARABIC ">
+                              <w:r>
+                                <w:rPr>
+                                  <w:noProof/>
+                                </w:rPr>
+                                <w:t>5</w:t>
+                              </w:r>
+                            </w:fldSimple>
                             <w:r>
                               <w:t xml:space="preserve"> - Diagrama BPMN Gestão Benificiários</w:t>
                             </w:r>
@@ -9055,27 +8951,14 @@
                       <w:r>
                         <w:t xml:space="preserve">Figura </w:t>
                       </w:r>
-                      <w:r>
-                        <w:fldChar w:fldCharType="begin"/>
-                      </w:r>
-                      <w:r>
-                        <w:instrText xml:space="preserve"> SEQ Figura \* ARABIC </w:instrText>
-                      </w:r>
-                      <w:r>
-                        <w:fldChar w:fldCharType="separate"/>
-                      </w:r>
-                      <w:r>
-                        <w:rPr>
-                          <w:noProof/>
-                        </w:rPr>
-                        <w:t>5</w:t>
-                      </w:r>
-                      <w:r>
-                        <w:rPr>
-                          <w:noProof/>
-                        </w:rPr>
-                        <w:fldChar w:fldCharType="end"/>
-                      </w:r>
+                      <w:fldSimple w:instr=" SEQ Figura \* ARABIC ">
+                        <w:r>
+                          <w:rPr>
+                            <w:noProof/>
+                          </w:rPr>
+                          <w:t>5</w:t>
+                        </w:r>
+                      </w:fldSimple>
                       <w:r>
                         <w:t xml:space="preserve"> - Diagrama BPMN Gestão Benificiários</w:t>
                       </w:r>
@@ -10395,27 +10278,14 @@
       <w:r>
         <w:t xml:space="preserve">Figura </w:t>
       </w:r>
-      <w:r>
-        <w:fldChar w:fldCharType="begin"/>
-      </w:r>
-      <w:r>
-        <w:instrText xml:space="preserve"> SEQ Figura \* ARABIC </w:instrText>
-      </w:r>
-      <w:r>
-        <w:fldChar w:fldCharType="separate"/>
-      </w:r>
-      <w:r>
-        <w:rPr>
-          <w:noProof/>
-        </w:rPr>
-        <w:t>5</w:t>
-      </w:r>
-      <w:r>
-        <w:rPr>
-          <w:noProof/>
-        </w:rPr>
-        <w:fldChar w:fldCharType="end"/>
-      </w:r>
+      <w:fldSimple w:instr=" SEQ Figura \* ARABIC ">
+        <w:r>
+          <w:rPr>
+            <w:noProof/>
+          </w:rPr>
+          <w:t>5</w:t>
+        </w:r>
+      </w:fldSimple>
       <w:r>
         <w:t xml:space="preserve"> - Diagrama Arquitetura </w:t>
       </w:r>
@@ -10548,27 +10418,14 @@
       <w:r>
         <w:t xml:space="preserve">Figura </w:t>
       </w:r>
-      <w:r>
-        <w:fldChar w:fldCharType="begin"/>
-      </w:r>
-      <w:r>
-        <w:instrText xml:space="preserve"> SEQ Figura \* ARABIC </w:instrText>
-      </w:r>
-      <w:r>
-        <w:fldChar w:fldCharType="separate"/>
-      </w:r>
-      <w:r>
-        <w:rPr>
-          <w:noProof/>
-        </w:rPr>
-        <w:t>7</w:t>
-      </w:r>
-      <w:r>
-        <w:rPr>
-          <w:noProof/>
-        </w:rPr>
-        <w:fldChar w:fldCharType="end"/>
-      </w:r>
+      <w:fldSimple w:instr=" SEQ Figura \* ARABIC ">
+        <w:r>
+          <w:rPr>
+            <w:noProof/>
+          </w:rPr>
+          <w:t>7</w:t>
+        </w:r>
+      </w:fldSimple>
       <w:r>
         <w:t xml:space="preserve"> - Diagrama de Estados Pedir Apoio</w:t>
       </w:r>
@@ -10677,27 +10534,14 @@
       <w:r>
         <w:t xml:space="preserve">Figura </w:t>
       </w:r>
-      <w:r>
-        <w:fldChar w:fldCharType="begin"/>
-      </w:r>
-      <w:r>
-        <w:instrText xml:space="preserve"> SEQ Figura \* ARABIC </w:instrText>
-      </w:r>
-      <w:r>
-        <w:fldChar w:fldCharType="separate"/>
-      </w:r>
-      <w:r>
-        <w:rPr>
-          <w:noProof/>
-        </w:rPr>
-        <w:t>8</w:t>
-      </w:r>
-      <w:r>
-        <w:rPr>
-          <w:noProof/>
-        </w:rPr>
-        <w:fldChar w:fldCharType="end"/>
-      </w:r>
+      <w:fldSimple w:instr=" SEQ Figura \* ARABIC ">
+        <w:r>
+          <w:rPr>
+            <w:noProof/>
+          </w:rPr>
+          <w:t>8</w:t>
+        </w:r>
+      </w:fldSimple>
       <w:r>
         <w:t xml:space="preserve"> - </w:t>
       </w:r>
@@ -10835,27 +10679,14 @@
       <w:r>
         <w:t xml:space="preserve">Figura </w:t>
       </w:r>
-      <w:r>
-        <w:fldChar w:fldCharType="begin"/>
-      </w:r>
-      <w:r>
-        <w:instrText xml:space="preserve"> SEQ Figura \* ARABIC </w:instrText>
-      </w:r>
-      <w:r>
-        <w:fldChar w:fldCharType="separate"/>
-      </w:r>
-      <w:r>
-        <w:rPr>
-          <w:noProof/>
-        </w:rPr>
-        <w:t>9</w:t>
-      </w:r>
-      <w:r>
-        <w:rPr>
-          <w:noProof/>
-        </w:rPr>
-        <w:fldChar w:fldCharType="end"/>
-      </w:r>
+      <w:fldSimple w:instr=" SEQ Figura \* ARABIC ">
+        <w:r>
+          <w:rPr>
+            <w:noProof/>
+          </w:rPr>
+          <w:t>9</w:t>
+        </w:r>
+      </w:fldSimple>
       <w:r>
         <w:t xml:space="preserve"> - Diagrama de Estados Agendamento de Entregas</w:t>
       </w:r>
@@ -10978,27 +10809,14 @@
       <w:r>
         <w:t xml:space="preserve">Figura </w:t>
       </w:r>
-      <w:r>
-        <w:fldChar w:fldCharType="begin"/>
-      </w:r>
-      <w:r>
-        <w:instrText xml:space="preserve"> SEQ Figura \* ARABIC </w:instrText>
-      </w:r>
-      <w:r>
-        <w:fldChar w:fldCharType="separate"/>
-      </w:r>
-      <w:r>
-        <w:rPr>
-          <w:noProof/>
-        </w:rPr>
-        <w:t>10</w:t>
-      </w:r>
-      <w:r>
-        <w:rPr>
-          <w:noProof/>
-        </w:rPr>
-        <w:fldChar w:fldCharType="end"/>
-      </w:r>
+      <w:fldSimple w:instr=" SEQ Figura \* ARABIC ">
+        <w:r>
+          <w:rPr>
+            <w:noProof/>
+          </w:rPr>
+          <w:t>10</w:t>
+        </w:r>
+      </w:fldSimple>
       <w:r>
         <w:t xml:space="preserve"> - </w:t>
       </w:r>
@@ -11143,32 +10961,16 @@
                             <w:r>
                               <w:t xml:space="preserve">Figura </w:t>
                             </w:r>
+                            <w:fldSimple w:instr=" SEQ Figura \* ARABIC ">
+                              <w:r>
+                                <w:rPr>
+                                  <w:noProof/>
+                                </w:rPr>
+                                <w:t>11</w:t>
+                              </w:r>
+                            </w:fldSimple>
                             <w:r>
-                              <w:fldChar w:fldCharType="begin"/>
-                            </w:r>
-                            <w:r>
-                              <w:instrText xml:space="preserve"> SEQ Figura \* ARABIC </w:instrText>
-                            </w:r>
-                            <w:r>
-                              <w:fldChar w:fldCharType="separate"/>
-                            </w:r>
-                            <w:r>
-                              <w:rPr>
-                                <w:noProof/>
-                              </w:rPr>
-                              <w:t>11</w:t>
-                            </w:r>
-                            <w:r>
-                              <w:rPr>
-                                <w:noProof/>
-                              </w:rPr>
-                              <w:fldChar w:fldCharType="end"/>
-                            </w:r>
-                            <w:r>
-                              <w:t xml:space="preserve"> - Diagrama </w:t>
-                            </w:r>
-                            <w:r>
-                              <w:t>de Casos de Uso de Candidatura</w:t>
+                              <w:t xml:space="preserve"> - Diagrama de Casos de Uso de Candidatura</w:t>
                             </w:r>
                             <w:bookmarkEnd w:id="43"/>
                           </w:p>
@@ -11205,32 +11007,16 @@
                       <w:r>
                         <w:t xml:space="preserve">Figura </w:t>
                       </w:r>
+                      <w:fldSimple w:instr=" SEQ Figura \* ARABIC ">
+                        <w:r>
+                          <w:rPr>
+                            <w:noProof/>
+                          </w:rPr>
+                          <w:t>11</w:t>
+                        </w:r>
+                      </w:fldSimple>
                       <w:r>
-                        <w:fldChar w:fldCharType="begin"/>
-                      </w:r>
-                      <w:r>
-                        <w:instrText xml:space="preserve"> SEQ Figura \* ARABIC </w:instrText>
-                      </w:r>
-                      <w:r>
-                        <w:fldChar w:fldCharType="separate"/>
-                      </w:r>
-                      <w:r>
-                        <w:rPr>
-                          <w:noProof/>
-                        </w:rPr>
-                        <w:t>11</w:t>
-                      </w:r>
-                      <w:r>
-                        <w:rPr>
-                          <w:noProof/>
-                        </w:rPr>
-                        <w:fldChar w:fldCharType="end"/>
-                      </w:r>
-                      <w:r>
-                        <w:t xml:space="preserve"> - Diagrama </w:t>
-                      </w:r>
-                      <w:r>
-                        <w:t>de Casos de Uso de Candidatura</w:t>
+                        <w:t xml:space="preserve"> - Diagrama de Casos de Uso de Candidatura</w:t>
                       </w:r>
                       <w:bookmarkEnd w:id="44"/>
                     </w:p>
@@ -11492,27 +11278,14 @@
       <w:r>
         <w:t xml:space="preserve">Figura </w:t>
       </w:r>
-      <w:r>
-        <w:fldChar w:fldCharType="begin"/>
-      </w:r>
-      <w:r>
-        <w:instrText xml:space="preserve"> SEQ Figura \* ARABIC </w:instrText>
-      </w:r>
-      <w:r>
-        <w:fldChar w:fldCharType="separate"/>
-      </w:r>
-      <w:r>
-        <w:rPr>
-          <w:noProof/>
-        </w:rPr>
-        <w:t>12</w:t>
-      </w:r>
-      <w:r>
-        <w:rPr>
-          <w:noProof/>
-        </w:rPr>
-        <w:fldChar w:fldCharType="end"/>
-      </w:r>
+      <w:fldSimple w:instr=" SEQ Figura \* ARABIC ">
+        <w:r>
+          <w:rPr>
+            <w:noProof/>
+          </w:rPr>
+          <w:t>12</w:t>
+        </w:r>
+      </w:fldSimple>
       <w:r>
         <w:t xml:space="preserve"> - </w:t>
       </w:r>
@@ -11568,13 +11341,7 @@
         <w:jc w:val="both"/>
       </w:pPr>
       <w:r>
-        <w:t>A</w:t>
-      </w:r>
-      <w:r>
-        <w:t xml:space="preserve"> </w:t>
-      </w:r>
-      <w:r>
-        <w:t>Loja Social executa "Procura Bens no Stock".</w:t>
+        <w:t>A Loja Social executa "Procura Bens no Stock".</w:t>
       </w:r>
     </w:p>
     <w:p>
@@ -11747,32 +11514,16 @@
                             <w:r>
                               <w:t xml:space="preserve">Figura </w:t>
                             </w:r>
+                            <w:fldSimple w:instr=" SEQ Figura \* ARABIC ">
+                              <w:r>
+                                <w:rPr>
+                                  <w:noProof/>
+                                </w:rPr>
+                                <w:t>13</w:t>
+                              </w:r>
+                            </w:fldSimple>
                             <w:r>
-                              <w:fldChar w:fldCharType="begin"/>
-                            </w:r>
-                            <w:r>
-                              <w:instrText xml:space="preserve"> SEQ Figura \* ARABIC </w:instrText>
-                            </w:r>
-                            <w:r>
-                              <w:fldChar w:fldCharType="separate"/>
-                            </w:r>
-                            <w:r>
-                              <w:rPr>
-                                <w:noProof/>
-                              </w:rPr>
-                              <w:t>13</w:t>
-                            </w:r>
-                            <w:r>
-                              <w:rPr>
-                                <w:noProof/>
-                              </w:rPr>
-                              <w:fldChar w:fldCharType="end"/>
-                            </w:r>
-                            <w:r>
-                              <w:t xml:space="preserve"> - Diagrama de Casos de Uso </w:t>
-                            </w:r>
-                            <w:r>
-                              <w:t>da entrega de bens</w:t>
+                              <w:t xml:space="preserve"> - Diagrama de Casos de Uso da entrega de bens</w:t>
                             </w:r>
                             <w:bookmarkEnd w:id="48"/>
                           </w:p>
@@ -11809,32 +11560,16 @@
                       <w:r>
                         <w:t xml:space="preserve">Figura </w:t>
                       </w:r>
+                      <w:fldSimple w:instr=" SEQ Figura \* ARABIC ">
+                        <w:r>
+                          <w:rPr>
+                            <w:noProof/>
+                          </w:rPr>
+                          <w:t>13</w:t>
+                        </w:r>
+                      </w:fldSimple>
                       <w:r>
-                        <w:fldChar w:fldCharType="begin"/>
-                      </w:r>
-                      <w:r>
-                        <w:instrText xml:space="preserve"> SEQ Figura \* ARABIC </w:instrText>
-                      </w:r>
-                      <w:r>
-                        <w:fldChar w:fldCharType="separate"/>
-                      </w:r>
-                      <w:r>
-                        <w:rPr>
-                          <w:noProof/>
-                        </w:rPr>
-                        <w:t>13</w:t>
-                      </w:r>
-                      <w:r>
-                        <w:rPr>
-                          <w:noProof/>
-                        </w:rPr>
-                        <w:fldChar w:fldCharType="end"/>
-                      </w:r>
-                      <w:r>
-                        <w:t xml:space="preserve"> - Diagrama de Casos de Uso </w:t>
-                      </w:r>
-                      <w:r>
-                        <w:t>da entrega de bens</w:t>
+                        <w:t xml:space="preserve"> - Diagrama de Casos de Uso da entrega de bens</w:t>
                       </w:r>
                       <w:bookmarkEnd w:id="49"/>
                     </w:p>
@@ -11968,27 +11703,14 @@
                             <w:r>
                               <w:t xml:space="preserve">Figura </w:t>
                             </w:r>
-                            <w:r>
-                              <w:fldChar w:fldCharType="begin"/>
-                            </w:r>
-                            <w:r>
-                              <w:instrText xml:space="preserve"> SEQ Figura \* ARABIC </w:instrText>
-                            </w:r>
-                            <w:r>
-                              <w:fldChar w:fldCharType="separate"/>
-                            </w:r>
-                            <w:r>
-                              <w:rPr>
-                                <w:noProof/>
-                              </w:rPr>
-                              <w:t>14</w:t>
-                            </w:r>
-                            <w:r>
-                              <w:rPr>
-                                <w:noProof/>
-                              </w:rPr>
-                              <w:fldChar w:fldCharType="end"/>
-                            </w:r>
+                            <w:fldSimple w:instr=" SEQ Figura \* ARABIC ">
+                              <w:r>
+                                <w:rPr>
+                                  <w:noProof/>
+                                </w:rPr>
+                                <w:t>14</w:t>
+                              </w:r>
+                            </w:fldSimple>
                             <w:r>
                               <w:t xml:space="preserve"> - Diagrama de Casos de Uso de Candidatura</w:t>
                             </w:r>
@@ -12027,27 +11749,14 @@
                       <w:r>
                         <w:t xml:space="preserve">Figura </w:t>
                       </w:r>
-                      <w:r>
-                        <w:fldChar w:fldCharType="begin"/>
-                      </w:r>
-                      <w:r>
-                        <w:instrText xml:space="preserve"> SEQ Figura \* ARABIC </w:instrText>
-                      </w:r>
-                      <w:r>
-                        <w:fldChar w:fldCharType="separate"/>
-                      </w:r>
-                      <w:r>
-                        <w:rPr>
-                          <w:noProof/>
-                        </w:rPr>
-                        <w:t>14</w:t>
-                      </w:r>
-                      <w:r>
-                        <w:rPr>
-                          <w:noProof/>
-                        </w:rPr>
-                        <w:fldChar w:fldCharType="end"/>
-                      </w:r>
+                      <w:fldSimple w:instr=" SEQ Figura \* ARABIC ">
+                        <w:r>
+                          <w:rPr>
+                            <w:noProof/>
+                          </w:rPr>
+                          <w:t>14</w:t>
+                        </w:r>
+                      </w:fldSimple>
                       <w:r>
                         <w:t xml:space="preserve"> - Diagrama de Casos de Uso de Candidatura</w:t>
                       </w:r>
@@ -12068,6 +11777,9 @@
         <w:t xml:space="preserve"> </w:t>
       </w:r>
       <w:r>
+        <w:rPr>
+          <w:noProof/>
+        </w:rPr>
         <w:drawing>
           <wp:inline distT="0" distB="0" distL="0" distR="0" wp14:anchorId="69F4733C" wp14:editId="1198E89A">
             <wp:extent cx="5579745" cy="1839595"/>
@@ -12189,22 +11901,23 @@
         <mc:AlternateContent>
           <mc:Choice Requires="wps">
             <w:drawing>
-              <wp:anchor distT="0" distB="0" distL="114300" distR="114300" simplePos="0" relativeHeight="251673600" behindDoc="1" locked="0" layoutInCell="1" allowOverlap="1" wp14:anchorId="00213DF0" wp14:editId="63496A0B">
+              <wp:anchor distT="0" distB="0" distL="114300" distR="114300" simplePos="0" relativeHeight="251673600" behindDoc="1" locked="0" layoutInCell="1" allowOverlap="1" wp14:anchorId="00213DF0" wp14:editId="79D8FA16">
                 <wp:simplePos x="0" y="0"/>
-                <wp:positionH relativeFrom="column">
-                  <wp:posOffset>-386080</wp:posOffset>
+                <wp:positionH relativeFrom="page">
+                  <wp:align>center</wp:align>
                 </wp:positionH>
                 <wp:positionV relativeFrom="paragraph">
-                  <wp:posOffset>4030345</wp:posOffset>
+                  <wp:posOffset>3731895</wp:posOffset>
                 </wp:positionV>
                 <wp:extent cx="6163945" cy="635"/>
-                <wp:effectExtent l="0" t="0" r="0" b="0"/>
+                <wp:effectExtent l="0" t="0" r="8255" b="0"/>
                 <wp:wrapTight wrapText="bothSides">
                   <wp:wrapPolygon edited="0">
                     <wp:start x="0" y="0"/>
-                    <wp:lineTo x="0" y="21600"/>
-                    <wp:lineTo x="21600" y="21600"/>
-                    <wp:lineTo x="21600" y="0"/>
+                    <wp:lineTo x="0" y="20057"/>
+                    <wp:lineTo x="21562" y="20057"/>
+                    <wp:lineTo x="21562" y="0"/>
+                    <wp:lineTo x="0" y="0"/>
                   </wp:wrapPolygon>
                 </wp:wrapTight>
                 <wp:docPr id="1861890514" name="Text Box 1"/>
@@ -12243,27 +11956,14 @@
                             <w:r>
                               <w:t xml:space="preserve">Figura </w:t>
                             </w:r>
-                            <w:r>
-                              <w:fldChar w:fldCharType="begin"/>
-                            </w:r>
-                            <w:r>
-                              <w:instrText xml:space="preserve"> SEQ Figura \* ARABIC </w:instrText>
-                            </w:r>
-                            <w:r>
-                              <w:fldChar w:fldCharType="separate"/>
-                            </w:r>
-                            <w:r>
-                              <w:rPr>
-                                <w:noProof/>
-                              </w:rPr>
-                              <w:t>15</w:t>
-                            </w:r>
-                            <w:r>
-                              <w:rPr>
-                                <w:noProof/>
-                              </w:rPr>
-                              <w:fldChar w:fldCharType="end"/>
-                            </w:r>
+                            <w:fldSimple w:instr=" SEQ Figura \* ARABIC ">
+                              <w:r>
+                                <w:rPr>
+                                  <w:noProof/>
+                                </w:rPr>
+                                <w:t>15</w:t>
+                              </w:r>
+                            </w:fldSimple>
                             <w:r>
                               <w:t xml:space="preserve"> - Diagram</w:t>
                             </w:r>
@@ -12291,7 +11991,7 @@
           </mc:Choice>
           <mc:Fallback>
             <w:pict>
-              <v:shape w14:anchorId="00213DF0" id="Text Box 1" o:spid="_x0000_s1033" type="#_x0000_t202" style="position:absolute;margin-left:-30.4pt;margin-top:317.35pt;width:485.35pt;height:.05pt;z-index:-251642880;visibility:visible;mso-wrap-style:square;mso-wrap-distance-left:9pt;mso-wrap-distance-top:0;mso-wrap-distance-right:9pt;mso-wrap-distance-bottom:0;mso-position-horizontal:absolute;mso-position-horizontal-relative:text;mso-position-vertical:absolute;mso-position-vertical-relative:text;v-text-anchor:top" o:gfxdata="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" stroked="f">
+              <v:shape w14:anchorId="00213DF0" id="Text Box 1" o:spid="_x0000_s1033" type="#_x0000_t202" style="position:absolute;margin-left:0;margin-top:293.85pt;width:485.35pt;height:.05pt;z-index:-251642880;visibility:visible;mso-wrap-style:square;mso-wrap-distance-left:9pt;mso-wrap-distance-top:0;mso-wrap-distance-right:9pt;mso-wrap-distance-bottom:0;mso-position-horizontal:center;mso-position-horizontal-relative:page;mso-position-vertical:absolute;mso-position-vertical-relative:text;v-text-anchor:top" o:gfxdata="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" stroked="f">
                 <v:textbox style="mso-fit-shape-to-text:t" inset="0,0,0,0">
                   <w:txbxContent>
                     <w:p>
@@ -12307,27 +12007,14 @@
                       <w:r>
                         <w:t xml:space="preserve">Figura </w:t>
                       </w:r>
-                      <w:r>
-                        <w:fldChar w:fldCharType="begin"/>
-                      </w:r>
-                      <w:r>
-                        <w:instrText xml:space="preserve"> SEQ Figura \* ARABIC </w:instrText>
-                      </w:r>
-                      <w:r>
-                        <w:fldChar w:fldCharType="separate"/>
-                      </w:r>
-                      <w:r>
-                        <w:rPr>
-                          <w:noProof/>
-                        </w:rPr>
-                        <w:t>15</w:t>
-                      </w:r>
-                      <w:r>
-                        <w:rPr>
-                          <w:noProof/>
-                        </w:rPr>
-                        <w:fldChar w:fldCharType="end"/>
-                      </w:r>
+                      <w:fldSimple w:instr=" SEQ Figura \* ARABIC ">
+                        <w:r>
+                          <w:rPr>
+                            <w:noProof/>
+                          </w:rPr>
+                          <w:t>15</w:t>
+                        </w:r>
+                      </w:fldSimple>
                       <w:r>
                         <w:t xml:space="preserve"> - Diagram</w:t>
                       </w:r>
@@ -12341,7 +12028,7 @@
                     </w:p>
                   </w:txbxContent>
                 </v:textbox>
-                <w10:wrap type="tight"/>
+                <w10:wrap type="tight" anchorx="page"/>
               </v:shape>
             </w:pict>
           </mc:Fallback>
@@ -12373,10 +12060,10 @@
           <w:noProof/>
         </w:rPr>
         <w:drawing>
-          <wp:inline distT="0" distB="0" distL="0" distR="0" wp14:anchorId="13377887" wp14:editId="618A5F32">
-            <wp:extent cx="5579745" cy="3037840"/>
-            <wp:effectExtent l="0" t="0" r="1905" b="0"/>
-            <wp:docPr id="1982451995" name="Imagem 22" descr="Uma imagem com texto, Retângulo, Esquema, Nota em post-it&#10;&#10;Os conteúdos gerados por IA podem estar incorretos."/>
+          <wp:inline distT="0" distB="0" distL="0" distR="0" wp14:anchorId="292451F9" wp14:editId="6682734A">
+            <wp:extent cx="5579745" cy="2943860"/>
+            <wp:effectExtent l="0" t="0" r="1905" b="8890"/>
+            <wp:docPr id="1218708799" name="Imagem 22" descr="Uma imagem com texto, Retângulo&#10;&#10;Os conteúdos gerados por IA podem estar incorretos."/>
             <wp:cNvGraphicFramePr>
               <a:graphicFrameLocks xmlns:a="http://schemas.openxmlformats.org/drawingml/2006/main" noChangeAspect="1"/>
             </wp:cNvGraphicFramePr>
@@ -12384,10 +12071,10 @@
               <a:graphicData uri="http://schemas.openxmlformats.org/drawingml/2006/picture">
                 <pic:pic xmlns:pic="http://schemas.openxmlformats.org/drawingml/2006/picture">
                   <pic:nvPicPr>
-                    <pic:cNvPr id="1982451995" name="Imagem 22" descr="Uma imagem com texto, Retângulo, Esquema, Nota em post-it&#10;&#10;Os conteúdos gerados por IA podem estar incorretos."/>
+                    <pic:cNvPr id="1218708799" name="Imagem 22" descr="Uma imagem com texto, Retângulo&#10;&#10;Os conteúdos gerados por IA podem estar incorretos."/>
                     <pic:cNvPicPr/>
                   </pic:nvPicPr>
-                  <pic:blipFill>
+                  <pic:blipFill rotWithShape="1">
                     <a:blip r:embed="rId23">
                       <a:extLst>
                         <a:ext uri="{28A0092B-C50C-407E-A947-70E740481C1C}">
@@ -12395,18 +12082,27 @@
                         </a:ext>
                       </a:extLst>
                     </a:blip>
+                    <a:srcRect t="1277"/>
                     <a:stretch>
                       <a:fillRect/>
                     </a:stretch>
                   </pic:blipFill>
-                  <pic:spPr>
+                  <pic:spPr bwMode="auto">
                     <a:xfrm>
                       <a:off x="0" y="0"/>
-                      <a:ext cx="5579745" cy="3037840"/>
+                      <a:ext cx="5579745" cy="2943860"/>
                     </a:xfrm>
                     <a:prstGeom prst="rect">
                       <a:avLst/>
                     </a:prstGeom>
+                    <a:ln>
+                      <a:noFill/>
+                    </a:ln>
+                    <a:extLst>
+                      <a:ext uri="{53640926-AAD7-44D8-BBD7-CCE9431645EC}">
+                        <a14:shadowObscured xmlns:a14="http://schemas.microsoft.com/office/drawing/2010/main"/>
+                      </a:ext>
+                    </a:extLst>
                   </pic:spPr>
                 </pic:pic>
               </a:graphicData>
@@ -12414,11 +12110,6 @@
           </wp:inline>
         </w:drawing>
       </w:r>
-    </w:p>
-    <w:p>
-      <w:pPr>
-        <w:spacing w:line="276" w:lineRule="auto"/>
-      </w:pPr>
     </w:p>
     <w:p>
       <w:pPr>
@@ -12986,27 +12677,14 @@
                             <w:r>
                               <w:t xml:space="preserve">Figura </w:t>
                             </w:r>
-                            <w:r>
-                              <w:fldChar w:fldCharType="begin"/>
-                            </w:r>
-                            <w:r>
-                              <w:instrText xml:space="preserve"> SEQ Figura \* ARABIC </w:instrText>
-                            </w:r>
-                            <w:r>
-                              <w:fldChar w:fldCharType="separate"/>
-                            </w:r>
-                            <w:r>
-                              <w:rPr>
-                                <w:noProof/>
-                              </w:rPr>
-                              <w:t>14</w:t>
-                            </w:r>
-                            <w:r>
-                              <w:rPr>
-                                <w:noProof/>
-                              </w:rPr>
-                              <w:fldChar w:fldCharType="end"/>
-                            </w:r>
+                            <w:fldSimple w:instr=" SEQ Figura \* ARABIC ">
+                              <w:r>
+                                <w:rPr>
+                                  <w:noProof/>
+                                </w:rPr>
+                                <w:t>14</w:t>
+                              </w:r>
+                            </w:fldSimple>
                             <w:r>
                               <w:t>- Diagrama de Classes</w:t>
                             </w:r>
@@ -13044,27 +12722,14 @@
                       <w:r>
                         <w:t xml:space="preserve">Figura </w:t>
                       </w:r>
-                      <w:r>
-                        <w:fldChar w:fldCharType="begin"/>
-                      </w:r>
-                      <w:r>
-                        <w:instrText xml:space="preserve"> SEQ Figura \* ARABIC </w:instrText>
-                      </w:r>
-                      <w:r>
-                        <w:fldChar w:fldCharType="separate"/>
-                      </w:r>
-                      <w:r>
-                        <w:rPr>
-                          <w:noProof/>
-                        </w:rPr>
-                        <w:t>14</w:t>
-                      </w:r>
-                      <w:r>
-                        <w:rPr>
-                          <w:noProof/>
-                        </w:rPr>
-                        <w:fldChar w:fldCharType="end"/>
-                      </w:r>
+                      <w:fldSimple w:instr=" SEQ Figura \* ARABIC ">
+                        <w:r>
+                          <w:rPr>
+                            <w:noProof/>
+                          </w:rPr>
+                          <w:t>14</w:t>
+                        </w:r>
+                      </w:fldSimple>
                       <w:r>
                         <w:t>- Diagrama de Classes</w:t>
                       </w:r>
@@ -13639,27 +13304,14 @@
       <w:r>
         <w:t xml:space="preserve">Figura </w:t>
       </w:r>
-      <w:r>
-        <w:fldChar w:fldCharType="begin"/>
-      </w:r>
-      <w:r>
-        <w:instrText xml:space="preserve"> SEQ Figura \* ARABIC </w:instrText>
-      </w:r>
-      <w:r>
-        <w:fldChar w:fldCharType="separate"/>
-      </w:r>
-      <w:r>
-        <w:rPr>
-          <w:noProof/>
-        </w:rPr>
-        <w:t>14</w:t>
-      </w:r>
-      <w:r>
-        <w:rPr>
-          <w:noProof/>
-        </w:rPr>
-        <w:fldChar w:fldCharType="end"/>
-      </w:r>
+      <w:fldSimple w:instr=" SEQ Figura \* ARABIC ">
+        <w:r>
+          <w:rPr>
+            <w:noProof/>
+          </w:rPr>
+          <w:t>14</w:t>
+        </w:r>
+      </w:fldSimple>
       <w:r>
         <w:t xml:space="preserve"> - </w:t>
       </w:r>
@@ -13747,27 +13399,14 @@
                             <w:r>
                               <w:t xml:space="preserve">Figura </w:t>
                             </w:r>
-                            <w:r>
-                              <w:fldChar w:fldCharType="begin"/>
-                            </w:r>
-                            <w:r>
-                              <w:instrText xml:space="preserve"> SEQ Figura \* ARABIC </w:instrText>
-                            </w:r>
-                            <w:r>
-                              <w:fldChar w:fldCharType="separate"/>
-                            </w:r>
-                            <w:r>
-                              <w:rPr>
-                                <w:noProof/>
-                              </w:rPr>
-                              <w:t>15</w:t>
-                            </w:r>
-                            <w:r>
-                              <w:rPr>
-                                <w:noProof/>
-                              </w:rPr>
-                              <w:fldChar w:fldCharType="end"/>
-                            </w:r>
+                            <w:fldSimple w:instr=" SEQ Figura \* ARABIC ">
+                              <w:r>
+                                <w:rPr>
+                                  <w:noProof/>
+                                </w:rPr>
+                                <w:t>15</w:t>
+                              </w:r>
+                            </w:fldSimple>
                             <w:r>
                               <w:t xml:space="preserve"> – Mockup da Criação da Candidatura</w:t>
                             </w:r>
@@ -13812,27 +13451,14 @@
                       <w:r>
                         <w:t xml:space="preserve">Figura </w:t>
                       </w:r>
-                      <w:r>
-                        <w:fldChar w:fldCharType="begin"/>
-                      </w:r>
-                      <w:r>
-                        <w:instrText xml:space="preserve"> SEQ Figura \* ARABIC </w:instrText>
-                      </w:r>
-                      <w:r>
-                        <w:fldChar w:fldCharType="separate"/>
-                      </w:r>
-                      <w:r>
-                        <w:rPr>
-                          <w:noProof/>
-                        </w:rPr>
-                        <w:t>15</w:t>
-                      </w:r>
-                      <w:r>
-                        <w:rPr>
-                          <w:noProof/>
-                        </w:rPr>
-                        <w:fldChar w:fldCharType="end"/>
-                      </w:r>
+                      <w:fldSimple w:instr=" SEQ Figura \* ARABIC ">
+                        <w:r>
+                          <w:rPr>
+                            <w:noProof/>
+                          </w:rPr>
+                          <w:t>15</w:t>
+                        </w:r>
+                      </w:fldSimple>
                       <w:r>
                         <w:t xml:space="preserve"> – Mockup da Criação da Candidatura</w:t>
                       </w:r>
@@ -13957,27 +13583,14 @@
                             <w:r>
                               <w:t xml:space="preserve">Figura </w:t>
                             </w:r>
-                            <w:r>
-                              <w:fldChar w:fldCharType="begin"/>
-                            </w:r>
-                            <w:r>
-                              <w:instrText xml:space="preserve"> SEQ Figura \* ARABIC </w:instrText>
-                            </w:r>
-                            <w:r>
-                              <w:fldChar w:fldCharType="separate"/>
-                            </w:r>
-                            <w:r>
-                              <w:rPr>
-                                <w:noProof/>
-                              </w:rPr>
-                              <w:t>16</w:t>
-                            </w:r>
-                            <w:r>
-                              <w:rPr>
-                                <w:noProof/>
-                              </w:rPr>
-                              <w:fldChar w:fldCharType="end"/>
-                            </w:r>
+                            <w:fldSimple w:instr=" SEQ Figura \* ARABIC ">
+                              <w:r>
+                                <w:rPr>
+                                  <w:noProof/>
+                                </w:rPr>
+                                <w:t>16</w:t>
+                              </w:r>
+                            </w:fldSimple>
                             <w:r>
                               <w:t xml:space="preserve"> - Diagrama Sequência da Criação de Candidatura</w:t>
                             </w:r>
@@ -14019,27 +13632,14 @@
                       <w:r>
                         <w:t xml:space="preserve">Figura </w:t>
                       </w:r>
-                      <w:r>
-                        <w:fldChar w:fldCharType="begin"/>
-                      </w:r>
-                      <w:r>
-                        <w:instrText xml:space="preserve"> SEQ Figura \* ARABIC </w:instrText>
-                      </w:r>
-                      <w:r>
-                        <w:fldChar w:fldCharType="separate"/>
-                      </w:r>
-                      <w:r>
-                        <w:rPr>
-                          <w:noProof/>
-                        </w:rPr>
-                        <w:t>16</w:t>
-                      </w:r>
-                      <w:r>
-                        <w:rPr>
-                          <w:noProof/>
-                        </w:rPr>
-                        <w:fldChar w:fldCharType="end"/>
-                      </w:r>
+                      <w:fldSimple w:instr=" SEQ Figura \* ARABIC ">
+                        <w:r>
+                          <w:rPr>
+                            <w:noProof/>
+                          </w:rPr>
+                          <w:t>16</w:t>
+                        </w:r>
+                      </w:fldSimple>
                       <w:r>
                         <w:t xml:space="preserve"> - Diagrama Sequência da Criação de Candidatura</w:t>
                       </w:r>
@@ -14253,27 +13853,14 @@
                             <w:r>
                               <w:t xml:space="preserve">Figura </w:t>
                             </w:r>
-                            <w:r>
-                              <w:fldChar w:fldCharType="begin"/>
-                            </w:r>
-                            <w:r>
-                              <w:instrText xml:space="preserve"> SEQ Figura \* ARABIC </w:instrText>
-                            </w:r>
-                            <w:r>
-                              <w:fldChar w:fldCharType="separate"/>
-                            </w:r>
-                            <w:r>
-                              <w:rPr>
-                                <w:noProof/>
-                              </w:rPr>
-                              <w:t>17</w:t>
-                            </w:r>
-                            <w:r>
-                              <w:rPr>
-                                <w:noProof/>
-                              </w:rPr>
-                              <w:fldChar w:fldCharType="end"/>
-                            </w:r>
+                            <w:fldSimple w:instr=" SEQ Figura \* ARABIC ">
+                              <w:r>
+                                <w:rPr>
+                                  <w:noProof/>
+                                </w:rPr>
+                                <w:t>17</w:t>
+                              </w:r>
+                            </w:fldSimple>
                             <w:r>
                               <w:t xml:space="preserve"> – Diagrama de Sequência</w:t>
                             </w:r>
@@ -14312,27 +13899,14 @@
                       <w:r>
                         <w:t xml:space="preserve">Figura </w:t>
                       </w:r>
-                      <w:r>
-                        <w:fldChar w:fldCharType="begin"/>
-                      </w:r>
-                      <w:r>
-                        <w:instrText xml:space="preserve"> SEQ Figura \* ARABIC </w:instrText>
-                      </w:r>
-                      <w:r>
-                        <w:fldChar w:fldCharType="separate"/>
-                      </w:r>
-                      <w:r>
-                        <w:rPr>
-                          <w:noProof/>
-                        </w:rPr>
-                        <w:t>17</w:t>
-                      </w:r>
-                      <w:r>
-                        <w:rPr>
-                          <w:noProof/>
-                        </w:rPr>
-                        <w:fldChar w:fldCharType="end"/>
-                      </w:r>
+                      <w:fldSimple w:instr=" SEQ Figura \* ARABIC ">
+                        <w:r>
+                          <w:rPr>
+                            <w:noProof/>
+                          </w:rPr>
+                          <w:t>17</w:t>
+                        </w:r>
+                      </w:fldSimple>
                       <w:r>
                         <w:t xml:space="preserve"> – Diagrama de Sequência</w:t>
                       </w:r>
@@ -14436,7 +14010,7 @@
           <w:noProof/>
         </w:rPr>
         <w:drawing>
-          <wp:inline distT="0" distB="0" distL="0" distR="0" wp14:anchorId="33356D91" wp14:editId="7D8B4B27">
+          <wp:inline distT="0" distB="0" distL="0" distR="0" wp14:anchorId="33356D91" wp14:editId="13FF0FA9">
             <wp:extent cx="5321039" cy="2686862"/>
             <wp:effectExtent l="0" t="0" r="0" b="0"/>
             <wp:docPr id="1719185855" name="Imagem 10" descr="Uma imagem com texto, captura de ecrã, Tipo de letra, Marca&#10;&#10;Os conteúdos gerados por IA podem estar incorretos."/>
@@ -14627,27 +14201,14 @@
                             <w:r>
                               <w:t xml:space="preserve">Figura </w:t>
                             </w:r>
-                            <w:r>
-                              <w:fldChar w:fldCharType="begin"/>
-                            </w:r>
-                            <w:r>
-                              <w:instrText xml:space="preserve"> SEQ Figura \* ARABIC </w:instrText>
-                            </w:r>
-                            <w:r>
-                              <w:fldChar w:fldCharType="separate"/>
-                            </w:r>
-                            <w:r>
-                              <w:rPr>
-                                <w:noProof/>
-                              </w:rPr>
-                              <w:t>18</w:t>
-                            </w:r>
-                            <w:r>
-                              <w:rPr>
-                                <w:noProof/>
-                              </w:rPr>
-                              <w:fldChar w:fldCharType="end"/>
-                            </w:r>
+                            <w:fldSimple w:instr=" SEQ Figura \* ARABIC ">
+                              <w:r>
+                                <w:rPr>
+                                  <w:noProof/>
+                                </w:rPr>
+                                <w:t>18</w:t>
+                              </w:r>
+                            </w:fldSimple>
                             <w:r>
                               <w:t xml:space="preserve"> - Diagrama Sequência de Estado da Candidatura</w:t>
                             </w:r>
@@ -14692,27 +14253,14 @@
                       <w:r>
                         <w:t xml:space="preserve">Figura </w:t>
                       </w:r>
-                      <w:r>
-                        <w:fldChar w:fldCharType="begin"/>
-                      </w:r>
-                      <w:r>
-                        <w:instrText xml:space="preserve"> SEQ Figura \* ARABIC </w:instrText>
-                      </w:r>
-                      <w:r>
-                        <w:fldChar w:fldCharType="separate"/>
-                      </w:r>
-                      <w:r>
-                        <w:rPr>
-                          <w:noProof/>
-                        </w:rPr>
-                        <w:t>18</w:t>
-                      </w:r>
-                      <w:r>
-                        <w:rPr>
-                          <w:noProof/>
-                        </w:rPr>
-                        <w:fldChar w:fldCharType="end"/>
-                      </w:r>
+                      <w:fldSimple w:instr=" SEQ Figura \* ARABIC ">
+                        <w:r>
+                          <w:rPr>
+                            <w:noProof/>
+                          </w:rPr>
+                          <w:t>18</w:t>
+                        </w:r>
+                      </w:fldSimple>
                       <w:r>
                         <w:t xml:space="preserve"> - Diagrama Sequência de Estado da Candidatura</w:t>
                       </w:r>
@@ -18933,6 +18481,7 @@
   <w:style w:type="character" w:default="1" w:styleId="Tipodeletrapredefinidodopargrafo">
     <w:name w:val="Default Paragraph Font"/>
     <w:uiPriority w:val="1"/>
+    <w:semiHidden/>
     <w:unhideWhenUsed/>
   </w:style>
   <w:style w:type="table" w:default="1" w:styleId="Tabelanormal">

</xml_diff>

<commit_message>
Add group organization dossier and update report
Added 'Dossier de organização de grupo.pdf' to the docs folder and updated 'Relatorio.docx' with new content.
</commit_message>
<xml_diff>
--- a/docs/Relatorio.docx
+++ b/docs/Relatorio.docx
@@ -1,6 +1,6 @@
 
 <file path=word/document.xml><?xml version="1.0" encoding="utf-8"?>
-<w:document xmlns:wpc="http://schemas.microsoft.com/office/word/2010/wordprocessingCanvas" xmlns:cx="http://schemas.microsoft.com/office/drawing/2014/chartex" xmlns:cx1="http://schemas.microsoft.com/office/drawing/2015/9/8/chartex" xmlns:cx2="http://schemas.microsoft.com/office/drawing/2015/10/21/chartex" xmlns:cx3="http://schemas.microsoft.com/office/drawing/2016/5/9/chartex" xmlns:cx4="http://schemas.microsoft.com/office/drawing/2016/5/10/chartex" xmlns:cx5="http://schemas.microsoft.com/office/drawing/2016/5/11/chartex" xmlns:cx6="http://schemas.microsoft.com/office/drawing/2016/5/12/chartex" xmlns:cx7="http://schemas.microsoft.com/office/drawing/2016/5/13/chartex" xmlns:cx8="http://schemas.microsoft.com/office/drawing/2016/5/14/chartex" xmlns:mc="http://schemas.openxmlformats.org/markup-compatibility/2006" xmlns:aink="http://schemas.microsoft.com/office/drawing/2016/ink" xmlns:am3d="http://schemas.microsoft.com/office/drawing/2017/model3d" xmlns:o="urn:schemas-microsoft-com:office:office" xmlns:oel="http://schemas.microsoft.com/office/2019/extlst" xmlns:r="http://schemas.openxmlformats.org/officeDocument/2006/relationships" xmlns:m="http://schemas.openxmlformats.org/officeDocument/2006/math" xmlns:v="urn:schemas-microsoft-com:vml" xmlns:wp14="http://schemas.microsoft.com/office/word/2010/wordprocessingDrawing" xmlns:wp="http://schemas.openxmlformats.org/drawingml/2006/wordprocessingDrawing" xmlns:w10="urn:schemas-microsoft-com:office:word" xmlns:w="http://schemas.openxmlformats.org/wordprocessingml/2006/main" xmlns:w14="http://schemas.microsoft.com/office/word/2010/wordml" xmlns:w15="http://schemas.microsoft.com/office/word/2012/wordml" xmlns:w16cex="http://schemas.microsoft.com/office/word/2018/wordml/cex" xmlns:w16cid="http://schemas.microsoft.com/office/word/2016/wordml/cid" xmlns:w16="http://schemas.microsoft.com/office/word/2018/wordml" xmlns:w16du="http://schemas.microsoft.com/office/word/2023/wordml/word16du" xmlns:w16sdtdh="http://schemas.microsoft.com/office/word/2020/wordml/sdtdatahash" xmlns:w16sdtfl="http://schemas.microsoft.com/office/word/2024/wordml/sdtformatlock" xmlns:w16se="http://schemas.microsoft.com/office/word/2015/wordml/symex" xmlns:wpg="http://schemas.microsoft.com/office/word/2010/wordprocessingGroup" xmlns:wpi="http://schemas.microsoft.com/office/word/2010/wordprocessingInk" xmlns:wne="http://schemas.microsoft.com/office/word/2006/wordml" xmlns:wps="http://schemas.microsoft.com/office/word/2010/wordprocessingShape" mc:Ignorable="w14 w15 w16se w16cid w16 w16cex w16sdtdh w16sdtfl w16du wp14">
+<w:document xmlns:wpc="http://schemas.microsoft.com/office/word/2010/wordprocessingCanvas" xmlns:cx="http://schemas.microsoft.com/office/drawing/2014/chartex" xmlns:cx1="http://schemas.microsoft.com/office/drawing/2015/9/8/chartex" xmlns:cx2="http://schemas.microsoft.com/office/drawing/2015/10/21/chartex" xmlns:cx3="http://schemas.microsoft.com/office/drawing/2016/5/9/chartex" xmlns:cx4="http://schemas.microsoft.com/office/drawing/2016/5/10/chartex" xmlns:cx5="http://schemas.microsoft.com/office/drawing/2016/5/11/chartex" xmlns:cx6="http://schemas.microsoft.com/office/drawing/2016/5/12/chartex" xmlns:cx7="http://schemas.microsoft.com/office/drawing/2016/5/13/chartex" xmlns:cx8="http://schemas.microsoft.com/office/drawing/2016/5/14/chartex" xmlns:mc="http://schemas.openxmlformats.org/markup-compatibility/2006" xmlns:aink="http://schemas.microsoft.com/office/drawing/2016/ink" xmlns:am3d="http://schemas.microsoft.com/office/drawing/2017/model3d" xmlns:o="urn:schemas-microsoft-com:office:office" xmlns:r="http://schemas.openxmlformats.org/officeDocument/2006/relationships" xmlns:m="http://schemas.openxmlformats.org/officeDocument/2006/math" xmlns:v="urn:schemas-microsoft-com:vml" xmlns:wp14="http://schemas.microsoft.com/office/word/2010/wordprocessingDrawing" xmlns:wp="http://schemas.openxmlformats.org/drawingml/2006/wordprocessingDrawing" xmlns:w10="urn:schemas-microsoft-com:office:word" xmlns:w="http://schemas.openxmlformats.org/wordprocessingml/2006/main" xmlns:w14="http://schemas.microsoft.com/office/word/2010/wordml" xmlns:w15="http://schemas.microsoft.com/office/word/2012/wordml" xmlns:w16cex="http://schemas.microsoft.com/office/word/2018/wordml/cex" xmlns:w16cid="http://schemas.microsoft.com/office/word/2016/wordml/cid" xmlns:w16="http://schemas.microsoft.com/office/word/2018/wordml" xmlns:w16sdtdh="http://schemas.microsoft.com/office/word/2020/wordml/sdtdatahash" xmlns:w16se="http://schemas.microsoft.com/office/word/2015/wordml/symex" xmlns:wpg="http://schemas.microsoft.com/office/word/2010/wordprocessingGroup" xmlns:wpi="http://schemas.microsoft.com/office/word/2010/wordprocessingInk" xmlns:wne="http://schemas.microsoft.com/office/word/2006/wordml" xmlns:wps="http://schemas.microsoft.com/office/word/2010/wordprocessingShape" mc:Ignorable="w14 w15 w16se w16cid w16 w16cex w16sdtdh wp14">
   <w:body>
     <w:p>
       <w:pPr>
@@ -8085,15 +8085,7 @@
         <w:jc w:val="both"/>
       </w:pPr>
       <w:r>
-        <w:t xml:space="preserve">Face a este cenário, torna-se pertinente a criação de uma aplicação móvel de </w:t>
-      </w:r>
-      <w:proofErr w:type="spellStart"/>
-      <w:r>
-        <w:t>caráter</w:t>
-      </w:r>
-      <w:proofErr w:type="spellEnd"/>
-      <w:r>
-        <w:t xml:space="preserve"> administrativo, concebida exclusivamente para uso dos responsáveis pela Loja Social para simplificar e otimizar as tarefas de gestão da mesma.</w:t>
+        <w:t>Face a este cenário, torna-se pertinente a criação de uma aplicação móvel de caráter administrativo, concebida exclusivamente para uso dos responsáveis pela Loja Social para simplificar e otimizar as tarefas de gestão da mesma.</w:t>
       </w:r>
     </w:p>
     <w:p>
@@ -8187,15 +8179,7 @@
         <w:jc w:val="both"/>
       </w:pPr>
       <w:r>
-        <w:t xml:space="preserve">A Loja Social do IPCA é uma iniciativa de </w:t>
-      </w:r>
-      <w:proofErr w:type="spellStart"/>
-      <w:r>
-        <w:t>caráter</w:t>
-      </w:r>
-      <w:proofErr w:type="spellEnd"/>
-      <w:r>
-        <w:t xml:space="preserve"> solidário e sem fins lucrativos, criada com o propósito de apoiar a comunidade académica, em especial os estudantes em situação de vulnerabilidade socioeconómica. O seu funcionamento baseia-se na recolha de bens doados, que são posteriormente organizados e disponibilizados para distribuição de forma gratuita a quem deles necessite.</w:t>
+        <w:t>A Loja Social do IPCA é uma iniciativa de caráter solidário e sem fins lucrativos, criada com o propósito de apoiar a comunidade académica, em especial os estudantes em situação de vulnerabilidade socioeconómica. O seu funcionamento baseia-se na recolha de bens doados, que são posteriormente organizados e disponibilizados para distribuição de forma gratuita a quem deles necessite.</w:t>
       </w:r>
     </w:p>
     <w:p>
@@ -9238,27 +9222,14 @@
                             <w:r>
                               <w:t xml:space="preserve">Figura </w:t>
                             </w:r>
-                            <w:r>
-                              <w:fldChar w:fldCharType="begin"/>
-                            </w:r>
-                            <w:r>
-                              <w:instrText xml:space="preserve"> SEQ Figura \* ARABIC </w:instrText>
-                            </w:r>
-                            <w:r>
-                              <w:fldChar w:fldCharType="separate"/>
-                            </w:r>
-                            <w:r>
-                              <w:rPr>
-                                <w:noProof/>
-                              </w:rPr>
-                              <w:t>1</w:t>
-                            </w:r>
-                            <w:r>
-                              <w:rPr>
-                                <w:noProof/>
-                              </w:rPr>
-                              <w:fldChar w:fldCharType="end"/>
-                            </w:r>
+                            <w:fldSimple w:instr=" SEQ Figura \* ARABIC ">
+                              <w:r>
+                                <w:rPr>
+                                  <w:noProof/>
+                                </w:rPr>
+                                <w:t>1</w:t>
+                              </w:r>
+                            </w:fldSimple>
                             <w:r>
                               <w:t xml:space="preserve"> - Diagrama BPMN </w:t>
                             </w:r>
@@ -9287,7 +9258,7 @@
                 <v:stroke joinstyle="miter"/>
                 <v:path gradientshapeok="t" o:connecttype="rect"/>
               </v:shapetype>
-              <v:shape id="Caixa de texto 1" o:spid="_x0000_s1026" type="#_x0000_t202" style="position:absolute;margin-left:-62.05pt;margin-top:187.6pt;width:572.3pt;height:.05pt;z-index:251661312;visibility:visible;mso-wrap-style:square;mso-wrap-distance-left:9pt;mso-wrap-distance-top:0;mso-wrap-distance-right:9pt;mso-wrap-distance-bottom:0;mso-position-horizontal:absolute;mso-position-horizontal-relative:text;mso-position-vertical:absolute;mso-position-vertical-relative:text;v-text-anchor:top" o:gfxdata="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" stroked="f">
+              <v:shape id="Caixa de texto 1" o:spid="_x0000_s1026" type="#_x0000_t202" style="position:absolute;margin-left:-62.05pt;margin-top:187.6pt;width:572.3pt;height:.05pt;z-index:251661312;visibility:visible;mso-wrap-style:square;mso-wrap-distance-left:9pt;mso-wrap-distance-top:0;mso-wrap-distance-right:9pt;mso-wrap-distance-bottom:0;mso-position-horizontal:absolute;mso-position-horizontal-relative:text;mso-position-vertical:absolute;mso-position-vertical-relative:text;v-text-anchor:top" o:gfxdata="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" stroked="f">
                 <v:textbox style="mso-fit-shape-to-text:t" inset="0,0,0,0">
                   <w:txbxContent>
                     <w:p>
@@ -9304,27 +9275,14 @@
                       <w:r>
                         <w:t xml:space="preserve">Figura </w:t>
                       </w:r>
-                      <w:r>
-                        <w:fldChar w:fldCharType="begin"/>
-                      </w:r>
-                      <w:r>
-                        <w:instrText xml:space="preserve"> SEQ Figura \* ARABIC </w:instrText>
-                      </w:r>
-                      <w:r>
-                        <w:fldChar w:fldCharType="separate"/>
-                      </w:r>
-                      <w:r>
-                        <w:rPr>
-                          <w:noProof/>
-                        </w:rPr>
-                        <w:t>1</w:t>
-                      </w:r>
-                      <w:r>
-                        <w:rPr>
-                          <w:noProof/>
-                        </w:rPr>
-                        <w:fldChar w:fldCharType="end"/>
-                      </w:r>
+                      <w:fldSimple w:instr=" SEQ Figura \* ARABIC ">
+                        <w:r>
+                          <w:rPr>
+                            <w:noProof/>
+                          </w:rPr>
+                          <w:t>1</w:t>
+                        </w:r>
+                      </w:fldSimple>
                       <w:r>
                         <w:t xml:space="preserve"> - Diagrama BPMN </w:t>
                       </w:r>
@@ -9559,27 +9517,14 @@
                             <w:r>
                               <w:t xml:space="preserve">Figura </w:t>
                             </w:r>
-                            <w:r>
-                              <w:fldChar w:fldCharType="begin"/>
-                            </w:r>
-                            <w:r>
-                              <w:instrText xml:space="preserve"> SEQ Figura \* ARABIC </w:instrText>
-                            </w:r>
-                            <w:r>
-                              <w:fldChar w:fldCharType="separate"/>
-                            </w:r>
-                            <w:r>
-                              <w:rPr>
-                                <w:noProof/>
-                              </w:rPr>
-                              <w:t>2</w:t>
-                            </w:r>
-                            <w:r>
-                              <w:rPr>
-                                <w:noProof/>
-                              </w:rPr>
-                              <w:fldChar w:fldCharType="end"/>
-                            </w:r>
+                            <w:fldSimple w:instr=" SEQ Figura \* ARABIC ">
+                              <w:r>
+                                <w:rPr>
+                                  <w:noProof/>
+                                </w:rPr>
+                                <w:t>2</w:t>
+                              </w:r>
+                            </w:fldSimple>
                             <w:r>
                               <w:t xml:space="preserve"> - Diagrama BPMN </w:t>
                             </w:r>
@@ -9604,7 +9549,7 @@
           </mc:Choice>
           <mc:Fallback>
             <w:pict>
-              <v:shape w14:anchorId="7086C7D4" id="_x0000_s1027" type="#_x0000_t202" style="position:absolute;left:0;text-align:left;margin-left:22.3pt;margin-top:197.5pt;width:572.3pt;height:.05pt;z-index:251711488;visibility:visible;mso-wrap-style:square;mso-wrap-distance-left:9pt;mso-wrap-distance-top:0;mso-wrap-distance-right:9pt;mso-wrap-distance-bottom:0;mso-position-horizontal:absolute;mso-position-horizontal-relative:page;mso-position-vertical:absolute;mso-position-vertical-relative:text;v-text-anchor:top" o:gfxdata="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" stroked="f">
+              <v:shape w14:anchorId="7086C7D4" id="_x0000_s1027" type="#_x0000_t202" style="position:absolute;left:0;text-align:left;margin-left:22.3pt;margin-top:197.5pt;width:572.3pt;height:.05pt;z-index:251711488;visibility:visible;mso-wrap-style:square;mso-wrap-distance-left:9pt;mso-wrap-distance-top:0;mso-wrap-distance-right:9pt;mso-wrap-distance-bottom:0;mso-position-horizontal:absolute;mso-position-horizontal-relative:page;mso-position-vertical:absolute;mso-position-vertical-relative:text;v-text-anchor:top" o:gfxdata="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" stroked="f">
                 <v:textbox style="mso-fit-shape-to-text:t" inset="0,0,0,0">
                   <w:txbxContent>
                     <w:p>
@@ -9621,27 +9566,14 @@
                       <w:r>
                         <w:t xml:space="preserve">Figura </w:t>
                       </w:r>
-                      <w:r>
-                        <w:fldChar w:fldCharType="begin"/>
-                      </w:r>
-                      <w:r>
-                        <w:instrText xml:space="preserve"> SEQ Figura \* ARABIC </w:instrText>
-                      </w:r>
-                      <w:r>
-                        <w:fldChar w:fldCharType="separate"/>
-                      </w:r>
-                      <w:r>
-                        <w:rPr>
-                          <w:noProof/>
-                        </w:rPr>
-                        <w:t>2</w:t>
-                      </w:r>
-                      <w:r>
-                        <w:rPr>
-                          <w:noProof/>
-                        </w:rPr>
-                        <w:fldChar w:fldCharType="end"/>
-                      </w:r>
+                      <w:fldSimple w:instr=" SEQ Figura \* ARABIC ">
+                        <w:r>
+                          <w:rPr>
+                            <w:noProof/>
+                          </w:rPr>
+                          <w:t>2</w:t>
+                        </w:r>
+                      </w:fldSimple>
                       <w:r>
                         <w:t xml:space="preserve"> - Diagrama BPMN </w:t>
                       </w:r>
@@ -9873,27 +9805,14 @@
       <w:r>
         <w:t xml:space="preserve">Figura </w:t>
       </w:r>
-      <w:r>
-        <w:fldChar w:fldCharType="begin"/>
-      </w:r>
-      <w:r>
-        <w:instrText xml:space="preserve"> SEQ Figura \* ARABIC </w:instrText>
-      </w:r>
-      <w:r>
-        <w:fldChar w:fldCharType="separate"/>
-      </w:r>
-      <w:r>
-        <w:rPr>
-          <w:noProof/>
-        </w:rPr>
-        <w:t>3</w:t>
-      </w:r>
-      <w:r>
-        <w:rPr>
-          <w:noProof/>
-        </w:rPr>
-        <w:fldChar w:fldCharType="end"/>
-      </w:r>
+      <w:fldSimple w:instr=" SEQ Figura \* ARABIC ">
+        <w:r>
+          <w:rPr>
+            <w:noProof/>
+          </w:rPr>
+          <w:t>3</w:t>
+        </w:r>
+      </w:fldSimple>
       <w:r>
         <w:t xml:space="preserve"> - </w:t>
       </w:r>
@@ -10059,27 +9978,14 @@
                             <w:r>
                               <w:t xml:space="preserve">Figura </w:t>
                             </w:r>
-                            <w:r>
-                              <w:fldChar w:fldCharType="begin"/>
-                            </w:r>
-                            <w:r>
-                              <w:instrText xml:space="preserve"> SEQ Figura \* ARABIC </w:instrText>
-                            </w:r>
-                            <w:r>
-                              <w:fldChar w:fldCharType="separate"/>
-                            </w:r>
-                            <w:r>
-                              <w:rPr>
-                                <w:noProof/>
-                              </w:rPr>
-                              <w:t>4</w:t>
-                            </w:r>
-                            <w:r>
-                              <w:rPr>
-                                <w:noProof/>
-                              </w:rPr>
-                              <w:fldChar w:fldCharType="end"/>
-                            </w:r>
+                            <w:fldSimple w:instr=" SEQ Figura \* ARABIC ">
+                              <w:r>
+                                <w:rPr>
+                                  <w:noProof/>
+                                </w:rPr>
+                                <w:t>4</w:t>
+                              </w:r>
+                            </w:fldSimple>
                             <w:r>
                               <w:t xml:space="preserve"> - Diagrama BPMN Agendamento De Entregas</w:t>
                             </w:r>
@@ -10101,7 +10007,7 @@
           </mc:Choice>
           <mc:Fallback>
             <w:pict>
-              <v:shape w14:anchorId="2DBB5D37" id="_x0000_s1028" type="#_x0000_t202" style="position:absolute;margin-left:0;margin-top:172.45pt;width:551.1pt;height:.05pt;z-index:251667456;visibility:visible;mso-wrap-style:square;mso-wrap-distance-left:9pt;mso-wrap-distance-top:0;mso-wrap-distance-right:9pt;mso-wrap-distance-bottom:0;mso-position-horizontal:center;mso-position-horizontal-relative:page;mso-position-vertical:absolute;mso-position-vertical-relative:text;v-text-anchor:top" o:gfxdata="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" stroked="f">
+              <v:shape w14:anchorId="2DBB5D37" id="_x0000_s1028" type="#_x0000_t202" style="position:absolute;margin-left:0;margin-top:172.45pt;width:551.1pt;height:.05pt;z-index:251667456;visibility:visible;mso-wrap-style:square;mso-wrap-distance-left:9pt;mso-wrap-distance-top:0;mso-wrap-distance-right:9pt;mso-wrap-distance-bottom:0;mso-position-horizontal:center;mso-position-horizontal-relative:page;mso-position-vertical:absolute;mso-position-vertical-relative:text;v-text-anchor:top" o:gfxdata="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" stroked="f">
                 <v:textbox style="mso-fit-shape-to-text:t" inset="0,0,0,0">
                   <w:txbxContent>
                     <w:p>
@@ -10118,27 +10024,14 @@
                       <w:r>
                         <w:t xml:space="preserve">Figura </w:t>
                       </w:r>
-                      <w:r>
-                        <w:fldChar w:fldCharType="begin"/>
-                      </w:r>
-                      <w:r>
-                        <w:instrText xml:space="preserve"> SEQ Figura \* ARABIC </w:instrText>
-                      </w:r>
-                      <w:r>
-                        <w:fldChar w:fldCharType="separate"/>
-                      </w:r>
-                      <w:r>
-                        <w:rPr>
-                          <w:noProof/>
-                        </w:rPr>
-                        <w:t>4</w:t>
-                      </w:r>
-                      <w:r>
-                        <w:rPr>
-                          <w:noProof/>
-                        </w:rPr>
-                        <w:fldChar w:fldCharType="end"/>
-                      </w:r>
+                      <w:fldSimple w:instr=" SEQ Figura \* ARABIC ">
+                        <w:r>
+                          <w:rPr>
+                            <w:noProof/>
+                          </w:rPr>
+                          <w:t>4</w:t>
+                        </w:r>
+                      </w:fldSimple>
                       <w:r>
                         <w:t xml:space="preserve"> - Diagrama BPMN Agendamento De Entregas</w:t>
                       </w:r>
@@ -10410,27 +10303,14 @@
                             <w:r>
                               <w:t xml:space="preserve">Figura </w:t>
                             </w:r>
-                            <w:r>
-                              <w:fldChar w:fldCharType="begin"/>
-                            </w:r>
-                            <w:r>
-                              <w:instrText xml:space="preserve"> SEQ Figura \* ARABIC </w:instrText>
-                            </w:r>
-                            <w:r>
-                              <w:fldChar w:fldCharType="separate"/>
-                            </w:r>
-                            <w:r>
-                              <w:rPr>
-                                <w:noProof/>
-                              </w:rPr>
-                              <w:t>5</w:t>
-                            </w:r>
-                            <w:r>
-                              <w:rPr>
-                                <w:noProof/>
-                              </w:rPr>
-                              <w:fldChar w:fldCharType="end"/>
-                            </w:r>
+                            <w:fldSimple w:instr=" SEQ Figura \* ARABIC ">
+                              <w:r>
+                                <w:rPr>
+                                  <w:noProof/>
+                                </w:rPr>
+                                <w:t>5</w:t>
+                              </w:r>
+                            </w:fldSimple>
                             <w:r>
                               <w:t xml:space="preserve"> - Diagrama BPMN Gestão Benificiários</w:t>
                             </w:r>
@@ -10452,7 +10332,7 @@
           </mc:Choice>
           <mc:Fallback>
             <w:pict>
-              <v:shape w14:anchorId="2076352C" id="_x0000_s1029" type="#_x0000_t202" style="position:absolute;left:0;text-align:left;margin-left:0;margin-top:212pt;width:565.4pt;height:.05pt;z-index:251670528;visibility:visible;mso-wrap-style:square;mso-wrap-distance-left:9pt;mso-wrap-distance-top:0;mso-wrap-distance-right:9pt;mso-wrap-distance-bottom:0;mso-position-horizontal:center;mso-position-horizontal-relative:page;mso-position-vertical:absolute;mso-position-vertical-relative:text;v-text-anchor:top" o:gfxdata="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" stroked="f">
+              <v:shape w14:anchorId="2076352C" id="_x0000_s1029" type="#_x0000_t202" style="position:absolute;left:0;text-align:left;margin-left:0;margin-top:212pt;width:565.4pt;height:.05pt;z-index:251670528;visibility:visible;mso-wrap-style:square;mso-wrap-distance-left:9pt;mso-wrap-distance-top:0;mso-wrap-distance-right:9pt;mso-wrap-distance-bottom:0;mso-position-horizontal:center;mso-position-horizontal-relative:page;mso-position-vertical:absolute;mso-position-vertical-relative:text;v-text-anchor:top" o:gfxdata="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" stroked="f">
                 <v:textbox style="mso-fit-shape-to-text:t" inset="0,0,0,0">
                   <w:txbxContent>
                     <w:p>
@@ -10469,27 +10349,14 @@
                       <w:r>
                         <w:t xml:space="preserve">Figura </w:t>
                       </w:r>
-                      <w:r>
-                        <w:fldChar w:fldCharType="begin"/>
-                      </w:r>
-                      <w:r>
-                        <w:instrText xml:space="preserve"> SEQ Figura \* ARABIC </w:instrText>
-                      </w:r>
-                      <w:r>
-                        <w:fldChar w:fldCharType="separate"/>
-                      </w:r>
-                      <w:r>
-                        <w:rPr>
-                          <w:noProof/>
-                        </w:rPr>
-                        <w:t>5</w:t>
-                      </w:r>
-                      <w:r>
-                        <w:rPr>
-                          <w:noProof/>
-                        </w:rPr>
-                        <w:fldChar w:fldCharType="end"/>
-                      </w:r>
+                      <w:fldSimple w:instr=" SEQ Figura \* ARABIC ">
+                        <w:r>
+                          <w:rPr>
+                            <w:noProof/>
+                          </w:rPr>
+                          <w:t>5</w:t>
+                        </w:r>
+                      </w:fldSimple>
                       <w:r>
                         <w:t xml:space="preserve"> - Diagrama BPMN Gestão Benificiários</w:t>
                       </w:r>
@@ -11717,7 +11584,7 @@
             </w:pPr>
             <w:proofErr w:type="spellStart"/>
             <w:r>
-              <w:t>PostgreSQL</w:t>
+              <w:t>SupaBase</w:t>
             </w:r>
             <w:proofErr w:type="spellEnd"/>
           </w:p>
@@ -11809,27 +11676,14 @@
       <w:r>
         <w:t xml:space="preserve">Figura </w:t>
       </w:r>
-      <w:r>
-        <w:fldChar w:fldCharType="begin"/>
-      </w:r>
-      <w:r>
-        <w:instrText xml:space="preserve"> SEQ Figura \* ARABIC </w:instrText>
-      </w:r>
-      <w:r>
-        <w:fldChar w:fldCharType="separate"/>
-      </w:r>
-      <w:r>
-        <w:rPr>
-          <w:noProof/>
-        </w:rPr>
-        <w:t>6</w:t>
-      </w:r>
-      <w:r>
-        <w:rPr>
-          <w:noProof/>
-        </w:rPr>
-        <w:fldChar w:fldCharType="end"/>
-      </w:r>
+      <w:fldSimple w:instr=" SEQ Figura \* ARABIC ">
+        <w:r>
+          <w:rPr>
+            <w:noProof/>
+          </w:rPr>
+          <w:t>6</w:t>
+        </w:r>
+      </w:fldSimple>
       <w:r>
         <w:t xml:space="preserve"> - Diagrama Arquitetura </w:t>
       </w:r>
@@ -11962,27 +11816,14 @@
       <w:r>
         <w:t xml:space="preserve">Figura </w:t>
       </w:r>
-      <w:r>
-        <w:fldChar w:fldCharType="begin"/>
-      </w:r>
-      <w:r>
-        <w:instrText xml:space="preserve"> SEQ Figura \* ARABIC </w:instrText>
-      </w:r>
-      <w:r>
-        <w:fldChar w:fldCharType="separate"/>
-      </w:r>
-      <w:r>
-        <w:rPr>
-          <w:noProof/>
-        </w:rPr>
-        <w:t>7</w:t>
-      </w:r>
-      <w:r>
-        <w:rPr>
-          <w:noProof/>
-        </w:rPr>
-        <w:fldChar w:fldCharType="end"/>
-      </w:r>
+      <w:fldSimple w:instr=" SEQ Figura \* ARABIC ">
+        <w:r>
+          <w:rPr>
+            <w:noProof/>
+          </w:rPr>
+          <w:t>7</w:t>
+        </w:r>
+      </w:fldSimple>
       <w:r>
         <w:t xml:space="preserve"> - Diagrama de Estados Pedir Apoio</w:t>
       </w:r>
@@ -12091,27 +11932,14 @@
       <w:r>
         <w:t xml:space="preserve">Figura </w:t>
       </w:r>
-      <w:r>
-        <w:fldChar w:fldCharType="begin"/>
-      </w:r>
-      <w:r>
-        <w:instrText xml:space="preserve"> SEQ Figura \* ARABIC </w:instrText>
-      </w:r>
-      <w:r>
-        <w:fldChar w:fldCharType="separate"/>
-      </w:r>
-      <w:r>
-        <w:rPr>
-          <w:noProof/>
-        </w:rPr>
-        <w:t>8</w:t>
-      </w:r>
-      <w:r>
-        <w:rPr>
-          <w:noProof/>
-        </w:rPr>
-        <w:fldChar w:fldCharType="end"/>
-      </w:r>
+      <w:fldSimple w:instr=" SEQ Figura \* ARABIC ">
+        <w:r>
+          <w:rPr>
+            <w:noProof/>
+          </w:rPr>
+          <w:t>8</w:t>
+        </w:r>
+      </w:fldSimple>
       <w:r>
         <w:t xml:space="preserve"> - </w:t>
       </w:r>
@@ -12254,27 +12082,14 @@
       <w:r>
         <w:t xml:space="preserve">Figura </w:t>
       </w:r>
-      <w:r>
-        <w:fldChar w:fldCharType="begin"/>
-      </w:r>
-      <w:r>
-        <w:instrText xml:space="preserve"> SEQ Figura \* ARABIC </w:instrText>
-      </w:r>
-      <w:r>
-        <w:fldChar w:fldCharType="separate"/>
-      </w:r>
-      <w:r>
-        <w:rPr>
-          <w:noProof/>
-        </w:rPr>
-        <w:t>9</w:t>
-      </w:r>
-      <w:r>
-        <w:rPr>
-          <w:noProof/>
-        </w:rPr>
-        <w:fldChar w:fldCharType="end"/>
-      </w:r>
+      <w:fldSimple w:instr=" SEQ Figura \* ARABIC ">
+        <w:r>
+          <w:rPr>
+            <w:noProof/>
+          </w:rPr>
+          <w:t>9</w:t>
+        </w:r>
+      </w:fldSimple>
       <w:r>
         <w:t xml:space="preserve"> - Diagrama de Estados Agendamento de Entregas</w:t>
       </w:r>
@@ -12394,27 +12209,14 @@
       <w:r>
         <w:t xml:space="preserve">Figura </w:t>
       </w:r>
-      <w:r>
-        <w:fldChar w:fldCharType="begin"/>
-      </w:r>
-      <w:r>
-        <w:instrText xml:space="preserve"> SEQ Figura \* ARABIC </w:instrText>
-      </w:r>
-      <w:r>
-        <w:fldChar w:fldCharType="separate"/>
-      </w:r>
-      <w:r>
-        <w:rPr>
-          <w:noProof/>
-        </w:rPr>
-        <w:t>10</w:t>
-      </w:r>
-      <w:r>
-        <w:rPr>
-          <w:noProof/>
-        </w:rPr>
-        <w:fldChar w:fldCharType="end"/>
-      </w:r>
+      <w:fldSimple w:instr=" SEQ Figura \* ARABIC ">
+        <w:r>
+          <w:rPr>
+            <w:noProof/>
+          </w:rPr>
+          <w:t>10</w:t>
+        </w:r>
+      </w:fldSimple>
       <w:r>
         <w:t xml:space="preserve"> - </w:t>
       </w:r>
@@ -12559,27 +12361,14 @@
                             <w:r>
                               <w:t xml:space="preserve">Figura </w:t>
                             </w:r>
-                            <w:r>
-                              <w:fldChar w:fldCharType="begin"/>
-                            </w:r>
-                            <w:r>
-                              <w:instrText xml:space="preserve"> SEQ Figura \* ARABIC </w:instrText>
-                            </w:r>
-                            <w:r>
-                              <w:fldChar w:fldCharType="separate"/>
-                            </w:r>
-                            <w:r>
-                              <w:rPr>
-                                <w:noProof/>
-                              </w:rPr>
-                              <w:t>11</w:t>
-                            </w:r>
-                            <w:r>
-                              <w:rPr>
-                                <w:noProof/>
-                              </w:rPr>
-                              <w:fldChar w:fldCharType="end"/>
-                            </w:r>
+                            <w:fldSimple w:instr=" SEQ Figura \* ARABIC ">
+                              <w:r>
+                                <w:rPr>
+                                  <w:noProof/>
+                                </w:rPr>
+                                <w:t>11</w:t>
+                              </w:r>
+                            </w:fldSimple>
                             <w:r>
                               <w:t xml:space="preserve"> - Diagrama de Casos de Uso de Candidatura</w:t>
                             </w:r>
@@ -12601,7 +12390,7 @@
           </mc:Choice>
           <mc:Fallback>
             <w:pict>
-              <v:shape w14:anchorId="564A8382" id="_x0000_s1030" type="#_x0000_t202" style="position:absolute;left:0;text-align:left;margin-left:0;margin-top:187.25pt;width:565.4pt;height:.05pt;z-index:251715584;visibility:visible;mso-wrap-style:square;mso-wrap-distance-left:9pt;mso-wrap-distance-top:0;mso-wrap-distance-right:9pt;mso-wrap-distance-bottom:0;mso-position-horizontal:center;mso-position-horizontal-relative:margin;mso-position-vertical:absolute;mso-position-vertical-relative:text;v-text-anchor:top" o:gfxdata="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" stroked="f">
+              <v:shape w14:anchorId="564A8382" id="_x0000_s1030" type="#_x0000_t202" style="position:absolute;left:0;text-align:left;margin-left:0;margin-top:187.25pt;width:565.4pt;height:.05pt;z-index:251715584;visibility:visible;mso-wrap-style:square;mso-wrap-distance-left:9pt;mso-wrap-distance-top:0;mso-wrap-distance-right:9pt;mso-wrap-distance-bottom:0;mso-position-horizontal:center;mso-position-horizontal-relative:margin;mso-position-vertical:absolute;mso-position-vertical-relative:text;v-text-anchor:top" o:gfxdata="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" stroked="f">
                 <v:textbox style="mso-fit-shape-to-text:t" inset="0,0,0,0">
                   <w:txbxContent>
                     <w:p>
@@ -12618,27 +12407,14 @@
                       <w:r>
                         <w:t xml:space="preserve">Figura </w:t>
                       </w:r>
-                      <w:r>
-                        <w:fldChar w:fldCharType="begin"/>
-                      </w:r>
-                      <w:r>
-                        <w:instrText xml:space="preserve"> SEQ Figura \* ARABIC </w:instrText>
-                      </w:r>
-                      <w:r>
-                        <w:fldChar w:fldCharType="separate"/>
-                      </w:r>
-                      <w:r>
-                        <w:rPr>
-                          <w:noProof/>
-                        </w:rPr>
-                        <w:t>11</w:t>
-                      </w:r>
-                      <w:r>
-                        <w:rPr>
-                          <w:noProof/>
-                        </w:rPr>
-                        <w:fldChar w:fldCharType="end"/>
-                      </w:r>
+                      <w:fldSimple w:instr=" SEQ Figura \* ARABIC ">
+                        <w:r>
+                          <w:rPr>
+                            <w:noProof/>
+                          </w:rPr>
+                          <w:t>11</w:t>
+                        </w:r>
+                      </w:fldSimple>
                       <w:r>
                         <w:t xml:space="preserve"> - Diagrama de Casos de Uso de Candidatura</w:t>
                       </w:r>
@@ -12905,27 +12681,14 @@
       <w:r>
         <w:t xml:space="preserve">Figura </w:t>
       </w:r>
-      <w:r>
-        <w:fldChar w:fldCharType="begin"/>
-      </w:r>
-      <w:r>
-        <w:instrText xml:space="preserve"> SEQ Figura \* ARABIC </w:instrText>
-      </w:r>
-      <w:r>
-        <w:fldChar w:fldCharType="separate"/>
-      </w:r>
-      <w:r>
-        <w:rPr>
-          <w:noProof/>
-        </w:rPr>
-        <w:t>12</w:t>
-      </w:r>
-      <w:r>
-        <w:rPr>
-          <w:noProof/>
-        </w:rPr>
-        <w:fldChar w:fldCharType="end"/>
-      </w:r>
+      <w:fldSimple w:instr=" SEQ Figura \* ARABIC ">
+        <w:r>
+          <w:rPr>
+            <w:noProof/>
+          </w:rPr>
+          <w:t>12</w:t>
+        </w:r>
+      </w:fldSimple>
       <w:r>
         <w:t xml:space="preserve"> - </w:t>
       </w:r>
@@ -13097,27 +12860,14 @@
                             <w:r>
                               <w:t xml:space="preserve">Figura </w:t>
                             </w:r>
-                            <w:r>
-                              <w:fldChar w:fldCharType="begin"/>
-                            </w:r>
-                            <w:r>
-                              <w:instrText xml:space="preserve"> SEQ Figura \* ARABIC </w:instrText>
-                            </w:r>
-                            <w:r>
-                              <w:fldChar w:fldCharType="separate"/>
-                            </w:r>
-                            <w:r>
-                              <w:rPr>
-                                <w:noProof/>
-                              </w:rPr>
-                              <w:t>13</w:t>
-                            </w:r>
-                            <w:r>
-                              <w:rPr>
-                                <w:noProof/>
-                              </w:rPr>
-                              <w:fldChar w:fldCharType="end"/>
-                            </w:r>
+                            <w:fldSimple w:instr=" SEQ Figura \* ARABIC ">
+                              <w:r>
+                                <w:rPr>
+                                  <w:noProof/>
+                                </w:rPr>
+                                <w:t>13</w:t>
+                              </w:r>
+                            </w:fldSimple>
                             <w:r>
                               <w:t xml:space="preserve"> - Diagrama de Casos de Uso da entrega de bens</w:t>
                             </w:r>
@@ -13139,7 +12889,7 @@
           </mc:Choice>
           <mc:Fallback>
             <w:pict>
-              <v:shape w14:anchorId="5B80D1A9" id="_x0000_s1031" type="#_x0000_t202" style="position:absolute;margin-left:-55.25pt;margin-top:259.65pt;width:565.4pt;height:.05pt;z-index:251717632;visibility:visible;mso-wrap-style:square;mso-wrap-distance-left:9pt;mso-wrap-distance-top:0;mso-wrap-distance-right:9pt;mso-wrap-distance-bottom:0;mso-position-horizontal:absolute;mso-position-horizontal-relative:margin;mso-position-vertical:absolute;mso-position-vertical-relative:text;v-text-anchor:top" o:gfxdata="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" stroked="f">
+              <v:shape w14:anchorId="5B80D1A9" id="_x0000_s1031" type="#_x0000_t202" style="position:absolute;margin-left:-55.25pt;margin-top:259.65pt;width:565.4pt;height:.05pt;z-index:251717632;visibility:visible;mso-wrap-style:square;mso-wrap-distance-left:9pt;mso-wrap-distance-top:0;mso-wrap-distance-right:9pt;mso-wrap-distance-bottom:0;mso-position-horizontal:absolute;mso-position-horizontal-relative:margin;mso-position-vertical:absolute;mso-position-vertical-relative:text;v-text-anchor:top" o:gfxdata="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" stroked="f">
                 <v:textbox style="mso-fit-shape-to-text:t" inset="0,0,0,0">
                   <w:txbxContent>
                     <w:p>
@@ -13156,27 +12906,14 @@
                       <w:r>
                         <w:t xml:space="preserve">Figura </w:t>
                       </w:r>
-                      <w:r>
-                        <w:fldChar w:fldCharType="begin"/>
-                      </w:r>
-                      <w:r>
-                        <w:instrText xml:space="preserve"> SEQ Figura \* ARABIC </w:instrText>
-                      </w:r>
-                      <w:r>
-                        <w:fldChar w:fldCharType="separate"/>
-                      </w:r>
-                      <w:r>
-                        <w:rPr>
-                          <w:noProof/>
-                        </w:rPr>
-                        <w:t>13</w:t>
-                      </w:r>
-                      <w:r>
-                        <w:rPr>
-                          <w:noProof/>
-                        </w:rPr>
-                        <w:fldChar w:fldCharType="end"/>
-                      </w:r>
+                      <w:fldSimple w:instr=" SEQ Figura \* ARABIC ">
+                        <w:r>
+                          <w:rPr>
+                            <w:noProof/>
+                          </w:rPr>
+                          <w:t>13</w:t>
+                        </w:r>
+                      </w:fldSimple>
                       <w:r>
                         <w:t xml:space="preserve"> - Diagrama de Casos de Uso da entrega de bens</w:t>
                       </w:r>
@@ -13370,27 +13107,14 @@
                             <w:r>
                               <w:t xml:space="preserve">Figura </w:t>
                             </w:r>
-                            <w:r>
-                              <w:fldChar w:fldCharType="begin"/>
-                            </w:r>
-                            <w:r>
-                              <w:instrText xml:space="preserve"> SEQ Figura \* ARABIC </w:instrText>
-                            </w:r>
-                            <w:r>
-                              <w:fldChar w:fldCharType="separate"/>
-                            </w:r>
-                            <w:r>
-                              <w:rPr>
-                                <w:noProof/>
-                              </w:rPr>
-                              <w:t>14</w:t>
-                            </w:r>
-                            <w:r>
-                              <w:rPr>
-                                <w:noProof/>
-                              </w:rPr>
-                              <w:fldChar w:fldCharType="end"/>
-                            </w:r>
+                            <w:fldSimple w:instr=" SEQ Figura \* ARABIC ">
+                              <w:r>
+                                <w:rPr>
+                                  <w:noProof/>
+                                </w:rPr>
+                                <w:t>14</w:t>
+                              </w:r>
+                            </w:fldSimple>
                             <w:r>
                               <w:t xml:space="preserve"> - Diagrama de Casos de Uso de Candidatura</w:t>
                             </w:r>
@@ -13412,7 +13136,7 @@
           </mc:Choice>
           <mc:Fallback>
             <w:pict>
-              <v:shape w14:anchorId="066E5DF1" id="_x0000_s1032" type="#_x0000_t202" style="position:absolute;margin-left:22.3pt;margin-top:170.1pt;width:565.4pt;height:.05pt;z-index:251719680;visibility:visible;mso-wrap-style:square;mso-wrap-distance-left:9pt;mso-wrap-distance-top:0;mso-wrap-distance-right:9pt;mso-wrap-distance-bottom:0;mso-position-horizontal:absolute;mso-position-horizontal-relative:page;mso-position-vertical:absolute;mso-position-vertical-relative:text;v-text-anchor:top" o:gfxdata="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" stroked="f">
+              <v:shape w14:anchorId="066E5DF1" id="_x0000_s1032" type="#_x0000_t202" style="position:absolute;margin-left:22.3pt;margin-top:170.1pt;width:565.4pt;height:.05pt;z-index:251719680;visibility:visible;mso-wrap-style:square;mso-wrap-distance-left:9pt;mso-wrap-distance-top:0;mso-wrap-distance-right:9pt;mso-wrap-distance-bottom:0;mso-position-horizontal:absolute;mso-position-horizontal-relative:page;mso-position-vertical:absolute;mso-position-vertical-relative:text;v-text-anchor:top" o:gfxdata="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" stroked="f">
                 <v:textbox style="mso-fit-shape-to-text:t" inset="0,0,0,0">
                   <w:txbxContent>
                     <w:p>
@@ -13429,27 +13153,14 @@
                       <w:r>
                         <w:t xml:space="preserve">Figura </w:t>
                       </w:r>
-                      <w:r>
-                        <w:fldChar w:fldCharType="begin"/>
-                      </w:r>
-                      <w:r>
-                        <w:instrText xml:space="preserve"> SEQ Figura \* ARABIC </w:instrText>
-                      </w:r>
-                      <w:r>
-                        <w:fldChar w:fldCharType="separate"/>
-                      </w:r>
-                      <w:r>
-                        <w:rPr>
-                          <w:noProof/>
-                        </w:rPr>
-                        <w:t>14</w:t>
-                      </w:r>
-                      <w:r>
-                        <w:rPr>
-                          <w:noProof/>
-                        </w:rPr>
-                        <w:fldChar w:fldCharType="end"/>
-                      </w:r>
+                      <w:fldSimple w:instr=" SEQ Figura \* ARABIC ">
+                        <w:r>
+                          <w:rPr>
+                            <w:noProof/>
+                          </w:rPr>
+                          <w:t>14</w:t>
+                        </w:r>
+                      </w:fldSimple>
                       <w:r>
                         <w:t xml:space="preserve"> - Diagrama de Casos de Uso de Candidatura</w:t>
                       </w:r>
@@ -13649,27 +13360,14 @@
                             <w:r>
                               <w:t xml:space="preserve">Figura </w:t>
                             </w:r>
-                            <w:r>
-                              <w:fldChar w:fldCharType="begin"/>
-                            </w:r>
-                            <w:r>
-                              <w:instrText xml:space="preserve"> SEQ Figura \* ARABIC </w:instrText>
-                            </w:r>
-                            <w:r>
-                              <w:fldChar w:fldCharType="separate"/>
-                            </w:r>
-                            <w:r>
-                              <w:rPr>
-                                <w:noProof/>
-                              </w:rPr>
-                              <w:t>15</w:t>
-                            </w:r>
-                            <w:r>
-                              <w:rPr>
-                                <w:noProof/>
-                              </w:rPr>
-                              <w:fldChar w:fldCharType="end"/>
-                            </w:r>
+                            <w:fldSimple w:instr=" SEQ Figura \* ARABIC ">
+                              <w:r>
+                                <w:rPr>
+                                  <w:noProof/>
+                                </w:rPr>
+                                <w:t>15</w:t>
+                              </w:r>
+                            </w:fldSimple>
                             <w:r>
                               <w:t xml:space="preserve"> - Diagram</w:t>
                             </w:r>
@@ -13697,7 +13395,7 @@
           </mc:Choice>
           <mc:Fallback>
             <w:pict>
-              <v:shape w14:anchorId="00213DF0" id="Text Box 1" o:spid="_x0000_s1033" type="#_x0000_t202" style="position:absolute;margin-left:0;margin-top:293.85pt;width:485.35pt;height:.05pt;z-index:-251642880;visibility:visible;mso-wrap-style:square;mso-wrap-distance-left:9pt;mso-wrap-distance-top:0;mso-wrap-distance-right:9pt;mso-wrap-distance-bottom:0;mso-position-horizontal:center;mso-position-horizontal-relative:page;mso-position-vertical:absolute;mso-position-vertical-relative:text;v-text-anchor:top" o:gfxdata="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" stroked="f">
+              <v:shape w14:anchorId="00213DF0" id="Text Box 1" o:spid="_x0000_s1033" type="#_x0000_t202" style="position:absolute;margin-left:0;margin-top:293.85pt;width:485.35pt;height:.05pt;z-index:-251642880;visibility:visible;mso-wrap-style:square;mso-wrap-distance-left:9pt;mso-wrap-distance-top:0;mso-wrap-distance-right:9pt;mso-wrap-distance-bottom:0;mso-position-horizontal:center;mso-position-horizontal-relative:page;mso-position-vertical:absolute;mso-position-vertical-relative:text;v-text-anchor:top" o:gfxdata="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" stroked="f">
                 <v:textbox style="mso-fit-shape-to-text:t" inset="0,0,0,0">
                   <w:txbxContent>
                     <w:p>
@@ -13713,27 +13411,14 @@
                       <w:r>
                         <w:t xml:space="preserve">Figura </w:t>
                       </w:r>
-                      <w:r>
-                        <w:fldChar w:fldCharType="begin"/>
-                      </w:r>
-                      <w:r>
-                        <w:instrText xml:space="preserve"> SEQ Figura \* ARABIC </w:instrText>
-                      </w:r>
-                      <w:r>
-                        <w:fldChar w:fldCharType="separate"/>
-                      </w:r>
-                      <w:r>
-                        <w:rPr>
-                          <w:noProof/>
-                        </w:rPr>
-                        <w:t>15</w:t>
-                      </w:r>
-                      <w:r>
-                        <w:rPr>
-                          <w:noProof/>
-                        </w:rPr>
-                        <w:fldChar w:fldCharType="end"/>
-                      </w:r>
+                      <w:fldSimple w:instr=" SEQ Figura \* ARABIC ">
+                        <w:r>
+                          <w:rPr>
+                            <w:noProof/>
+                          </w:rPr>
+                          <w:t>15</w:t>
+                        </w:r>
+                      </w:fldSimple>
                       <w:r>
                         <w:t xml:space="preserve"> - Diagram</w:t>
                       </w:r>
@@ -13858,7 +13543,7 @@
           <w:b/>
           <w:bCs/>
         </w:rPr>
-        <w:t>PostgreSQL</w:t>
+        <w:t>SupaBase</w:t>
       </w:r>
       <w:proofErr w:type="spellEnd"/>
       <w:r>
@@ -14397,27 +14082,14 @@
                             <w:r>
                               <w:t xml:space="preserve">Figura </w:t>
                             </w:r>
-                            <w:r>
-                              <w:fldChar w:fldCharType="begin"/>
-                            </w:r>
-                            <w:r>
-                              <w:instrText xml:space="preserve"> SEQ Figura \* ARABIC </w:instrText>
-                            </w:r>
-                            <w:r>
-                              <w:fldChar w:fldCharType="separate"/>
-                            </w:r>
-                            <w:r>
-                              <w:rPr>
-                                <w:noProof/>
-                              </w:rPr>
-                              <w:t>16</w:t>
-                            </w:r>
-                            <w:r>
-                              <w:rPr>
-                                <w:noProof/>
-                              </w:rPr>
-                              <w:fldChar w:fldCharType="end"/>
-                            </w:r>
+                            <w:fldSimple w:instr=" SEQ Figura \* ARABIC ">
+                              <w:r>
+                                <w:rPr>
+                                  <w:noProof/>
+                                </w:rPr>
+                                <w:t>16</w:t>
+                              </w:r>
+                            </w:fldSimple>
                             <w:r>
                               <w:t>- Diagrama de Classes</w:t>
                             </w:r>
@@ -14439,7 +14111,7 @@
           </mc:Choice>
           <mc:Fallback>
             <w:pict>
-              <v:shape w14:anchorId="668A83A5" id="_x0000_s1034" type="#_x0000_t202" style="position:absolute;margin-left:0;margin-top:222.05pt;width:527.35pt;height:.05pt;z-index:-251639808;visibility:visible;mso-wrap-style:square;mso-wrap-distance-left:9pt;mso-wrap-distance-top:0;mso-wrap-distance-right:9pt;mso-wrap-distance-bottom:0;mso-position-horizontal:center;mso-position-horizontal-relative:margin;mso-position-vertical:absolute;mso-position-vertical-relative:text;v-text-anchor:top" o:gfxdata="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" stroked="f">
+              <v:shape w14:anchorId="668A83A5" id="_x0000_s1034" type="#_x0000_t202" style="position:absolute;margin-left:0;margin-top:222.05pt;width:527.35pt;height:.05pt;z-index:-251639808;visibility:visible;mso-wrap-style:square;mso-wrap-distance-left:9pt;mso-wrap-distance-top:0;mso-wrap-distance-right:9pt;mso-wrap-distance-bottom:0;mso-position-horizontal:center;mso-position-horizontal-relative:margin;mso-position-vertical:absolute;mso-position-vertical-relative:text;v-text-anchor:top" o:gfxdata="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" stroked="f">
                 <v:textbox style="mso-fit-shape-to-text:t" inset="0,0,0,0">
                   <w:txbxContent>
                     <w:p>
@@ -14455,27 +14127,14 @@
                       <w:r>
                         <w:t xml:space="preserve">Figura </w:t>
                       </w:r>
-                      <w:r>
-                        <w:fldChar w:fldCharType="begin"/>
-                      </w:r>
-                      <w:r>
-                        <w:instrText xml:space="preserve"> SEQ Figura \* ARABIC </w:instrText>
-                      </w:r>
-                      <w:r>
-                        <w:fldChar w:fldCharType="separate"/>
-                      </w:r>
-                      <w:r>
-                        <w:rPr>
-                          <w:noProof/>
-                        </w:rPr>
-                        <w:t>16</w:t>
-                      </w:r>
-                      <w:r>
-                        <w:rPr>
-                          <w:noProof/>
-                        </w:rPr>
-                        <w:fldChar w:fldCharType="end"/>
-                      </w:r>
+                      <w:fldSimple w:instr=" SEQ Figura \* ARABIC ">
+                        <w:r>
+                          <w:rPr>
+                            <w:noProof/>
+                          </w:rPr>
+                          <w:t>16</w:t>
+                        </w:r>
+                      </w:fldSimple>
                       <w:r>
                         <w:t>- Diagrama de Classes</w:t>
                       </w:r>
@@ -14614,25 +14273,12 @@
         <w:t>), +</w:t>
       </w:r>
       <w:proofErr w:type="spellStart"/>
-      <w:proofErr w:type="gramStart"/>
       <w:r>
         <w:t>PrepararItens</w:t>
       </w:r>
       <w:proofErr w:type="spellEnd"/>
       <w:r>
-        <w:t>(</w:t>
-      </w:r>
-      <w:proofErr w:type="gramEnd"/>
-      <w:r>
-        <w:t>), +</w:t>
-      </w:r>
-      <w:proofErr w:type="gramStart"/>
-      <w:r>
-        <w:t>Login(</w:t>
-      </w:r>
-      <w:proofErr w:type="gramEnd"/>
-      <w:r>
-        <w:t xml:space="preserve">)), que representam as ações e funções que a aplicação executa para implementar os requisitos de negócio (como a verificação de expiração ou o fluxo de entrega). A estrutura da base de dados apenas define o </w:t>
+        <w:t xml:space="preserve">(), +Login()), que representam as ações e funções que a aplicação executa para implementar os requisitos de negócio (como a verificação de expiração ou o fluxo de entrega). A estrutura da base de dados apenas define o </w:t>
       </w:r>
       <w:r>
         <w:rPr>
@@ -14814,27 +14460,14 @@
                             <w:r>
                               <w:t xml:space="preserve">Figura </w:t>
                             </w:r>
-                            <w:r>
-                              <w:fldChar w:fldCharType="begin"/>
-                            </w:r>
-                            <w:r>
-                              <w:instrText xml:space="preserve"> SEQ Figura \* ARABIC </w:instrText>
-                            </w:r>
-                            <w:r>
-                              <w:fldChar w:fldCharType="separate"/>
-                            </w:r>
-                            <w:r>
-                              <w:rPr>
-                                <w:noProof/>
-                              </w:rPr>
-                              <w:t>17</w:t>
-                            </w:r>
-                            <w:r>
-                              <w:rPr>
-                                <w:noProof/>
-                              </w:rPr>
-                              <w:fldChar w:fldCharType="end"/>
-                            </w:r>
+                            <w:fldSimple w:instr=" SEQ Figura \* ARABIC ">
+                              <w:r>
+                                <w:rPr>
+                                  <w:noProof/>
+                                </w:rPr>
+                                <w:t>17</w:t>
+                              </w:r>
+                            </w:fldSimple>
                             <w:r>
                               <w:t>- Diagrama de Domínio</w:t>
                             </w:r>
@@ -14855,7 +14488,7 @@
           </mc:Choice>
           <mc:Fallback>
             <w:pict>
-              <v:shape w14:anchorId="19C2DD67" id="_x0000_s1035" type="#_x0000_t202" style="position:absolute;margin-left:0;margin-top:22.7pt;width:527.35pt;height:.05pt;z-index:-251636736;visibility:visible;mso-wrap-style:square;mso-wrap-distance-left:9pt;mso-wrap-distance-top:0;mso-wrap-distance-right:9pt;mso-wrap-distance-bottom:0;mso-position-horizontal:center;mso-position-horizontal-relative:margin;mso-position-vertical:absolute;mso-position-vertical-relative:text;v-text-anchor:top" o:gfxdata="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" stroked="f">
+              <v:shape w14:anchorId="19C2DD67" id="_x0000_s1035" type="#_x0000_t202" style="position:absolute;margin-left:0;margin-top:22.7pt;width:527.35pt;height:.05pt;z-index:-251636736;visibility:visible;mso-wrap-style:square;mso-wrap-distance-left:9pt;mso-wrap-distance-top:0;mso-wrap-distance-right:9pt;mso-wrap-distance-bottom:0;mso-position-horizontal:center;mso-position-horizontal-relative:margin;mso-position-vertical:absolute;mso-position-vertical-relative:text;v-text-anchor:top" o:gfxdata="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" stroked="f">
                 <v:textbox style="mso-fit-shape-to-text:t" inset="0,0,0,0">
                   <w:txbxContent>
                     <w:p>
@@ -14870,27 +14503,14 @@
                       <w:r>
                         <w:t xml:space="preserve">Figura </w:t>
                       </w:r>
-                      <w:r>
-                        <w:fldChar w:fldCharType="begin"/>
-                      </w:r>
-                      <w:r>
-                        <w:instrText xml:space="preserve"> SEQ Figura \* ARABIC </w:instrText>
-                      </w:r>
-                      <w:r>
-                        <w:fldChar w:fldCharType="separate"/>
-                      </w:r>
-                      <w:r>
-                        <w:rPr>
-                          <w:noProof/>
-                        </w:rPr>
-                        <w:t>17</w:t>
-                      </w:r>
-                      <w:r>
-                        <w:rPr>
-                          <w:noProof/>
-                        </w:rPr>
-                        <w:fldChar w:fldCharType="end"/>
-                      </w:r>
+                      <w:fldSimple w:instr=" SEQ Figura \* ARABIC ">
+                        <w:r>
+                          <w:rPr>
+                            <w:noProof/>
+                          </w:rPr>
+                          <w:t>17</w:t>
+                        </w:r>
+                      </w:fldSimple>
                       <w:r>
                         <w:t>- Diagrama de Domínio</w:t>
                       </w:r>
@@ -15052,27 +14672,14 @@
                             <w:r>
                               <w:t xml:space="preserve">Figura </w:t>
                             </w:r>
-                            <w:r>
-                              <w:fldChar w:fldCharType="begin"/>
-                            </w:r>
-                            <w:r>
-                              <w:instrText xml:space="preserve"> SEQ Figura \* ARABIC </w:instrText>
-                            </w:r>
-                            <w:r>
-                              <w:fldChar w:fldCharType="separate"/>
-                            </w:r>
-                            <w:r>
-                              <w:rPr>
-                                <w:noProof/>
-                              </w:rPr>
-                              <w:t>18</w:t>
-                            </w:r>
-                            <w:r>
-                              <w:rPr>
-                                <w:noProof/>
-                              </w:rPr>
-                              <w:fldChar w:fldCharType="end"/>
-                            </w:r>
+                            <w:fldSimple w:instr=" SEQ Figura \* ARABIC ">
+                              <w:r>
+                                <w:rPr>
+                                  <w:noProof/>
+                                </w:rPr>
+                                <w:t>18</w:t>
+                              </w:r>
+                            </w:fldSimple>
                             <w:r>
                               <w:t xml:space="preserve">- </w:t>
                             </w:r>
@@ -15101,7 +14708,7 @@
           </mc:Choice>
           <mc:Fallback>
             <w:pict>
-              <v:shape w14:anchorId="5C2189B4" id="_x0000_s1036" type="#_x0000_t202" style="position:absolute;left:0;text-align:left;margin-left:0;margin-top:461.05pt;width:527.35pt;height:.05pt;z-index:-251588608;visibility:visible;mso-wrap-style:square;mso-wrap-distance-left:9pt;mso-wrap-distance-top:0;mso-wrap-distance-right:9pt;mso-wrap-distance-bottom:0;mso-position-horizontal:center;mso-position-horizontal-relative:margin;mso-position-vertical:absolute;mso-position-vertical-relative:text;v-text-anchor:top" o:gfxdata="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" stroked="f">
+              <v:shape w14:anchorId="5C2189B4" id="_x0000_s1036" type="#_x0000_t202" style="position:absolute;left:0;text-align:left;margin-left:0;margin-top:461.05pt;width:527.35pt;height:.05pt;z-index:-251588608;visibility:visible;mso-wrap-style:square;mso-wrap-distance-left:9pt;mso-wrap-distance-top:0;mso-wrap-distance-right:9pt;mso-wrap-distance-bottom:0;mso-position-horizontal:center;mso-position-horizontal-relative:margin;mso-position-vertical:absolute;mso-position-vertical-relative:text;v-text-anchor:top" o:gfxdata="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" stroked="f">
                 <v:textbox style="mso-fit-shape-to-text:t" inset="0,0,0,0">
                   <w:txbxContent>
                     <w:p>
@@ -15116,27 +14723,14 @@
                       <w:r>
                         <w:t xml:space="preserve">Figura </w:t>
                       </w:r>
-                      <w:r>
-                        <w:fldChar w:fldCharType="begin"/>
-                      </w:r>
-                      <w:r>
-                        <w:instrText xml:space="preserve"> SEQ Figura \* ARABIC </w:instrText>
-                      </w:r>
-                      <w:r>
-                        <w:fldChar w:fldCharType="separate"/>
-                      </w:r>
-                      <w:r>
-                        <w:rPr>
-                          <w:noProof/>
-                        </w:rPr>
-                        <w:t>18</w:t>
-                      </w:r>
-                      <w:r>
-                        <w:rPr>
-                          <w:noProof/>
-                        </w:rPr>
-                        <w:fldChar w:fldCharType="end"/>
-                      </w:r>
+                      <w:fldSimple w:instr=" SEQ Figura \* ARABIC ">
+                        <w:r>
+                          <w:rPr>
+                            <w:noProof/>
+                          </w:rPr>
+                          <w:t>18</w:t>
+                        </w:r>
+                      </w:fldSimple>
                       <w:r>
                         <w:t xml:space="preserve">- </w:t>
                       </w:r>
@@ -15158,6 +14752,9 @@
         </mc:AlternateContent>
       </w:r>
       <w:r>
+        <w:rPr>
+          <w:noProof/>
+        </w:rPr>
         <w:drawing>
           <wp:inline distT="0" distB="0" distL="0" distR="0" wp14:anchorId="76DB8A07" wp14:editId="7BCC97A3">
             <wp:extent cx="5579745" cy="5706745"/>
@@ -15276,27 +14873,14 @@
                             <w:r>
                               <w:t xml:space="preserve">Figura </w:t>
                             </w:r>
-                            <w:r>
-                              <w:fldChar w:fldCharType="begin"/>
-                            </w:r>
-                            <w:r>
-                              <w:instrText xml:space="preserve"> SEQ Figura \* ARABIC </w:instrText>
-                            </w:r>
-                            <w:r>
-                              <w:fldChar w:fldCharType="separate"/>
-                            </w:r>
-                            <w:r>
-                              <w:rPr>
-                                <w:noProof/>
-                              </w:rPr>
-                              <w:t>19</w:t>
-                            </w:r>
-                            <w:r>
-                              <w:rPr>
-                                <w:noProof/>
-                              </w:rPr>
-                              <w:fldChar w:fldCharType="end"/>
-                            </w:r>
+                            <w:fldSimple w:instr=" SEQ Figura \* ARABIC ">
+                              <w:r>
+                                <w:rPr>
+                                  <w:noProof/>
+                                </w:rPr>
+                                <w:t>19</w:t>
+                              </w:r>
+                            </w:fldSimple>
                             <w:r>
                               <w:t xml:space="preserve">- </w:t>
                             </w:r>
@@ -15306,10 +14890,7 @@
                             </w:r>
                             <w:proofErr w:type="spellEnd"/>
                             <w:r>
-                              <w:t xml:space="preserve"> </w:t>
-                            </w:r>
-                            <w:r>
-                              <w:t>da página de edição de perfil</w:t>
+                              <w:t xml:space="preserve"> da página de edição de perfil</w:t>
                             </w:r>
                           </w:p>
                         </w:txbxContent>
@@ -15328,7 +14909,7 @@
           </mc:Choice>
           <mc:Fallback>
             <w:pict>
-              <v:shape w14:anchorId="0F4B2EF8" id="_x0000_s1037" type="#_x0000_t202" style="position:absolute;left:0;text-align:left;margin-left:0;margin-top:553.2pt;width:527.35pt;height:.05pt;z-index:-251586560;visibility:visible;mso-wrap-style:square;mso-wrap-distance-left:9pt;mso-wrap-distance-top:0;mso-wrap-distance-right:9pt;mso-wrap-distance-bottom:0;mso-position-horizontal:center;mso-position-horizontal-relative:page;mso-position-vertical:absolute;mso-position-vertical-relative:text;v-text-anchor:top" o:gfxdata="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" stroked="f">
+              <v:shape w14:anchorId="0F4B2EF8" id="_x0000_s1037" type="#_x0000_t202" style="position:absolute;left:0;text-align:left;margin-left:0;margin-top:553.2pt;width:527.35pt;height:.05pt;z-index:-251586560;visibility:visible;mso-wrap-style:square;mso-wrap-distance-left:9pt;mso-wrap-distance-top:0;mso-wrap-distance-right:9pt;mso-wrap-distance-bottom:0;mso-position-horizontal:center;mso-position-horizontal-relative:page;mso-position-vertical:absolute;mso-position-vertical-relative:text;v-text-anchor:top" o:gfxdata="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" stroked="f">
                 <v:textbox style="mso-fit-shape-to-text:t" inset="0,0,0,0">
                   <w:txbxContent>
                     <w:p>
@@ -15343,27 +14924,14 @@
                       <w:r>
                         <w:t xml:space="preserve">Figura </w:t>
                       </w:r>
-                      <w:r>
-                        <w:fldChar w:fldCharType="begin"/>
-                      </w:r>
-                      <w:r>
-                        <w:instrText xml:space="preserve"> SEQ Figura \* ARABIC </w:instrText>
-                      </w:r>
-                      <w:r>
-                        <w:fldChar w:fldCharType="separate"/>
-                      </w:r>
-                      <w:r>
-                        <w:rPr>
-                          <w:noProof/>
-                        </w:rPr>
-                        <w:t>19</w:t>
-                      </w:r>
-                      <w:r>
-                        <w:rPr>
-                          <w:noProof/>
-                        </w:rPr>
-                        <w:fldChar w:fldCharType="end"/>
-                      </w:r>
+                      <w:fldSimple w:instr=" SEQ Figura \* ARABIC ">
+                        <w:r>
+                          <w:rPr>
+                            <w:noProof/>
+                          </w:rPr>
+                          <w:t>19</w:t>
+                        </w:r>
+                      </w:fldSimple>
                       <w:r>
                         <w:t xml:space="preserve">- </w:t>
                       </w:r>
@@ -15373,10 +14941,7 @@
                       </w:r>
                       <w:proofErr w:type="spellEnd"/>
                       <w:r>
-                        <w:t xml:space="preserve"> </w:t>
-                      </w:r>
-                      <w:r>
-                        <w:t>da página de edição de perfil</w:t>
+                        <w:t xml:space="preserve"> da página de edição de perfil</w:t>
                       </w:r>
                     </w:p>
                   </w:txbxContent>
@@ -15388,6 +14953,9 @@
         </mc:AlternateContent>
       </w:r>
       <w:r>
+        <w:rPr>
+          <w:noProof/>
+        </w:rPr>
         <w:drawing>
           <wp:inline distT="0" distB="0" distL="0" distR="0" wp14:anchorId="48FF3760" wp14:editId="440EF7DC">
             <wp:extent cx="3229426" cy="6868484"/>
@@ -15506,27 +15074,14 @@
                             <w:r>
                               <w:t xml:space="preserve">Figura </w:t>
                             </w:r>
-                            <w:r>
-                              <w:fldChar w:fldCharType="begin"/>
-                            </w:r>
-                            <w:r>
-                              <w:instrText xml:space="preserve"> SEQ Figura \* ARABIC </w:instrText>
-                            </w:r>
-                            <w:r>
-                              <w:fldChar w:fldCharType="separate"/>
-                            </w:r>
-                            <w:r>
-                              <w:rPr>
-                                <w:noProof/>
-                              </w:rPr>
-                              <w:t>20</w:t>
-                            </w:r>
-                            <w:r>
-                              <w:rPr>
-                                <w:noProof/>
-                              </w:rPr>
-                              <w:fldChar w:fldCharType="end"/>
-                            </w:r>
+                            <w:fldSimple w:instr=" SEQ Figura \* ARABIC ">
+                              <w:r>
+                                <w:rPr>
+                                  <w:noProof/>
+                                </w:rPr>
+                                <w:t>20</w:t>
+                              </w:r>
+                            </w:fldSimple>
                             <w:r>
                               <w:t xml:space="preserve">- </w:t>
                             </w:r>
@@ -15536,10 +15091,7 @@
                             </w:r>
                             <w:proofErr w:type="spellEnd"/>
                             <w:r>
-                              <w:t xml:space="preserve"> </w:t>
-                            </w:r>
-                            <w:r>
-                              <w:t>da página de edição de Palavra-passe</w:t>
+                              <w:t xml:space="preserve"> da página de edição de Palavra-passe</w:t>
                             </w:r>
                           </w:p>
                         </w:txbxContent>
@@ -15558,7 +15110,7 @@
           </mc:Choice>
           <mc:Fallback>
             <w:pict>
-              <v:shape w14:anchorId="5F1D4D1B" id="_x0000_s1038" type="#_x0000_t202" style="position:absolute;left:0;text-align:left;margin-left:0;margin-top:550.7pt;width:527.35pt;height:.05pt;z-index:-251584512;visibility:visible;mso-wrap-style:square;mso-wrap-distance-left:9pt;mso-wrap-distance-top:0;mso-wrap-distance-right:9pt;mso-wrap-distance-bottom:0;mso-position-horizontal:center;mso-position-horizontal-relative:margin;mso-position-vertical:absolute;mso-position-vertical-relative:text;v-text-anchor:top" o:gfxdata="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" stroked="f">
+              <v:shape w14:anchorId="5F1D4D1B" id="_x0000_s1038" type="#_x0000_t202" style="position:absolute;left:0;text-align:left;margin-left:0;margin-top:550.7pt;width:527.35pt;height:.05pt;z-index:-251584512;visibility:visible;mso-wrap-style:square;mso-wrap-distance-left:9pt;mso-wrap-distance-top:0;mso-wrap-distance-right:9pt;mso-wrap-distance-bottom:0;mso-position-horizontal:center;mso-position-horizontal-relative:margin;mso-position-vertical:absolute;mso-position-vertical-relative:text;v-text-anchor:top" o:gfxdata="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" stroked="f">
                 <v:textbox style="mso-fit-shape-to-text:t" inset="0,0,0,0">
                   <w:txbxContent>
                     <w:p>
@@ -15573,27 +15125,14 @@
                       <w:r>
                         <w:t xml:space="preserve">Figura </w:t>
                       </w:r>
-                      <w:r>
-                        <w:fldChar w:fldCharType="begin"/>
-                      </w:r>
-                      <w:r>
-                        <w:instrText xml:space="preserve"> SEQ Figura \* ARABIC </w:instrText>
-                      </w:r>
-                      <w:r>
-                        <w:fldChar w:fldCharType="separate"/>
-                      </w:r>
-                      <w:r>
-                        <w:rPr>
-                          <w:noProof/>
-                        </w:rPr>
-                        <w:t>20</w:t>
-                      </w:r>
-                      <w:r>
-                        <w:rPr>
-                          <w:noProof/>
-                        </w:rPr>
-                        <w:fldChar w:fldCharType="end"/>
-                      </w:r>
+                      <w:fldSimple w:instr=" SEQ Figura \* ARABIC ">
+                        <w:r>
+                          <w:rPr>
+                            <w:noProof/>
+                          </w:rPr>
+                          <w:t>20</w:t>
+                        </w:r>
+                      </w:fldSimple>
                       <w:r>
                         <w:t xml:space="preserve">- </w:t>
                       </w:r>
@@ -15603,10 +15142,7 @@
                       </w:r>
                       <w:proofErr w:type="spellEnd"/>
                       <w:r>
-                        <w:t xml:space="preserve"> </w:t>
-                      </w:r>
-                      <w:r>
-                        <w:t>da página de edição de Palavra-passe</w:t>
+                        <w:t xml:space="preserve"> da página de edição de Palavra-passe</w:t>
                       </w:r>
                     </w:p>
                   </w:txbxContent>
@@ -15618,6 +15154,9 @@
         </mc:AlternateContent>
       </w:r>
       <w:r>
+        <w:rPr>
+          <w:noProof/>
+        </w:rPr>
         <w:drawing>
           <wp:inline distT="0" distB="0" distL="0" distR="0" wp14:anchorId="054989D1" wp14:editId="2A9CE462">
             <wp:extent cx="3238952" cy="6868484"/>
@@ -15746,27 +15285,14 @@
       <w:r>
         <w:t xml:space="preserve">Figura </w:t>
       </w:r>
-      <w:r>
-        <w:fldChar w:fldCharType="begin"/>
-      </w:r>
-      <w:r>
-        <w:instrText xml:space="preserve"> SEQ Figura \* ARABIC </w:instrText>
-      </w:r>
-      <w:r>
-        <w:fldChar w:fldCharType="separate"/>
-      </w:r>
-      <w:r>
-        <w:rPr>
-          <w:noProof/>
-        </w:rPr>
-        <w:t>21</w:t>
-      </w:r>
-      <w:r>
-        <w:rPr>
-          <w:noProof/>
-        </w:rPr>
-        <w:fldChar w:fldCharType="end"/>
-      </w:r>
+      <w:fldSimple w:instr=" SEQ Figura \* ARABIC ">
+        <w:r>
+          <w:rPr>
+            <w:noProof/>
+          </w:rPr>
+          <w:t>21</w:t>
+        </w:r>
+      </w:fldSimple>
       <w:r>
         <w:t xml:space="preserve"> - </w:t>
       </w:r>
@@ -15856,27 +15382,14 @@
                             <w:r>
                               <w:t xml:space="preserve">Figura </w:t>
                             </w:r>
-                            <w:r>
-                              <w:fldChar w:fldCharType="begin"/>
-                            </w:r>
-                            <w:r>
-                              <w:instrText xml:space="preserve"> SEQ Figura \* ARABIC </w:instrText>
-                            </w:r>
-                            <w:r>
-                              <w:fldChar w:fldCharType="separate"/>
-                            </w:r>
-                            <w:r>
-                              <w:rPr>
-                                <w:noProof/>
-                              </w:rPr>
-                              <w:t>22</w:t>
-                            </w:r>
-                            <w:r>
-                              <w:rPr>
-                                <w:noProof/>
-                              </w:rPr>
-                              <w:fldChar w:fldCharType="end"/>
-                            </w:r>
+                            <w:fldSimple w:instr=" SEQ Figura \* ARABIC ">
+                              <w:r>
+                                <w:rPr>
+                                  <w:noProof/>
+                                </w:rPr>
+                                <w:t>22</w:t>
+                              </w:r>
+                            </w:fldSimple>
                             <w:r>
                               <w:t xml:space="preserve">- </w:t>
                             </w:r>
@@ -15905,7 +15418,7 @@
           </mc:Choice>
           <mc:Fallback>
             <w:pict>
-              <v:shape w14:anchorId="54804F3E" id="_x0000_s1039" type="#_x0000_t202" style="position:absolute;left:0;text-align:left;margin-left:0;margin-top:462.35pt;width:527.35pt;height:.05pt;z-index:-251582464;visibility:visible;mso-wrap-style:square;mso-wrap-distance-left:9pt;mso-wrap-distance-top:0;mso-wrap-distance-right:9pt;mso-wrap-distance-bottom:0;mso-position-horizontal:center;mso-position-horizontal-relative:margin;mso-position-vertical:absolute;mso-position-vertical-relative:text;v-text-anchor:top" o:gfxdata="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" stroked="f">
+              <v:shape w14:anchorId="54804F3E" id="_x0000_s1039" type="#_x0000_t202" style="position:absolute;left:0;text-align:left;margin-left:0;margin-top:462.35pt;width:527.35pt;height:.05pt;z-index:-251582464;visibility:visible;mso-wrap-style:square;mso-wrap-distance-left:9pt;mso-wrap-distance-top:0;mso-wrap-distance-right:9pt;mso-wrap-distance-bottom:0;mso-position-horizontal:center;mso-position-horizontal-relative:margin;mso-position-vertical:absolute;mso-position-vertical-relative:text;v-text-anchor:top" o:gfxdata="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" stroked="f">
                 <v:textbox style="mso-fit-shape-to-text:t" inset="0,0,0,0">
                   <w:txbxContent>
                     <w:p>
@@ -15920,27 +15433,14 @@
                       <w:r>
                         <w:t xml:space="preserve">Figura </w:t>
                       </w:r>
-                      <w:r>
-                        <w:fldChar w:fldCharType="begin"/>
-                      </w:r>
-                      <w:r>
-                        <w:instrText xml:space="preserve"> SEQ Figura \* ARABIC </w:instrText>
-                      </w:r>
-                      <w:r>
-                        <w:fldChar w:fldCharType="separate"/>
-                      </w:r>
-                      <w:r>
-                        <w:rPr>
-                          <w:noProof/>
-                        </w:rPr>
-                        <w:t>22</w:t>
-                      </w:r>
-                      <w:r>
-                        <w:rPr>
-                          <w:noProof/>
-                        </w:rPr>
-                        <w:fldChar w:fldCharType="end"/>
-                      </w:r>
+                      <w:fldSimple w:instr=" SEQ Figura \* ARABIC ">
+                        <w:r>
+                          <w:rPr>
+                            <w:noProof/>
+                          </w:rPr>
+                          <w:t>22</w:t>
+                        </w:r>
+                      </w:fldSimple>
                       <w:r>
                         <w:t xml:space="preserve">- </w:t>
                       </w:r>
@@ -15962,6 +15462,9 @@
         </mc:AlternateContent>
       </w:r>
       <w:r>
+        <w:rPr>
+          <w:noProof/>
+        </w:rPr>
         <w:drawing>
           <wp:inline distT="0" distB="0" distL="0" distR="0" wp14:anchorId="43130166" wp14:editId="1189AC76">
             <wp:extent cx="2715004" cy="5715798"/>
@@ -16078,27 +15581,14 @@
                             <w:r>
                               <w:t xml:space="preserve">Figura </w:t>
                             </w:r>
-                            <w:r>
-                              <w:fldChar w:fldCharType="begin"/>
-                            </w:r>
-                            <w:r>
-                              <w:instrText xml:space="preserve"> SEQ Figura \* ARABIC </w:instrText>
-                            </w:r>
-                            <w:r>
-                              <w:fldChar w:fldCharType="separate"/>
-                            </w:r>
-                            <w:r>
-                              <w:rPr>
-                                <w:noProof/>
-                              </w:rPr>
-                              <w:t>23</w:t>
-                            </w:r>
-                            <w:r>
-                              <w:rPr>
-                                <w:noProof/>
-                              </w:rPr>
-                              <w:fldChar w:fldCharType="end"/>
-                            </w:r>
+                            <w:fldSimple w:instr=" SEQ Figura \* ARABIC ">
+                              <w:r>
+                                <w:rPr>
+                                  <w:noProof/>
+                                </w:rPr>
+                                <w:t>23</w:t>
+                              </w:r>
+                            </w:fldSimple>
                             <w:r>
                               <w:t xml:space="preserve"> – Mockup da Criação da Candidatura</w:t>
                             </w:r>
@@ -16123,7 +15613,7 @@
           </mc:Choice>
           <mc:Fallback>
             <w:pict>
-              <v:shape w14:anchorId="5A06CCB9" id="_x0000_s1040" type="#_x0000_t202" style="position:absolute;left:0;text-align:left;margin-left:135.75pt;margin-top:488.95pt;width:182.55pt;height:.05pt;z-index:251691008;visibility:visible;mso-wrap-style:square;mso-width-percent:0;mso-wrap-distance-left:9pt;mso-wrap-distance-top:0;mso-wrap-distance-right:9pt;mso-wrap-distance-bottom:0;mso-position-horizontal:absolute;mso-position-horizontal-relative:text;mso-position-vertical:absolute;mso-position-vertical-relative:text;mso-width-percent:0;mso-width-relative:margin;v-text-anchor:top" o:gfxdata="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" stroked="f">
+              <v:shape w14:anchorId="5A06CCB9" id="_x0000_s1040" type="#_x0000_t202" style="position:absolute;left:0;text-align:left;margin-left:135.75pt;margin-top:488.95pt;width:182.55pt;height:.05pt;z-index:251691008;visibility:visible;mso-wrap-style:square;mso-width-percent:0;mso-wrap-distance-left:9pt;mso-wrap-distance-top:0;mso-wrap-distance-right:9pt;mso-wrap-distance-bottom:0;mso-position-horizontal:absolute;mso-position-horizontal-relative:text;mso-position-vertical:absolute;mso-position-vertical-relative:text;mso-width-percent:0;mso-width-relative:margin;v-text-anchor:top" o:gfxdata="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" stroked="f">
                 <v:textbox style="mso-fit-shape-to-text:t" inset="0,0,0,0">
                   <w:txbxContent>
                     <w:p>
@@ -16143,27 +15633,14 @@
                       <w:r>
                         <w:t xml:space="preserve">Figura </w:t>
                       </w:r>
-                      <w:r>
-                        <w:fldChar w:fldCharType="begin"/>
-                      </w:r>
-                      <w:r>
-                        <w:instrText xml:space="preserve"> SEQ Figura \* ARABIC </w:instrText>
-                      </w:r>
-                      <w:r>
-                        <w:fldChar w:fldCharType="separate"/>
-                      </w:r>
-                      <w:r>
-                        <w:rPr>
-                          <w:noProof/>
-                        </w:rPr>
-                        <w:t>23</w:t>
-                      </w:r>
-                      <w:r>
-                        <w:rPr>
-                          <w:noProof/>
-                        </w:rPr>
-                        <w:fldChar w:fldCharType="end"/>
-                      </w:r>
+                      <w:fldSimple w:instr=" SEQ Figura \* ARABIC ">
+                        <w:r>
+                          <w:rPr>
+                            <w:noProof/>
+                          </w:rPr>
+                          <w:t>23</w:t>
+                        </w:r>
+                      </w:fldSimple>
                       <w:r>
                         <w:t xml:space="preserve"> – Mockup da Criação da Candidatura</w:t>
                       </w:r>
@@ -16296,27 +15773,14 @@
                             <w:r>
                               <w:t xml:space="preserve">Figura </w:t>
                             </w:r>
-                            <w:r>
-                              <w:fldChar w:fldCharType="begin"/>
-                            </w:r>
-                            <w:r>
-                              <w:instrText xml:space="preserve"> SEQ Figura \* ARABIC </w:instrText>
-                            </w:r>
-                            <w:r>
-                              <w:fldChar w:fldCharType="separate"/>
-                            </w:r>
-                            <w:r>
-                              <w:rPr>
-                                <w:noProof/>
-                              </w:rPr>
-                              <w:t>24</w:t>
-                            </w:r>
-                            <w:r>
-                              <w:rPr>
-                                <w:noProof/>
-                              </w:rPr>
-                              <w:fldChar w:fldCharType="end"/>
-                            </w:r>
+                            <w:fldSimple w:instr=" SEQ Figura \* ARABIC ">
+                              <w:r>
+                                <w:rPr>
+                                  <w:noProof/>
+                                </w:rPr>
+                                <w:t>24</w:t>
+                              </w:r>
+                            </w:fldSimple>
                             <w:r>
                               <w:t xml:space="preserve"> - Diagrama Sequência da Criação de Candidatura</w:t>
                             </w:r>
@@ -16338,7 +15802,7 @@
           </mc:Choice>
           <mc:Fallback>
             <w:pict>
-              <v:shape w14:anchorId="568A5AC6" id="_x0000_s1041" type="#_x0000_t202" style="position:absolute;left:0;text-align:left;margin-left:92.95pt;margin-top:323.95pt;width:216.65pt;height:.05pt;z-index:-251623424;visibility:visible;mso-wrap-style:square;mso-wrap-distance-left:9pt;mso-wrap-distance-top:0;mso-wrap-distance-right:9pt;mso-wrap-distance-bottom:0;mso-position-horizontal:absolute;mso-position-horizontal-relative:margin;mso-position-vertical:absolute;mso-position-vertical-relative:text;v-text-anchor:top" o:gfxdata="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" stroked="f">
+              <v:shape w14:anchorId="568A5AC6" id="_x0000_s1041" type="#_x0000_t202" style="position:absolute;left:0;text-align:left;margin-left:92.95pt;margin-top:323.95pt;width:216.65pt;height:.05pt;z-index:-251623424;visibility:visible;mso-wrap-style:square;mso-wrap-distance-left:9pt;mso-wrap-distance-top:0;mso-wrap-distance-right:9pt;mso-wrap-distance-bottom:0;mso-position-horizontal:absolute;mso-position-horizontal-relative:margin;mso-position-vertical:absolute;mso-position-vertical-relative:text;v-text-anchor:top" o:gfxdata="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" stroked="f">
                 <v:textbox style="mso-fit-shape-to-text:t" inset="0,0,0,0">
                   <w:txbxContent>
                     <w:p>
@@ -16358,27 +15822,14 @@
                       <w:r>
                         <w:t xml:space="preserve">Figura </w:t>
                       </w:r>
-                      <w:r>
-                        <w:fldChar w:fldCharType="begin"/>
-                      </w:r>
-                      <w:r>
-                        <w:instrText xml:space="preserve"> SEQ Figura \* ARABIC </w:instrText>
-                      </w:r>
-                      <w:r>
-                        <w:fldChar w:fldCharType="separate"/>
-                      </w:r>
-                      <w:r>
-                        <w:rPr>
-                          <w:noProof/>
-                        </w:rPr>
-                        <w:t>24</w:t>
-                      </w:r>
-                      <w:r>
-                        <w:rPr>
-                          <w:noProof/>
-                        </w:rPr>
-                        <w:fldChar w:fldCharType="end"/>
-                      </w:r>
+                      <w:fldSimple w:instr=" SEQ Figura \* ARABIC ">
+                        <w:r>
+                          <w:rPr>
+                            <w:noProof/>
+                          </w:rPr>
+                          <w:t>24</w:t>
+                        </w:r>
+                      </w:fldSimple>
                       <w:r>
                         <w:t xml:space="preserve"> - Diagrama Sequência da Criação de Candidatura</w:t>
                       </w:r>
@@ -16541,27 +15992,14 @@
                             <w:r>
                               <w:t xml:space="preserve">Figura </w:t>
                             </w:r>
-                            <w:r>
-                              <w:fldChar w:fldCharType="begin"/>
-                            </w:r>
-                            <w:r>
-                              <w:instrText xml:space="preserve"> SEQ Figura \* ARABIC </w:instrText>
-                            </w:r>
-                            <w:r>
-                              <w:fldChar w:fldCharType="separate"/>
-                            </w:r>
-                            <w:r>
-                              <w:rPr>
-                                <w:noProof/>
-                              </w:rPr>
-                              <w:t>25</w:t>
-                            </w:r>
-                            <w:r>
-                              <w:rPr>
-                                <w:noProof/>
-                              </w:rPr>
-                              <w:fldChar w:fldCharType="end"/>
-                            </w:r>
+                            <w:fldSimple w:instr=" SEQ Figura \* ARABIC ">
+                              <w:r>
+                                <w:rPr>
+                                  <w:noProof/>
+                                </w:rPr>
+                                <w:t>25</w:t>
+                              </w:r>
+                            </w:fldSimple>
                             <w:r>
                               <w:t xml:space="preserve">- </w:t>
                             </w:r>
@@ -16571,10 +16009,7 @@
                             </w:r>
                             <w:proofErr w:type="spellEnd"/>
                             <w:r>
-                              <w:t xml:space="preserve"> das páginas </w:t>
-                            </w:r>
-                            <w:r>
-                              <w:t>de dados e documentos</w:t>
+                              <w:t xml:space="preserve"> das páginas de dados e documentos</w:t>
                             </w:r>
                           </w:p>
                         </w:txbxContent>
@@ -16593,7 +16028,7 @@
           </mc:Choice>
           <mc:Fallback>
             <w:pict>
-              <v:shape w14:anchorId="51931630" id="_x0000_s1042" type="#_x0000_t202" style="position:absolute;left:0;text-align:left;margin-left:0;margin-top:310.8pt;width:527.35pt;height:.05pt;z-index:-251580416;visibility:visible;mso-wrap-style:square;mso-wrap-distance-left:9pt;mso-wrap-distance-top:0;mso-wrap-distance-right:9pt;mso-wrap-distance-bottom:0;mso-position-horizontal:center;mso-position-horizontal-relative:margin;mso-position-vertical:absolute;mso-position-vertical-relative:text;v-text-anchor:top" o:gfxdata="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" stroked="f">
+              <v:shape w14:anchorId="51931630" id="_x0000_s1042" type="#_x0000_t202" style="position:absolute;left:0;text-align:left;margin-left:0;margin-top:310.8pt;width:527.35pt;height:.05pt;z-index:-251580416;visibility:visible;mso-wrap-style:square;mso-wrap-distance-left:9pt;mso-wrap-distance-top:0;mso-wrap-distance-right:9pt;mso-wrap-distance-bottom:0;mso-position-horizontal:center;mso-position-horizontal-relative:margin;mso-position-vertical:absolute;mso-position-vertical-relative:text;v-text-anchor:top" o:gfxdata="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" stroked="f">
                 <v:textbox style="mso-fit-shape-to-text:t" inset="0,0,0,0">
                   <w:txbxContent>
                     <w:p>
@@ -16608,27 +16043,14 @@
                       <w:r>
                         <w:t xml:space="preserve">Figura </w:t>
                       </w:r>
-                      <w:r>
-                        <w:fldChar w:fldCharType="begin"/>
-                      </w:r>
-                      <w:r>
-                        <w:instrText xml:space="preserve"> SEQ Figura \* ARABIC </w:instrText>
-                      </w:r>
-                      <w:r>
-                        <w:fldChar w:fldCharType="separate"/>
-                      </w:r>
-                      <w:r>
-                        <w:rPr>
-                          <w:noProof/>
-                        </w:rPr>
-                        <w:t>25</w:t>
-                      </w:r>
-                      <w:r>
-                        <w:rPr>
-                          <w:noProof/>
-                        </w:rPr>
-                        <w:fldChar w:fldCharType="end"/>
-                      </w:r>
+                      <w:fldSimple w:instr=" SEQ Figura \* ARABIC ">
+                        <w:r>
+                          <w:rPr>
+                            <w:noProof/>
+                          </w:rPr>
+                          <w:t>25</w:t>
+                        </w:r>
+                      </w:fldSimple>
                       <w:r>
                         <w:t xml:space="preserve">- </w:t>
                       </w:r>
@@ -16638,10 +16060,7 @@
                       </w:r>
                       <w:proofErr w:type="spellEnd"/>
                       <w:r>
-                        <w:t xml:space="preserve"> das páginas </w:t>
-                      </w:r>
-                      <w:r>
-                        <w:t>de dados e documentos</w:t>
+                        <w:t xml:space="preserve"> das páginas de dados e documentos</w:t>
                       </w:r>
                     </w:p>
                   </w:txbxContent>
@@ -16757,27 +16176,14 @@
                             <w:r>
                               <w:t xml:space="preserve">Figura </w:t>
                             </w:r>
-                            <w:r>
-                              <w:fldChar w:fldCharType="begin"/>
-                            </w:r>
-                            <w:r>
-                              <w:instrText xml:space="preserve"> SEQ Figura \* ARABIC </w:instrText>
-                            </w:r>
-                            <w:r>
-                              <w:fldChar w:fldCharType="separate"/>
-                            </w:r>
-                            <w:r>
-                              <w:rPr>
-                                <w:noProof/>
-                              </w:rPr>
-                              <w:t>26</w:t>
-                            </w:r>
-                            <w:r>
-                              <w:rPr>
-                                <w:noProof/>
-                              </w:rPr>
-                              <w:fldChar w:fldCharType="end"/>
-                            </w:r>
+                            <w:fldSimple w:instr=" SEQ Figura \* ARABIC ">
+                              <w:r>
+                                <w:rPr>
+                                  <w:noProof/>
+                                </w:rPr>
+                                <w:t>26</w:t>
+                              </w:r>
+                            </w:fldSimple>
                             <w:r>
                               <w:t xml:space="preserve"> – Diagrama de Sequência</w:t>
                             </w:r>
@@ -16805,7 +16211,7 @@
           </mc:Choice>
           <mc:Fallback>
             <w:pict>
-              <v:shape w14:anchorId="6A0084D5" id="_x0000_s1043" type="#_x0000_t202" style="position:absolute;left:0;text-align:left;margin-left:0;margin-top:179.75pt;width:251.8pt;height:.05pt;z-index:251682816;visibility:visible;mso-wrap-style:square;mso-wrap-distance-left:9pt;mso-wrap-distance-top:0;mso-wrap-distance-right:9pt;mso-wrap-distance-bottom:0;mso-position-horizontal:center;mso-position-horizontal-relative:margin;mso-position-vertical:absolute;mso-position-vertical-relative:text;v-text-anchor:top" o:gfxdata="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" stroked="f">
+              <v:shape w14:anchorId="6A0084D5" id="_x0000_s1043" type="#_x0000_t202" style="position:absolute;left:0;text-align:left;margin-left:0;margin-top:179.75pt;width:251.8pt;height:.05pt;z-index:251682816;visibility:visible;mso-wrap-style:square;mso-wrap-distance-left:9pt;mso-wrap-distance-top:0;mso-wrap-distance-right:9pt;mso-wrap-distance-bottom:0;mso-position-horizontal:center;mso-position-horizontal-relative:margin;mso-position-vertical:absolute;mso-position-vertical-relative:text;v-text-anchor:top" o:gfxdata="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" stroked="f">
                 <v:textbox style="mso-fit-shape-to-text:t" inset="0,0,0,0">
                   <w:txbxContent>
                     <w:p>
@@ -16817,27 +16223,14 @@
                       <w:r>
                         <w:t xml:space="preserve">Figura </w:t>
                       </w:r>
-                      <w:r>
-                        <w:fldChar w:fldCharType="begin"/>
-                      </w:r>
-                      <w:r>
-                        <w:instrText xml:space="preserve"> SEQ Figura \* ARABIC </w:instrText>
-                      </w:r>
-                      <w:r>
-                        <w:fldChar w:fldCharType="separate"/>
-                      </w:r>
-                      <w:r>
-                        <w:rPr>
-                          <w:noProof/>
-                        </w:rPr>
-                        <w:t>26</w:t>
-                      </w:r>
-                      <w:r>
-                        <w:rPr>
-                          <w:noProof/>
-                        </w:rPr>
-                        <w:fldChar w:fldCharType="end"/>
-                      </w:r>
+                      <w:fldSimple w:instr=" SEQ Figura \* ARABIC ">
+                        <w:r>
+                          <w:rPr>
+                            <w:noProof/>
+                          </w:rPr>
+                          <w:t>26</w:t>
+                        </w:r>
+                      </w:fldSimple>
                       <w:r>
                         <w:t xml:space="preserve"> – Diagrama de Sequência</w:t>
                       </w:r>
@@ -17007,27 +16400,14 @@
                             <w:r>
                               <w:t xml:space="preserve">Figura </w:t>
                             </w:r>
-                            <w:r>
-                              <w:fldChar w:fldCharType="begin"/>
-                            </w:r>
-                            <w:r>
-                              <w:instrText xml:space="preserve"> SEQ Figura \* ARABIC </w:instrText>
-                            </w:r>
-                            <w:r>
-                              <w:fldChar w:fldCharType="separate"/>
-                            </w:r>
-                            <w:r>
-                              <w:rPr>
-                                <w:noProof/>
-                              </w:rPr>
-                              <w:t>27</w:t>
-                            </w:r>
-                            <w:r>
-                              <w:rPr>
-                                <w:noProof/>
-                              </w:rPr>
-                              <w:fldChar w:fldCharType="end"/>
-                            </w:r>
+                            <w:fldSimple w:instr=" SEQ Figura \* ARABIC ">
+                              <w:r>
+                                <w:rPr>
+                                  <w:noProof/>
+                                </w:rPr>
+                                <w:t>27</w:t>
+                              </w:r>
+                            </w:fldSimple>
                             <w:r>
                               <w:t xml:space="preserve">- </w:t>
                             </w:r>
@@ -17037,10 +16417,7 @@
                             </w:r>
                             <w:proofErr w:type="spellEnd"/>
                             <w:r>
-                              <w:t xml:space="preserve"> das páginas </w:t>
-                            </w:r>
-                            <w:r>
-                              <w:t>de Estados da candidatura</w:t>
+                              <w:t xml:space="preserve"> das páginas de Estados da candidatura</w:t>
                             </w:r>
                           </w:p>
                         </w:txbxContent>
@@ -17059,7 +16436,7 @@
           </mc:Choice>
           <mc:Fallback>
             <w:pict>
-              <v:shape w14:anchorId="0691EECF" id="_x0000_s1044" type="#_x0000_t202" style="position:absolute;margin-left:0;margin-top:222.6pt;width:527.35pt;height:.05pt;z-index:-251578368;visibility:visible;mso-wrap-style:square;mso-wrap-distance-left:9pt;mso-wrap-distance-top:0;mso-wrap-distance-right:9pt;mso-wrap-distance-bottom:0;mso-position-horizontal:center;mso-position-horizontal-relative:margin;mso-position-vertical:absolute;mso-position-vertical-relative:text;v-text-anchor:top" o:gfxdata="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" stroked="f">
+              <v:shape w14:anchorId="0691EECF" id="_x0000_s1044" type="#_x0000_t202" style="position:absolute;margin-left:0;margin-top:222.6pt;width:527.35pt;height:.05pt;z-index:-251578368;visibility:visible;mso-wrap-style:square;mso-wrap-distance-left:9pt;mso-wrap-distance-top:0;mso-wrap-distance-right:9pt;mso-wrap-distance-bottom:0;mso-position-horizontal:center;mso-position-horizontal-relative:margin;mso-position-vertical:absolute;mso-position-vertical-relative:text;v-text-anchor:top" o:gfxdata="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" stroked="f">
                 <v:textbox style="mso-fit-shape-to-text:t" inset="0,0,0,0">
                   <w:txbxContent>
                     <w:p>
@@ -17074,27 +16451,14 @@
                       <w:r>
                         <w:t xml:space="preserve">Figura </w:t>
                       </w:r>
-                      <w:r>
-                        <w:fldChar w:fldCharType="begin"/>
-                      </w:r>
-                      <w:r>
-                        <w:instrText xml:space="preserve"> SEQ Figura \* ARABIC </w:instrText>
-                      </w:r>
-                      <w:r>
-                        <w:fldChar w:fldCharType="separate"/>
-                      </w:r>
-                      <w:r>
-                        <w:rPr>
-                          <w:noProof/>
-                        </w:rPr>
-                        <w:t>27</w:t>
-                      </w:r>
-                      <w:r>
-                        <w:rPr>
-                          <w:noProof/>
-                        </w:rPr>
-                        <w:fldChar w:fldCharType="end"/>
-                      </w:r>
+                      <w:fldSimple w:instr=" SEQ Figura \* ARABIC ">
+                        <w:r>
+                          <w:rPr>
+                            <w:noProof/>
+                          </w:rPr>
+                          <w:t>27</w:t>
+                        </w:r>
+                      </w:fldSimple>
                       <w:r>
                         <w:t xml:space="preserve">- </w:t>
                       </w:r>
@@ -17104,10 +16468,7 @@
                       </w:r>
                       <w:proofErr w:type="spellEnd"/>
                       <w:r>
-                        <w:t xml:space="preserve"> das páginas </w:t>
-                      </w:r>
-                      <w:r>
-                        <w:t>de Estados da candidatura</w:t>
+                        <w:t xml:space="preserve"> das páginas de Estados da candidatura</w:t>
                       </w:r>
                     </w:p>
                   </w:txbxContent>
@@ -17314,27 +16675,14 @@
                             <w:r>
                               <w:t xml:space="preserve">Figura </w:t>
                             </w:r>
-                            <w:r>
-                              <w:fldChar w:fldCharType="begin"/>
-                            </w:r>
-                            <w:r>
-                              <w:instrText xml:space="preserve"> SEQ Figura \* ARABIC </w:instrText>
-                            </w:r>
-                            <w:r>
-                              <w:fldChar w:fldCharType="separate"/>
-                            </w:r>
-                            <w:r>
-                              <w:rPr>
-                                <w:noProof/>
-                              </w:rPr>
-                              <w:t>28</w:t>
-                            </w:r>
-                            <w:r>
-                              <w:rPr>
-                                <w:noProof/>
-                              </w:rPr>
-                              <w:fldChar w:fldCharType="end"/>
-                            </w:r>
+                            <w:fldSimple w:instr=" SEQ Figura \* ARABIC ">
+                              <w:r>
+                                <w:rPr>
+                                  <w:noProof/>
+                                </w:rPr>
+                                <w:t>28</w:t>
+                              </w:r>
+                            </w:fldSimple>
                             <w:r>
                               <w:t xml:space="preserve"> - Diagrama Sequência de Estado da Candidatura</w:t>
                             </w:r>
@@ -17359,7 +16707,7 @@
           </mc:Choice>
           <mc:Fallback>
             <w:pict>
-              <v:shape w14:anchorId="19C457F3" id="_x0000_s1045" type="#_x0000_t202" style="position:absolute;margin-left:0;margin-top:8.3pt;width:220.05pt;height:.05pt;z-index:-251621376;visibility:visible;mso-wrap-style:square;mso-width-percent:0;mso-wrap-distance-left:9pt;mso-wrap-distance-top:0;mso-wrap-distance-right:9pt;mso-wrap-distance-bottom:0;mso-position-horizontal:center;mso-position-horizontal-relative:margin;mso-position-vertical:absolute;mso-position-vertical-relative:text;mso-width-percent:0;mso-width-relative:margin;v-text-anchor:top" o:gfxdata="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" stroked="f">
+              <v:shape w14:anchorId="19C457F3" id="_x0000_s1045" type="#_x0000_t202" style="position:absolute;margin-left:0;margin-top:8.3pt;width:220.05pt;height:.05pt;z-index:-251621376;visibility:visible;mso-wrap-style:square;mso-width-percent:0;mso-wrap-distance-left:9pt;mso-wrap-distance-top:0;mso-wrap-distance-right:9pt;mso-wrap-distance-bottom:0;mso-position-horizontal:center;mso-position-horizontal-relative:margin;mso-position-vertical:absolute;mso-position-vertical-relative:text;mso-width-percent:0;mso-width-relative:margin;v-text-anchor:top" o:gfxdata="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" stroked="f">
                 <v:textbox style="mso-fit-shape-to-text:t" inset="0,0,0,0">
                   <w:txbxContent>
                     <w:p>
@@ -17379,27 +16727,14 @@
                       <w:r>
                         <w:t xml:space="preserve">Figura </w:t>
                       </w:r>
-                      <w:r>
-                        <w:fldChar w:fldCharType="begin"/>
-                      </w:r>
-                      <w:r>
-                        <w:instrText xml:space="preserve"> SEQ Figura \* ARABIC </w:instrText>
-                      </w:r>
-                      <w:r>
-                        <w:fldChar w:fldCharType="separate"/>
-                      </w:r>
-                      <w:r>
-                        <w:rPr>
-                          <w:noProof/>
-                        </w:rPr>
-                        <w:t>28</w:t>
-                      </w:r>
-                      <w:r>
-                        <w:rPr>
-                          <w:noProof/>
-                        </w:rPr>
-                        <w:fldChar w:fldCharType="end"/>
-                      </w:r>
+                      <w:fldSimple w:instr=" SEQ Figura \* ARABIC ">
+                        <w:r>
+                          <w:rPr>
+                            <w:noProof/>
+                          </w:rPr>
+                          <w:t>28</w:t>
+                        </w:r>
+                      </w:fldSimple>
                       <w:r>
                         <w:t xml:space="preserve"> - Diagrama Sequência de Estado da Candidatura</w:t>
                       </w:r>
@@ -17544,32 +16879,16 @@
                             </w:pPr>
                             <w:bookmarkStart w:id="85" w:name="_Toc219064834"/>
                             <w:r>
-                              <w:t>F</w:t>
+                              <w:t xml:space="preserve">Figura </w:t>
                             </w:r>
-                            <w:r>
-                              <w:t xml:space="preserve">igura </w:t>
-                            </w:r>
-                            <w:r>
-                              <w:fldChar w:fldCharType="begin"/>
-                            </w:r>
-                            <w:r>
-                              <w:instrText xml:space="preserve"> SEQ Figura \* ARABIC </w:instrText>
-                            </w:r>
-                            <w:r>
-                              <w:fldChar w:fldCharType="separate"/>
-                            </w:r>
-                            <w:r>
-                              <w:rPr>
-                                <w:noProof/>
-                              </w:rPr>
-                              <w:t>29</w:t>
-                            </w:r>
-                            <w:r>
-                              <w:rPr>
-                                <w:noProof/>
-                              </w:rPr>
-                              <w:fldChar w:fldCharType="end"/>
-                            </w:r>
+                            <w:fldSimple w:instr=" SEQ Figura \* ARABIC ">
+                              <w:r>
+                                <w:rPr>
+                                  <w:noProof/>
+                                </w:rPr>
+                                <w:t>29</w:t>
+                              </w:r>
+                            </w:fldSimple>
                             <w:r>
                               <w:t xml:space="preserve">– </w:t>
                             </w:r>
@@ -17602,7 +16921,7 @@
           </mc:Choice>
           <mc:Fallback>
             <w:pict>
-              <v:shape w14:anchorId="6C14E0B2" id="_x0000_s1046" type="#_x0000_t202" style="position:absolute;margin-left:0;margin-top:.5pt;width:220.05pt;height:.05pt;z-index:-251619328;visibility:visible;mso-wrap-style:square;mso-width-percent:0;mso-wrap-distance-left:9pt;mso-wrap-distance-top:0;mso-wrap-distance-right:9pt;mso-wrap-distance-bottom:0;mso-position-horizontal:center;mso-position-horizontal-relative:margin;mso-position-vertical:absolute;mso-position-vertical-relative:text;mso-width-percent:0;mso-width-relative:margin;v-text-anchor:top" o:gfxdata="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" stroked="f">
+              <v:shape w14:anchorId="6C14E0B2" id="_x0000_s1046" type="#_x0000_t202" style="position:absolute;margin-left:0;margin-top:.5pt;width:220.05pt;height:.05pt;z-index:-251619328;visibility:visible;mso-wrap-style:square;mso-width-percent:0;mso-wrap-distance-left:9pt;mso-wrap-distance-top:0;mso-wrap-distance-right:9pt;mso-wrap-distance-bottom:0;mso-position-horizontal:center;mso-position-horizontal-relative:margin;mso-position-vertical:absolute;mso-position-vertical-relative:text;mso-width-percent:0;mso-width-relative:margin;v-text-anchor:top" o:gfxdata="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" stroked="f">
                 <v:textbox style="mso-fit-shape-to-text:t" inset="0,0,0,0">
                   <w:txbxContent>
                     <w:p>
@@ -17621,32 +16940,16 @@
                       </w:pPr>
                       <w:bookmarkStart w:id="86" w:name="_Toc219064834"/>
                       <w:r>
-                        <w:t>F</w:t>
+                        <w:t xml:space="preserve">Figura </w:t>
                       </w:r>
-                      <w:r>
-                        <w:t xml:space="preserve">igura </w:t>
-                      </w:r>
-                      <w:r>
-                        <w:fldChar w:fldCharType="begin"/>
-                      </w:r>
-                      <w:r>
-                        <w:instrText xml:space="preserve"> SEQ Figura \* ARABIC </w:instrText>
-                      </w:r>
-                      <w:r>
-                        <w:fldChar w:fldCharType="separate"/>
-                      </w:r>
-                      <w:r>
-                        <w:rPr>
-                          <w:noProof/>
-                        </w:rPr>
-                        <w:t>29</w:t>
-                      </w:r>
-                      <w:r>
-                        <w:rPr>
-                          <w:noProof/>
-                        </w:rPr>
-                        <w:fldChar w:fldCharType="end"/>
-                      </w:r>
+                      <w:fldSimple w:instr=" SEQ Figura \* ARABIC ">
+                        <w:r>
+                          <w:rPr>
+                            <w:noProof/>
+                          </w:rPr>
+                          <w:t>29</w:t>
+                        </w:r>
+                      </w:fldSimple>
                       <w:r>
                         <w:t xml:space="preserve">– </w:t>
                       </w:r>
@@ -17808,32 +17111,16 @@
                             </w:pPr>
                             <w:bookmarkStart w:id="88" w:name="_Toc219064835"/>
                             <w:r>
-                              <w:t>F</w:t>
+                              <w:t xml:space="preserve">Figura </w:t>
                             </w:r>
-                            <w:r>
-                              <w:t xml:space="preserve">igura </w:t>
-                            </w:r>
-                            <w:r>
-                              <w:fldChar w:fldCharType="begin"/>
-                            </w:r>
-                            <w:r>
-                              <w:instrText xml:space="preserve"> SEQ Figura \* ARABIC </w:instrText>
-                            </w:r>
-                            <w:r>
-                              <w:fldChar w:fldCharType="separate"/>
-                            </w:r>
-                            <w:r>
-                              <w:rPr>
-                                <w:noProof/>
-                              </w:rPr>
-                              <w:t>30</w:t>
-                            </w:r>
-                            <w:r>
-                              <w:rPr>
-                                <w:noProof/>
-                              </w:rPr>
-                              <w:fldChar w:fldCharType="end"/>
-                            </w:r>
+                            <w:fldSimple w:instr=" SEQ Figura \* ARABIC ">
+                              <w:r>
+                                <w:rPr>
+                                  <w:noProof/>
+                                </w:rPr>
+                                <w:t>30</w:t>
+                              </w:r>
+                            </w:fldSimple>
                             <w:r>
                               <w:t xml:space="preserve"> – </w:t>
                             </w:r>
@@ -17866,7 +17153,7 @@
           </mc:Choice>
           <mc:Fallback>
             <w:pict>
-              <v:shape w14:anchorId="10D6FB8B" id="_x0000_s1047" type="#_x0000_t202" style="position:absolute;margin-left:0;margin-top:.65pt;width:220.05pt;height:.05pt;z-index:-251617280;visibility:visible;mso-wrap-style:square;mso-width-percent:0;mso-wrap-distance-left:9pt;mso-wrap-distance-top:0;mso-wrap-distance-right:9pt;mso-wrap-distance-bottom:0;mso-position-horizontal:center;mso-position-horizontal-relative:margin;mso-position-vertical:absolute;mso-position-vertical-relative:text;mso-width-percent:0;mso-width-relative:margin;v-text-anchor:top" o:gfxdata="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" stroked="f">
+              <v:shape w14:anchorId="10D6FB8B" id="_x0000_s1047" type="#_x0000_t202" style="position:absolute;margin-left:0;margin-top:.65pt;width:220.05pt;height:.05pt;z-index:-251617280;visibility:visible;mso-wrap-style:square;mso-width-percent:0;mso-wrap-distance-left:9pt;mso-wrap-distance-top:0;mso-wrap-distance-right:9pt;mso-wrap-distance-bottom:0;mso-position-horizontal:center;mso-position-horizontal-relative:margin;mso-position-vertical:absolute;mso-position-vertical-relative:text;mso-width-percent:0;mso-width-relative:margin;v-text-anchor:top" o:gfxdata="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" stroked="f">
                 <v:textbox style="mso-fit-shape-to-text:t" inset="0,0,0,0">
                   <w:txbxContent>
                     <w:p>
@@ -17885,32 +17172,16 @@
                       </w:pPr>
                       <w:bookmarkStart w:id="89" w:name="_Toc219064835"/>
                       <w:r>
-                        <w:t>F</w:t>
+                        <w:t xml:space="preserve">Figura </w:t>
                       </w:r>
-                      <w:r>
-                        <w:t xml:space="preserve">igura </w:t>
-                      </w:r>
-                      <w:r>
-                        <w:fldChar w:fldCharType="begin"/>
-                      </w:r>
-                      <w:r>
-                        <w:instrText xml:space="preserve"> SEQ Figura \* ARABIC </w:instrText>
-                      </w:r>
-                      <w:r>
-                        <w:fldChar w:fldCharType="separate"/>
-                      </w:r>
-                      <w:r>
-                        <w:rPr>
-                          <w:noProof/>
-                        </w:rPr>
-                        <w:t>30</w:t>
-                      </w:r>
-                      <w:r>
-                        <w:rPr>
-                          <w:noProof/>
-                        </w:rPr>
-                        <w:fldChar w:fldCharType="end"/>
-                      </w:r>
+                      <w:fldSimple w:instr=" SEQ Figura \* ARABIC ">
+                        <w:r>
+                          <w:rPr>
+                            <w:noProof/>
+                          </w:rPr>
+                          <w:t>30</w:t>
+                        </w:r>
+                      </w:fldSimple>
                       <w:r>
                         <w:t xml:space="preserve"> – </w:t>
                       </w:r>
@@ -18022,27 +17293,14 @@
                             <w:r>
                               <w:t xml:space="preserve">Figura </w:t>
                             </w:r>
-                            <w:r>
-                              <w:fldChar w:fldCharType="begin"/>
-                            </w:r>
-                            <w:r>
-                              <w:instrText xml:space="preserve"> SEQ Figura \* ARABIC </w:instrText>
-                            </w:r>
-                            <w:r>
-                              <w:fldChar w:fldCharType="separate"/>
-                            </w:r>
-                            <w:r>
-                              <w:rPr>
-                                <w:noProof/>
-                              </w:rPr>
-                              <w:t>31</w:t>
-                            </w:r>
-                            <w:r>
-                              <w:rPr>
-                                <w:noProof/>
-                              </w:rPr>
-                              <w:fldChar w:fldCharType="end"/>
-                            </w:r>
+                            <w:fldSimple w:instr=" SEQ Figura \* ARABIC ">
+                              <w:r>
+                                <w:rPr>
+                                  <w:noProof/>
+                                </w:rPr>
+                                <w:t>31</w:t>
+                              </w:r>
+                            </w:fldSimple>
                             <w:r>
                               <w:t xml:space="preserve">- </w:t>
                             </w:r>
@@ -18052,10 +17310,7 @@
                             </w:r>
                             <w:proofErr w:type="spellEnd"/>
                             <w:r>
-                              <w:t xml:space="preserve"> das páginas </w:t>
-                            </w:r>
-                            <w:r>
-                              <w:t>de gestão de candidaturas</w:t>
+                              <w:t xml:space="preserve"> das páginas de gestão de candidaturas</w:t>
                             </w:r>
                           </w:p>
                         </w:txbxContent>
@@ -18074,7 +17329,7 @@
           </mc:Choice>
           <mc:Fallback>
             <w:pict>
-              <v:shape w14:anchorId="5823E391" id="_x0000_s1048" type="#_x0000_t202" style="position:absolute;margin-left:0;margin-top:235.05pt;width:527.35pt;height:.05pt;z-index:-251576320;visibility:visible;mso-wrap-style:square;mso-wrap-distance-left:9pt;mso-wrap-distance-top:0;mso-wrap-distance-right:9pt;mso-wrap-distance-bottom:0;mso-position-horizontal:center;mso-position-horizontal-relative:margin;mso-position-vertical:absolute;mso-position-vertical-relative:text;v-text-anchor:top" o:gfxdata="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" stroked="f">
+              <v:shape w14:anchorId="5823E391" id="_x0000_s1048" type="#_x0000_t202" style="position:absolute;margin-left:0;margin-top:235.05pt;width:527.35pt;height:.05pt;z-index:-251576320;visibility:visible;mso-wrap-style:square;mso-wrap-distance-left:9pt;mso-wrap-distance-top:0;mso-wrap-distance-right:9pt;mso-wrap-distance-bottom:0;mso-position-horizontal:center;mso-position-horizontal-relative:margin;mso-position-vertical:absolute;mso-position-vertical-relative:text;v-text-anchor:top" o:gfxdata="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" stroked="f">
                 <v:textbox style="mso-fit-shape-to-text:t" inset="0,0,0,0">
                   <w:txbxContent>
                     <w:p>
@@ -18089,27 +17344,14 @@
                       <w:r>
                         <w:t xml:space="preserve">Figura </w:t>
                       </w:r>
-                      <w:r>
-                        <w:fldChar w:fldCharType="begin"/>
-                      </w:r>
-                      <w:r>
-                        <w:instrText xml:space="preserve"> SEQ Figura \* ARABIC </w:instrText>
-                      </w:r>
-                      <w:r>
-                        <w:fldChar w:fldCharType="separate"/>
-                      </w:r>
-                      <w:r>
-                        <w:rPr>
-                          <w:noProof/>
-                        </w:rPr>
-                        <w:t>31</w:t>
-                      </w:r>
-                      <w:r>
-                        <w:rPr>
-                          <w:noProof/>
-                        </w:rPr>
-                        <w:fldChar w:fldCharType="end"/>
-                      </w:r>
+                      <w:fldSimple w:instr=" SEQ Figura \* ARABIC ">
+                        <w:r>
+                          <w:rPr>
+                            <w:noProof/>
+                          </w:rPr>
+                          <w:t>31</w:t>
+                        </w:r>
+                      </w:fldSimple>
                       <w:r>
                         <w:t xml:space="preserve">- </w:t>
                       </w:r>
@@ -18119,10 +17361,7 @@
                       </w:r>
                       <w:proofErr w:type="spellEnd"/>
                       <w:r>
-                        <w:t xml:space="preserve"> das páginas </w:t>
-                      </w:r>
-                      <w:r>
-                        <w:t>de gestão de candidaturas</w:t>
+                        <w:t xml:space="preserve"> das páginas de gestão de candidaturas</w:t>
                       </w:r>
                     </w:p>
                   </w:txbxContent>
@@ -18134,6 +17373,9 @@
         </mc:AlternateContent>
       </w:r>
       <w:r>
+        <w:rPr>
+          <w:noProof/>
+        </w:rPr>
         <w:drawing>
           <wp:inline distT="0" distB="0" distL="0" distR="0" wp14:anchorId="3E6D3569" wp14:editId="0DB138C2">
             <wp:extent cx="5579745" cy="2872740"/>
@@ -18248,27 +17490,14 @@
                             <w:r>
                               <w:t xml:space="preserve">Figura </w:t>
                             </w:r>
-                            <w:r>
-                              <w:fldChar w:fldCharType="begin"/>
-                            </w:r>
-                            <w:r>
-                              <w:instrText xml:space="preserve"> SEQ Figura \* ARABIC </w:instrText>
-                            </w:r>
-                            <w:r>
-                              <w:fldChar w:fldCharType="separate"/>
-                            </w:r>
-                            <w:r>
-                              <w:rPr>
-                                <w:noProof/>
-                              </w:rPr>
-                              <w:t>17</w:t>
-                            </w:r>
-                            <w:r>
-                              <w:rPr>
-                                <w:noProof/>
-                              </w:rPr>
-                              <w:fldChar w:fldCharType="end"/>
-                            </w:r>
+                            <w:fldSimple w:instr=" SEQ Figura \* ARABIC ">
+                              <w:r>
+                                <w:rPr>
+                                  <w:noProof/>
+                                </w:rPr>
+                                <w:t>17</w:t>
+                              </w:r>
+                            </w:fldSimple>
                             <w:r>
                               <w:t xml:space="preserve">- </w:t>
                             </w:r>
@@ -18278,10 +17507,7 @@
                             </w:r>
                             <w:proofErr w:type="spellEnd"/>
                             <w:r>
-                              <w:t xml:space="preserve"> da</w:t>
-                            </w:r>
-                            <w:r>
-                              <w:t xml:space="preserve"> página inicial do beneficiário</w:t>
+                              <w:t xml:space="preserve"> da página inicial do beneficiário</w:t>
                             </w:r>
                           </w:p>
                         </w:txbxContent>
@@ -18300,7 +17526,7 @@
           </mc:Choice>
           <mc:Fallback>
             <w:pict>
-              <v:shape w14:anchorId="7F4F8814" id="_x0000_s1049" type="#_x0000_t202" style="position:absolute;left:0;text-align:left;margin-left:0;margin-top:504.3pt;width:527.35pt;height:.05pt;z-index:-251574272;visibility:visible;mso-wrap-style:square;mso-wrap-distance-left:9pt;mso-wrap-distance-top:0;mso-wrap-distance-right:9pt;mso-wrap-distance-bottom:0;mso-position-horizontal:center;mso-position-horizontal-relative:page;mso-position-vertical:absolute;mso-position-vertical-relative:text;v-text-anchor:top" o:gfxdata="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" stroked="f">
+              <v:shape w14:anchorId="7F4F8814" id="_x0000_s1049" type="#_x0000_t202" style="position:absolute;left:0;text-align:left;margin-left:0;margin-top:504.3pt;width:527.35pt;height:.05pt;z-index:-251574272;visibility:visible;mso-wrap-style:square;mso-wrap-distance-left:9pt;mso-wrap-distance-top:0;mso-wrap-distance-right:9pt;mso-wrap-distance-bottom:0;mso-position-horizontal:center;mso-position-horizontal-relative:page;mso-position-vertical:absolute;mso-position-vertical-relative:text;v-text-anchor:top" o:gfxdata="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" stroked="f">
                 <v:textbox style="mso-fit-shape-to-text:t" inset="0,0,0,0">
                   <w:txbxContent>
                     <w:p>
@@ -18315,27 +17541,14 @@
                       <w:r>
                         <w:t xml:space="preserve">Figura </w:t>
                       </w:r>
-                      <w:r>
-                        <w:fldChar w:fldCharType="begin"/>
-                      </w:r>
-                      <w:r>
-                        <w:instrText xml:space="preserve"> SEQ Figura \* ARABIC </w:instrText>
-                      </w:r>
-                      <w:r>
-                        <w:fldChar w:fldCharType="separate"/>
-                      </w:r>
-                      <w:r>
-                        <w:rPr>
-                          <w:noProof/>
-                        </w:rPr>
-                        <w:t>17</w:t>
-                      </w:r>
-                      <w:r>
-                        <w:rPr>
-                          <w:noProof/>
-                        </w:rPr>
-                        <w:fldChar w:fldCharType="end"/>
-                      </w:r>
+                      <w:fldSimple w:instr=" SEQ Figura \* ARABIC ">
+                        <w:r>
+                          <w:rPr>
+                            <w:noProof/>
+                          </w:rPr>
+                          <w:t>17</w:t>
+                        </w:r>
+                      </w:fldSimple>
                       <w:r>
                         <w:t xml:space="preserve">- </w:t>
                       </w:r>
@@ -18345,10 +17558,7 @@
                       </w:r>
                       <w:proofErr w:type="spellEnd"/>
                       <w:r>
-                        <w:t xml:space="preserve"> da</w:t>
-                      </w:r>
-                      <w:r>
-                        <w:t xml:space="preserve"> página inicial do beneficiário</w:t>
+                        <w:t xml:space="preserve"> da página inicial do beneficiário</w:t>
                       </w:r>
                     </w:p>
                   </w:txbxContent>
@@ -18360,6 +17570,9 @@
         </mc:AlternateContent>
       </w:r>
       <w:r>
+        <w:rPr>
+          <w:noProof/>
+        </w:rPr>
         <w:drawing>
           <wp:inline distT="0" distB="0" distL="0" distR="0" wp14:anchorId="29DEC0DD" wp14:editId="5C822B9D">
             <wp:extent cx="2876951" cy="6239746"/>
@@ -18486,32 +17699,16 @@
                             </w:pPr>
                             <w:bookmarkStart w:id="93" w:name="_Toc219064836"/>
                             <w:r>
-                              <w:t>F</w:t>
+                              <w:t xml:space="preserve">Figura </w:t>
                             </w:r>
-                            <w:r>
-                              <w:t xml:space="preserve">igura </w:t>
-                            </w:r>
-                            <w:r>
-                              <w:fldChar w:fldCharType="begin"/>
-                            </w:r>
-                            <w:r>
-                              <w:instrText xml:space="preserve"> SEQ Figura \* ARABIC </w:instrText>
-                            </w:r>
-                            <w:r>
-                              <w:fldChar w:fldCharType="separate"/>
-                            </w:r>
-                            <w:r>
-                              <w:rPr>
-                                <w:noProof/>
-                              </w:rPr>
-                              <w:t>33</w:t>
-                            </w:r>
-                            <w:r>
-                              <w:rPr>
-                                <w:noProof/>
-                              </w:rPr>
-                              <w:fldChar w:fldCharType="end"/>
-                            </w:r>
+                            <w:fldSimple w:instr=" SEQ Figura \* ARABIC ">
+                              <w:r>
+                                <w:rPr>
+                                  <w:noProof/>
+                                </w:rPr>
+                                <w:t>33</w:t>
+                              </w:r>
+                            </w:fldSimple>
                             <w:r>
                               <w:t xml:space="preserve">– </w:t>
                             </w:r>
@@ -18544,7 +17741,7 @@
           </mc:Choice>
           <mc:Fallback>
             <w:pict>
-              <v:shape w14:anchorId="19DF9A79" id="_x0000_s1050" type="#_x0000_t202" style="position:absolute;left:0;text-align:left;margin-left:0;margin-top:459.75pt;width:220.05pt;height:.05pt;z-index:-251615232;visibility:visible;mso-wrap-style:square;mso-width-percent:0;mso-wrap-distance-left:9pt;mso-wrap-distance-top:0;mso-wrap-distance-right:9pt;mso-wrap-distance-bottom:0;mso-position-horizontal:center;mso-position-horizontal-relative:margin;mso-position-vertical:absolute;mso-position-vertical-relative:text;mso-width-percent:0;mso-width-relative:margin;v-text-anchor:top" o:gfxdata="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" stroked="f">
+              <v:shape w14:anchorId="19DF9A79" id="_x0000_s1050" type="#_x0000_t202" style="position:absolute;left:0;text-align:left;margin-left:0;margin-top:459.75pt;width:220.05pt;height:.05pt;z-index:-251615232;visibility:visible;mso-wrap-style:square;mso-width-percent:0;mso-wrap-distance-left:9pt;mso-wrap-distance-top:0;mso-wrap-distance-right:9pt;mso-wrap-distance-bottom:0;mso-position-horizontal:center;mso-position-horizontal-relative:margin;mso-position-vertical:absolute;mso-position-vertical-relative:text;mso-width-percent:0;mso-width-relative:margin;v-text-anchor:top" o:gfxdata="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" stroked="f">
                 <v:textbox style="mso-fit-shape-to-text:t" inset="0,0,0,0">
                   <w:txbxContent>
                     <w:p>
@@ -18563,32 +17760,16 @@
                       </w:pPr>
                       <w:bookmarkStart w:id="94" w:name="_Toc219064836"/>
                       <w:r>
-                        <w:t>F</w:t>
+                        <w:t xml:space="preserve">Figura </w:t>
                       </w:r>
-                      <w:r>
-                        <w:t xml:space="preserve">igura </w:t>
-                      </w:r>
-                      <w:r>
-                        <w:fldChar w:fldCharType="begin"/>
-                      </w:r>
-                      <w:r>
-                        <w:instrText xml:space="preserve"> SEQ Figura \* ARABIC </w:instrText>
-                      </w:r>
-                      <w:r>
-                        <w:fldChar w:fldCharType="separate"/>
-                      </w:r>
-                      <w:r>
-                        <w:rPr>
-                          <w:noProof/>
-                        </w:rPr>
-                        <w:t>33</w:t>
-                      </w:r>
-                      <w:r>
-                        <w:rPr>
-                          <w:noProof/>
-                        </w:rPr>
-                        <w:fldChar w:fldCharType="end"/>
-                      </w:r>
+                      <w:fldSimple w:instr=" SEQ Figura \* ARABIC ">
+                        <w:r>
+                          <w:rPr>
+                            <w:noProof/>
+                          </w:rPr>
+                          <w:t>33</w:t>
+                        </w:r>
+                      </w:fldSimple>
                       <w:r>
                         <w:t xml:space="preserve">– </w:t>
                       </w:r>
@@ -18668,6 +17849,9 @@
         <w:jc w:val="center"/>
       </w:pPr>
       <w:r>
+        <w:rPr>
+          <w:noProof/>
+        </w:rPr>
         <w:drawing>
           <wp:inline distT="0" distB="0" distL="0" distR="0" wp14:anchorId="576C26DA" wp14:editId="162185D8">
             <wp:extent cx="2648320" cy="5601482"/>
@@ -18774,32 +17958,16 @@
                             </w:pPr>
                             <w:bookmarkStart w:id="96" w:name="_Toc219064837"/>
                             <w:r>
-                              <w:t>F</w:t>
+                              <w:t xml:space="preserve">Figura </w:t>
                             </w:r>
-                            <w:r>
-                              <w:t xml:space="preserve">igura </w:t>
-                            </w:r>
-                            <w:r>
-                              <w:fldChar w:fldCharType="begin"/>
-                            </w:r>
-                            <w:r>
-                              <w:instrText xml:space="preserve"> SEQ Figura \* ARABIC </w:instrText>
-                            </w:r>
-                            <w:r>
-                              <w:fldChar w:fldCharType="separate"/>
-                            </w:r>
-                            <w:r>
-                              <w:rPr>
-                                <w:noProof/>
-                              </w:rPr>
-                              <w:t>34</w:t>
-                            </w:r>
-                            <w:r>
-                              <w:rPr>
-                                <w:noProof/>
-                              </w:rPr>
-                              <w:fldChar w:fldCharType="end"/>
-                            </w:r>
+                            <w:fldSimple w:instr=" SEQ Figura \* ARABIC ">
+                              <w:r>
+                                <w:rPr>
+                                  <w:noProof/>
+                                </w:rPr>
+                                <w:t>34</w:t>
+                              </w:r>
+                            </w:fldSimple>
                             <w:r>
                               <w:t xml:space="preserve"> – </w:t>
                             </w:r>
@@ -18832,7 +18000,7 @@
           </mc:Choice>
           <mc:Fallback>
             <w:pict>
-              <v:shape w14:anchorId="386332F8" id="_x0000_s1051" type="#_x0000_t202" style="position:absolute;left:0;text-align:left;margin-left:0;margin-top:.45pt;width:220.05pt;height:.05pt;z-index:-251613184;visibility:visible;mso-wrap-style:square;mso-width-percent:0;mso-wrap-distance-left:9pt;mso-wrap-distance-top:0;mso-wrap-distance-right:9pt;mso-wrap-distance-bottom:0;mso-position-horizontal:center;mso-position-horizontal-relative:margin;mso-position-vertical:absolute;mso-position-vertical-relative:text;mso-width-percent:0;mso-width-relative:margin;v-text-anchor:top" o:gfxdata="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" stroked="f">
+              <v:shape w14:anchorId="386332F8" id="_x0000_s1051" type="#_x0000_t202" style="position:absolute;left:0;text-align:left;margin-left:0;margin-top:.45pt;width:220.05pt;height:.05pt;z-index:-251613184;visibility:visible;mso-wrap-style:square;mso-width-percent:0;mso-wrap-distance-left:9pt;mso-wrap-distance-top:0;mso-wrap-distance-right:9pt;mso-wrap-distance-bottom:0;mso-position-horizontal:center;mso-position-horizontal-relative:margin;mso-position-vertical:absolute;mso-position-vertical-relative:text;mso-width-percent:0;mso-width-relative:margin;v-text-anchor:top" o:gfxdata="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" stroked="f">
                 <v:textbox style="mso-fit-shape-to-text:t" inset="0,0,0,0">
                   <w:txbxContent>
                     <w:p>
@@ -18851,32 +18019,16 @@
                       </w:pPr>
                       <w:bookmarkStart w:id="97" w:name="_Toc219064837"/>
                       <w:r>
-                        <w:t>F</w:t>
+                        <w:t xml:space="preserve">Figura </w:t>
                       </w:r>
-                      <w:r>
-                        <w:t xml:space="preserve">igura </w:t>
-                      </w:r>
-                      <w:r>
-                        <w:fldChar w:fldCharType="begin"/>
-                      </w:r>
-                      <w:r>
-                        <w:instrText xml:space="preserve"> SEQ Figura \* ARABIC </w:instrText>
-                      </w:r>
-                      <w:r>
-                        <w:fldChar w:fldCharType="separate"/>
-                      </w:r>
-                      <w:r>
-                        <w:rPr>
-                          <w:noProof/>
-                        </w:rPr>
-                        <w:t>34</w:t>
-                      </w:r>
-                      <w:r>
-                        <w:rPr>
-                          <w:noProof/>
-                        </w:rPr>
-                        <w:fldChar w:fldCharType="end"/>
-                      </w:r>
+                      <w:fldSimple w:instr=" SEQ Figura \* ARABIC ">
+                        <w:r>
+                          <w:rPr>
+                            <w:noProof/>
+                          </w:rPr>
+                          <w:t>34</w:t>
+                        </w:r>
+                      </w:fldSimple>
                       <w:r>
                         <w:t xml:space="preserve"> – </w:t>
                       </w:r>
@@ -19032,32 +18184,16 @@
                             </w:pPr>
                             <w:bookmarkStart w:id="99" w:name="_Toc219064838"/>
                             <w:r>
-                              <w:t>F</w:t>
+                              <w:t xml:space="preserve">Figura </w:t>
                             </w:r>
-                            <w:r>
-                              <w:t xml:space="preserve">igura </w:t>
-                            </w:r>
-                            <w:r>
-                              <w:fldChar w:fldCharType="begin"/>
-                            </w:r>
-                            <w:r>
-                              <w:instrText xml:space="preserve"> SEQ Figura \* ARABIC </w:instrText>
-                            </w:r>
-                            <w:r>
-                              <w:fldChar w:fldCharType="separate"/>
-                            </w:r>
-                            <w:r>
-                              <w:rPr>
-                                <w:noProof/>
-                              </w:rPr>
-                              <w:t>35</w:t>
-                            </w:r>
-                            <w:r>
-                              <w:rPr>
-                                <w:noProof/>
-                              </w:rPr>
-                              <w:fldChar w:fldCharType="end"/>
-                            </w:r>
+                            <w:fldSimple w:instr=" SEQ Figura \* ARABIC ">
+                              <w:r>
+                                <w:rPr>
+                                  <w:noProof/>
+                                </w:rPr>
+                                <w:t>35</w:t>
+                              </w:r>
+                            </w:fldSimple>
                             <w:r>
                               <w:t xml:space="preserve">– </w:t>
                             </w:r>
@@ -19090,7 +18226,7 @@
           </mc:Choice>
           <mc:Fallback>
             <w:pict>
-              <v:shape w14:anchorId="447FCAC5" id="_x0000_s1052" type="#_x0000_t202" style="position:absolute;margin-left:0;margin-top:.45pt;width:220.05pt;height:.05pt;z-index:-251611136;visibility:visible;mso-wrap-style:square;mso-width-percent:0;mso-wrap-distance-left:9pt;mso-wrap-distance-top:0;mso-wrap-distance-right:9pt;mso-wrap-distance-bottom:0;mso-position-horizontal:center;mso-position-horizontal-relative:margin;mso-position-vertical:absolute;mso-position-vertical-relative:text;mso-width-percent:0;mso-width-relative:margin;v-text-anchor:top" o:gfxdata="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" stroked="f">
+              <v:shape w14:anchorId="447FCAC5" id="_x0000_s1052" type="#_x0000_t202" style="position:absolute;margin-left:0;margin-top:.45pt;width:220.05pt;height:.05pt;z-index:-251611136;visibility:visible;mso-wrap-style:square;mso-width-percent:0;mso-wrap-distance-left:9pt;mso-wrap-distance-top:0;mso-wrap-distance-right:9pt;mso-wrap-distance-bottom:0;mso-position-horizontal:center;mso-position-horizontal-relative:margin;mso-position-vertical:absolute;mso-position-vertical-relative:text;mso-width-percent:0;mso-width-relative:margin;v-text-anchor:top" o:gfxdata="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" stroked="f">
                 <v:textbox style="mso-fit-shape-to-text:t" inset="0,0,0,0">
                   <w:txbxContent>
                     <w:p>
@@ -19109,32 +18245,16 @@
                       </w:pPr>
                       <w:bookmarkStart w:id="100" w:name="_Toc219064838"/>
                       <w:r>
-                        <w:t>F</w:t>
+                        <w:t xml:space="preserve">Figura </w:t>
                       </w:r>
-                      <w:r>
-                        <w:t xml:space="preserve">igura </w:t>
-                      </w:r>
-                      <w:r>
-                        <w:fldChar w:fldCharType="begin"/>
-                      </w:r>
-                      <w:r>
-                        <w:instrText xml:space="preserve"> SEQ Figura \* ARABIC </w:instrText>
-                      </w:r>
-                      <w:r>
-                        <w:fldChar w:fldCharType="separate"/>
-                      </w:r>
-                      <w:r>
-                        <w:rPr>
-                          <w:noProof/>
-                        </w:rPr>
-                        <w:t>35</w:t>
-                      </w:r>
-                      <w:r>
-                        <w:rPr>
-                          <w:noProof/>
-                        </w:rPr>
-                        <w:fldChar w:fldCharType="end"/>
-                      </w:r>
+                      <w:fldSimple w:instr=" SEQ Figura \* ARABIC ">
+                        <w:r>
+                          <w:rPr>
+                            <w:noProof/>
+                          </w:rPr>
+                          <w:t>35</w:t>
+                        </w:r>
+                      </w:fldSimple>
                       <w:r>
                         <w:t xml:space="preserve">– </w:t>
                       </w:r>
@@ -19246,27 +18366,14 @@
                             <w:r>
                               <w:t xml:space="preserve">igura </w:t>
                             </w:r>
-                            <w:r>
-                              <w:fldChar w:fldCharType="begin"/>
-                            </w:r>
-                            <w:r>
-                              <w:instrText xml:space="preserve"> SEQ Figura \* ARABIC </w:instrText>
-                            </w:r>
-                            <w:r>
-                              <w:fldChar w:fldCharType="separate"/>
-                            </w:r>
-                            <w:r>
-                              <w:rPr>
-                                <w:noProof/>
-                              </w:rPr>
-                              <w:t>36</w:t>
-                            </w:r>
-                            <w:r>
-                              <w:rPr>
-                                <w:noProof/>
-                              </w:rPr>
-                              <w:fldChar w:fldCharType="end"/>
-                            </w:r>
+                            <w:fldSimple w:instr=" SEQ Figura \* ARABIC ">
+                              <w:r>
+                                <w:rPr>
+                                  <w:noProof/>
+                                </w:rPr>
+                                <w:t>36</w:t>
+                              </w:r>
+                            </w:fldSimple>
                             <w:r>
                               <w:t xml:space="preserve">– </w:t>
                             </w:r>
@@ -19317,7 +18424,7 @@
           </mc:Choice>
           <mc:Fallback>
             <w:pict>
-              <v:shape w14:anchorId="394C169E" id="_x0000_s1053" type="#_x0000_t202" style="position:absolute;left:0;text-align:left;margin-left:111.4pt;margin-top:292.25pt;width:220.05pt;height:.05pt;z-index:-251609088;visibility:visible;mso-wrap-style:square;mso-width-percent:0;mso-wrap-distance-left:9pt;mso-wrap-distance-top:0;mso-wrap-distance-right:9pt;mso-wrap-distance-bottom:0;mso-position-horizontal:absolute;mso-position-horizontal-relative:margin;mso-position-vertical:absolute;mso-position-vertical-relative:text;mso-width-percent:0;mso-width-relative:margin;v-text-anchor:top" o:gfxdata="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" stroked="f">
+              <v:shape w14:anchorId="394C169E" id="_x0000_s1053" type="#_x0000_t202" style="position:absolute;left:0;text-align:left;margin-left:111.4pt;margin-top:292.25pt;width:220.05pt;height:.05pt;z-index:-251609088;visibility:visible;mso-wrap-style:square;mso-width-percent:0;mso-wrap-distance-left:9pt;mso-wrap-distance-top:0;mso-wrap-distance-right:9pt;mso-wrap-distance-bottom:0;mso-position-horizontal:absolute;mso-position-horizontal-relative:margin;mso-position-vertical:absolute;mso-position-vertical-relative:text;mso-width-percent:0;mso-width-relative:margin;v-text-anchor:top" o:gfxdata="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" stroked="f">
                 <v:textbox style="mso-fit-shape-to-text:t" inset="0,0,0,0">
                   <w:txbxContent>
                     <w:p>
@@ -19341,27 +18448,14 @@
                       <w:r>
                         <w:t xml:space="preserve">igura </w:t>
                       </w:r>
-                      <w:r>
-                        <w:fldChar w:fldCharType="begin"/>
-                      </w:r>
-                      <w:r>
-                        <w:instrText xml:space="preserve"> SEQ Figura \* ARABIC </w:instrText>
-                      </w:r>
-                      <w:r>
-                        <w:fldChar w:fldCharType="separate"/>
-                      </w:r>
-                      <w:r>
-                        <w:rPr>
-                          <w:noProof/>
-                        </w:rPr>
-                        <w:t>36</w:t>
-                      </w:r>
-                      <w:r>
-                        <w:rPr>
-                          <w:noProof/>
-                        </w:rPr>
-                        <w:fldChar w:fldCharType="end"/>
-                      </w:r>
+                      <w:fldSimple w:instr=" SEQ Figura \* ARABIC ">
+                        <w:r>
+                          <w:rPr>
+                            <w:noProof/>
+                          </w:rPr>
+                          <w:t>36</w:t>
+                        </w:r>
+                      </w:fldSimple>
                       <w:r>
                         <w:t xml:space="preserve">– </w:t>
                       </w:r>
@@ -19442,6 +18536,9 @@
         </w:drawing>
       </w:r>
       <w:r>
+        <w:rPr>
+          <w:noProof/>
+        </w:rPr>
         <w:drawing>
           <wp:inline distT="0" distB="0" distL="0" distR="0" wp14:anchorId="50FB3DD6" wp14:editId="51800E36">
             <wp:extent cx="1685903" cy="3530048"/>
@@ -19479,6 +18576,9 @@
         </w:drawing>
       </w:r>
       <w:r>
+        <w:rPr>
+          <w:noProof/>
+        </w:rPr>
         <w:drawing>
           <wp:inline distT="0" distB="0" distL="0" distR="0" wp14:anchorId="3551DADF" wp14:editId="0CFD7BEB">
             <wp:extent cx="1716102" cy="3516208"/>
@@ -19626,32 +18726,16 @@
                             </w:pPr>
                             <w:bookmarkStart w:id="105" w:name="_Toc219064840"/>
                             <w:r>
-                              <w:t>F</w:t>
+                              <w:t xml:space="preserve">Figura </w:t>
                             </w:r>
-                            <w:r>
-                              <w:t xml:space="preserve">igura </w:t>
-                            </w:r>
-                            <w:r>
-                              <w:fldChar w:fldCharType="begin"/>
-                            </w:r>
-                            <w:r>
-                              <w:instrText xml:space="preserve"> SEQ Figura \* ARABIC </w:instrText>
-                            </w:r>
-                            <w:r>
-                              <w:fldChar w:fldCharType="separate"/>
-                            </w:r>
-                            <w:r>
-                              <w:rPr>
-                                <w:noProof/>
-                              </w:rPr>
-                              <w:t>37</w:t>
-                            </w:r>
-                            <w:r>
-                              <w:rPr>
-                                <w:noProof/>
-                              </w:rPr>
-                              <w:fldChar w:fldCharType="end"/>
-                            </w:r>
+                            <w:fldSimple w:instr=" SEQ Figura \* ARABIC ">
+                              <w:r>
+                                <w:rPr>
+                                  <w:noProof/>
+                                </w:rPr>
+                                <w:t>37</w:t>
+                              </w:r>
+                            </w:fldSimple>
                             <w:r>
                               <w:t xml:space="preserve">– </w:t>
                             </w:r>
@@ -19684,7 +18768,7 @@
           </mc:Choice>
           <mc:Fallback>
             <w:pict>
-              <v:shape w14:anchorId="75FE844B" id="_x0000_s1054" type="#_x0000_t202" style="position:absolute;left:0;text-align:left;margin-left:0;margin-top:464.8pt;width:220.05pt;height:.05pt;z-index:-251594752;visibility:visible;mso-wrap-style:square;mso-width-percent:0;mso-wrap-distance-left:9pt;mso-wrap-distance-top:0;mso-wrap-distance-right:9pt;mso-wrap-distance-bottom:0;mso-position-horizontal:center;mso-position-horizontal-relative:margin;mso-position-vertical:absolute;mso-position-vertical-relative:text;mso-width-percent:0;mso-width-relative:margin;v-text-anchor:top" o:gfxdata="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" stroked="f">
+              <v:shape w14:anchorId="75FE844B" id="_x0000_s1054" type="#_x0000_t202" style="position:absolute;left:0;text-align:left;margin-left:0;margin-top:464.8pt;width:220.05pt;height:.05pt;z-index:-251594752;visibility:visible;mso-wrap-style:square;mso-width-percent:0;mso-wrap-distance-left:9pt;mso-wrap-distance-top:0;mso-wrap-distance-right:9pt;mso-wrap-distance-bottom:0;mso-position-horizontal:center;mso-position-horizontal-relative:margin;mso-position-vertical:absolute;mso-position-vertical-relative:text;mso-width-percent:0;mso-width-relative:margin;v-text-anchor:top" o:gfxdata="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" stroked="f">
                 <v:textbox style="mso-fit-shape-to-text:t" inset="0,0,0,0">
                   <w:txbxContent>
                     <w:p>
@@ -19703,32 +18787,16 @@
                       </w:pPr>
                       <w:bookmarkStart w:id="106" w:name="_Toc219064840"/>
                       <w:r>
-                        <w:t>F</w:t>
+                        <w:t xml:space="preserve">Figura </w:t>
                       </w:r>
-                      <w:r>
-                        <w:t xml:space="preserve">igura </w:t>
-                      </w:r>
-                      <w:r>
-                        <w:fldChar w:fldCharType="begin"/>
-                      </w:r>
-                      <w:r>
-                        <w:instrText xml:space="preserve"> SEQ Figura \* ARABIC </w:instrText>
-                      </w:r>
-                      <w:r>
-                        <w:fldChar w:fldCharType="separate"/>
-                      </w:r>
-                      <w:r>
-                        <w:rPr>
-                          <w:noProof/>
-                        </w:rPr>
-                        <w:t>37</w:t>
-                      </w:r>
-                      <w:r>
-                        <w:rPr>
-                          <w:noProof/>
-                        </w:rPr>
-                        <w:fldChar w:fldCharType="end"/>
-                      </w:r>
+                      <w:fldSimple w:instr=" SEQ Figura \* ARABIC ">
+                        <w:r>
+                          <w:rPr>
+                            <w:noProof/>
+                          </w:rPr>
+                          <w:t>37</w:t>
+                        </w:r>
+                      </w:fldSimple>
                       <w:r>
                         <w:t xml:space="preserve">– </w:t>
                       </w:r>
@@ -19751,6 +18819,9 @@
         </mc:AlternateContent>
       </w:r>
       <w:r>
+        <w:rPr>
+          <w:noProof/>
+        </w:rPr>
         <w:drawing>
           <wp:inline distT="0" distB="0" distL="0" distR="0" wp14:anchorId="1271D1A4" wp14:editId="73465DD0">
             <wp:extent cx="2762636" cy="5763429"/>
@@ -19872,6 +18943,9 @@
         </w:drawing>
       </w:r>
       <w:r>
+        <w:rPr>
+          <w:noProof/>
+        </w:rPr>
         <w:drawing>
           <wp:inline distT="0" distB="0" distL="0" distR="0" wp14:anchorId="04A16C32" wp14:editId="69C50FB9">
             <wp:extent cx="2150559" cy="4493820"/>
@@ -19975,32 +19049,16 @@
                             </w:pPr>
                             <w:bookmarkStart w:id="108" w:name="_Toc219064841"/>
                             <w:r>
-                              <w:t>F</w:t>
+                              <w:t xml:space="preserve">Figura </w:t>
                             </w:r>
-                            <w:r>
-                              <w:t xml:space="preserve">igura </w:t>
-                            </w:r>
-                            <w:r>
-                              <w:fldChar w:fldCharType="begin"/>
-                            </w:r>
-                            <w:r>
-                              <w:instrText xml:space="preserve"> SEQ Figura \* ARABIC </w:instrText>
-                            </w:r>
-                            <w:r>
-                              <w:fldChar w:fldCharType="separate"/>
-                            </w:r>
-                            <w:r>
-                              <w:rPr>
-                                <w:noProof/>
-                              </w:rPr>
-                              <w:t>38</w:t>
-                            </w:r>
-                            <w:r>
-                              <w:rPr>
-                                <w:noProof/>
-                              </w:rPr>
-                              <w:fldChar w:fldCharType="end"/>
-                            </w:r>
+                            <w:fldSimple w:instr=" SEQ Figura \* ARABIC ">
+                              <w:r>
+                                <w:rPr>
+                                  <w:noProof/>
+                                </w:rPr>
+                                <w:t>38</w:t>
+                              </w:r>
+                            </w:fldSimple>
                             <w:r>
                               <w:t xml:space="preserve">– </w:t>
                             </w:r>
@@ -20033,7 +19091,7 @@
           </mc:Choice>
           <mc:Fallback>
             <w:pict>
-              <v:shape w14:anchorId="5E851F1D" id="_x0000_s1055" type="#_x0000_t202" style="position:absolute;margin-left:0;margin-top:.8pt;width:220.05pt;height:.05pt;z-index:-251607040;visibility:visible;mso-wrap-style:square;mso-width-percent:0;mso-wrap-distance-left:9pt;mso-wrap-distance-top:0;mso-wrap-distance-right:9pt;mso-wrap-distance-bottom:0;mso-position-horizontal:center;mso-position-horizontal-relative:margin;mso-position-vertical:absolute;mso-position-vertical-relative:text;mso-width-percent:0;mso-width-relative:margin;v-text-anchor:top" o:gfxdata="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" stroked="f">
+              <v:shape w14:anchorId="5E851F1D" id="_x0000_s1055" type="#_x0000_t202" style="position:absolute;margin-left:0;margin-top:.8pt;width:220.05pt;height:.05pt;z-index:-251607040;visibility:visible;mso-wrap-style:square;mso-width-percent:0;mso-wrap-distance-left:9pt;mso-wrap-distance-top:0;mso-wrap-distance-right:9pt;mso-wrap-distance-bottom:0;mso-position-horizontal:center;mso-position-horizontal-relative:margin;mso-position-vertical:absolute;mso-position-vertical-relative:text;mso-width-percent:0;mso-width-relative:margin;v-text-anchor:top" o:gfxdata="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" stroked="f">
                 <v:textbox style="mso-fit-shape-to-text:t" inset="0,0,0,0">
                   <w:txbxContent>
                     <w:p>
@@ -20052,32 +19110,16 @@
                       </w:pPr>
                       <w:bookmarkStart w:id="109" w:name="_Toc219064841"/>
                       <w:r>
-                        <w:t>F</w:t>
+                        <w:t xml:space="preserve">Figura </w:t>
                       </w:r>
-                      <w:r>
-                        <w:t xml:space="preserve">igura </w:t>
-                      </w:r>
-                      <w:r>
-                        <w:fldChar w:fldCharType="begin"/>
-                      </w:r>
-                      <w:r>
-                        <w:instrText xml:space="preserve"> SEQ Figura \* ARABIC </w:instrText>
-                      </w:r>
-                      <w:r>
-                        <w:fldChar w:fldCharType="separate"/>
-                      </w:r>
-                      <w:r>
-                        <w:rPr>
-                          <w:noProof/>
-                        </w:rPr>
-                        <w:t>38</w:t>
-                      </w:r>
-                      <w:r>
-                        <w:rPr>
-                          <w:noProof/>
-                        </w:rPr>
-                        <w:fldChar w:fldCharType="end"/>
-                      </w:r>
+                      <w:fldSimple w:instr=" SEQ Figura \* ARABIC ">
+                        <w:r>
+                          <w:rPr>
+                            <w:noProof/>
+                          </w:rPr>
+                          <w:t>38</w:t>
+                        </w:r>
+                      </w:fldSimple>
                       <w:r>
                         <w:t xml:space="preserve">– </w:t>
                       </w:r>
@@ -20132,6 +19174,9 @@
         <w:jc w:val="center"/>
       </w:pPr>
       <w:r>
+        <w:rPr>
+          <w:noProof/>
+        </w:rPr>
         <w:drawing>
           <wp:inline distT="0" distB="0" distL="0" distR="0" wp14:anchorId="6E3921B3" wp14:editId="7D29E16B">
             <wp:extent cx="2167787" cy="4635374"/>
@@ -20238,27 +19283,14 @@
                             <w:r>
                               <w:t xml:space="preserve">Figura </w:t>
                             </w:r>
-                            <w:r>
-                              <w:fldChar w:fldCharType="begin"/>
-                            </w:r>
-                            <w:r>
-                              <w:instrText xml:space="preserve"> SEQ Figura \* ARABIC </w:instrText>
-                            </w:r>
-                            <w:r>
-                              <w:fldChar w:fldCharType="separate"/>
-                            </w:r>
-                            <w:r>
-                              <w:rPr>
-                                <w:noProof/>
-                              </w:rPr>
-                              <w:t>39</w:t>
-                            </w:r>
-                            <w:r>
-                              <w:rPr>
-                                <w:noProof/>
-                              </w:rPr>
-                              <w:fldChar w:fldCharType="end"/>
-                            </w:r>
+                            <w:fldSimple w:instr=" SEQ Figura \* ARABIC ">
+                              <w:r>
+                                <w:rPr>
+                                  <w:noProof/>
+                                </w:rPr>
+                                <w:t>39</w:t>
+                              </w:r>
+                            </w:fldSimple>
                             <w:r>
                               <w:t xml:space="preserve">– </w:t>
                             </w:r>
@@ -20291,7 +19323,7 @@
           </mc:Choice>
           <mc:Fallback>
             <w:pict>
-              <v:shape w14:anchorId="2094BEB0" id="_x0000_s1056" type="#_x0000_t202" style="position:absolute;margin-left:0;margin-top:.15pt;width:220.05pt;height:.05pt;z-index:-251592704;visibility:visible;mso-wrap-style:square;mso-width-percent:0;mso-wrap-distance-left:9pt;mso-wrap-distance-top:0;mso-wrap-distance-right:9pt;mso-wrap-distance-bottom:0;mso-position-horizontal:center;mso-position-horizontal-relative:page;mso-position-vertical:absolute;mso-position-vertical-relative:text;mso-width-percent:0;mso-width-relative:margin;v-text-anchor:top" o:gfxdata="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" stroked="f">
+              <v:shape w14:anchorId="2094BEB0" id="_x0000_s1056" type="#_x0000_t202" style="position:absolute;margin-left:0;margin-top:.15pt;width:220.05pt;height:.05pt;z-index:-251592704;visibility:visible;mso-wrap-style:square;mso-width-percent:0;mso-wrap-distance-left:9pt;mso-wrap-distance-top:0;mso-wrap-distance-right:9pt;mso-wrap-distance-bottom:0;mso-position-horizontal:center;mso-position-horizontal-relative:page;mso-position-vertical:absolute;mso-position-vertical-relative:text;mso-width-percent:0;mso-width-relative:margin;v-text-anchor:top" o:gfxdata="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" stroked="f">
                 <v:textbox style="mso-fit-shape-to-text:t" inset="0,0,0,0">
                   <w:txbxContent>
                     <w:p>
@@ -20313,27 +19345,14 @@
                       <w:r>
                         <w:t xml:space="preserve">Figura </w:t>
                       </w:r>
-                      <w:r>
-                        <w:fldChar w:fldCharType="begin"/>
-                      </w:r>
-                      <w:r>
-                        <w:instrText xml:space="preserve"> SEQ Figura \* ARABIC </w:instrText>
-                      </w:r>
-                      <w:r>
-                        <w:fldChar w:fldCharType="separate"/>
-                      </w:r>
-                      <w:r>
-                        <w:rPr>
-                          <w:noProof/>
-                        </w:rPr>
-                        <w:t>39</w:t>
-                      </w:r>
-                      <w:r>
-                        <w:rPr>
-                          <w:noProof/>
-                        </w:rPr>
-                        <w:fldChar w:fldCharType="end"/>
-                      </w:r>
+                      <w:fldSimple w:instr=" SEQ Figura \* ARABIC ">
+                        <w:r>
+                          <w:rPr>
+                            <w:noProof/>
+                          </w:rPr>
+                          <w:t>39</w:t>
+                        </w:r>
+                      </w:fldSimple>
                       <w:r>
                         <w:t xml:space="preserve">– </w:t>
                       </w:r>
@@ -20379,21 +19398,15 @@
       <w:bookmarkStart w:id="113" w:name="_Toc219064811"/>
       <w:r>
         <w:lastRenderedPageBreak/>
-        <w:t>Criar</w:t>
-      </w:r>
-      <w:r>
-        <w:t>/Editar</w:t>
-      </w:r>
-      <w:r>
-        <w:t xml:space="preserve"> </w:t>
-      </w:r>
-      <w:r>
-        <w:t>Campanha</w:t>
+        <w:t>Criar/Editar Campanha</w:t>
       </w:r>
       <w:bookmarkEnd w:id="113"/>
     </w:p>
     <w:p>
       <w:r>
+        <w:rPr>
+          <w:noProof/>
+        </w:rPr>
         <w:drawing>
           <wp:inline distT="0" distB="0" distL="0" distR="0" wp14:anchorId="3416D1DA" wp14:editId="6A7D5FE6">
             <wp:extent cx="1627390" cy="3412268"/>
@@ -20431,6 +19444,9 @@
         </w:drawing>
       </w:r>
       <w:r>
+        <w:rPr>
+          <w:noProof/>
+        </w:rPr>
         <w:drawing>
           <wp:inline distT="0" distB="0" distL="0" distR="0" wp14:anchorId="11753141" wp14:editId="75D43D37">
             <wp:extent cx="3256240" cy="3395050"/>
@@ -20537,27 +19553,14 @@
                             <w:r>
                               <w:t xml:space="preserve">Figura </w:t>
                             </w:r>
-                            <w:r>
-                              <w:fldChar w:fldCharType="begin"/>
-                            </w:r>
-                            <w:r>
-                              <w:instrText xml:space="preserve"> SEQ Figura \* ARABIC </w:instrText>
-                            </w:r>
-                            <w:r>
-                              <w:fldChar w:fldCharType="separate"/>
-                            </w:r>
-                            <w:r>
-                              <w:rPr>
-                                <w:noProof/>
-                              </w:rPr>
-                              <w:t>40</w:t>
-                            </w:r>
-                            <w:r>
-                              <w:rPr>
-                                <w:noProof/>
-                              </w:rPr>
-                              <w:fldChar w:fldCharType="end"/>
-                            </w:r>
+                            <w:fldSimple w:instr=" SEQ Figura \* ARABIC ">
+                              <w:r>
+                                <w:rPr>
+                                  <w:noProof/>
+                                </w:rPr>
+                                <w:t>40</w:t>
+                              </w:r>
+                            </w:fldSimple>
                             <w:r>
                               <w:t xml:space="preserve">– </w:t>
                             </w:r>
@@ -20590,7 +19593,7 @@
           </mc:Choice>
           <mc:Fallback>
             <w:pict>
-              <v:shape w14:anchorId="5EC35913" id="_x0000_s1057" type="#_x0000_t202" style="position:absolute;margin-left:0;margin-top:7.25pt;width:220.05pt;height:.05pt;z-index:-251590656;visibility:visible;mso-wrap-style:square;mso-width-percent:0;mso-wrap-distance-left:9pt;mso-wrap-distance-top:0;mso-wrap-distance-right:9pt;mso-wrap-distance-bottom:0;mso-position-horizontal:center;mso-position-horizontal-relative:page;mso-position-vertical:absolute;mso-position-vertical-relative:text;mso-width-percent:0;mso-width-relative:margin;v-text-anchor:top" o:gfxdata="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" stroked="f">
+              <v:shape w14:anchorId="5EC35913" id="_x0000_s1057" type="#_x0000_t202" style="position:absolute;margin-left:0;margin-top:7.25pt;width:220.05pt;height:.05pt;z-index:-251590656;visibility:visible;mso-wrap-style:square;mso-width-percent:0;mso-wrap-distance-left:9pt;mso-wrap-distance-top:0;mso-wrap-distance-right:9pt;mso-wrap-distance-bottom:0;mso-position-horizontal:center;mso-position-horizontal-relative:page;mso-position-vertical:absolute;mso-position-vertical-relative:text;mso-width-percent:0;mso-width-relative:margin;v-text-anchor:top" o:gfxdata="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" stroked="f">
                 <v:textbox style="mso-fit-shape-to-text:t" inset="0,0,0,0">
                   <w:txbxContent>
                     <w:p>
@@ -20612,27 +19615,14 @@
                       <w:r>
                         <w:t xml:space="preserve">Figura </w:t>
                       </w:r>
-                      <w:r>
-                        <w:fldChar w:fldCharType="begin"/>
-                      </w:r>
-                      <w:r>
-                        <w:instrText xml:space="preserve"> SEQ Figura \* ARABIC </w:instrText>
-                      </w:r>
-                      <w:r>
-                        <w:fldChar w:fldCharType="separate"/>
-                      </w:r>
-                      <w:r>
-                        <w:rPr>
-                          <w:noProof/>
-                        </w:rPr>
-                        <w:t>40</w:t>
-                      </w:r>
-                      <w:r>
-                        <w:rPr>
-                          <w:noProof/>
-                        </w:rPr>
-                        <w:fldChar w:fldCharType="end"/>
-                      </w:r>
+                      <w:fldSimple w:instr=" SEQ Figura \* ARABIC ">
+                        <w:r>
+                          <w:rPr>
+                            <w:noProof/>
+                          </w:rPr>
+                          <w:t>40</w:t>
+                        </w:r>
+                      </w:fldSimple>
                       <w:r>
                         <w:t xml:space="preserve">– </w:t>
                       </w:r>
@@ -20758,7 +19748,7 @@
 </file>
 
 <file path=word/endnotes.xml><?xml version="1.0" encoding="utf-8"?>
-<w:endnotes xmlns:wpc="http://schemas.microsoft.com/office/word/2010/wordprocessingCanvas" xmlns:cx="http://schemas.microsoft.com/office/drawing/2014/chartex" xmlns:cx1="http://schemas.microsoft.com/office/drawing/2015/9/8/chartex" xmlns:cx2="http://schemas.microsoft.com/office/drawing/2015/10/21/chartex" xmlns:cx3="http://schemas.microsoft.com/office/drawing/2016/5/9/chartex" xmlns:cx4="http://schemas.microsoft.com/office/drawing/2016/5/10/chartex" xmlns:cx5="http://schemas.microsoft.com/office/drawing/2016/5/11/chartex" xmlns:cx6="http://schemas.microsoft.com/office/drawing/2016/5/12/chartex" xmlns:cx7="http://schemas.microsoft.com/office/drawing/2016/5/13/chartex" xmlns:cx8="http://schemas.microsoft.com/office/drawing/2016/5/14/chartex" xmlns:mc="http://schemas.openxmlformats.org/markup-compatibility/2006" xmlns:aink="http://schemas.microsoft.com/office/drawing/2016/ink" xmlns:am3d="http://schemas.microsoft.com/office/drawing/2017/model3d" xmlns:o="urn:schemas-microsoft-com:office:office" xmlns:oel="http://schemas.microsoft.com/office/2019/extlst" xmlns:r="http://schemas.openxmlformats.org/officeDocument/2006/relationships" xmlns:m="http://schemas.openxmlformats.org/officeDocument/2006/math" xmlns:v="urn:schemas-microsoft-com:vml" xmlns:wp14="http://schemas.microsoft.com/office/word/2010/wordprocessingDrawing" xmlns:wp="http://schemas.openxmlformats.org/drawingml/2006/wordprocessingDrawing" xmlns:w10="urn:schemas-microsoft-com:office:word" xmlns:w="http://schemas.openxmlformats.org/wordprocessingml/2006/main" xmlns:w14="http://schemas.microsoft.com/office/word/2010/wordml" xmlns:w15="http://schemas.microsoft.com/office/word/2012/wordml" xmlns:w16cex="http://schemas.microsoft.com/office/word/2018/wordml/cex" xmlns:w16cid="http://schemas.microsoft.com/office/word/2016/wordml/cid" xmlns:w16="http://schemas.microsoft.com/office/word/2018/wordml" xmlns:w16du="http://schemas.microsoft.com/office/word/2023/wordml/word16du" xmlns:w16sdtdh="http://schemas.microsoft.com/office/word/2020/wordml/sdtdatahash" xmlns:w16sdtfl="http://schemas.microsoft.com/office/word/2024/wordml/sdtformatlock" xmlns:w16se="http://schemas.microsoft.com/office/word/2015/wordml/symex" xmlns:wpg="http://schemas.microsoft.com/office/word/2010/wordprocessingGroup" xmlns:wpi="http://schemas.microsoft.com/office/word/2010/wordprocessingInk" xmlns:wne="http://schemas.microsoft.com/office/word/2006/wordml" xmlns:wps="http://schemas.microsoft.com/office/word/2010/wordprocessingShape" mc:Ignorable="w14 w15 w16se w16cid w16 w16cex w16sdtdh w16sdtfl w16du wp14">
+<w:endnotes xmlns:wpc="http://schemas.microsoft.com/office/word/2010/wordprocessingCanvas" xmlns:cx="http://schemas.microsoft.com/office/drawing/2014/chartex" xmlns:cx1="http://schemas.microsoft.com/office/drawing/2015/9/8/chartex" xmlns:cx2="http://schemas.microsoft.com/office/drawing/2015/10/21/chartex" xmlns:cx3="http://schemas.microsoft.com/office/drawing/2016/5/9/chartex" xmlns:cx4="http://schemas.microsoft.com/office/drawing/2016/5/10/chartex" xmlns:cx5="http://schemas.microsoft.com/office/drawing/2016/5/11/chartex" xmlns:cx6="http://schemas.microsoft.com/office/drawing/2016/5/12/chartex" xmlns:cx7="http://schemas.microsoft.com/office/drawing/2016/5/13/chartex" xmlns:cx8="http://schemas.microsoft.com/office/drawing/2016/5/14/chartex" xmlns:mc="http://schemas.openxmlformats.org/markup-compatibility/2006" xmlns:aink="http://schemas.microsoft.com/office/drawing/2016/ink" xmlns:am3d="http://schemas.microsoft.com/office/drawing/2017/model3d" xmlns:o="urn:schemas-microsoft-com:office:office" xmlns:r="http://schemas.openxmlformats.org/officeDocument/2006/relationships" xmlns:m="http://schemas.openxmlformats.org/officeDocument/2006/math" xmlns:v="urn:schemas-microsoft-com:vml" xmlns:wp14="http://schemas.microsoft.com/office/word/2010/wordprocessingDrawing" xmlns:wp="http://schemas.openxmlformats.org/drawingml/2006/wordprocessingDrawing" xmlns:w10="urn:schemas-microsoft-com:office:word" xmlns:w="http://schemas.openxmlformats.org/wordprocessingml/2006/main" xmlns:w14="http://schemas.microsoft.com/office/word/2010/wordml" xmlns:w15="http://schemas.microsoft.com/office/word/2012/wordml" xmlns:w16cex="http://schemas.microsoft.com/office/word/2018/wordml/cex" xmlns:w16cid="http://schemas.microsoft.com/office/word/2016/wordml/cid" xmlns:w16="http://schemas.microsoft.com/office/word/2018/wordml" xmlns:w16sdtdh="http://schemas.microsoft.com/office/word/2020/wordml/sdtdatahash" xmlns:w16se="http://schemas.microsoft.com/office/word/2015/wordml/symex" xmlns:wpg="http://schemas.microsoft.com/office/word/2010/wordprocessingGroup" xmlns:wpi="http://schemas.microsoft.com/office/word/2010/wordprocessingInk" xmlns:wne="http://schemas.microsoft.com/office/word/2006/wordml" xmlns:wps="http://schemas.microsoft.com/office/word/2010/wordprocessingShape" mc:Ignorable="w14 w15 w16se w16cid w16 w16cex w16sdtdh wp14">
   <w:endnote w:type="separator" w:id="-1">
     <w:p>
       <w:pPr>
@@ -20783,7 +19773,7 @@
 </file>
 
 <file path=word/footer1.xml><?xml version="1.0" encoding="utf-8"?>
-<w:ftr xmlns:wpc="http://schemas.microsoft.com/office/word/2010/wordprocessingCanvas" xmlns:cx="http://schemas.microsoft.com/office/drawing/2014/chartex" xmlns:cx1="http://schemas.microsoft.com/office/drawing/2015/9/8/chartex" xmlns:cx2="http://schemas.microsoft.com/office/drawing/2015/10/21/chartex" xmlns:cx3="http://schemas.microsoft.com/office/drawing/2016/5/9/chartex" xmlns:cx4="http://schemas.microsoft.com/office/drawing/2016/5/10/chartex" xmlns:cx5="http://schemas.microsoft.com/office/drawing/2016/5/11/chartex" xmlns:cx6="http://schemas.microsoft.com/office/drawing/2016/5/12/chartex" xmlns:cx7="http://schemas.microsoft.com/office/drawing/2016/5/13/chartex" xmlns:cx8="http://schemas.microsoft.com/office/drawing/2016/5/14/chartex" xmlns:mc="http://schemas.openxmlformats.org/markup-compatibility/2006" xmlns:aink="http://schemas.microsoft.com/office/drawing/2016/ink" xmlns:am3d="http://schemas.microsoft.com/office/drawing/2017/model3d" xmlns:o="urn:schemas-microsoft-com:office:office" xmlns:oel="http://schemas.microsoft.com/office/2019/extlst" xmlns:r="http://schemas.openxmlformats.org/officeDocument/2006/relationships" xmlns:m="http://schemas.openxmlformats.org/officeDocument/2006/math" xmlns:v="urn:schemas-microsoft-com:vml" xmlns:wp14="http://schemas.microsoft.com/office/word/2010/wordprocessingDrawing" xmlns:wp="http://schemas.openxmlformats.org/drawingml/2006/wordprocessingDrawing" xmlns:w10="urn:schemas-microsoft-com:office:word" xmlns:w="http://schemas.openxmlformats.org/wordprocessingml/2006/main" xmlns:w14="http://schemas.microsoft.com/office/word/2010/wordml" xmlns:w15="http://schemas.microsoft.com/office/word/2012/wordml" xmlns:w16cex="http://schemas.microsoft.com/office/word/2018/wordml/cex" xmlns:w16cid="http://schemas.microsoft.com/office/word/2016/wordml/cid" xmlns:w16="http://schemas.microsoft.com/office/word/2018/wordml" xmlns:w16du="http://schemas.microsoft.com/office/word/2023/wordml/word16du" xmlns:w16sdtdh="http://schemas.microsoft.com/office/word/2020/wordml/sdtdatahash" xmlns:w16sdtfl="http://schemas.microsoft.com/office/word/2024/wordml/sdtformatlock" xmlns:w16se="http://schemas.microsoft.com/office/word/2015/wordml/symex" xmlns:wpg="http://schemas.microsoft.com/office/word/2010/wordprocessingGroup" xmlns:wpi="http://schemas.microsoft.com/office/word/2010/wordprocessingInk" xmlns:wne="http://schemas.microsoft.com/office/word/2006/wordml" xmlns:wps="http://schemas.microsoft.com/office/word/2010/wordprocessingShape" mc:Ignorable="w14 w15 w16se w16cid w16 w16cex w16sdtdh w16sdtfl w16du wp14">
+<w:ftr xmlns:wpc="http://schemas.microsoft.com/office/word/2010/wordprocessingCanvas" xmlns:cx="http://schemas.microsoft.com/office/drawing/2014/chartex" xmlns:cx1="http://schemas.microsoft.com/office/drawing/2015/9/8/chartex" xmlns:cx2="http://schemas.microsoft.com/office/drawing/2015/10/21/chartex" xmlns:cx3="http://schemas.microsoft.com/office/drawing/2016/5/9/chartex" xmlns:cx4="http://schemas.microsoft.com/office/drawing/2016/5/10/chartex" xmlns:cx5="http://schemas.microsoft.com/office/drawing/2016/5/11/chartex" xmlns:cx6="http://schemas.microsoft.com/office/drawing/2016/5/12/chartex" xmlns:cx7="http://schemas.microsoft.com/office/drawing/2016/5/13/chartex" xmlns:cx8="http://schemas.microsoft.com/office/drawing/2016/5/14/chartex" xmlns:mc="http://schemas.openxmlformats.org/markup-compatibility/2006" xmlns:aink="http://schemas.microsoft.com/office/drawing/2016/ink" xmlns:am3d="http://schemas.microsoft.com/office/drawing/2017/model3d" xmlns:o="urn:schemas-microsoft-com:office:office" xmlns:r="http://schemas.openxmlformats.org/officeDocument/2006/relationships" xmlns:m="http://schemas.openxmlformats.org/officeDocument/2006/math" xmlns:v="urn:schemas-microsoft-com:vml" xmlns:wp14="http://schemas.microsoft.com/office/word/2010/wordprocessingDrawing" xmlns:wp="http://schemas.openxmlformats.org/drawingml/2006/wordprocessingDrawing" xmlns:w10="urn:schemas-microsoft-com:office:word" xmlns:w="http://schemas.openxmlformats.org/wordprocessingml/2006/main" xmlns:w14="http://schemas.microsoft.com/office/word/2010/wordml" xmlns:w15="http://schemas.microsoft.com/office/word/2012/wordml" xmlns:w16cex="http://schemas.microsoft.com/office/word/2018/wordml/cex" xmlns:w16cid="http://schemas.microsoft.com/office/word/2016/wordml/cid" xmlns:w16="http://schemas.microsoft.com/office/word/2018/wordml" xmlns:w16sdtdh="http://schemas.microsoft.com/office/word/2020/wordml/sdtdatahash" xmlns:w16se="http://schemas.microsoft.com/office/word/2015/wordml/symex" xmlns:wpg="http://schemas.microsoft.com/office/word/2010/wordprocessingGroup" xmlns:wpi="http://schemas.microsoft.com/office/word/2010/wordprocessingInk" xmlns:wne="http://schemas.microsoft.com/office/word/2006/wordml" xmlns:wps="http://schemas.microsoft.com/office/word/2010/wordprocessingShape" mc:Ignorable="w14 w15 w16se w16cid w16 w16cex w16sdtdh wp14">
   <w:sdt>
     <w:sdtPr>
       <w:id w:val="423088017"/>
@@ -20792,6 +19782,7 @@
         <w:docPartUnique/>
       </w:docPartObj>
     </w:sdtPr>
+    <w:sdtEndPr/>
     <w:sdtContent>
       <w:p>
         <w:pPr>
@@ -20810,7 +19801,7 @@
 </file>
 
 <file path=word/footer2.xml><?xml version="1.0" encoding="utf-8"?>
-<w:ftr xmlns:wpc="http://schemas.microsoft.com/office/word/2010/wordprocessingCanvas" xmlns:cx="http://schemas.microsoft.com/office/drawing/2014/chartex" xmlns:cx1="http://schemas.microsoft.com/office/drawing/2015/9/8/chartex" xmlns:cx2="http://schemas.microsoft.com/office/drawing/2015/10/21/chartex" xmlns:cx3="http://schemas.microsoft.com/office/drawing/2016/5/9/chartex" xmlns:cx4="http://schemas.microsoft.com/office/drawing/2016/5/10/chartex" xmlns:cx5="http://schemas.microsoft.com/office/drawing/2016/5/11/chartex" xmlns:cx6="http://schemas.microsoft.com/office/drawing/2016/5/12/chartex" xmlns:cx7="http://schemas.microsoft.com/office/drawing/2016/5/13/chartex" xmlns:cx8="http://schemas.microsoft.com/office/drawing/2016/5/14/chartex" xmlns:mc="http://schemas.openxmlformats.org/markup-compatibility/2006" xmlns:aink="http://schemas.microsoft.com/office/drawing/2016/ink" xmlns:am3d="http://schemas.microsoft.com/office/drawing/2017/model3d" xmlns:o="urn:schemas-microsoft-com:office:office" xmlns:oel="http://schemas.microsoft.com/office/2019/extlst" xmlns:r="http://schemas.openxmlformats.org/officeDocument/2006/relationships" xmlns:m="http://schemas.openxmlformats.org/officeDocument/2006/math" xmlns:v="urn:schemas-microsoft-com:vml" xmlns:wp14="http://schemas.microsoft.com/office/word/2010/wordprocessingDrawing" xmlns:wp="http://schemas.openxmlformats.org/drawingml/2006/wordprocessingDrawing" xmlns:w10="urn:schemas-microsoft-com:office:word" xmlns:w="http://schemas.openxmlformats.org/wordprocessingml/2006/main" xmlns:w14="http://schemas.microsoft.com/office/word/2010/wordml" xmlns:w15="http://schemas.microsoft.com/office/word/2012/wordml" xmlns:w16cex="http://schemas.microsoft.com/office/word/2018/wordml/cex" xmlns:w16cid="http://schemas.microsoft.com/office/word/2016/wordml/cid" xmlns:w16="http://schemas.microsoft.com/office/word/2018/wordml" xmlns:w16du="http://schemas.microsoft.com/office/word/2023/wordml/word16du" xmlns:w16sdtdh="http://schemas.microsoft.com/office/word/2020/wordml/sdtdatahash" xmlns:w16sdtfl="http://schemas.microsoft.com/office/word/2024/wordml/sdtformatlock" xmlns:w16se="http://schemas.microsoft.com/office/word/2015/wordml/symex" xmlns:wpg="http://schemas.microsoft.com/office/word/2010/wordprocessingGroup" xmlns:wpi="http://schemas.microsoft.com/office/word/2010/wordprocessingInk" xmlns:wne="http://schemas.microsoft.com/office/word/2006/wordml" xmlns:wps="http://schemas.microsoft.com/office/word/2010/wordprocessingShape" mc:Ignorable="w14 w15 w16se w16cid w16 w16cex w16sdtdh w16sdtfl w16du wp14">
+<w:ftr xmlns:wpc="http://schemas.microsoft.com/office/word/2010/wordprocessingCanvas" xmlns:cx="http://schemas.microsoft.com/office/drawing/2014/chartex" xmlns:cx1="http://schemas.microsoft.com/office/drawing/2015/9/8/chartex" xmlns:cx2="http://schemas.microsoft.com/office/drawing/2015/10/21/chartex" xmlns:cx3="http://schemas.microsoft.com/office/drawing/2016/5/9/chartex" xmlns:cx4="http://schemas.microsoft.com/office/drawing/2016/5/10/chartex" xmlns:cx5="http://schemas.microsoft.com/office/drawing/2016/5/11/chartex" xmlns:cx6="http://schemas.microsoft.com/office/drawing/2016/5/12/chartex" xmlns:cx7="http://schemas.microsoft.com/office/drawing/2016/5/13/chartex" xmlns:cx8="http://schemas.microsoft.com/office/drawing/2016/5/14/chartex" xmlns:mc="http://schemas.openxmlformats.org/markup-compatibility/2006" xmlns:aink="http://schemas.microsoft.com/office/drawing/2016/ink" xmlns:am3d="http://schemas.microsoft.com/office/drawing/2017/model3d" xmlns:o="urn:schemas-microsoft-com:office:office" xmlns:r="http://schemas.openxmlformats.org/officeDocument/2006/relationships" xmlns:m="http://schemas.openxmlformats.org/officeDocument/2006/math" xmlns:v="urn:schemas-microsoft-com:vml" xmlns:wp14="http://schemas.microsoft.com/office/word/2010/wordprocessingDrawing" xmlns:wp="http://schemas.openxmlformats.org/drawingml/2006/wordprocessingDrawing" xmlns:w10="urn:schemas-microsoft-com:office:word" xmlns:w="http://schemas.openxmlformats.org/wordprocessingml/2006/main" xmlns:w14="http://schemas.microsoft.com/office/word/2010/wordml" xmlns:w15="http://schemas.microsoft.com/office/word/2012/wordml" xmlns:w16cex="http://schemas.microsoft.com/office/word/2018/wordml/cex" xmlns:w16cid="http://schemas.microsoft.com/office/word/2016/wordml/cid" xmlns:w16="http://schemas.microsoft.com/office/word/2018/wordml" xmlns:w16sdtdh="http://schemas.microsoft.com/office/word/2020/wordml/sdtdatahash" xmlns:w16se="http://schemas.microsoft.com/office/word/2015/wordml/symex" xmlns:wpg="http://schemas.microsoft.com/office/word/2010/wordprocessingGroup" xmlns:wpi="http://schemas.microsoft.com/office/word/2010/wordprocessingInk" xmlns:wne="http://schemas.microsoft.com/office/word/2006/wordml" xmlns:wps="http://schemas.microsoft.com/office/word/2010/wordprocessingShape" mc:Ignorable="w14 w15 w16se w16cid w16 w16cex w16sdtdh wp14">
   <w:sdt>
     <w:sdtPr>
       <w:id w:val="6349135"/>
@@ -20819,6 +19810,7 @@
         <w:docPartUnique/>
       </w:docPartObj>
     </w:sdtPr>
+    <w:sdtEndPr/>
     <w:sdtContent>
       <w:p>
         <w:pPr>
@@ -20858,7 +19850,7 @@
 </file>
 
 <file path=word/footnotes.xml><?xml version="1.0" encoding="utf-8"?>
-<w:footnotes xmlns:wpc="http://schemas.microsoft.com/office/word/2010/wordprocessingCanvas" xmlns:cx="http://schemas.microsoft.com/office/drawing/2014/chartex" xmlns:cx1="http://schemas.microsoft.com/office/drawing/2015/9/8/chartex" xmlns:cx2="http://schemas.microsoft.com/office/drawing/2015/10/21/chartex" xmlns:cx3="http://schemas.microsoft.com/office/drawing/2016/5/9/chartex" xmlns:cx4="http://schemas.microsoft.com/office/drawing/2016/5/10/chartex" xmlns:cx5="http://schemas.microsoft.com/office/drawing/2016/5/11/chartex" xmlns:cx6="http://schemas.microsoft.com/office/drawing/2016/5/12/chartex" xmlns:cx7="http://schemas.microsoft.com/office/drawing/2016/5/13/chartex" xmlns:cx8="http://schemas.microsoft.com/office/drawing/2016/5/14/chartex" xmlns:mc="http://schemas.openxmlformats.org/markup-compatibility/2006" xmlns:aink="http://schemas.microsoft.com/office/drawing/2016/ink" xmlns:am3d="http://schemas.microsoft.com/office/drawing/2017/model3d" xmlns:o="urn:schemas-microsoft-com:office:office" xmlns:oel="http://schemas.microsoft.com/office/2019/extlst" xmlns:r="http://schemas.openxmlformats.org/officeDocument/2006/relationships" xmlns:m="http://schemas.openxmlformats.org/officeDocument/2006/math" xmlns:v="urn:schemas-microsoft-com:vml" xmlns:wp14="http://schemas.microsoft.com/office/word/2010/wordprocessingDrawing" xmlns:wp="http://schemas.openxmlformats.org/drawingml/2006/wordprocessingDrawing" xmlns:w10="urn:schemas-microsoft-com:office:word" xmlns:w="http://schemas.openxmlformats.org/wordprocessingml/2006/main" xmlns:w14="http://schemas.microsoft.com/office/word/2010/wordml" xmlns:w15="http://schemas.microsoft.com/office/word/2012/wordml" xmlns:w16cex="http://schemas.microsoft.com/office/word/2018/wordml/cex" xmlns:w16cid="http://schemas.microsoft.com/office/word/2016/wordml/cid" xmlns:w16="http://schemas.microsoft.com/office/word/2018/wordml" xmlns:w16du="http://schemas.microsoft.com/office/word/2023/wordml/word16du" xmlns:w16sdtdh="http://schemas.microsoft.com/office/word/2020/wordml/sdtdatahash" xmlns:w16sdtfl="http://schemas.microsoft.com/office/word/2024/wordml/sdtformatlock" xmlns:w16se="http://schemas.microsoft.com/office/word/2015/wordml/symex" xmlns:wpg="http://schemas.microsoft.com/office/word/2010/wordprocessingGroup" xmlns:wpi="http://schemas.microsoft.com/office/word/2010/wordprocessingInk" xmlns:wne="http://schemas.microsoft.com/office/word/2006/wordml" xmlns:wps="http://schemas.microsoft.com/office/word/2010/wordprocessingShape" mc:Ignorable="w14 w15 w16se w16cid w16 w16cex w16sdtdh w16sdtfl w16du wp14">
+<w:footnotes xmlns:wpc="http://schemas.microsoft.com/office/word/2010/wordprocessingCanvas" xmlns:cx="http://schemas.microsoft.com/office/drawing/2014/chartex" xmlns:cx1="http://schemas.microsoft.com/office/drawing/2015/9/8/chartex" xmlns:cx2="http://schemas.microsoft.com/office/drawing/2015/10/21/chartex" xmlns:cx3="http://schemas.microsoft.com/office/drawing/2016/5/9/chartex" xmlns:cx4="http://schemas.microsoft.com/office/drawing/2016/5/10/chartex" xmlns:cx5="http://schemas.microsoft.com/office/drawing/2016/5/11/chartex" xmlns:cx6="http://schemas.microsoft.com/office/drawing/2016/5/12/chartex" xmlns:cx7="http://schemas.microsoft.com/office/drawing/2016/5/13/chartex" xmlns:cx8="http://schemas.microsoft.com/office/drawing/2016/5/14/chartex" xmlns:mc="http://schemas.openxmlformats.org/markup-compatibility/2006" xmlns:aink="http://schemas.microsoft.com/office/drawing/2016/ink" xmlns:am3d="http://schemas.microsoft.com/office/drawing/2017/model3d" xmlns:o="urn:schemas-microsoft-com:office:office" xmlns:r="http://schemas.openxmlformats.org/officeDocument/2006/relationships" xmlns:m="http://schemas.openxmlformats.org/officeDocument/2006/math" xmlns:v="urn:schemas-microsoft-com:vml" xmlns:wp14="http://schemas.microsoft.com/office/word/2010/wordprocessingDrawing" xmlns:wp="http://schemas.openxmlformats.org/drawingml/2006/wordprocessingDrawing" xmlns:w10="urn:schemas-microsoft-com:office:word" xmlns:w="http://schemas.openxmlformats.org/wordprocessingml/2006/main" xmlns:w14="http://schemas.microsoft.com/office/word/2010/wordml" xmlns:w15="http://schemas.microsoft.com/office/word/2012/wordml" xmlns:w16cex="http://schemas.microsoft.com/office/word/2018/wordml/cex" xmlns:w16cid="http://schemas.microsoft.com/office/word/2016/wordml/cid" xmlns:w16="http://schemas.microsoft.com/office/word/2018/wordml" xmlns:w16sdtdh="http://schemas.microsoft.com/office/word/2020/wordml/sdtdatahash" xmlns:w16se="http://schemas.microsoft.com/office/word/2015/wordml/symex" xmlns:wpg="http://schemas.microsoft.com/office/word/2010/wordprocessingGroup" xmlns:wpi="http://schemas.microsoft.com/office/word/2010/wordprocessingInk" xmlns:wne="http://schemas.microsoft.com/office/word/2006/wordml" xmlns:wps="http://schemas.microsoft.com/office/word/2010/wordprocessingShape" mc:Ignorable="w14 w15 w16se w16cid w16 w16cex w16sdtdh wp14">
   <w:footnote w:type="separator" w:id="-1">
     <w:p>
       <w:pPr>
@@ -20883,7 +19875,7 @@
 </file>
 
 <file path=word/header1.xml><?xml version="1.0" encoding="utf-8"?>
-<w:hdr xmlns:wpc="http://schemas.microsoft.com/office/word/2010/wordprocessingCanvas" xmlns:cx="http://schemas.microsoft.com/office/drawing/2014/chartex" xmlns:cx1="http://schemas.microsoft.com/office/drawing/2015/9/8/chartex" xmlns:cx2="http://schemas.microsoft.com/office/drawing/2015/10/21/chartex" xmlns:cx3="http://schemas.microsoft.com/office/drawing/2016/5/9/chartex" xmlns:cx4="http://schemas.microsoft.com/office/drawing/2016/5/10/chartex" xmlns:cx5="http://schemas.microsoft.com/office/drawing/2016/5/11/chartex" xmlns:cx6="http://schemas.microsoft.com/office/drawing/2016/5/12/chartex" xmlns:cx7="http://schemas.microsoft.com/office/drawing/2016/5/13/chartex" xmlns:cx8="http://schemas.microsoft.com/office/drawing/2016/5/14/chartex" xmlns:mc="http://schemas.openxmlformats.org/markup-compatibility/2006" xmlns:aink="http://schemas.microsoft.com/office/drawing/2016/ink" xmlns:am3d="http://schemas.microsoft.com/office/drawing/2017/model3d" xmlns:o="urn:schemas-microsoft-com:office:office" xmlns:oel="http://schemas.microsoft.com/office/2019/extlst" xmlns:r="http://schemas.openxmlformats.org/officeDocument/2006/relationships" xmlns:m="http://schemas.openxmlformats.org/officeDocument/2006/math" xmlns:v="urn:schemas-microsoft-com:vml" xmlns:wp14="http://schemas.microsoft.com/office/word/2010/wordprocessingDrawing" xmlns:wp="http://schemas.openxmlformats.org/drawingml/2006/wordprocessingDrawing" xmlns:w10="urn:schemas-microsoft-com:office:word" xmlns:w="http://schemas.openxmlformats.org/wordprocessingml/2006/main" xmlns:w14="http://schemas.microsoft.com/office/word/2010/wordml" xmlns:w15="http://schemas.microsoft.com/office/word/2012/wordml" xmlns:w16cex="http://schemas.microsoft.com/office/word/2018/wordml/cex" xmlns:w16cid="http://schemas.microsoft.com/office/word/2016/wordml/cid" xmlns:w16="http://schemas.microsoft.com/office/word/2018/wordml" xmlns:w16du="http://schemas.microsoft.com/office/word/2023/wordml/word16du" xmlns:w16sdtdh="http://schemas.microsoft.com/office/word/2020/wordml/sdtdatahash" xmlns:w16sdtfl="http://schemas.microsoft.com/office/word/2024/wordml/sdtformatlock" xmlns:w16se="http://schemas.microsoft.com/office/word/2015/wordml/symex" xmlns:wpg="http://schemas.microsoft.com/office/word/2010/wordprocessingGroup" xmlns:wpi="http://schemas.microsoft.com/office/word/2010/wordprocessingInk" xmlns:wne="http://schemas.microsoft.com/office/word/2006/wordml" xmlns:wps="http://schemas.microsoft.com/office/word/2010/wordprocessingShape" mc:Ignorable="w14 w15 w16se w16cid w16 w16cex w16sdtdh w16sdtfl w16du wp14">
+<w:hdr xmlns:wpc="http://schemas.microsoft.com/office/word/2010/wordprocessingCanvas" xmlns:cx="http://schemas.microsoft.com/office/drawing/2014/chartex" xmlns:cx1="http://schemas.microsoft.com/office/drawing/2015/9/8/chartex" xmlns:cx2="http://schemas.microsoft.com/office/drawing/2015/10/21/chartex" xmlns:cx3="http://schemas.microsoft.com/office/drawing/2016/5/9/chartex" xmlns:cx4="http://schemas.microsoft.com/office/drawing/2016/5/10/chartex" xmlns:cx5="http://schemas.microsoft.com/office/drawing/2016/5/11/chartex" xmlns:cx6="http://schemas.microsoft.com/office/drawing/2016/5/12/chartex" xmlns:cx7="http://schemas.microsoft.com/office/drawing/2016/5/13/chartex" xmlns:cx8="http://schemas.microsoft.com/office/drawing/2016/5/14/chartex" xmlns:mc="http://schemas.openxmlformats.org/markup-compatibility/2006" xmlns:aink="http://schemas.microsoft.com/office/drawing/2016/ink" xmlns:am3d="http://schemas.microsoft.com/office/drawing/2017/model3d" xmlns:o="urn:schemas-microsoft-com:office:office" xmlns:r="http://schemas.openxmlformats.org/officeDocument/2006/relationships" xmlns:m="http://schemas.openxmlformats.org/officeDocument/2006/math" xmlns:v="urn:schemas-microsoft-com:vml" xmlns:wp14="http://schemas.microsoft.com/office/word/2010/wordprocessingDrawing" xmlns:wp="http://schemas.openxmlformats.org/drawingml/2006/wordprocessingDrawing" xmlns:w10="urn:schemas-microsoft-com:office:word" xmlns:w="http://schemas.openxmlformats.org/wordprocessingml/2006/main" xmlns:w14="http://schemas.microsoft.com/office/word/2010/wordml" xmlns:w15="http://schemas.microsoft.com/office/word/2012/wordml" xmlns:w16cex="http://schemas.microsoft.com/office/word/2018/wordml/cex" xmlns:w16cid="http://schemas.microsoft.com/office/word/2016/wordml/cid" xmlns:w16="http://schemas.microsoft.com/office/word/2018/wordml" xmlns:w16sdtdh="http://schemas.microsoft.com/office/word/2020/wordml/sdtdatahash" xmlns:w16se="http://schemas.microsoft.com/office/word/2015/wordml/symex" xmlns:wpg="http://schemas.microsoft.com/office/word/2010/wordprocessingGroup" xmlns:wpi="http://schemas.microsoft.com/office/word/2010/wordprocessingInk" xmlns:wne="http://schemas.microsoft.com/office/word/2006/wordml" xmlns:wps="http://schemas.microsoft.com/office/word/2010/wordprocessingShape" mc:Ignorable="w14 w15 w16se w16cid w16 w16cex w16sdtdh wp14">
   <w:sdt>
     <w:sdtPr>
       <w:rPr>
@@ -20894,6 +19886,7 @@
       <w:dataBinding w:prefixMappings="xmlns:ns0='http://schemas.openxmlformats.org/package/2006/metadata/core-properties' xmlns:ns1='http://purl.org/dc/elements/1.1/'" w:xpath="/ns0:coreProperties[1]/ns1:title[1]" w:storeItemID="{6C3C8BC8-F283-45AE-878A-BAB7291924A1}"/>
       <w:text/>
     </w:sdtPr>
+    <w:sdtEndPr/>
     <w:sdtContent>
       <w:p>
         <w:pPr>
@@ -20938,7 +19931,7 @@
 </file>
 
 <file path=word/numbering.xml><?xml version="1.0" encoding="utf-8"?>
-<w:numbering xmlns:wpc="http://schemas.microsoft.com/office/word/2010/wordprocessingCanvas" xmlns:cx="http://schemas.microsoft.com/office/drawing/2014/chartex" xmlns:cx1="http://schemas.microsoft.com/office/drawing/2015/9/8/chartex" xmlns:cx2="http://schemas.microsoft.com/office/drawing/2015/10/21/chartex" xmlns:cx3="http://schemas.microsoft.com/office/drawing/2016/5/9/chartex" xmlns:cx4="http://schemas.microsoft.com/office/drawing/2016/5/10/chartex" xmlns:cx5="http://schemas.microsoft.com/office/drawing/2016/5/11/chartex" xmlns:cx6="http://schemas.microsoft.com/office/drawing/2016/5/12/chartex" xmlns:cx7="http://schemas.microsoft.com/office/drawing/2016/5/13/chartex" xmlns:cx8="http://schemas.microsoft.com/office/drawing/2016/5/14/chartex" xmlns:mc="http://schemas.openxmlformats.org/markup-compatibility/2006" xmlns:aink="http://schemas.microsoft.com/office/drawing/2016/ink" xmlns:am3d="http://schemas.microsoft.com/office/drawing/2017/model3d" xmlns:o="urn:schemas-microsoft-com:office:office" xmlns:oel="http://schemas.microsoft.com/office/2019/extlst" xmlns:r="http://schemas.openxmlformats.org/officeDocument/2006/relationships" xmlns:m="http://schemas.openxmlformats.org/officeDocument/2006/math" xmlns:v="urn:schemas-microsoft-com:vml" xmlns:wp14="http://schemas.microsoft.com/office/word/2010/wordprocessingDrawing" xmlns:wp="http://schemas.openxmlformats.org/drawingml/2006/wordprocessingDrawing" xmlns:w10="urn:schemas-microsoft-com:office:word" xmlns:w="http://schemas.openxmlformats.org/wordprocessingml/2006/main" xmlns:w14="http://schemas.microsoft.com/office/word/2010/wordml" xmlns:w15="http://schemas.microsoft.com/office/word/2012/wordml" xmlns:w16cex="http://schemas.microsoft.com/office/word/2018/wordml/cex" xmlns:w16cid="http://schemas.microsoft.com/office/word/2016/wordml/cid" xmlns:w16="http://schemas.microsoft.com/office/word/2018/wordml" xmlns:w16du="http://schemas.microsoft.com/office/word/2023/wordml/word16du" xmlns:w16sdtdh="http://schemas.microsoft.com/office/word/2020/wordml/sdtdatahash" xmlns:w16sdtfl="http://schemas.microsoft.com/office/word/2024/wordml/sdtformatlock" xmlns:w16se="http://schemas.microsoft.com/office/word/2015/wordml/symex" xmlns:wpg="http://schemas.microsoft.com/office/word/2010/wordprocessingGroup" xmlns:wpi="http://schemas.microsoft.com/office/word/2010/wordprocessingInk" xmlns:wne="http://schemas.microsoft.com/office/word/2006/wordml" xmlns:wps="http://schemas.microsoft.com/office/word/2010/wordprocessingShape" mc:Ignorable="w14 w15 w16se w16cid w16 w16cex w16sdtdh w16sdtfl w16du wp14">
+<w:numbering xmlns:wpc="http://schemas.microsoft.com/office/word/2010/wordprocessingCanvas" xmlns:cx="http://schemas.microsoft.com/office/drawing/2014/chartex" xmlns:cx1="http://schemas.microsoft.com/office/drawing/2015/9/8/chartex" xmlns:cx2="http://schemas.microsoft.com/office/drawing/2015/10/21/chartex" xmlns:cx3="http://schemas.microsoft.com/office/drawing/2016/5/9/chartex" xmlns:cx4="http://schemas.microsoft.com/office/drawing/2016/5/10/chartex" xmlns:cx5="http://schemas.microsoft.com/office/drawing/2016/5/11/chartex" xmlns:cx6="http://schemas.microsoft.com/office/drawing/2016/5/12/chartex" xmlns:cx7="http://schemas.microsoft.com/office/drawing/2016/5/13/chartex" xmlns:cx8="http://schemas.microsoft.com/office/drawing/2016/5/14/chartex" xmlns:mc="http://schemas.openxmlformats.org/markup-compatibility/2006" xmlns:aink="http://schemas.microsoft.com/office/drawing/2016/ink" xmlns:am3d="http://schemas.microsoft.com/office/drawing/2017/model3d" xmlns:o="urn:schemas-microsoft-com:office:office" xmlns:r="http://schemas.openxmlformats.org/officeDocument/2006/relationships" xmlns:m="http://schemas.openxmlformats.org/officeDocument/2006/math" xmlns:v="urn:schemas-microsoft-com:vml" xmlns:wp14="http://schemas.microsoft.com/office/word/2010/wordprocessingDrawing" xmlns:wp="http://schemas.openxmlformats.org/drawingml/2006/wordprocessingDrawing" xmlns:w10="urn:schemas-microsoft-com:office:word" xmlns:w="http://schemas.openxmlformats.org/wordprocessingml/2006/main" xmlns:w14="http://schemas.microsoft.com/office/word/2010/wordml" xmlns:w15="http://schemas.microsoft.com/office/word/2012/wordml" xmlns:w16cex="http://schemas.microsoft.com/office/word/2018/wordml/cex" xmlns:w16cid="http://schemas.microsoft.com/office/word/2016/wordml/cid" xmlns:w16="http://schemas.microsoft.com/office/word/2018/wordml" xmlns:w16sdtdh="http://schemas.microsoft.com/office/word/2020/wordml/sdtdatahash" xmlns:w16se="http://schemas.microsoft.com/office/word/2015/wordml/symex" xmlns:wpg="http://schemas.microsoft.com/office/word/2010/wordprocessingGroup" xmlns:wpi="http://schemas.microsoft.com/office/word/2010/wordprocessingInk" xmlns:wne="http://schemas.microsoft.com/office/word/2006/wordml" xmlns:wps="http://schemas.microsoft.com/office/word/2010/wordprocessingShape" mc:Ignorable="w14 w15 w16se w16cid w16 w16cex w16sdtdh wp14">
   <w:abstractNum w:abstractNumId="0" w15:restartNumberingAfterBreak="0">
     <w:nsid w:val="0DB04654"/>
     <w:multiLevelType w:val="hybridMultilevel"/>
@@ -22736,22 +21729,22 @@
       </w:rPr>
     </w:lvl>
   </w:abstractNum>
-  <w:num w:numId="1" w16cid:durableId="1378385288">
+  <w:num w:numId="1">
     <w:abstractNumId w:val="7"/>
   </w:num>
-  <w:num w:numId="2" w16cid:durableId="2094349142">
+  <w:num w:numId="2">
     <w:abstractNumId w:val="11"/>
   </w:num>
-  <w:num w:numId="3" w16cid:durableId="387728177">
+  <w:num w:numId="3">
     <w:abstractNumId w:val="6"/>
   </w:num>
-  <w:num w:numId="4" w16cid:durableId="1018698418">
+  <w:num w:numId="4">
     <w:abstractNumId w:val="7"/>
   </w:num>
-  <w:num w:numId="5" w16cid:durableId="1641033722">
+  <w:num w:numId="5">
     <w:abstractNumId w:val="7"/>
   </w:num>
-  <w:num w:numId="6" w16cid:durableId="391730874">
+  <w:num w:numId="6">
     <w:abstractNumId w:val="7"/>
     <w:lvlOverride w:ilvl="0">
       <w:startOverride w:val="1"/>
@@ -22781,28 +21774,28 @@
       <w:startOverride w:val="1"/>
     </w:lvlOverride>
   </w:num>
-  <w:num w:numId="7" w16cid:durableId="61876254">
+  <w:num w:numId="7">
     <w:abstractNumId w:val="4"/>
   </w:num>
-  <w:num w:numId="8" w16cid:durableId="1231815040">
+  <w:num w:numId="8">
     <w:abstractNumId w:val="5"/>
   </w:num>
-  <w:num w:numId="9" w16cid:durableId="1126656068">
+  <w:num w:numId="9">
     <w:abstractNumId w:val="12"/>
   </w:num>
-  <w:num w:numId="10" w16cid:durableId="1784684789">
+  <w:num w:numId="10">
     <w:abstractNumId w:val="0"/>
   </w:num>
-  <w:num w:numId="11" w16cid:durableId="855774475">
+  <w:num w:numId="11">
     <w:abstractNumId w:val="14"/>
   </w:num>
-  <w:num w:numId="12" w16cid:durableId="375811482">
+  <w:num w:numId="12">
     <w:abstractNumId w:val="13"/>
   </w:num>
-  <w:num w:numId="13" w16cid:durableId="1745955133">
+  <w:num w:numId="13">
     <w:abstractNumId w:val="7"/>
   </w:num>
-  <w:num w:numId="14" w16cid:durableId="1153332724">
+  <w:num w:numId="14">
     <w:abstractNumId w:val="7"/>
     <w:lvlOverride w:ilvl="0">
       <w:startOverride w:val="1"/>
@@ -22832,7 +21825,7 @@
       <w:startOverride w:val="1"/>
     </w:lvlOverride>
   </w:num>
-  <w:num w:numId="15" w16cid:durableId="260770092">
+  <w:num w:numId="15">
     <w:abstractNumId w:val="7"/>
     <w:lvlOverride w:ilvl="0">
       <w:startOverride w:val="1"/>
@@ -22862,7 +21855,7 @@
       <w:startOverride w:val="1"/>
     </w:lvlOverride>
   </w:num>
-  <w:num w:numId="16" w16cid:durableId="664554041">
+  <w:num w:numId="16">
     <w:abstractNumId w:val="7"/>
     <w:lvlOverride w:ilvl="0">
       <w:startOverride w:val="1"/>
@@ -22892,7 +21885,7 @@
       <w:startOverride w:val="1"/>
     </w:lvlOverride>
   </w:num>
-  <w:num w:numId="17" w16cid:durableId="1612712025">
+  <w:num w:numId="17">
     <w:abstractNumId w:val="7"/>
     <w:lvlOverride w:ilvl="0">
       <w:startOverride w:val="1"/>
@@ -22922,7 +21915,7 @@
       <w:startOverride w:val="1"/>
     </w:lvlOverride>
   </w:num>
-  <w:num w:numId="18" w16cid:durableId="1178696172">
+  <w:num w:numId="18">
     <w:abstractNumId w:val="7"/>
     <w:lvlOverride w:ilvl="0">
       <w:startOverride w:val="1"/>
@@ -22952,7 +21945,7 @@
       <w:startOverride w:val="1"/>
     </w:lvlOverride>
   </w:num>
-  <w:num w:numId="19" w16cid:durableId="200754442">
+  <w:num w:numId="19">
     <w:abstractNumId w:val="7"/>
     <w:lvlOverride w:ilvl="0">
       <w:startOverride w:val="1"/>
@@ -22982,7 +21975,7 @@
       <w:startOverride w:val="1"/>
     </w:lvlOverride>
   </w:num>
-  <w:num w:numId="20" w16cid:durableId="2041785104">
+  <w:num w:numId="20">
     <w:abstractNumId w:val="7"/>
     <w:lvlOverride w:ilvl="0">
       <w:startOverride w:val="1"/>
@@ -23012,7 +22005,7 @@
       <w:startOverride w:val="1"/>
     </w:lvlOverride>
   </w:num>
-  <w:num w:numId="21" w16cid:durableId="2009091962">
+  <w:num w:numId="21">
     <w:abstractNumId w:val="7"/>
     <w:lvlOverride w:ilvl="0">
       <w:startOverride w:val="1"/>
@@ -23042,28 +22035,28 @@
       <w:startOverride w:val="1"/>
     </w:lvlOverride>
   </w:num>
-  <w:num w:numId="22" w16cid:durableId="710879724">
+  <w:num w:numId="22">
     <w:abstractNumId w:val="10"/>
   </w:num>
-  <w:num w:numId="23" w16cid:durableId="984353287">
+  <w:num w:numId="23">
     <w:abstractNumId w:val="9"/>
   </w:num>
-  <w:num w:numId="24" w16cid:durableId="535235570">
+  <w:num w:numId="24">
     <w:abstractNumId w:val="15"/>
   </w:num>
-  <w:num w:numId="25" w16cid:durableId="433209563">
+  <w:num w:numId="25">
     <w:abstractNumId w:val="8"/>
   </w:num>
-  <w:num w:numId="26" w16cid:durableId="1570730282">
+  <w:num w:numId="26">
     <w:abstractNumId w:val="1"/>
   </w:num>
-  <w:num w:numId="27" w16cid:durableId="946426550">
+  <w:num w:numId="27">
     <w:abstractNumId w:val="2"/>
   </w:num>
-  <w:num w:numId="28" w16cid:durableId="1846555589">
+  <w:num w:numId="28">
     <w:abstractNumId w:val="3"/>
   </w:num>
-  <w:num w:numId="29" w16cid:durableId="2075156328">
+  <w:num w:numId="29">
     <w:abstractNumId w:val="7"/>
     <w:lvlOverride w:ilvl="0">
       <w:startOverride w:val="1"/>
@@ -23093,7 +22086,7 @@
       <w:startOverride w:val="1"/>
     </w:lvlOverride>
   </w:num>
-  <w:num w:numId="30" w16cid:durableId="2119372405">
+  <w:num w:numId="30">
     <w:abstractNumId w:val="7"/>
     <w:lvlOverride w:ilvl="0">
       <w:startOverride w:val="1"/>
@@ -23123,7 +22116,7 @@
       <w:startOverride w:val="1"/>
     </w:lvlOverride>
   </w:num>
-  <w:num w:numId="31" w16cid:durableId="359204003">
+  <w:num w:numId="31">
     <w:abstractNumId w:val="7"/>
     <w:lvlOverride w:ilvl="0">
       <w:startOverride w:val="1"/>
@@ -23153,7 +22146,7 @@
       <w:startOverride w:val="1"/>
     </w:lvlOverride>
   </w:num>
-  <w:num w:numId="32" w16cid:durableId="520510691">
+  <w:num w:numId="32">
     <w:abstractNumId w:val="7"/>
     <w:lvlOverride w:ilvl="0">
       <w:startOverride w:val="1"/>
@@ -23188,7 +22181,7 @@
 </file>
 
 <file path=word/styles.xml><?xml version="1.0" encoding="utf-8"?>
-<w:styles xmlns:mc="http://schemas.openxmlformats.org/markup-compatibility/2006" xmlns:r="http://schemas.openxmlformats.org/officeDocument/2006/relationships" xmlns:w="http://schemas.openxmlformats.org/wordprocessingml/2006/main" xmlns:w14="http://schemas.microsoft.com/office/word/2010/wordml" xmlns:w15="http://schemas.microsoft.com/office/word/2012/wordml" xmlns:w16cex="http://schemas.microsoft.com/office/word/2018/wordml/cex" xmlns:w16cid="http://schemas.microsoft.com/office/word/2016/wordml/cid" xmlns:w16="http://schemas.microsoft.com/office/word/2018/wordml" xmlns:w16du="http://schemas.microsoft.com/office/word/2023/wordml/word16du" xmlns:w16sdtdh="http://schemas.microsoft.com/office/word/2020/wordml/sdtdatahash" xmlns:w16sdtfl="http://schemas.microsoft.com/office/word/2024/wordml/sdtformatlock" xmlns:w16se="http://schemas.microsoft.com/office/word/2015/wordml/symex" mc:Ignorable="w14 w15 w16se w16cid w16 w16cex w16sdtdh w16sdtfl w16du">
+<w:styles xmlns:mc="http://schemas.openxmlformats.org/markup-compatibility/2006" xmlns:r="http://schemas.openxmlformats.org/officeDocument/2006/relationships" xmlns:w="http://schemas.openxmlformats.org/wordprocessingml/2006/main" xmlns:w14="http://schemas.microsoft.com/office/word/2010/wordml" xmlns:w15="http://schemas.microsoft.com/office/word/2012/wordml" xmlns:w16cex="http://schemas.microsoft.com/office/word/2018/wordml/cex" xmlns:w16cid="http://schemas.microsoft.com/office/word/2016/wordml/cid" xmlns:w16="http://schemas.microsoft.com/office/word/2018/wordml" xmlns:w16sdtdh="http://schemas.microsoft.com/office/word/2020/wordml/sdtdatahash" xmlns:w16se="http://schemas.microsoft.com/office/word/2015/wordml/symex" mc:Ignorable="w14 w15 w16se w16cid w16 w16cex w16sdtdh">
   <w:docDefaults>
     <w:rPrDefault>
       <w:rPr>
@@ -23657,6 +22650,7 @@
   <w:style w:type="character" w:default="1" w:styleId="Tipodeletrapredefinidodopargrafo">
     <w:name w:val="Default Paragraph Font"/>
     <w:uiPriority w:val="1"/>
+    <w:semiHidden/>
     <w:unhideWhenUsed/>
   </w:style>
   <w:style w:type="table" w:default="1" w:styleId="Tabelanormal">

</xml_diff>